<commit_message>
Revising some text and responding to some simple comments
</commit_message>
<xml_diff>
--- a/docs/Revision1/Response_to_Reviewers.docx
+++ b/docs/Revision1/Response_to_Reviewers.docx
@@ -17,7 +17,18 @@
         <w:t>Editor</w:t>
       </w:r>
     </w:p>
-    <w:p>
+    <w:p/>
+    <w:p>
+      <w:r>
+        <w:rPr>
+          <w:b/>
+          <w:bCs/>
+        </w:rPr>
+        <w:t>C1:</w:t>
+      </w:r>
+      <w:r>
+        <w:t xml:space="preserve"> </w:t>
+      </w:r>
       <w:r>
         <w:t xml:space="preserve">Referee 1 and 2 both point out that you discuss different models but give no advice as to how one might go about choosing a model, particularly important for practitioners - how your ideas might be applied. </w:t>
       </w:r>
@@ -34,17 +45,124 @@
     <w:p/>
     <w:p>
       <w:r>
+        <w:rPr>
+          <w:b/>
+          <w:bCs/>
+          <w:color w:val="215E99" w:themeColor="text2" w:themeTint="BF"/>
+        </w:rPr>
+        <w:t>Response</w:t>
+      </w:r>
+      <w:r>
+        <w:rPr>
+          <w:color w:val="215E99" w:themeColor="text2" w:themeTint="BF"/>
+        </w:rPr>
+        <w:t>:</w:t>
+      </w:r>
+      <w:r>
+        <w:rPr>
+          <w:color w:val="215E99" w:themeColor="text2" w:themeTint="BF"/>
+        </w:rPr>
+        <w:t xml:space="preserve"> Thank you. This is a great idea. We have now re-written our Concluding Remarks section to discuss how to choose a model. </w:t>
+      </w:r>
+    </w:p>
+    <w:p/>
+    <w:p>
+      <w:r>
+        <w:rPr>
+          <w:b/>
+          <w:bCs/>
+        </w:rPr>
+        <w:t>C</w:t>
+      </w:r>
+      <w:r>
+        <w:rPr>
+          <w:b/>
+          <w:bCs/>
+        </w:rPr>
+        <w:t>2</w:t>
+      </w:r>
+      <w:r>
+        <w:rPr>
+          <w:b/>
+          <w:bCs/>
+        </w:rPr>
+        <w:t>:</w:t>
+      </w:r>
+      <w:r>
+        <w:t xml:space="preserve"> </w:t>
+      </w:r>
+      <w:r>
         <w:t>Referees 2 and 3 feels that you spend too much time on certain aspects which have been covered by recent reviews and, as such, skim over what is more interesting and novel about your approach. Again, this will free up space to discuss broader applications of your approach.</w:t>
       </w:r>
     </w:p>
     <w:p/>
     <w:p>
       <w:r>
+        <w:rPr>
+          <w:b/>
+          <w:bCs/>
+          <w:color w:val="215E99" w:themeColor="text2" w:themeTint="BF"/>
+        </w:rPr>
+        <w:t>Response</w:t>
+      </w:r>
+      <w:r>
+        <w:rPr>
+          <w:color w:val="215E99" w:themeColor="text2" w:themeTint="BF"/>
+        </w:rPr>
+        <w:t>:</w:t>
+      </w:r>
+    </w:p>
+    <w:p/>
+    <w:p>
+      <w:r>
+        <w:rPr>
+          <w:b/>
+          <w:bCs/>
+        </w:rPr>
+        <w:t>C3:</w:t>
+      </w:r>
+      <w:r>
+        <w:rPr>
+          <w:b/>
+          <w:bCs/>
+        </w:rPr>
+        <w:t xml:space="preserve"> </w:t>
+      </w:r>
+      <w:r>
         <w:t>Referee 3 comments on many of the figures and states that they found them hard to understand.</w:t>
       </w:r>
     </w:p>
     <w:p/>
     <w:p>
+      <w:r>
+        <w:rPr>
+          <w:b/>
+          <w:bCs/>
+          <w:color w:val="215E99" w:themeColor="text2" w:themeTint="BF"/>
+        </w:rPr>
+        <w:t>Response</w:t>
+      </w:r>
+      <w:r>
+        <w:rPr>
+          <w:color w:val="215E99" w:themeColor="text2" w:themeTint="BF"/>
+        </w:rPr>
+        <w:t>:</w:t>
+      </w:r>
+      <w:r>
+        <w:rPr>
+          <w:color w:val="215E99" w:themeColor="text2" w:themeTint="BF"/>
+        </w:rPr>
+        <w:t xml:space="preserve"> We have tried to adjust our figures and figure legends to hopefully make them easier to understand. </w:t>
+      </w:r>
+    </w:p>
+    <w:p/>
+    <w:p>
+      <w:pPr>
+        <w:rPr>
+          <w:b/>
+          <w:bCs/>
+        </w:rPr>
+      </w:pPr>
       <w:proofErr w:type="spellStart"/>
       <w:r>
         <w:t>Editorally</w:t>
@@ -63,6 +181,34 @@
       </w:r>
       <w:r>
         <w:br/>
+      </w:r>
+    </w:p>
+    <w:p>
+      <w:r>
+        <w:rPr>
+          <w:b/>
+          <w:bCs/>
+        </w:rPr>
+        <w:t>C</w:t>
+      </w:r>
+      <w:r>
+        <w:rPr>
+          <w:b/>
+          <w:bCs/>
+        </w:rPr>
+        <w:t>4</w:t>
+      </w:r>
+      <w:r>
+        <w:rPr>
+          <w:b/>
+          <w:bCs/>
+        </w:rPr>
+        <w:t>:</w:t>
+      </w:r>
+      <w:r>
+        <w:t xml:space="preserve"> </w:t>
+      </w:r>
+      <w:r>
         <w:t xml:space="preserve">(1) Many parts of the paper are over the various word counts - every section must be within 10% of the stated limits (except the Abstract, where 120 words is a hard limit). This has been categorised as an Opinion </w:t>
       </w:r>
       <w:proofErr w:type="gramStart"/>
@@ -74,15 +220,113 @@
         <w:t xml:space="preserve"> and it appears you have used the guidelines for a Review article. The main text is 3810 words and needs to be reduced to no more than 2750. You currently have five elements (2 figures and 3 boxes), you must remove one (Box 3 is the obvious candidate). All Boxes need to be reduced to no more than 440 words and the main text figure captions to no more than 250. Box figure captions must be short (i.e. less than 100 words) - they are currently okay.</w:t>
       </w:r>
     </w:p>
-    <w:p>
-      <w:r>
-        <w:br/>
+    <w:p/>
+    <w:p>
+      <w:pPr>
+        <w:rPr>
+          <w:color w:val="215E99" w:themeColor="text2" w:themeTint="BF"/>
+        </w:rPr>
+      </w:pPr>
+      <w:r>
+        <w:rPr>
+          <w:b/>
+          <w:bCs/>
+          <w:color w:val="215E99" w:themeColor="text2" w:themeTint="BF"/>
+        </w:rPr>
+        <w:t>Response</w:t>
+      </w:r>
+      <w:r>
+        <w:rPr>
+          <w:color w:val="215E99" w:themeColor="text2" w:themeTint="BF"/>
+        </w:rPr>
+        <w:t xml:space="preserve">: Sorry. There was some confusion about the article type as it was originally approved as an Opinion but changed to a Review between the acceptance of the proposal and the submission. As clarified with the Editor, this should be considered a Review. We have checked that our submission word counts and element numbers follow the Review submission guidelines. </w:t>
+      </w:r>
+    </w:p>
+    <w:p>
+      <w:r>
+        <w:br/>
+      </w:r>
+      <w:r>
+        <w:rPr>
+          <w:b/>
+          <w:bCs/>
+        </w:rPr>
+        <w:t>C</w:t>
+      </w:r>
+      <w:r>
+        <w:rPr>
+          <w:b/>
+          <w:bCs/>
+        </w:rPr>
+        <w:t>5</w:t>
+      </w:r>
+      <w:r>
+        <w:rPr>
+          <w:b/>
+          <w:bCs/>
+        </w:rPr>
+        <w:t>:</w:t>
+      </w:r>
+      <w:r>
+        <w:t xml:space="preserve"> </w:t>
+      </w:r>
+      <w:r>
         <w:t>(2) The Concluding Remarks need rewriting. You have just provided a summary of the paper. The Concluding Remarks section should aim to tie threads together and indicate the path forward</w:t>
       </w:r>
     </w:p>
-    <w:p>
-      <w:r>
-        <w:br/>
+    <w:p/>
+    <w:p>
+      <w:r>
+        <w:rPr>
+          <w:b/>
+          <w:bCs/>
+          <w:color w:val="215E99" w:themeColor="text2" w:themeTint="BF"/>
+        </w:rPr>
+        <w:lastRenderedPageBreak/>
+        <w:t>Response</w:t>
+      </w:r>
+      <w:r>
+        <w:rPr>
+          <w:color w:val="215E99" w:themeColor="text2" w:themeTint="BF"/>
+        </w:rPr>
+        <w:t>:</w:t>
+      </w:r>
+      <w:r>
+        <w:rPr>
+          <w:color w:val="215E99" w:themeColor="text2" w:themeTint="BF"/>
+        </w:rPr>
+        <w:t xml:space="preserve"> Thank you. Good suggestion. We have now re-written our concluding Remarks section to encapsulate how to choose a model and suggests some paths forward.</w:t>
+      </w:r>
+    </w:p>
+    <w:p>
+      <w:r>
+        <w:br/>
+      </w:r>
+      <w:r>
+        <w:rPr>
+          <w:b/>
+          <w:bCs/>
+        </w:rPr>
+        <w:t>C</w:t>
+      </w:r>
+      <w:r>
+        <w:rPr>
+          <w:b/>
+          <w:bCs/>
+        </w:rPr>
+        <w:t>6</w:t>
+      </w:r>
+      <w:r>
+        <w:rPr>
+          <w:b/>
+          <w:bCs/>
+        </w:rPr>
+        <w:t>:</w:t>
+      </w:r>
+      <w:r>
+        <w:t xml:space="preserve"> </w:t>
+      </w:r>
+      <w:r>
         <w:t xml:space="preserve">(3) The Supplementary Information is to go. I appreciate that you have put a lot of work into </w:t>
       </w:r>
       <w:proofErr w:type="gramStart"/>
@@ -94,21 +338,164 @@
         <w:t xml:space="preserve"> but it is too extensive for a TREE article. You have essentially an additional paper in there. Either the information is important enough that it is brought into the text as a Box or it isn't important. Very few readers will access it (we have download figures).</w:t>
       </w:r>
     </w:p>
-    <w:p>
-      <w:r>
-        <w:br/>
+    <w:p/>
+    <w:p>
+      <w:r>
+        <w:rPr>
+          <w:b/>
+          <w:bCs/>
+          <w:color w:val="215E99" w:themeColor="text2" w:themeTint="BF"/>
+        </w:rPr>
+        <w:t>Response</w:t>
+      </w:r>
+      <w:r>
+        <w:rPr>
+          <w:color w:val="215E99" w:themeColor="text2" w:themeTint="BF"/>
+        </w:rPr>
+        <w:t>:</w:t>
+      </w:r>
+      <w:r>
+        <w:rPr>
+          <w:color w:val="215E99" w:themeColor="text2" w:themeTint="BF"/>
+        </w:rPr>
+        <w:t xml:space="preserve"> We have moved the crucial elements out of the supplement in the main manuscript now. </w:t>
+      </w:r>
+    </w:p>
+    <w:p>
+      <w:r>
+        <w:br/>
+      </w:r>
+      <w:r>
+        <w:rPr>
+          <w:b/>
+          <w:bCs/>
+        </w:rPr>
+        <w:t>C</w:t>
+      </w:r>
+      <w:r>
+        <w:rPr>
+          <w:b/>
+          <w:bCs/>
+        </w:rPr>
+        <w:t>7</w:t>
+      </w:r>
+      <w:r>
+        <w:rPr>
+          <w:b/>
+          <w:bCs/>
+        </w:rPr>
+        <w:t>:</w:t>
+      </w:r>
+      <w:r>
+        <w:t xml:space="preserve"> </w:t>
+      </w:r>
+      <w:r>
         <w:t>(4) The equations in the main text are to be replaced with a narrative discussion.</w:t>
       </w:r>
     </w:p>
-    <w:p>
-      <w:r>
-        <w:br/>
+    <w:p/>
+    <w:p>
+      <w:r>
+        <w:rPr>
+          <w:b/>
+          <w:bCs/>
+          <w:color w:val="215E99" w:themeColor="text2" w:themeTint="BF"/>
+        </w:rPr>
+        <w:t>Response</w:t>
+      </w:r>
+      <w:r>
+        <w:rPr>
+          <w:color w:val="215E99" w:themeColor="text2" w:themeTint="BF"/>
+        </w:rPr>
+        <w:t>:</w:t>
+      </w:r>
+      <w:r>
+        <w:rPr>
+          <w:color w:val="215E99" w:themeColor="text2" w:themeTint="BF"/>
+        </w:rPr>
+        <w:t xml:space="preserve"> We agree. We have removed equations from the main text and restricted these to boxes.</w:t>
+      </w:r>
+    </w:p>
+    <w:p>
+      <w:r>
+        <w:br/>
+      </w:r>
+      <w:r>
+        <w:rPr>
+          <w:b/>
+          <w:bCs/>
+        </w:rPr>
+        <w:t>C</w:t>
+      </w:r>
+      <w:r>
+        <w:rPr>
+          <w:b/>
+          <w:bCs/>
+        </w:rPr>
+        <w:t>8</w:t>
+      </w:r>
+      <w:r>
+        <w:rPr>
+          <w:b/>
+          <w:bCs/>
+        </w:rPr>
+        <w:t>:</w:t>
+      </w:r>
+      <w:r>
+        <w:t xml:space="preserve"> </w:t>
+      </w:r>
+      <w:r>
         <w:t>(5) The Abstract &amp; the Highlights - currently they overlap, which is a lost opportunity. Consider these as a complementary pair and work on them together. The Abstract should cover the paper at hand - focus on your key findings, not what you are going to cover. The Highlights should place the article into the broader literature. The final bullet of the Highlights is your key "take-home" message - write this first. Then the ones above move up and out to be more general and broader.</w:t>
       </w:r>
     </w:p>
     <w:p/>
     <w:p>
       <w:r>
+        <w:rPr>
+          <w:b/>
+          <w:bCs/>
+          <w:color w:val="215E99" w:themeColor="text2" w:themeTint="BF"/>
+        </w:rPr>
+        <w:t>Response</w:t>
+      </w:r>
+      <w:r>
+        <w:rPr>
+          <w:color w:val="215E99" w:themeColor="text2" w:themeTint="BF"/>
+        </w:rPr>
+        <w:t>:</w:t>
+      </w:r>
+    </w:p>
+    <w:p/>
+    <w:p>
+      <w:r>
+        <w:rPr>
+          <w:b/>
+          <w:bCs/>
+        </w:rPr>
+        <w:t>C</w:t>
+      </w:r>
+      <w:r>
+        <w:rPr>
+          <w:b/>
+          <w:bCs/>
+        </w:rPr>
+        <w:t>9</w:t>
+      </w:r>
+      <w:r>
+        <w:rPr>
+          <w:b/>
+          <w:bCs/>
+        </w:rPr>
+        <w:t>:</w:t>
+      </w:r>
+      <w:r>
+        <w:rPr>
+          <w:b/>
+          <w:bCs/>
+        </w:rPr>
+        <w:t xml:space="preserve"> </w:t>
+      </w:r>
+      <w:r>
         <w:t>I have also provided a marked up copy of your manuscript with comments and suggestions that I would like you to follow. I have also uploaded the Cell Press DI form, which you must provide on resubmission. </w:t>
       </w:r>
       <w:r>
@@ -117,16 +504,7 @@
           <w:bCs/>
           <w:u w:val="single"/>
         </w:rPr>
-        <w:t xml:space="preserve">Major (non-typographical) comments must </w:t>
-      </w:r>
-      <w:r>
-        <w:rPr>
-          <w:b/>
-          <w:bCs/>
-          <w:u w:val="single"/>
-        </w:rPr>
-        <w:lastRenderedPageBreak/>
-        <w:t xml:space="preserve">also be included in your response to </w:t>
+        <w:t xml:space="preserve">Major (non-typographical) comments must also be included in your response to </w:t>
       </w:r>
       <w:proofErr w:type="gramStart"/>
       <w:r>
@@ -180,6 +558,26 @@
           <w:bCs/>
         </w:rPr>
       </w:pPr>
+      <w:r>
+        <w:rPr>
+          <w:b/>
+          <w:bCs/>
+          <w:color w:val="215E99" w:themeColor="text2" w:themeTint="BF"/>
+        </w:rPr>
+        <w:t>Response</w:t>
+      </w:r>
+      <w:r>
+        <w:rPr>
+          <w:color w:val="215E99" w:themeColor="text2" w:themeTint="BF"/>
+        </w:rPr>
+        <w:t>:</w:t>
+      </w:r>
+      <w:r>
+        <w:rPr>
+          <w:color w:val="215E99" w:themeColor="text2" w:themeTint="BF"/>
+        </w:rPr>
+        <w:t xml:space="preserve"> Thank you. We have incorporated these suggestions into our revised manuscript. </w:t>
+      </w:r>
     </w:p>
     <w:p>
       <w:pPr>
@@ -188,6 +586,14 @@
           <w:bCs/>
         </w:rPr>
       </w:pPr>
+    </w:p>
+    <w:p>
+      <w:pPr>
+        <w:rPr>
+          <w:b/>
+          <w:bCs/>
+        </w:rPr>
+      </w:pPr>
       <w:r>
         <w:rPr>
           <w:b/>
@@ -198,7 +604,98 @@
     </w:p>
     <w:p>
       <w:r>
-        <w:t xml:space="preserve">This paper explores how linking different types of models (i.e., biophysical, physiological, population, community, and social-ecological models) operating at various scales can inform understanding of the impacts of extreme heat on ecological systems. The authors discuss the opportunities that model integration across scales can have for understanding the impacts of extreme heat as well as the challenges involved. They touch on implications for natural and agricultural systems, food security, and ecosystem services. I think that the overall conceptual approach is appealing and offers promise. </w:t>
+        <w:rPr>
+          <w:b/>
+          <w:bCs/>
+        </w:rPr>
+        <w:t>C</w:t>
+      </w:r>
+      <w:r>
+        <w:rPr>
+          <w:b/>
+          <w:bCs/>
+        </w:rPr>
+        <w:t>10</w:t>
+      </w:r>
+      <w:r>
+        <w:rPr>
+          <w:b/>
+          <w:bCs/>
+        </w:rPr>
+        <w:t>:</w:t>
+      </w:r>
+      <w:r>
+        <w:rPr>
+          <w:b/>
+          <w:bCs/>
+        </w:rPr>
+        <w:t xml:space="preserve"> </w:t>
+      </w:r>
+      <w:r>
+        <w:t xml:space="preserve">This paper explores how linking different types of models (i.e., biophysical, physiological, population, community, and social-ecological models) operating at various scales can inform understanding of the impacts of extreme heat on ecological systems. The authors discuss the opportunities that model integration across scales can have for understanding the impacts of extreme heat as well as the challenges involved. They touch on implications for natural and agricultural systems, food security, </w:t>
+      </w:r>
+      <w:r>
+        <w:lastRenderedPageBreak/>
+        <w:t xml:space="preserve">and ecosystem services. I think that the overall conceptual approach is appealing and offers promise. </w:t>
+      </w:r>
+    </w:p>
+    <w:p/>
+    <w:p>
+      <w:pPr>
+        <w:rPr>
+          <w:color w:val="215E99" w:themeColor="text2" w:themeTint="BF"/>
+        </w:rPr>
+      </w:pPr>
+      <w:r>
+        <w:rPr>
+          <w:b/>
+          <w:bCs/>
+          <w:color w:val="215E99" w:themeColor="text2" w:themeTint="BF"/>
+        </w:rPr>
+        <w:t>Response</w:t>
+      </w:r>
+      <w:r>
+        <w:rPr>
+          <w:color w:val="215E99" w:themeColor="text2" w:themeTint="BF"/>
+        </w:rPr>
+        <w:t>:</w:t>
+      </w:r>
+      <w:r>
+        <w:rPr>
+          <w:color w:val="215E99" w:themeColor="text2" w:themeTint="BF"/>
+        </w:rPr>
+        <w:t xml:space="preserve"> We are glad Reviewer 1 finds the conceptual approach promising and appealing for predicting how systems might be impacted by extreme heat.</w:t>
+      </w:r>
+    </w:p>
+    <w:p/>
+    <w:p>
+      <w:r>
+        <w:rPr>
+          <w:b/>
+          <w:bCs/>
+        </w:rPr>
+        <w:t>C</w:t>
+      </w:r>
+      <w:r>
+        <w:rPr>
+          <w:b/>
+          <w:bCs/>
+        </w:rPr>
+        <w:t>11</w:t>
+      </w:r>
+      <w:r>
+        <w:rPr>
+          <w:b/>
+          <w:bCs/>
+        </w:rPr>
+        <w:t>:</w:t>
+      </w:r>
+      <w:r>
+        <w:rPr>
+          <w:b/>
+          <w:bCs/>
+        </w:rPr>
+        <w:t xml:space="preserve"> </w:t>
       </w:r>
       <w:r>
         <w:rPr>
@@ -227,15 +724,64 @@
         <w:t xml:space="preserve"> Practice and guidance on model documentation, development, validation, etc. that would be helpful to briefly describe and cite. These issues become even more important when the models will be used for real-world decision-making (often by non-modelers), rather than as research tools.</w:t>
       </w:r>
     </w:p>
+    <w:p/>
     <w:p>
       <w:pPr>
         <w:rPr>
-          <w:b/>
-          <w:bCs/>
+          <w:color w:val="215E99" w:themeColor="text2" w:themeTint="BF"/>
         </w:rPr>
       </w:pPr>
-    </w:p>
-    <w:p>
+      <w:r>
+        <w:rPr>
+          <w:b/>
+          <w:bCs/>
+          <w:color w:val="215E99" w:themeColor="text2" w:themeTint="BF"/>
+        </w:rPr>
+        <w:t>Response</w:t>
+      </w:r>
+      <w:r>
+        <w:rPr>
+          <w:color w:val="215E99" w:themeColor="text2" w:themeTint="BF"/>
+        </w:rPr>
+        <w:t>:</w:t>
+      </w:r>
+      <w:r>
+        <w:rPr>
+          <w:color w:val="215E99" w:themeColor="text2" w:themeTint="BF"/>
+        </w:rPr>
+        <w:t xml:space="preserve"> This is an excellent point. ….</w:t>
+      </w:r>
+    </w:p>
+    <w:p/>
+    <w:p>
+      <w:r>
+        <w:rPr>
+          <w:b/>
+          <w:bCs/>
+        </w:rPr>
+        <w:t>C</w:t>
+      </w:r>
+      <w:r>
+        <w:rPr>
+          <w:b/>
+          <w:bCs/>
+        </w:rPr>
+        <w:t>12</w:t>
+      </w:r>
+      <w:r>
+        <w:rPr>
+          <w:b/>
+          <w:bCs/>
+        </w:rPr>
+        <w:t>:</w:t>
+      </w:r>
+      <w:r>
+        <w:rPr>
+          <w:b/>
+          <w:bCs/>
+        </w:rPr>
+        <w:t xml:space="preserve"> </w:t>
+      </w:r>
       <w:r>
         <w:t xml:space="preserve">I have </w:t>
       </w:r>
@@ -289,15 +835,119 @@
     <w:p/>
     <w:p>
       <w:r>
+        <w:rPr>
+          <w:b/>
+          <w:bCs/>
+          <w:color w:val="215E99" w:themeColor="text2" w:themeTint="BF"/>
+        </w:rPr>
+        <w:t>Response</w:t>
+      </w:r>
+      <w:r>
+        <w:rPr>
+          <w:color w:val="215E99" w:themeColor="text2" w:themeTint="BF"/>
+        </w:rPr>
+        <w:t>:</w:t>
+      </w:r>
+    </w:p>
+    <w:p/>
+    <w:p>
+      <w:r>
         <w:t>Some specific comments:</w:t>
       </w:r>
     </w:p>
     <w:p>
       <w:r>
+        <w:rPr>
+          <w:b/>
+          <w:bCs/>
+        </w:rPr>
+        <w:t>C</w:t>
+      </w:r>
+      <w:r>
+        <w:rPr>
+          <w:b/>
+          <w:bCs/>
+        </w:rPr>
+        <w:t>13</w:t>
+      </w:r>
+      <w:r>
+        <w:rPr>
+          <w:b/>
+          <w:bCs/>
+        </w:rPr>
+        <w:t>:</w:t>
+      </w:r>
+      <w:r>
+        <w:rPr>
+          <w:b/>
+          <w:bCs/>
+        </w:rPr>
+        <w:t xml:space="preserve"> </w:t>
+      </w:r>
+      <w:r>
         <w:t>L 54: resulting should be result.</w:t>
       </w:r>
     </w:p>
-    <w:p>
+    <w:p/>
+    <w:p>
+      <w:r>
+        <w:rPr>
+          <w:b/>
+          <w:bCs/>
+          <w:color w:val="215E99" w:themeColor="text2" w:themeTint="BF"/>
+        </w:rPr>
+        <w:t>Response</w:t>
+      </w:r>
+      <w:r>
+        <w:rPr>
+          <w:color w:val="215E99" w:themeColor="text2" w:themeTint="BF"/>
+        </w:rPr>
+        <w:t>:</w:t>
+      </w:r>
+      <w:r>
+        <w:rPr>
+          <w:color w:val="215E99" w:themeColor="text2" w:themeTint="BF"/>
+        </w:rPr>
+        <w:t xml:space="preserve"> Fixed.</w:t>
+      </w:r>
+    </w:p>
+    <w:p/>
+    <w:p>
+      <w:r>
+        <w:rPr>
+          <w:b/>
+          <w:bCs/>
+        </w:rPr>
+        <w:t>C</w:t>
+      </w:r>
+      <w:r>
+        <w:rPr>
+          <w:b/>
+          <w:bCs/>
+        </w:rPr>
+        <w:t>1</w:t>
+      </w:r>
+      <w:r>
+        <w:rPr>
+          <w:b/>
+          <w:bCs/>
+        </w:rPr>
+        <w:t>4</w:t>
+      </w:r>
+      <w:r>
+        <w:rPr>
+          <w:b/>
+          <w:bCs/>
+        </w:rPr>
+        <w:t>:</w:t>
+      </w:r>
+      <w:r>
+        <w:rPr>
+          <w:b/>
+          <w:bCs/>
+        </w:rPr>
+        <w:t xml:space="preserve"> </w:t>
+      </w:r>
       <w:r>
         <w:t xml:space="preserve">Figure 1, L 15 of caption: "novel integration of existing models in this novel way"; probably don't need </w:t>
       </w:r>
@@ -310,12 +960,130 @@
         <w:t xml:space="preserve"> novels.</w:t>
       </w:r>
     </w:p>
-    <w:p>
+    <w:p/>
+    <w:p>
+      <w:r>
+        <w:rPr>
+          <w:b/>
+          <w:bCs/>
+          <w:color w:val="215E99" w:themeColor="text2" w:themeTint="BF"/>
+        </w:rPr>
+        <w:t>Response</w:t>
+      </w:r>
+      <w:r>
+        <w:rPr>
+          <w:color w:val="215E99" w:themeColor="text2" w:themeTint="BF"/>
+        </w:rPr>
+        <w:t>:</w:t>
+      </w:r>
+      <w:r>
+        <w:rPr>
+          <w:color w:val="215E99" w:themeColor="text2" w:themeTint="BF"/>
+        </w:rPr>
+        <w:t xml:space="preserve"> Thanks. We have removed the second “novel”.</w:t>
+      </w:r>
+    </w:p>
+    <w:p/>
+    <w:p>
+      <w:r>
+        <w:rPr>
+          <w:b/>
+          <w:bCs/>
+        </w:rPr>
+        <w:t>C</w:t>
+      </w:r>
+      <w:r>
+        <w:rPr>
+          <w:b/>
+          <w:bCs/>
+        </w:rPr>
+        <w:t>1</w:t>
+      </w:r>
+      <w:r>
+        <w:rPr>
+          <w:b/>
+          <w:bCs/>
+        </w:rPr>
+        <w:t>5</w:t>
+      </w:r>
+      <w:r>
+        <w:rPr>
+          <w:b/>
+          <w:bCs/>
+        </w:rPr>
+        <w:t>:</w:t>
+      </w:r>
+      <w:r>
+        <w:rPr>
+          <w:b/>
+          <w:bCs/>
+        </w:rPr>
+        <w:t xml:space="preserve"> </w:t>
+      </w:r>
       <w:r>
         <w:t>L 208: heat injures should be heat injuries.</w:t>
       </w:r>
     </w:p>
-    <w:p>
+    <w:p/>
+    <w:p>
+      <w:r>
+        <w:rPr>
+          <w:b/>
+          <w:bCs/>
+          <w:color w:val="215E99" w:themeColor="text2" w:themeTint="BF"/>
+        </w:rPr>
+        <w:t>Response</w:t>
+      </w:r>
+      <w:r>
+        <w:rPr>
+          <w:color w:val="215E99" w:themeColor="text2" w:themeTint="BF"/>
+        </w:rPr>
+        <w:t>:</w:t>
+      </w:r>
+      <w:r>
+        <w:rPr>
+          <w:color w:val="215E99" w:themeColor="text2" w:themeTint="BF"/>
+        </w:rPr>
+        <w:t xml:space="preserve"> Thanks. We’ve fixed this but note we’ve done some re-writing of this section.</w:t>
+      </w:r>
+    </w:p>
+    <w:p/>
+    <w:p>
+      <w:r>
+        <w:rPr>
+          <w:b/>
+          <w:bCs/>
+        </w:rPr>
+        <w:t>C</w:t>
+      </w:r>
+      <w:r>
+        <w:rPr>
+          <w:b/>
+          <w:bCs/>
+        </w:rPr>
+        <w:t>1</w:t>
+      </w:r>
+      <w:r>
+        <w:rPr>
+          <w:b/>
+          <w:bCs/>
+        </w:rPr>
+        <w:t>6</w:t>
+      </w:r>
+      <w:r>
+        <w:rPr>
+          <w:b/>
+          <w:bCs/>
+        </w:rPr>
+        <w:t>:</w:t>
+      </w:r>
+      <w:r>
+        <w:rPr>
+          <w:b/>
+          <w:bCs/>
+        </w:rPr>
+        <w:t xml:space="preserve"> </w:t>
+      </w:r>
       <w:r>
         <w:t>Box 1, first line of P 13: "can also impact thermal sensitivity" is repeated twice.</w:t>
       </w:r>
@@ -326,13 +1094,150 @@
       </w:r>
     </w:p>
     <w:p>
+      <w:pPr>
+        <w:rPr>
+          <w:b/>
+          <w:bCs/>
+        </w:rPr>
+      </w:pPr>
+    </w:p>
+    <w:p>
+      <w:pPr>
+        <w:rPr>
+          <w:b/>
+          <w:bCs/>
+        </w:rPr>
+      </w:pPr>
+      <w:r>
+        <w:rPr>
+          <w:b/>
+          <w:bCs/>
+          <w:color w:val="215E99" w:themeColor="text2" w:themeTint="BF"/>
+        </w:rPr>
+        <w:lastRenderedPageBreak/>
+        <w:t>Response</w:t>
+      </w:r>
+      <w:r>
+        <w:rPr>
+          <w:color w:val="215E99" w:themeColor="text2" w:themeTint="BF"/>
+        </w:rPr>
+        <w:t>:</w:t>
+      </w:r>
+      <w:r>
+        <w:rPr>
+          <w:color w:val="215E99" w:themeColor="text2" w:themeTint="BF"/>
+        </w:rPr>
+        <w:t xml:space="preserve"> Thanks for catching these errors. We’ve removed the repeated text and fixed the glossary.</w:t>
+      </w:r>
+      <w:r>
+        <w:rPr>
+          <w:color w:val="215E99" w:themeColor="text2" w:themeTint="BF"/>
+        </w:rPr>
+        <w:t xml:space="preserve"> We’ve also simplified and re-wrote the definition around “coexistence”, which also removed the “are”. </w:t>
+      </w:r>
+    </w:p>
+    <w:p>
+      <w:pPr>
+        <w:rPr>
+          <w:b/>
+          <w:bCs/>
+        </w:rPr>
+      </w:pPr>
+    </w:p>
+    <w:p>
+      <w:r>
+        <w:rPr>
+          <w:b/>
+          <w:bCs/>
+        </w:rPr>
+        <w:t>C</w:t>
+      </w:r>
+      <w:r>
+        <w:rPr>
+          <w:b/>
+          <w:bCs/>
+        </w:rPr>
+        <w:t>1</w:t>
+      </w:r>
+      <w:r>
+        <w:rPr>
+          <w:b/>
+          <w:bCs/>
+        </w:rPr>
+        <w:t>7</w:t>
+      </w:r>
+      <w:r>
+        <w:rPr>
+          <w:b/>
+          <w:bCs/>
+        </w:rPr>
+        <w:t>:</w:t>
+      </w:r>
+      <w:r>
+        <w:rPr>
+          <w:b/>
+          <w:bCs/>
+        </w:rPr>
+        <w:t xml:space="preserve"> </w:t>
+      </w:r>
       <w:r>
         <w:t>L 232 - 233: "DEB models integrate many processes in a parameter-sparse manner" - With this I must disagree. DEB has 18 parameters, and many of them do not reflect properties that one can measure in actual organisms. This is one of the disadvantages of DEB.</w:t>
       </w:r>
     </w:p>
-    <w:p>
-      <w:r>
-        <w:lastRenderedPageBreak/>
+    <w:p/>
+    <w:p>
+      <w:r>
+        <w:rPr>
+          <w:b/>
+          <w:bCs/>
+          <w:color w:val="215E99" w:themeColor="text2" w:themeTint="BF"/>
+        </w:rPr>
+        <w:t>Response</w:t>
+      </w:r>
+      <w:r>
+        <w:rPr>
+          <w:color w:val="215E99" w:themeColor="text2" w:themeTint="BF"/>
+        </w:rPr>
+        <w:t>:</w:t>
+      </w:r>
+    </w:p>
+    <w:p>
+      <w:r>
+        <w:rPr>
+          <w:b/>
+          <w:bCs/>
+        </w:rPr>
+        <w:t>C</w:t>
+      </w:r>
+      <w:r>
+        <w:rPr>
+          <w:b/>
+          <w:bCs/>
+        </w:rPr>
+        <w:t>1</w:t>
+      </w:r>
+      <w:r>
+        <w:rPr>
+          <w:b/>
+          <w:bCs/>
+        </w:rPr>
+        <w:t>8</w:t>
+      </w:r>
+      <w:r>
+        <w:rPr>
+          <w:b/>
+          <w:bCs/>
+        </w:rPr>
+        <w:t>:</w:t>
+      </w:r>
+      <w:r>
+        <w:rPr>
+          <w:b/>
+          <w:bCs/>
+        </w:rPr>
+        <w:t xml:space="preserve"> </w:t>
+      </w:r>
+      <w:r>
         <w:t xml:space="preserve">L 234 - 236: Although it is possible to estimate parameters without data, the jury is still out as to how robust such estimated parameters </w:t>
       </w:r>
       <w:proofErr w:type="gramStart"/>
@@ -344,7 +1249,60 @@
         <w:t>.</w:t>
       </w:r>
     </w:p>
-    <w:p>
+    <w:p/>
+    <w:p>
+      <w:r>
+        <w:rPr>
+          <w:b/>
+          <w:bCs/>
+          <w:color w:val="215E99" w:themeColor="text2" w:themeTint="BF"/>
+        </w:rPr>
+        <w:t>Response</w:t>
+      </w:r>
+      <w:r>
+        <w:rPr>
+          <w:color w:val="215E99" w:themeColor="text2" w:themeTint="BF"/>
+        </w:rPr>
+        <w:t>:</w:t>
+      </w:r>
+    </w:p>
+    <w:p/>
+    <w:p>
+      <w:r>
+        <w:rPr>
+          <w:b/>
+          <w:bCs/>
+        </w:rPr>
+        <w:t>C</w:t>
+      </w:r>
+      <w:r>
+        <w:rPr>
+          <w:b/>
+          <w:bCs/>
+        </w:rPr>
+        <w:t>1</w:t>
+      </w:r>
+      <w:r>
+        <w:rPr>
+          <w:b/>
+          <w:bCs/>
+        </w:rPr>
+        <w:t>9</w:t>
+      </w:r>
+      <w:r>
+        <w:rPr>
+          <w:b/>
+          <w:bCs/>
+        </w:rPr>
+        <w:t>:</w:t>
+      </w:r>
+      <w:r>
+        <w:rPr>
+          <w:b/>
+          <w:bCs/>
+        </w:rPr>
+        <w:t xml:space="preserve"> </w:t>
+      </w:r>
       <w:r>
         <w:t xml:space="preserve">L 276: Suggest </w:t>
       </w:r>
@@ -357,7 +1315,53 @@
         <w:t xml:space="preserve"> "ecological".</w:t>
       </w:r>
     </w:p>
-    <w:p>
+    <w:p/>
+    <w:p>
+      <w:r>
+        <w:rPr>
+          <w:b/>
+          <w:bCs/>
+          <w:color w:val="215E99" w:themeColor="text2" w:themeTint="BF"/>
+        </w:rPr>
+        <w:t>Response</w:t>
+      </w:r>
+      <w:r>
+        <w:rPr>
+          <w:color w:val="215E99" w:themeColor="text2" w:themeTint="BF"/>
+        </w:rPr>
+        <w:t>:</w:t>
+      </w:r>
+    </w:p>
+    <w:p/>
+    <w:p>
+      <w:r>
+        <w:rPr>
+          <w:b/>
+          <w:bCs/>
+        </w:rPr>
+        <w:t>C</w:t>
+      </w:r>
+      <w:r>
+        <w:rPr>
+          <w:b/>
+          <w:bCs/>
+        </w:rPr>
+        <w:t>20</w:t>
+      </w:r>
+      <w:r>
+        <w:rPr>
+          <w:b/>
+          <w:bCs/>
+        </w:rPr>
+        <w:t>:</w:t>
+      </w:r>
+      <w:r>
+        <w:rPr>
+          <w:b/>
+          <w:bCs/>
+        </w:rPr>
+        <w:t xml:space="preserve"> </w:t>
+      </w:r>
       <w:r>
         <w:t>Figure 4 caption: delete "and" before "compares" on line 9 and change "hazards" to "hazard" on line 21.</w:t>
       </w:r>
@@ -366,6 +1370,23 @@
       </w:r>
     </w:p>
     <w:p>
+      <w:r>
+        <w:rPr>
+          <w:b/>
+          <w:bCs/>
+          <w:color w:val="215E99" w:themeColor="text2" w:themeTint="BF"/>
+        </w:rPr>
+        <w:t>Response</w:t>
+      </w:r>
+      <w:r>
+        <w:rPr>
+          <w:color w:val="215E99" w:themeColor="text2" w:themeTint="BF"/>
+        </w:rPr>
+        <w:t>:</w:t>
+      </w:r>
+    </w:p>
+    <w:p/>
+    <w:p>
       <w:pPr>
         <w:rPr>
           <w:b/>
@@ -382,6 +1403,34 @@
     </w:p>
     <w:p>
       <w:r>
+        <w:rPr>
+          <w:b/>
+          <w:bCs/>
+        </w:rPr>
+        <w:t>C</w:t>
+      </w:r>
+      <w:r>
+        <w:rPr>
+          <w:b/>
+          <w:bCs/>
+        </w:rPr>
+        <w:t>21</w:t>
+      </w:r>
+      <w:r>
+        <w:rPr>
+          <w:b/>
+          <w:bCs/>
+        </w:rPr>
+        <w:t>:</w:t>
+      </w:r>
+      <w:r>
+        <w:rPr>
+          <w:b/>
+          <w:bCs/>
+        </w:rPr>
+        <w:t xml:space="preserve"> </w:t>
+      </w:r>
+      <w:r>
         <w:t xml:space="preserve">This is an ambitious review offering an integrated fusion of several relatively new approaches including mechanistic microclimate </w:t>
       </w:r>
       <w:proofErr w:type="spellStart"/>
@@ -428,8 +1477,56 @@
       <w:r>
         <w:br/>
       </w:r>
-      <w:r>
-        <w:br/>
+    </w:p>
+    <w:p>
+      <w:r>
+        <w:rPr>
+          <w:b/>
+          <w:bCs/>
+          <w:color w:val="215E99" w:themeColor="text2" w:themeTint="BF"/>
+        </w:rPr>
+        <w:t>Response</w:t>
+      </w:r>
+      <w:r>
+        <w:rPr>
+          <w:color w:val="215E99" w:themeColor="text2" w:themeTint="BF"/>
+        </w:rPr>
+        <w:t>:</w:t>
+      </w:r>
+    </w:p>
+    <w:p>
+      <w:r>
+        <w:br/>
+      </w:r>
+      <w:r>
+        <w:rPr>
+          <w:b/>
+          <w:bCs/>
+        </w:rPr>
+        <w:t>C</w:t>
+      </w:r>
+      <w:r>
+        <w:rPr>
+          <w:b/>
+          <w:bCs/>
+        </w:rPr>
+        <w:t>22</w:t>
+      </w:r>
+      <w:r>
+        <w:rPr>
+          <w:b/>
+          <w:bCs/>
+        </w:rPr>
+        <w:t>:</w:t>
+      </w:r>
+      <w:r>
+        <w:rPr>
+          <w:b/>
+          <w:bCs/>
+        </w:rPr>
+        <w:t xml:space="preserve"> </w:t>
+      </w:r>
+      <w:r>
         <w:t xml:space="preserve">Although it was interesting, I felt like the section on the "current state of extreme weather </w:t>
       </w:r>
       <w:proofErr w:type="spellStart"/>
@@ -471,7 +1568,58 @@
       </w:r>
       <w:proofErr w:type="spellEnd"/>
       <w:r>
-        <w:t xml:space="preserve">, etc.), and I think it can be a more succinct review of the general approach and how it can be used to capture extreme temperature conditions at the organismal level. By reducing the overview of GCMs and LSMs, there could be additional room for addressing other aspects of this approach that are more relevant. </w:t>
+        <w:t xml:space="preserve">, etc.), and I think it can be a more succinct review of the general approach and how it can be used to capture extreme temperature conditions at the organismal level. </w:t>
+      </w:r>
+    </w:p>
+    <w:p/>
+    <w:p>
+      <w:r>
+        <w:rPr>
+          <w:b/>
+          <w:bCs/>
+          <w:color w:val="215E99" w:themeColor="text2" w:themeTint="BF"/>
+        </w:rPr>
+        <w:t>Response</w:t>
+      </w:r>
+      <w:r>
+        <w:rPr>
+          <w:color w:val="215E99" w:themeColor="text2" w:themeTint="BF"/>
+        </w:rPr>
+        <w:t>:</w:t>
+      </w:r>
+    </w:p>
+    <w:p/>
+    <w:p>
+      <w:r>
+        <w:rPr>
+          <w:b/>
+          <w:bCs/>
+        </w:rPr>
+        <w:t>C</w:t>
+      </w:r>
+      <w:r>
+        <w:rPr>
+          <w:b/>
+          <w:bCs/>
+        </w:rPr>
+        <w:t>23</w:t>
+      </w:r>
+      <w:r>
+        <w:rPr>
+          <w:b/>
+          <w:bCs/>
+        </w:rPr>
+        <w:t>:</w:t>
+      </w:r>
+      <w:r>
+        <w:rPr>
+          <w:b/>
+          <w:bCs/>
+        </w:rPr>
+        <w:t xml:space="preserve"> </w:t>
+      </w:r>
+      <w:r>
+        <w:t xml:space="preserve">By reducing the overview of GCMs and LSMs, there could be additional room for addressing other aspects of this approach that are more relevant. </w:t>
       </w:r>
       <w:r>
         <w:rPr>
@@ -552,6 +1700,34 @@
     <w:p>
       <w:r>
         <w:rPr>
+          <w:b/>
+          <w:bCs/>
+        </w:rPr>
+        <w:t>C</w:t>
+      </w:r>
+      <w:r>
+        <w:rPr>
+          <w:b/>
+          <w:bCs/>
+        </w:rPr>
+        <w:t>24</w:t>
+      </w:r>
+      <w:r>
+        <w:rPr>
+          <w:b/>
+          <w:bCs/>
+        </w:rPr>
+        <w:t>:</w:t>
+      </w:r>
+      <w:r>
+        <w:rPr>
+          <w:b/>
+          <w:bCs/>
+        </w:rPr>
+        <w:t xml:space="preserve"> </w:t>
+      </w:r>
+      <w:r>
+        <w:rPr>
           <w:highlight w:val="yellow"/>
         </w:rPr>
         <w:t xml:space="preserve">Similarly, there is a fair amount of space devoted to thermal load </w:t>
@@ -576,8 +1752,56 @@
       <w:r>
         <w:br/>
       </w:r>
-      <w:r>
-        <w:br/>
+    </w:p>
+    <w:p>
+      <w:r>
+        <w:rPr>
+          <w:b/>
+          <w:bCs/>
+          <w:color w:val="215E99" w:themeColor="text2" w:themeTint="BF"/>
+        </w:rPr>
+        <w:t>Response</w:t>
+      </w:r>
+      <w:r>
+        <w:rPr>
+          <w:color w:val="215E99" w:themeColor="text2" w:themeTint="BF"/>
+        </w:rPr>
+        <w:t>:</w:t>
+      </w:r>
+    </w:p>
+    <w:p>
+      <w:r>
+        <w:br/>
+      </w:r>
+      <w:r>
+        <w:rPr>
+          <w:b/>
+          <w:bCs/>
+        </w:rPr>
+        <w:t>C</w:t>
+      </w:r>
+      <w:r>
+        <w:rPr>
+          <w:b/>
+          <w:bCs/>
+        </w:rPr>
+        <w:t>25</w:t>
+      </w:r>
+      <w:r>
+        <w:rPr>
+          <w:b/>
+          <w:bCs/>
+        </w:rPr>
+        <w:t>:</w:t>
+      </w:r>
+      <w:r>
+        <w:rPr>
+          <w:b/>
+          <w:bCs/>
+        </w:rPr>
+        <w:t xml:space="preserve"> </w:t>
+      </w:r>
+      <w:r>
         <w:t xml:space="preserve">The biophysical </w:t>
       </w:r>
       <w:proofErr w:type="spellStart"/>
@@ -627,7 +1851,40 @@
         <w:t>it left me wondering what types of recommendations you would offer to researchers and conservation practitioners interested in parametrizing these models with empirical data.</w:t>
       </w:r>
       <w:r>
-        <w:t xml:space="preserve"> I think this is of critical importance given your use of a socio-ecological example of agricultural systems. Given the </w:t>
+        <w:t xml:space="preserve"> I think this is of critical importance given your use of a socio-ecological example of agricultural systems. </w:t>
+      </w:r>
+    </w:p>
+    <w:p/>
+    <w:p>
+      <w:r>
+        <w:rPr>
+          <w:b/>
+          <w:bCs/>
+          <w:color w:val="215E99" w:themeColor="text2" w:themeTint="BF"/>
+        </w:rPr>
+        <w:t>Response</w:t>
+      </w:r>
+      <w:r>
+        <w:rPr>
+          <w:color w:val="215E99" w:themeColor="text2" w:themeTint="BF"/>
+        </w:rPr>
+        <w:t>:</w:t>
+      </w:r>
+    </w:p>
+    <w:p/>
+    <w:p>
+      <w:r>
+        <w:rPr>
+          <w:b/>
+          <w:bCs/>
+        </w:rPr>
+        <w:t>C26</w:t>
+      </w:r>
+      <w:r>
+        <w:t xml:space="preserve">: </w:t>
+      </w:r>
+      <w:r>
+        <w:t xml:space="preserve">Given the </w:t>
       </w:r>
       <w:proofErr w:type="gramStart"/>
       <w:r>
@@ -635,15 +1892,28 @@
       </w:r>
       <w:proofErr w:type="gramEnd"/>
       <w:r>
-        <w:t xml:space="preserve"> implications of managing these systems </w:t>
-      </w:r>
-      <w:r>
-        <w:lastRenderedPageBreak/>
-        <w:t>and their associated species during periods of extreme conditions, how can those in authority be assured that these models are realistic? What type of data would be needed at the habitat, organismal, population, and community level? What type of validation would be necessary?</w:t>
+        <w:t xml:space="preserve"> implications of managing these systems and their associated species during periods of extreme conditions, how can those in authority be assured that these models are realistic? What type of data would be needed at the habitat, organismal, population, and community level? What type of validation would be necessary?</w:t>
       </w:r>
     </w:p>
     <w:p/>
     <w:p>
+      <w:r>
+        <w:rPr>
+          <w:b/>
+          <w:bCs/>
+          <w:color w:val="215E99" w:themeColor="text2" w:themeTint="BF"/>
+        </w:rPr>
+        <w:t>Response</w:t>
+      </w:r>
+      <w:r>
+        <w:rPr>
+          <w:color w:val="215E99" w:themeColor="text2" w:themeTint="BF"/>
+        </w:rPr>
+        <w:t>:</w:t>
+      </w:r>
+    </w:p>
+    <w:p/>
+    <w:p>
       <w:pPr>
         <w:rPr>
           <w:b/>
@@ -659,6 +1929,34 @@
       </w:r>
     </w:p>
     <w:p>
+      <w:r>
+        <w:rPr>
+          <w:b/>
+          <w:bCs/>
+        </w:rPr>
+        <w:t>C</w:t>
+      </w:r>
+      <w:r>
+        <w:rPr>
+          <w:b/>
+          <w:bCs/>
+        </w:rPr>
+        <w:t>27</w:t>
+      </w:r>
+      <w:r>
+        <w:rPr>
+          <w:b/>
+          <w:bCs/>
+        </w:rPr>
+        <w:t>:</w:t>
+      </w:r>
+      <w:r>
+        <w:rPr>
+          <w:b/>
+          <w:bCs/>
+        </w:rPr>
+        <w:t xml:space="preserve"> </w:t>
+      </w:r>
       <w:r>
         <w:t xml:space="preserve">The consequences of extreme events including extreme heat and heat waves are truly critical for our future. These types of events are inherently challenging to forecast as well as hard to understand the consequences of because they are rare and because they involve </w:t>
       </w:r>
@@ -685,7 +1983,11 @@
       </w:r>
       <w:r>
         <w:br/>
-        <w:t xml:space="preserve">The paper is said to be an "opinion" paper which gives some freedom for more open reflections and way forward thinking for the area, and the title indicates, that the paper describes an approach to modelling impacts of extreme heat at the systems level. Maybe this is a bit challenging, because </w:t>
+        <w:t xml:space="preserve">The paper is said to be an "opinion" paper which gives some freedom for more open </w:t>
+      </w:r>
+      <w:r>
+        <w:lastRenderedPageBreak/>
+        <w:t xml:space="preserve">reflections and way forward thinking for the area, and the title indicates, that the paper describes an approach to modelling impacts of extreme heat at the systems level. Maybe this is a bit challenging, because </w:t>
       </w:r>
       <w:r>
         <w:rPr>
@@ -699,8 +2001,63 @@
       <w:r>
         <w:br/>
       </w:r>
-      <w:r>
-        <w:br/>
+    </w:p>
+    <w:p>
+      <w:r>
+        <w:rPr>
+          <w:b/>
+          <w:bCs/>
+          <w:color w:val="215E99" w:themeColor="text2" w:themeTint="BF"/>
+        </w:rPr>
+        <w:t>Response</w:t>
+      </w:r>
+      <w:r>
+        <w:rPr>
+          <w:color w:val="215E99" w:themeColor="text2" w:themeTint="BF"/>
+        </w:rPr>
+        <w:t>:</w:t>
+      </w:r>
+    </w:p>
+    <w:p>
+      <w:r>
+        <w:br/>
+      </w:r>
+      <w:r>
+        <w:rPr>
+          <w:b/>
+          <w:bCs/>
+        </w:rPr>
+        <w:t>C</w:t>
+      </w:r>
+      <w:r>
+        <w:rPr>
+          <w:b/>
+          <w:bCs/>
+        </w:rPr>
+        <w:t>2</w:t>
+      </w:r>
+      <w:r>
+        <w:rPr>
+          <w:b/>
+          <w:bCs/>
+        </w:rPr>
+        <w:t>8</w:t>
+      </w:r>
+      <w:r>
+        <w:rPr>
+          <w:b/>
+          <w:bCs/>
+        </w:rPr>
+        <w:t>:</w:t>
+      </w:r>
+      <w:r>
+        <w:rPr>
+          <w:b/>
+          <w:bCs/>
+        </w:rPr>
+        <w:t xml:space="preserve"> </w:t>
+      </w:r>
+      <w:r>
         <w:t xml:space="preserve">The paper describes a </w:t>
       </w:r>
       <w:r>
@@ -741,8 +2098,61 @@
       <w:r>
         <w:br/>
       </w:r>
-      <w:r>
-        <w:br/>
+    </w:p>
+    <w:p>
+      <w:r>
+        <w:rPr>
+          <w:b/>
+          <w:bCs/>
+          <w:color w:val="215E99" w:themeColor="text2" w:themeTint="BF"/>
+        </w:rPr>
+        <w:t>Response</w:t>
+      </w:r>
+      <w:r>
+        <w:rPr>
+          <w:color w:val="215E99" w:themeColor="text2" w:themeTint="BF"/>
+        </w:rPr>
+        <w:t>:</w:t>
+      </w:r>
+    </w:p>
+    <w:p>
+      <w:r>
+        <w:br/>
+      </w:r>
+      <w:r>
+        <w:rPr>
+          <w:b/>
+          <w:bCs/>
+        </w:rPr>
+        <w:t>C</w:t>
+      </w:r>
+      <w:r>
+        <w:rPr>
+          <w:b/>
+          <w:bCs/>
+        </w:rPr>
+        <w:t>2</w:t>
+      </w:r>
+      <w:r>
+        <w:rPr>
+          <w:b/>
+          <w:bCs/>
+        </w:rPr>
+        <w:t>9</w:t>
+      </w:r>
+      <w:r>
+        <w:rPr>
+          <w:b/>
+          <w:bCs/>
+        </w:rPr>
+        <w:t>:</w:t>
+      </w:r>
+      <w:r>
+        <w:rPr>
+          <w:b/>
+          <w:bCs/>
+        </w:rPr>
+        <w:t xml:space="preserve"> </w:t>
       </w:r>
       <w:r>
         <w:rPr>
@@ -756,8 +2166,56 @@
       <w:r>
         <w:br/>
       </w:r>
-      <w:r>
-        <w:br/>
+    </w:p>
+    <w:p>
+      <w:r>
+        <w:rPr>
+          <w:b/>
+          <w:bCs/>
+          <w:color w:val="215E99" w:themeColor="text2" w:themeTint="BF"/>
+        </w:rPr>
+        <w:t>Response</w:t>
+      </w:r>
+      <w:r>
+        <w:rPr>
+          <w:color w:val="215E99" w:themeColor="text2" w:themeTint="BF"/>
+        </w:rPr>
+        <w:t>:</w:t>
+      </w:r>
+    </w:p>
+    <w:p>
+      <w:r>
+        <w:br/>
+      </w:r>
+      <w:r>
+        <w:rPr>
+          <w:b/>
+          <w:bCs/>
+        </w:rPr>
+        <w:t>C</w:t>
+      </w:r>
+      <w:r>
+        <w:rPr>
+          <w:b/>
+          <w:bCs/>
+        </w:rPr>
+        <w:t>30</w:t>
+      </w:r>
+      <w:r>
+        <w:rPr>
+          <w:b/>
+          <w:bCs/>
+        </w:rPr>
+        <w:t>:</w:t>
+      </w:r>
+      <w:r>
+        <w:rPr>
+          <w:b/>
+          <w:bCs/>
+        </w:rPr>
+        <w:t xml:space="preserve"> </w:t>
+      </w:r>
+      <w:r>
         <w:t xml:space="preserve">The introduction explains how the underlying causes and ramifications of observed impacts of climate variability and extremes are not fully understood (lines 45-53). This is clearly correct, but the </w:t>
       </w:r>
       <w:r>
@@ -767,17 +2225,95 @@
         <w:t>paper lacks to explain how an integrated modelling approach will or can change this problem</w:t>
       </w:r>
       <w:r>
-        <w:t xml:space="preserve">, and to provide a clear link to the ecological understanding. There is no doubt that merging and integrating modelling approaches at different scales and domains would offer a strong potential, but this does not in itself provide the understanding we miss, but rather could serve as a strong tool for generating and testing model based hypothesis and create collaboration with and </w:t>
+        <w:t xml:space="preserve">, and to provide a clear link to the ecological understanding. There is no doubt that merging and integrating modelling approaches at different scales and domains would offer a strong potential, but this does not in itself provide the understanding we miss, but rather could serve as a strong tool for generating and testing model based hypothesis and create collaboration with and identify questions and understanding to be tested through observations and experiments. </w:t>
+      </w:r>
+      <w:r>
+        <w:rPr>
+          <w:highlight w:val="red"/>
+        </w:rPr>
+        <w:t>Part of the problem is that our ecological understanding of extremes and their impacts is missing and requires more observations and experiments to provide better biological understanding. This interaction and collaboration between models and observations is completely missing</w:t>
+      </w:r>
+      <w:r>
+        <w:t>.</w:t>
+      </w:r>
+      <w:r>
+        <w:br/>
+      </w:r>
+    </w:p>
+    <w:p>
+      <w:r>
+        <w:rPr>
+          <w:b/>
+          <w:bCs/>
+          <w:color w:val="215E99" w:themeColor="text2" w:themeTint="BF"/>
+        </w:rPr>
+        <w:t>Response</w:t>
+      </w:r>
+      <w:r>
+        <w:rPr>
+          <w:color w:val="215E99" w:themeColor="text2" w:themeTint="BF"/>
+        </w:rPr>
+        <w:t>:</w:t>
+      </w:r>
+    </w:p>
+    <w:p>
+      <w:r>
+        <w:br/>
+      </w:r>
+      <w:r>
+        <w:rPr>
+          <w:b/>
+          <w:bCs/>
+        </w:rPr>
+        <w:t>C</w:t>
+      </w:r>
+      <w:r>
+        <w:rPr>
+          <w:b/>
+          <w:bCs/>
+        </w:rPr>
+        <w:t>31</w:t>
+      </w:r>
+      <w:r>
+        <w:rPr>
+          <w:b/>
+          <w:bCs/>
+        </w:rPr>
+        <w:t>:</w:t>
+      </w:r>
+      <w:r>
+        <w:rPr>
+          <w:b/>
+          <w:bCs/>
+        </w:rPr>
+        <w:t xml:space="preserve"> </w:t>
+      </w:r>
+      <w:r>
+        <w:t xml:space="preserve">I do not understand the statement in lines 54-58, and the statement in line 58-59 indicates that coupling of different model concepts does not take place today. I do not </w:t>
       </w:r>
       <w:r>
         <w:lastRenderedPageBreak/>
-        <w:t xml:space="preserve">identify questions and understanding to be tested through observations and experiments. </w:t>
+        <w:t xml:space="preserve">think this is correct. Several of the authors are deeply involved in different model concepts that to various degrees couple different domains. </w:t>
       </w:r>
       <w:r>
         <w:rPr>
           <w:highlight w:val="red"/>
         </w:rPr>
-        <w:t>Part of the problem is that our ecological understanding of extremes and their impacts is missing and requires more observations and experiments to provide better biological understanding. This interaction and collaboration between models and observations is completely missing</w:t>
+        <w:t xml:space="preserve">It may be that it is not good enough and there is a need for more, new or better coupling, especially when we speak about extremes and heat waves, but this </w:t>
+      </w:r>
+      <w:proofErr w:type="gramStart"/>
+      <w:r>
+        <w:rPr>
+          <w:highlight w:val="red"/>
+        </w:rPr>
+        <w:t>has to</w:t>
+      </w:r>
+      <w:proofErr w:type="gramEnd"/>
+      <w:r>
+        <w:rPr>
+          <w:highlight w:val="red"/>
+        </w:rPr>
+        <w:t xml:space="preserve"> be described much more precisely</w:t>
       </w:r>
       <w:r>
         <w:t>.</w:t>
@@ -785,31 +2321,131 @@
       <w:r>
         <w:br/>
       </w:r>
-      <w:r>
-        <w:br/>
-        <w:t xml:space="preserve">I do not understand the statement in lines 54-58, and the statement in line 58-59 indicates that coupling of different model concepts does not take place today. I do not think this is correct. Several of the authors are deeply involved in different model concepts that to various degrees couple different domains. </w:t>
-      </w:r>
-      <w:r>
-        <w:rPr>
-          <w:highlight w:val="red"/>
-        </w:rPr>
-        <w:t>It may be that it is not good enough and there is a need for more, new or better coupling, especially when we speak about extremes and heat waves, but this has to be described much more precisely</w:t>
-      </w:r>
-      <w:r>
-        <w:t>.</w:t>
-      </w:r>
-      <w:r>
-        <w:br/>
-      </w:r>
-      <w:r>
-        <w:br/>
+    </w:p>
+    <w:p>
+      <w:r>
+        <w:rPr>
+          <w:b/>
+          <w:bCs/>
+          <w:color w:val="215E99" w:themeColor="text2" w:themeTint="BF"/>
+        </w:rPr>
+        <w:t>Response</w:t>
+      </w:r>
+      <w:r>
+        <w:rPr>
+          <w:color w:val="215E99" w:themeColor="text2" w:themeTint="BF"/>
+        </w:rPr>
+        <w:t>:</w:t>
+      </w:r>
+    </w:p>
+    <w:p>
+      <w:r>
+        <w:br/>
+      </w:r>
+      <w:r>
+        <w:rPr>
+          <w:b/>
+          <w:bCs/>
+        </w:rPr>
+        <w:t>C</w:t>
+      </w:r>
+      <w:r>
+        <w:rPr>
+          <w:b/>
+          <w:bCs/>
+        </w:rPr>
+        <w:t>3</w:t>
+      </w:r>
+      <w:r>
+        <w:rPr>
+          <w:b/>
+          <w:bCs/>
+        </w:rPr>
+        <w:t>2</w:t>
+      </w:r>
+      <w:r>
+        <w:rPr>
+          <w:b/>
+          <w:bCs/>
+        </w:rPr>
+        <w:t>:</w:t>
+      </w:r>
+      <w:r>
+        <w:rPr>
+          <w:b/>
+          <w:bCs/>
+        </w:rPr>
+        <w:t xml:space="preserve"> </w:t>
+      </w:r>
+      <w:r>
         <w:t>Line 60 - I cannot read from the context and the previous paragraph what "feat" refers to?</w:t>
       </w:r>
       <w:r>
         <w:br/>
       </w:r>
-      <w:r>
-        <w:br/>
+    </w:p>
+    <w:p/>
+    <w:p>
+      <w:pPr>
+        <w:rPr>
+          <w:color w:val="215E99" w:themeColor="text2" w:themeTint="BF"/>
+        </w:rPr>
+      </w:pPr>
+      <w:r>
+        <w:rPr>
+          <w:b/>
+          <w:bCs/>
+          <w:color w:val="215E99" w:themeColor="text2" w:themeTint="BF"/>
+        </w:rPr>
+        <w:t>Response</w:t>
+      </w:r>
+      <w:r>
+        <w:rPr>
+          <w:color w:val="215E99" w:themeColor="text2" w:themeTint="BF"/>
+        </w:rPr>
+        <w:t>:</w:t>
+      </w:r>
+    </w:p>
+    <w:p>
+      <w:r>
+        <w:br/>
+      </w:r>
+      <w:r>
+        <w:rPr>
+          <w:b/>
+          <w:bCs/>
+        </w:rPr>
+        <w:t>C</w:t>
+      </w:r>
+      <w:r>
+        <w:rPr>
+          <w:b/>
+          <w:bCs/>
+        </w:rPr>
+        <w:t>3</w:t>
+      </w:r>
+      <w:r>
+        <w:rPr>
+          <w:b/>
+          <w:bCs/>
+        </w:rPr>
+        <w:t>3</w:t>
+      </w:r>
+      <w:r>
+        <w:rPr>
+          <w:b/>
+          <w:bCs/>
+        </w:rPr>
+        <w:t>:</w:t>
+      </w:r>
+      <w:r>
+        <w:rPr>
+          <w:b/>
+          <w:bCs/>
+        </w:rPr>
+        <w:t xml:space="preserve"> </w:t>
+      </w:r>
+      <w:r>
         <w:t xml:space="preserve">Line 62-66 - It is unclear what the challenge with heat waves relative to general temperature increases is and how general climate change driven temperature increases and extreme heat waves are different or connected. Much of the text and descriptions sound more like impacts of general temperature increases, but heat waves have some distinct differences. What specific challenges do you see in the understanding and the modelling, at different scales, and what are you delivering or proposing? Also, how are heat waves different from other extremes? It seems to me that a modelling approach with the characteristics the authors </w:t>
       </w:r>
       <w:proofErr w:type="gramStart"/>
@@ -823,8 +2459,63 @@
       <w:r>
         <w:br/>
       </w:r>
-      <w:r>
-        <w:br/>
+    </w:p>
+    <w:p>
+      <w:r>
+        <w:rPr>
+          <w:b/>
+          <w:bCs/>
+          <w:color w:val="215E99" w:themeColor="text2" w:themeTint="BF"/>
+        </w:rPr>
+        <w:t>Response</w:t>
+      </w:r>
+      <w:r>
+        <w:rPr>
+          <w:color w:val="215E99" w:themeColor="text2" w:themeTint="BF"/>
+        </w:rPr>
+        <w:t>:</w:t>
+      </w:r>
+    </w:p>
+    <w:p>
+      <w:r>
+        <w:br/>
+      </w:r>
+      <w:r>
+        <w:rPr>
+          <w:b/>
+          <w:bCs/>
+        </w:rPr>
+        <w:t>C</w:t>
+      </w:r>
+      <w:r>
+        <w:rPr>
+          <w:b/>
+          <w:bCs/>
+        </w:rPr>
+        <w:t>3</w:t>
+      </w:r>
+      <w:r>
+        <w:rPr>
+          <w:b/>
+          <w:bCs/>
+        </w:rPr>
+        <w:t>4</w:t>
+      </w:r>
+      <w:r>
+        <w:rPr>
+          <w:b/>
+          <w:bCs/>
+        </w:rPr>
+        <w:t>:</w:t>
+      </w:r>
+      <w:r>
+        <w:rPr>
+          <w:b/>
+          <w:bCs/>
+        </w:rPr>
+        <w:t xml:space="preserve"> </w:t>
+      </w:r>
+      <w:r>
         <w:t xml:space="preserve">Line 67-69 - it sounds like current modelling does not integrate detailed process modelling into community and population dimensions. I am sure there are important limitations that needs to be improved and developed, and that heat waves and other extremes provide much understudied cases, but I disagree that such integrations do not exist. Please do not simplify and </w:t>
       </w:r>
       <w:proofErr w:type="gramStart"/>
@@ -838,20 +2529,135 @@
       <w:r>
         <w:br/>
       </w:r>
-      <w:r>
-        <w:br/>
+    </w:p>
+    <w:p>
+      <w:r>
+        <w:rPr>
+          <w:b/>
+          <w:bCs/>
+          <w:color w:val="215E99" w:themeColor="text2" w:themeTint="BF"/>
+        </w:rPr>
+        <w:t>Response</w:t>
+      </w:r>
+      <w:r>
+        <w:rPr>
+          <w:color w:val="215E99" w:themeColor="text2" w:themeTint="BF"/>
+        </w:rPr>
+        <w:t>:</w:t>
+      </w:r>
+    </w:p>
+    <w:p>
+      <w:r>
+        <w:br/>
+      </w:r>
+      <w:r>
+        <w:rPr>
+          <w:b/>
+          <w:bCs/>
+        </w:rPr>
+        <w:t>C</w:t>
+      </w:r>
+      <w:r>
+        <w:rPr>
+          <w:b/>
+          <w:bCs/>
+        </w:rPr>
+        <w:t>3</w:t>
+      </w:r>
+      <w:r>
+        <w:rPr>
+          <w:b/>
+          <w:bCs/>
+        </w:rPr>
+        <w:t>5</w:t>
+      </w:r>
+      <w:r>
+        <w:rPr>
+          <w:b/>
+          <w:bCs/>
+        </w:rPr>
+        <w:t>:</w:t>
+      </w:r>
+      <w:r>
+        <w:rPr>
+          <w:b/>
+          <w:bCs/>
+        </w:rPr>
+        <w:t xml:space="preserve"> </w:t>
+      </w:r>
+      <w:r>
         <w:t>Line 70 - "We bring together modelling approaches ….". No, you present some loose ideas and wishes, but I do not see an approach.</w:t>
       </w:r>
       <w:r>
         <w:br/>
       </w:r>
-      <w:r>
-        <w:br/>
-        <w:t xml:space="preserve">Line 89-92 - I think there is a confusion or mixing of general thermal adaptation and extreme heat damage. The sentence suggests that individuals mitigate extreme heat through habitat selection, but I think there is a lack of ecological description or understanding here. Most ecosystems and habitats have a history of extremes to which they are adapted. This may involve severe damage to individuals and eventual dieback from which the system may recover and over time disappeared species may return. In a future climate with novel and more severe types and intensities of extremes, these may change the pressure on individuals with dieback and avoidance, but the actual adaptation and new habitat selection is not entirely driven by the extremes, but by the </w:t>
+    </w:p>
+    <w:p>
+      <w:pPr>
+        <w:rPr>
+          <w:color w:val="215E99" w:themeColor="text2" w:themeTint="BF"/>
+        </w:rPr>
+      </w:pPr>
+      <w:r>
+        <w:rPr>
+          <w:b/>
+          <w:bCs/>
+          <w:color w:val="215E99" w:themeColor="text2" w:themeTint="BF"/>
+        </w:rPr>
+        <w:t>Response</w:t>
+      </w:r>
+      <w:r>
+        <w:rPr>
+          <w:color w:val="215E99" w:themeColor="text2" w:themeTint="BF"/>
+        </w:rPr>
+        <w:t>:</w:t>
+      </w:r>
+    </w:p>
+    <w:p>
+      <w:r>
+        <w:br/>
+      </w:r>
+      <w:r>
+        <w:rPr>
+          <w:b/>
+          <w:bCs/>
+        </w:rPr>
+        <w:t>C</w:t>
+      </w:r>
+      <w:r>
+        <w:rPr>
+          <w:b/>
+          <w:bCs/>
+        </w:rPr>
+        <w:t>3</w:t>
+      </w:r>
+      <w:r>
+        <w:rPr>
+          <w:b/>
+          <w:bCs/>
+        </w:rPr>
+        <w:t>6</w:t>
+      </w:r>
+      <w:r>
+        <w:rPr>
+          <w:b/>
+          <w:bCs/>
+        </w:rPr>
+        <w:t>:</w:t>
+      </w:r>
+      <w:r>
+        <w:rPr>
+          <w:b/>
+          <w:bCs/>
+        </w:rPr>
+        <w:t xml:space="preserve"> </w:t>
+      </w:r>
+      <w:r>
+        <w:t xml:space="preserve">Line 89-92 - I think there is a confusion or mixing of general thermal adaptation and extreme heat damage. The sentence suggests that individuals mitigate extreme heat through habitat selection, but I think there is a lack of ecological description or understanding here. Most ecosystems and habitats have a history of extremes to which they are adapted. This may involve severe damage to individuals and eventual dieback from which the system may recover and over time disappeared species may return. In a </w:t>
       </w:r>
       <w:r>
         <w:lastRenderedPageBreak/>
-        <w:t xml:space="preserve">general </w:t>
+        <w:t xml:space="preserve">future climate with novel and more severe types and intensities of extremes, these may change the pressure on individuals with dieback and avoidance, but the actual adaptation and new habitat selection is not entirely driven by the extremes, but by the general </w:t>
       </w:r>
       <w:proofErr w:type="gramStart"/>
       <w:r>
@@ -864,8 +2670,63 @@
       <w:r>
         <w:br/>
       </w:r>
-      <w:r>
-        <w:br/>
+    </w:p>
+    <w:p>
+      <w:r>
+        <w:rPr>
+          <w:b/>
+          <w:bCs/>
+          <w:color w:val="215E99" w:themeColor="text2" w:themeTint="BF"/>
+        </w:rPr>
+        <w:t>Response</w:t>
+      </w:r>
+      <w:r>
+        <w:rPr>
+          <w:color w:val="215E99" w:themeColor="text2" w:themeTint="BF"/>
+        </w:rPr>
+        <w:t>:</w:t>
+      </w:r>
+    </w:p>
+    <w:p>
+      <w:r>
+        <w:br/>
+      </w:r>
+      <w:r>
+        <w:rPr>
+          <w:b/>
+          <w:bCs/>
+        </w:rPr>
+        <w:t>C</w:t>
+      </w:r>
+      <w:r>
+        <w:rPr>
+          <w:b/>
+          <w:bCs/>
+        </w:rPr>
+        <w:t>3</w:t>
+      </w:r>
+      <w:r>
+        <w:rPr>
+          <w:b/>
+          <w:bCs/>
+        </w:rPr>
+        <w:t>7</w:t>
+      </w:r>
+      <w:r>
+        <w:rPr>
+          <w:b/>
+          <w:bCs/>
+        </w:rPr>
+        <w:t>:</w:t>
+      </w:r>
+      <w:r>
+        <w:rPr>
+          <w:b/>
+          <w:bCs/>
+        </w:rPr>
+        <w:t xml:space="preserve"> </w:t>
+      </w:r>
+      <w:r>
         <w:t xml:space="preserve">Line 96-98 - Is this integration </w:t>
       </w:r>
       <w:proofErr w:type="gramStart"/>
@@ -879,8 +2740,63 @@
       <w:r>
         <w:br/>
       </w:r>
-      <w:r>
-        <w:br/>
+    </w:p>
+    <w:p>
+      <w:r>
+        <w:rPr>
+          <w:b/>
+          <w:bCs/>
+          <w:color w:val="215E99" w:themeColor="text2" w:themeTint="BF"/>
+        </w:rPr>
+        <w:t>Response</w:t>
+      </w:r>
+      <w:r>
+        <w:rPr>
+          <w:color w:val="215E99" w:themeColor="text2" w:themeTint="BF"/>
+        </w:rPr>
+        <w:t>:</w:t>
+      </w:r>
+    </w:p>
+    <w:p>
+      <w:r>
+        <w:br/>
+      </w:r>
+      <w:r>
+        <w:rPr>
+          <w:b/>
+          <w:bCs/>
+        </w:rPr>
+        <w:t>C</w:t>
+      </w:r>
+      <w:r>
+        <w:rPr>
+          <w:b/>
+          <w:bCs/>
+        </w:rPr>
+        <w:t>3</w:t>
+      </w:r>
+      <w:r>
+        <w:rPr>
+          <w:b/>
+          <w:bCs/>
+        </w:rPr>
+        <w:t>8</w:t>
+      </w:r>
+      <w:r>
+        <w:rPr>
+          <w:b/>
+          <w:bCs/>
+        </w:rPr>
+        <w:t>:</w:t>
+      </w:r>
+      <w:r>
+        <w:rPr>
+          <w:b/>
+          <w:bCs/>
+        </w:rPr>
+        <w:t xml:space="preserve"> </w:t>
+      </w:r>
+      <w:r>
         <w:t xml:space="preserve">Figure 1 - This is an extremely busy figure. It is </w:t>
       </w:r>
       <w:proofErr w:type="gramStart"/>
@@ -905,7 +2821,15 @@
       </w:r>
       <w:proofErr w:type="gramEnd"/>
       <w:r>
-        <w:t xml:space="preserve"> and it is unclear which aspects of the ecosystem functioning are involved and how they are linked. Are the ecosystem boxes separate from the modelling or are they part of the modelling (which must be the case for many of the models??). And finally, the figure claims to focus on extreme heat - but it is unclear how this is done and how it interacts with other drivers such as especially water and management. The figure is not entirely helpful and it is not clear when you refer to existing models, approaches and concepts and when you present a wish or suggestion for </w:t>
+        <w:t xml:space="preserve"> and it is unclear which aspects of the ecosystem functioning are involved and how they are linked. Are the ecosystem boxes separate from the modelling or are they part of the modelling (which must be the case for many of the models??). And finally, the figure claims to focus on extreme heat - but it is unclear how this is done and how it interacts with other drivers such as especially water and management. The figure is not entirely </w:t>
+      </w:r>
+      <w:proofErr w:type="gramStart"/>
+      <w:r>
+        <w:t>helpful</w:t>
+      </w:r>
+      <w:proofErr w:type="gramEnd"/>
+      <w:r>
+        <w:t xml:space="preserve"> and it is not clear when you refer to existing models, approaches and concepts and when you present a wish or suggestion for </w:t>
       </w:r>
       <w:proofErr w:type="spellStart"/>
       <w:r>
@@ -918,8 +2842,63 @@
       <w:r>
         <w:br/>
       </w:r>
-      <w:r>
-        <w:br/>
+    </w:p>
+    <w:p>
+      <w:r>
+        <w:rPr>
+          <w:b/>
+          <w:bCs/>
+          <w:color w:val="215E99" w:themeColor="text2" w:themeTint="BF"/>
+        </w:rPr>
+        <w:t>Response</w:t>
+      </w:r>
+      <w:r>
+        <w:rPr>
+          <w:color w:val="215E99" w:themeColor="text2" w:themeTint="BF"/>
+        </w:rPr>
+        <w:t>:</w:t>
+      </w:r>
+    </w:p>
+    <w:p>
+      <w:r>
+        <w:br/>
+      </w:r>
+      <w:r>
+        <w:rPr>
+          <w:b/>
+          <w:bCs/>
+        </w:rPr>
+        <w:t>C</w:t>
+      </w:r>
+      <w:r>
+        <w:rPr>
+          <w:b/>
+          <w:bCs/>
+        </w:rPr>
+        <w:t>3</w:t>
+      </w:r>
+      <w:r>
+        <w:rPr>
+          <w:b/>
+          <w:bCs/>
+        </w:rPr>
+        <w:t>9</w:t>
+      </w:r>
+      <w:r>
+        <w:rPr>
+          <w:b/>
+          <w:bCs/>
+        </w:rPr>
+        <w:t>:</w:t>
+      </w:r>
+      <w:r>
+        <w:rPr>
+          <w:b/>
+          <w:bCs/>
+        </w:rPr>
+        <w:t xml:space="preserve"> </w:t>
+      </w:r>
+      <w:r>
         <w:t xml:space="preserve">Line 101-121 - It is probably all true what is in here, but what is the purpose of spending 20 lines to describe weather modelling in general including the coding language? If weather and meteorological modelling is at all relevant in this context, I would suggest </w:t>
       </w:r>
       <w:proofErr w:type="gramStart"/>
@@ -949,8 +2928,56 @@
       <w:r>
         <w:br/>
       </w:r>
-      <w:r>
-        <w:br/>
+    </w:p>
+    <w:p>
+      <w:r>
+        <w:rPr>
+          <w:b/>
+          <w:bCs/>
+          <w:color w:val="215E99" w:themeColor="text2" w:themeTint="BF"/>
+        </w:rPr>
+        <w:t>Response</w:t>
+      </w:r>
+      <w:r>
+        <w:rPr>
+          <w:color w:val="215E99" w:themeColor="text2" w:themeTint="BF"/>
+        </w:rPr>
+        <w:t>:</w:t>
+      </w:r>
+    </w:p>
+    <w:p>
+      <w:r>
+        <w:br/>
+      </w:r>
+      <w:r>
+        <w:rPr>
+          <w:b/>
+          <w:bCs/>
+        </w:rPr>
+        <w:t>C</w:t>
+      </w:r>
+      <w:r>
+        <w:rPr>
+          <w:b/>
+          <w:bCs/>
+        </w:rPr>
+        <w:t>40</w:t>
+      </w:r>
+      <w:r>
+        <w:rPr>
+          <w:b/>
+          <w:bCs/>
+        </w:rPr>
+        <w:t>:</w:t>
+      </w:r>
+      <w:r>
+        <w:rPr>
+          <w:b/>
+          <w:bCs/>
+        </w:rPr>
+        <w:t xml:space="preserve"> </w:t>
+      </w:r>
+      <w:r>
         <w:t xml:space="preserve">Line 122-135 - Again, I suggest you include some more specific ecological understanding here. The section looks at extremes mostly from a meteorological point of view, but this may not in itself be relevant if the ecosystems or species do not experience the pressure as extreme. Melinda Smith has a great paper where she </w:t>
       </w:r>
       <w:proofErr w:type="gramStart"/>
@@ -964,50 +2991,674 @@
       <w:r>
         <w:br/>
       </w:r>
-      <w:r>
-        <w:br/>
+    </w:p>
+    <w:p>
+      <w:r>
+        <w:rPr>
+          <w:b/>
+          <w:bCs/>
+          <w:color w:val="215E99" w:themeColor="text2" w:themeTint="BF"/>
+        </w:rPr>
+        <w:lastRenderedPageBreak/>
+        <w:t>Response</w:t>
+      </w:r>
+      <w:r>
+        <w:rPr>
+          <w:color w:val="215E99" w:themeColor="text2" w:themeTint="BF"/>
+        </w:rPr>
+        <w:t>:</w:t>
+      </w:r>
+    </w:p>
+    <w:p>
+      <w:r>
+        <w:br/>
+      </w:r>
+      <w:r>
+        <w:rPr>
+          <w:b/>
+          <w:bCs/>
+        </w:rPr>
+        <w:t>C</w:t>
+      </w:r>
+      <w:r>
+        <w:rPr>
+          <w:b/>
+          <w:bCs/>
+        </w:rPr>
+        <w:t>4</w:t>
+      </w:r>
+      <w:r>
+        <w:rPr>
+          <w:b/>
+          <w:bCs/>
+        </w:rPr>
+        <w:t>1</w:t>
+      </w:r>
+      <w:r>
+        <w:rPr>
+          <w:b/>
+          <w:bCs/>
+        </w:rPr>
+        <w:t>:</w:t>
+      </w:r>
+      <w:r>
+        <w:rPr>
+          <w:b/>
+          <w:bCs/>
+        </w:rPr>
+        <w:t xml:space="preserve"> </w:t>
+      </w:r>
+      <w:r>
         <w:t>Line 133-135 - I miss a reference for this latter sentence, or a more comprehensive unfolding of the non-linearity aspects. It is a surprise how little space you offer to the non-linearity aspects of extremes and how to model them, despite they are crucial characteristics of such events.</w:t>
       </w:r>
       <w:r>
         <w:br/>
       </w:r>
-      <w:r>
-        <w:br/>
+    </w:p>
+    <w:p>
+      <w:r>
+        <w:rPr>
+          <w:b/>
+          <w:bCs/>
+          <w:color w:val="215E99" w:themeColor="text2" w:themeTint="BF"/>
+        </w:rPr>
+        <w:t>Response</w:t>
+      </w:r>
+      <w:r>
+        <w:rPr>
+          <w:color w:val="215E99" w:themeColor="text2" w:themeTint="BF"/>
+        </w:rPr>
+        <w:t>:</w:t>
+      </w:r>
+    </w:p>
+    <w:p>
+      <w:r>
+        <w:br/>
+      </w:r>
+      <w:r>
+        <w:rPr>
+          <w:b/>
+          <w:bCs/>
+        </w:rPr>
+        <w:t>C</w:t>
+      </w:r>
+      <w:r>
+        <w:rPr>
+          <w:b/>
+          <w:bCs/>
+        </w:rPr>
+        <w:t>4</w:t>
+      </w:r>
+      <w:r>
+        <w:rPr>
+          <w:b/>
+          <w:bCs/>
+        </w:rPr>
+        <w:t>2</w:t>
+      </w:r>
+      <w:r>
+        <w:rPr>
+          <w:b/>
+          <w:bCs/>
+        </w:rPr>
+        <w:t>:</w:t>
+      </w:r>
+      <w:r>
+        <w:rPr>
+          <w:b/>
+          <w:bCs/>
+        </w:rPr>
+        <w:t xml:space="preserve"> </w:t>
+      </w:r>
+      <w:r>
         <w:t>Line 159-161 - I do not understand what you try to say here? This sounds like what all models do (or try to do). What is the challenge you see here - is it modelling the thermal regime or the plant/system dynamics?</w:t>
       </w:r>
       <w:r>
         <w:br/>
       </w:r>
-      <w:r>
-        <w:br/>
-        <w:t xml:space="preserve">Line 165-217 - There is a lot about responses of organisms and almost nothing about systems. And all examples given are for individual species. You claim that the papers </w:t>
+    </w:p>
+    <w:p>
+      <w:pPr>
+        <w:rPr>
+          <w:color w:val="215E99" w:themeColor="text2" w:themeTint="BF"/>
+        </w:rPr>
+      </w:pPr>
+      <w:r>
+        <w:rPr>
+          <w:b/>
+          <w:bCs/>
+          <w:color w:val="215E99" w:themeColor="text2" w:themeTint="BF"/>
+        </w:rPr>
+        <w:t>Response</w:t>
+      </w:r>
+      <w:r>
+        <w:rPr>
+          <w:color w:val="215E99" w:themeColor="text2" w:themeTint="BF"/>
+        </w:rPr>
+        <w:t>:</w:t>
+      </w:r>
+    </w:p>
+    <w:p>
+      <w:r>
+        <w:br/>
+      </w:r>
+      <w:r>
+        <w:rPr>
+          <w:b/>
+          <w:bCs/>
+        </w:rPr>
+        <w:t>C</w:t>
+      </w:r>
+      <w:r>
+        <w:rPr>
+          <w:b/>
+          <w:bCs/>
+        </w:rPr>
+        <w:t>4</w:t>
+      </w:r>
+      <w:r>
+        <w:rPr>
+          <w:b/>
+          <w:bCs/>
+        </w:rPr>
+        <w:t>3</w:t>
+      </w:r>
+      <w:r>
+        <w:rPr>
+          <w:b/>
+          <w:bCs/>
+        </w:rPr>
+        <w:t>:</w:t>
+      </w:r>
+      <w:r>
+        <w:rPr>
+          <w:b/>
+          <w:bCs/>
+        </w:rPr>
+        <w:t xml:space="preserve"> </w:t>
+      </w:r>
+      <w:r>
+        <w:t xml:space="preserve">Line 165-217 - There is a lot about responses of organisms and almost nothing about systems. And all examples given are for individual species. You claim that the papers should go across dimensions - but you give almost no ideas to provide the systems integration. I know that systems </w:t>
+      </w:r>
+      <w:proofErr w:type="gramStart"/>
+      <w:r>
+        <w:t>consists</w:t>
+      </w:r>
+      <w:proofErr w:type="gramEnd"/>
+      <w:r>
+        <w:t xml:space="preserve"> of individuals, but doing species and individuals right does not automatically lead to correct treatments of systems.</w:t>
+      </w:r>
+      <w:r>
+        <w:br/>
+      </w:r>
+    </w:p>
+    <w:p>
+      <w:r>
+        <w:rPr>
+          <w:b/>
+          <w:bCs/>
+          <w:color w:val="215E99" w:themeColor="text2" w:themeTint="BF"/>
+        </w:rPr>
+        <w:t>Response</w:t>
+      </w:r>
+      <w:r>
+        <w:rPr>
+          <w:color w:val="215E99" w:themeColor="text2" w:themeTint="BF"/>
+        </w:rPr>
+        <w:t>:</w:t>
+      </w:r>
+    </w:p>
+    <w:p>
+      <w:r>
+        <w:br/>
+      </w:r>
+      <w:r>
+        <w:rPr>
+          <w:b/>
+          <w:bCs/>
+        </w:rPr>
+        <w:t>C</w:t>
+      </w:r>
+      <w:r>
+        <w:rPr>
+          <w:b/>
+          <w:bCs/>
+        </w:rPr>
+        <w:t>4</w:t>
+      </w:r>
+      <w:r>
+        <w:rPr>
+          <w:b/>
+          <w:bCs/>
+        </w:rPr>
+        <w:t>4</w:t>
+      </w:r>
+      <w:r>
+        <w:rPr>
+          <w:b/>
+          <w:bCs/>
+        </w:rPr>
+        <w:t>:</w:t>
+      </w:r>
+      <w:r>
+        <w:rPr>
+          <w:b/>
+          <w:bCs/>
+        </w:rPr>
+        <w:t xml:space="preserve"> </w:t>
+      </w:r>
+      <w:r>
+        <w:t xml:space="preserve">Box 1 and Figure 2 - It is an important aspect to include - the mediation of heat waves at the systems level and through interaction with different other drivers. However, the figure is </w:t>
+      </w:r>
+      <w:proofErr w:type="gramStart"/>
+      <w:r>
+        <w:t>really hard</w:t>
+      </w:r>
+      <w:proofErr w:type="gramEnd"/>
+      <w:r>
+        <w:t xml:space="preserve"> to read and understand, and to me it is not enough to treat this in a box and figure, but the message </w:t>
+      </w:r>
+      <w:proofErr w:type="gramStart"/>
+      <w:r>
+        <w:t>has to</w:t>
+      </w:r>
+      <w:proofErr w:type="gramEnd"/>
+      <w:r>
+        <w:t xml:space="preserve"> be integrated into the text as well. You need to include the aspects of mediation into the description and not just rely on the reader being able to see the consequences of these aspects just by having it in a box or a figure. The figure text is not at all useful.</w:t>
+      </w:r>
+      <w:r>
+        <w:br/>
+      </w:r>
+    </w:p>
+    <w:p>
+      <w:r>
+        <w:rPr>
+          <w:b/>
+          <w:bCs/>
+          <w:color w:val="215E99" w:themeColor="text2" w:themeTint="BF"/>
+        </w:rPr>
+        <w:t>Response</w:t>
+      </w:r>
+      <w:r>
+        <w:rPr>
+          <w:color w:val="215E99" w:themeColor="text2" w:themeTint="BF"/>
+        </w:rPr>
+        <w:t>:</w:t>
+      </w:r>
+    </w:p>
+    <w:p>
+      <w:r>
+        <w:br/>
+      </w:r>
+      <w:r>
+        <w:rPr>
+          <w:b/>
+          <w:bCs/>
+        </w:rPr>
+        <w:t>C</w:t>
+      </w:r>
+      <w:r>
+        <w:rPr>
+          <w:b/>
+          <w:bCs/>
+        </w:rPr>
+        <w:t>4</w:t>
+      </w:r>
+      <w:r>
+        <w:rPr>
+          <w:b/>
+          <w:bCs/>
+        </w:rPr>
+        <w:t>5</w:t>
+      </w:r>
+      <w:r>
+        <w:rPr>
+          <w:b/>
+          <w:bCs/>
+        </w:rPr>
+        <w:t>:</w:t>
+      </w:r>
+      <w:r>
+        <w:rPr>
+          <w:b/>
+          <w:bCs/>
+        </w:rPr>
+        <w:t xml:space="preserve"> </w:t>
+      </w:r>
+      <w:r>
+        <w:t>Glossary - hmmm - not clear why you bring this and why exactly those words are explained?</w:t>
+      </w:r>
+      <w:r>
+        <w:br/>
+      </w:r>
+    </w:p>
+    <w:p>
+      <w:r>
+        <w:rPr>
+          <w:b/>
+          <w:bCs/>
+          <w:color w:val="215E99" w:themeColor="text2" w:themeTint="BF"/>
+        </w:rPr>
+        <w:t>Response</w:t>
+      </w:r>
+      <w:r>
+        <w:rPr>
+          <w:color w:val="215E99" w:themeColor="text2" w:themeTint="BF"/>
+        </w:rPr>
+        <w:t>:</w:t>
+      </w:r>
+    </w:p>
+    <w:p>
+      <w:r>
+        <w:br/>
+      </w:r>
+      <w:r>
+        <w:rPr>
+          <w:b/>
+          <w:bCs/>
+        </w:rPr>
+        <w:t>C</w:t>
+      </w:r>
+      <w:r>
+        <w:rPr>
+          <w:b/>
+          <w:bCs/>
+        </w:rPr>
+        <w:t>4</w:t>
+      </w:r>
+      <w:r>
+        <w:rPr>
+          <w:b/>
+          <w:bCs/>
+        </w:rPr>
+        <w:t>6</w:t>
+      </w:r>
+      <w:r>
+        <w:rPr>
+          <w:b/>
+          <w:bCs/>
+        </w:rPr>
+        <w:t>:</w:t>
+      </w:r>
+      <w:r>
+        <w:rPr>
+          <w:b/>
+          <w:bCs/>
+        </w:rPr>
+        <w:t xml:space="preserve"> </w:t>
+      </w:r>
+      <w:r>
+        <w:t xml:space="preserve">Line 248-253 - The interaction between temperature and water are </w:t>
+      </w:r>
+      <w:proofErr w:type="gramStart"/>
+      <w:r>
+        <w:t>really important</w:t>
+      </w:r>
+      <w:proofErr w:type="gramEnd"/>
+      <w:r>
+        <w:t>, also for the case of heat waves, but I think it deserves a bit more attention in the paper.</w:t>
+      </w:r>
+      <w:r>
+        <w:br/>
+      </w:r>
+    </w:p>
+    <w:p>
+      <w:r>
+        <w:rPr>
+          <w:b/>
+          <w:bCs/>
+          <w:color w:val="215E99" w:themeColor="text2" w:themeTint="BF"/>
+        </w:rPr>
+        <w:t>Response</w:t>
+      </w:r>
+      <w:r>
+        <w:rPr>
+          <w:color w:val="215E99" w:themeColor="text2" w:themeTint="BF"/>
+        </w:rPr>
+        <w:t>:</w:t>
+      </w:r>
+    </w:p>
+    <w:p>
+      <w:r>
+        <w:br/>
+      </w:r>
+      <w:r>
+        <w:rPr>
+          <w:b/>
+          <w:bCs/>
+        </w:rPr>
+        <w:t>C</w:t>
+      </w:r>
+      <w:r>
+        <w:rPr>
+          <w:b/>
+          <w:bCs/>
+        </w:rPr>
+        <w:t>4</w:t>
+      </w:r>
+      <w:r>
+        <w:rPr>
+          <w:b/>
+          <w:bCs/>
+        </w:rPr>
+        <w:t>7</w:t>
+      </w:r>
+      <w:r>
+        <w:rPr>
+          <w:b/>
+          <w:bCs/>
+        </w:rPr>
+        <w:t>:</w:t>
+      </w:r>
+      <w:r>
+        <w:rPr>
+          <w:b/>
+          <w:bCs/>
+        </w:rPr>
+        <w:t xml:space="preserve"> </w:t>
+      </w:r>
+      <w:r>
+        <w:t xml:space="preserve">Line 256 - What is the idea behind the use of "coexistence" as a key explanatory model? It is true that species interactions are relevant for describing the interaction between two or more species relative to the site conditions at a given site. But how is </w:t>
       </w:r>
       <w:r>
         <w:lastRenderedPageBreak/>
-        <w:t xml:space="preserve">should go across dimensions - but you give almost no ideas to provide the systems integration. I know that systems </w:t>
+        <w:t xml:space="preserve">that relevant for the understanding of the overall consequences of extremes and heat waves? I would think coexistence is of core relevance for general site conditions and for more gradual climatic changes, while the sudden and potentially dieback provoking nature of extreme events, also described here by damage and repair, would be different from classic coexistence. </w:t>
+      </w:r>
+      <w:proofErr w:type="spellStart"/>
+      <w:r>
+        <w:t>Ofcourse</w:t>
+      </w:r>
+      <w:proofErr w:type="spellEnd"/>
+      <w:r>
+        <w:t>, if future heat waves is a novel factor for a given site, the ability of a given specie and community to withstand this pressure is importance, but I do not really see how coexistence is the core logical framework to describe systems responses to heat waves (or other extremes). The authors may have a point, but it must be described.</w:t>
+      </w:r>
+      <w:r>
+        <w:br/>
+      </w:r>
+    </w:p>
+    <w:p>
+      <w:r>
+        <w:rPr>
+          <w:b/>
+          <w:bCs/>
+          <w:color w:val="215E99" w:themeColor="text2" w:themeTint="BF"/>
+        </w:rPr>
+        <w:t>Response</w:t>
+      </w:r>
+      <w:r>
+        <w:rPr>
+          <w:color w:val="215E99" w:themeColor="text2" w:themeTint="BF"/>
+        </w:rPr>
+        <w:t>:</w:t>
+      </w:r>
+    </w:p>
+    <w:p>
+      <w:r>
+        <w:br/>
+      </w:r>
+      <w:r>
+        <w:rPr>
+          <w:b/>
+          <w:bCs/>
+        </w:rPr>
+        <w:t>C</w:t>
+      </w:r>
+      <w:r>
+        <w:rPr>
+          <w:b/>
+          <w:bCs/>
+        </w:rPr>
+        <w:t>4</w:t>
+      </w:r>
+      <w:r>
+        <w:rPr>
+          <w:b/>
+          <w:bCs/>
+        </w:rPr>
+        <w:t>8</w:t>
+      </w:r>
+      <w:r>
+        <w:rPr>
+          <w:b/>
+          <w:bCs/>
+        </w:rPr>
+        <w:t>:</w:t>
+      </w:r>
+      <w:r>
+        <w:rPr>
+          <w:b/>
+          <w:bCs/>
+        </w:rPr>
+        <w:t xml:space="preserve"> </w:t>
+      </w:r>
+      <w:r>
+        <w:t xml:space="preserve">Box 2 - I think there is a time perspective missing in the description of heat waves as the driver for natural selection and evolution, and I think these two aspects are mistakenly mixed up. Extreme events may clearly drive selection of genetic variants that has the traits to survive the extreme pressure, but less so for evolution because it is a single and dramatic event. And evolution runs over longer time scales. Further, the consequence of extreme events may not be adaptation and evolution, but simply dieback, </w:t>
+      </w:r>
+      <w:proofErr w:type="spellStart"/>
+      <w:r>
+        <w:t>disappearence</w:t>
+      </w:r>
+      <w:proofErr w:type="spellEnd"/>
+      <w:r>
+        <w:t xml:space="preserve"> and replacement. Extreme events may cause dieback and complete removal of certain species or a complete exchange of existing species and systems with new and different species and system (e.g. desertification) meaning that survival and/or invasion may be more important. So, many of the aspects mentioned here clearly play an important </w:t>
       </w:r>
       <w:proofErr w:type="gramStart"/>
       <w:r>
-        <w:t>consists</w:t>
+        <w:t>role, but</w:t>
       </w:r>
       <w:proofErr w:type="gramEnd"/>
       <w:r>
-        <w:t xml:space="preserve"> of individuals, but doing species and individuals right does not automatically lead to correct treatments of systems.</w:t>
-      </w:r>
-      <w:r>
-        <w:br/>
-      </w:r>
-      <w:r>
-        <w:br/>
-        <w:t xml:space="preserve">Box 1 and Figure 2 - It is an important aspect to include - the mediation of heat waves at the systems level and through interaction with different other drivers. However, the figure is </w:t>
+        <w:t xml:space="preserve"> may only present part of the story and other relevant and equally important processes and </w:t>
+      </w:r>
+      <w:proofErr w:type="spellStart"/>
+      <w:r>
+        <w:t>ressponses</w:t>
+      </w:r>
+      <w:proofErr w:type="spellEnd"/>
+      <w:r>
+        <w:t xml:space="preserve"> are completely missing. For example, the equation 2 seems to be of minor importance (as also stated in the box text).</w:t>
+      </w:r>
+      <w:r>
+        <w:br/>
+      </w:r>
+    </w:p>
+    <w:p>
+      <w:r>
+        <w:rPr>
+          <w:b/>
+          <w:bCs/>
+          <w:color w:val="215E99" w:themeColor="text2" w:themeTint="BF"/>
+        </w:rPr>
+        <w:t>Response</w:t>
+      </w:r>
+      <w:r>
+        <w:rPr>
+          <w:color w:val="215E99" w:themeColor="text2" w:themeTint="BF"/>
+        </w:rPr>
+        <w:t>:</w:t>
+      </w:r>
+    </w:p>
+    <w:p>
+      <w:r>
+        <w:br/>
+      </w:r>
+      <w:r>
+        <w:rPr>
+          <w:b/>
+          <w:bCs/>
+        </w:rPr>
+        <w:t>C</w:t>
+      </w:r>
+      <w:r>
+        <w:rPr>
+          <w:b/>
+          <w:bCs/>
+        </w:rPr>
+        <w:t>4</w:t>
+      </w:r>
+      <w:r>
+        <w:rPr>
+          <w:b/>
+          <w:bCs/>
+        </w:rPr>
+        <w:t>9</w:t>
+      </w:r>
+      <w:r>
+        <w:rPr>
+          <w:b/>
+          <w:bCs/>
+        </w:rPr>
+        <w:t>:</w:t>
+      </w:r>
+      <w:r>
+        <w:rPr>
+          <w:b/>
+          <w:bCs/>
+        </w:rPr>
+        <w:t xml:space="preserve"> </w:t>
+      </w:r>
+      <w:r>
+        <w:t xml:space="preserve">Box 3 - I acknowledge that heat waves and other climatic extremes causing major impacts on plants and ecosystems will cascade to also have potentially significant societal impacts. However, the paper has a strange mismatch in scale with on the one hand quite some detailed description of single species and on the other hand attempts to embrace the entire global society - and these overly complex societal responses are handled by a single box and just 15 lines! This is just not convincing. The societal aspects of these changes may be </w:t>
       </w:r>
       <w:proofErr w:type="gramStart"/>
       <w:r>
-        <w:t>really hard</w:t>
+        <w:t>really complex</w:t>
       </w:r>
       <w:proofErr w:type="gramEnd"/>
       <w:r>
-        <w:t xml:space="preserve"> to read and understand, and to me it is not enough to treat this in a box and figure, but the message </w:t>
+        <w:t xml:space="preserve"> and involve severe impacts on anything from changes in classic </w:t>
+      </w:r>
+      <w:proofErr w:type="spellStart"/>
+      <w:r>
+        <w:t>provisionary</w:t>
+      </w:r>
+      <w:proofErr w:type="spellEnd"/>
+      <w:r>
+        <w:t xml:space="preserve"> ecosystems services like food, feed and fibre to economic progress, human </w:t>
+      </w:r>
+      <w:proofErr w:type="spellStart"/>
+      <w:r>
+        <w:t>behavior</w:t>
+      </w:r>
+      <w:proofErr w:type="spellEnd"/>
+      <w:r>
+        <w:t xml:space="preserve">, migration and political unrest. These are really complex changes which the paper does not really acknowledge, and therefore the statement in line 292 that systems modelling can provide us with quantitative tools for </w:t>
+      </w:r>
+      <w:proofErr w:type="spellStart"/>
+      <w:r>
+        <w:t>predictins</w:t>
+      </w:r>
+      <w:proofErr w:type="spellEnd"/>
+      <w:r>
+        <w:t xml:space="preserve"> and decisions may in principle be correct, but we do not get any clear descriptions or approaches (which was the promise in the title of the paper) - or even a glance of what need to be scientifically and </w:t>
+      </w:r>
+      <w:proofErr w:type="spellStart"/>
+      <w:r>
+        <w:t>modelwise</w:t>
+      </w:r>
+      <w:proofErr w:type="spellEnd"/>
+      <w:r>
+        <w:t xml:space="preserve"> developed to get there. It may be relevant to include these aspects, but it </w:t>
       </w:r>
       <w:proofErr w:type="gramStart"/>
       <w:r>
@@ -1015,179 +3666,237 @@
       </w:r>
       <w:proofErr w:type="gramEnd"/>
       <w:r>
-        <w:t xml:space="preserve"> be integrated into the text as well. You need to include the aspects of mediation into the description and not just rely on the reader being able to see the consequences of these aspects just by having it in a box or a figure. The figure text is not at all useful.</w:t>
-      </w:r>
-      <w:r>
-        <w:br/>
-      </w:r>
-      <w:r>
-        <w:br/>
-        <w:t>Glossary - hmmm - not clear why you bring this and why exactly those words are explained?</w:t>
-      </w:r>
-      <w:r>
-        <w:br/>
-      </w:r>
-      <w:r>
-        <w:br/>
-        <w:t>Line 248-253 - The interaction between temperature and water are really important, also for the case of heat waves, but I think it deserves a bit more attention in the paper.</w:t>
-      </w:r>
-      <w:r>
-        <w:br/>
-      </w:r>
-      <w:r>
-        <w:br/>
-        <w:t xml:space="preserve">Line 256 - What is the idea behind the use of "coexistence" as a key explanatory model? It is true that species interactions are relevant for describing the interaction between two or more species relative to the site conditions at a given site. But how is that relevant for the understanding of the overall consequences of extremes and heat waves? I would think coexistence is of core relevance for general site conditions and for more gradual climatic changes, while the sudden and potentially dieback provoking nature of extreme events, also described here by damage and repair, would be different from classic coexistence. </w:t>
-      </w:r>
-      <w:proofErr w:type="spellStart"/>
-      <w:r>
-        <w:t>Ofcourse</w:t>
-      </w:r>
-      <w:proofErr w:type="spellEnd"/>
-      <w:r>
-        <w:t>, if future heat waves is a novel factor for a given site, the ability of a given specie and community to withstand this pressure is importance, but I do not really see how coexistence is the core logical framework to describe systems responses to heat waves (or other extremes). The authors may have a point, but it must be described.</w:t>
-      </w:r>
-      <w:r>
-        <w:br/>
-      </w:r>
-      <w:r>
-        <w:br/>
-        <w:t xml:space="preserve">Box 2 - I think there is a time perspective missing in the description of heat waves as the driver for natural selection and evolution, and I think these two aspects are mistakenly mixed up. Extreme events may clearly drive selection of genetic variants that has the traits to survive the extreme pressure, but less so for evolution because it is a single and dramatic event. And evolution runs over longer time scales. Further, the consequence of extreme events may not be adaptation and evolution, but simply dieback, </w:t>
-      </w:r>
-      <w:proofErr w:type="spellStart"/>
-      <w:r>
-        <w:t>disappearence</w:t>
-      </w:r>
-      <w:proofErr w:type="spellEnd"/>
-      <w:r>
-        <w:t xml:space="preserve"> and replacement. Extreme events may cause dieback and complete removal of certain species or a complete exchange of existing species and systems with new and different species and system (e.g. desertification) meaning that survival and/or invasion may be more important. So, many of the aspects mentioned here clearly play an important </w:t>
+        <w:t xml:space="preserve"> be carefully described and framed, and the modelling aspects must be treated with the same carefulness as the physical-biological systems.</w:t>
+      </w:r>
+      <w:r>
+        <w:br/>
+      </w:r>
+    </w:p>
+    <w:p>
+      <w:r>
+        <w:rPr>
+          <w:b/>
+          <w:bCs/>
+          <w:color w:val="215E99" w:themeColor="text2" w:themeTint="BF"/>
+        </w:rPr>
+        <w:lastRenderedPageBreak/>
+        <w:t>Response</w:t>
+      </w:r>
+      <w:r>
+        <w:rPr>
+          <w:color w:val="215E99" w:themeColor="text2" w:themeTint="BF"/>
+        </w:rPr>
+        <w:t>:</w:t>
+      </w:r>
+    </w:p>
+    <w:p>
+      <w:r>
+        <w:br/>
+      </w:r>
+      <w:r>
+        <w:rPr>
+          <w:b/>
+          <w:bCs/>
+        </w:rPr>
+        <w:t>C</w:t>
+      </w:r>
+      <w:r>
+        <w:rPr>
+          <w:b/>
+          <w:bCs/>
+        </w:rPr>
+        <w:t>50</w:t>
+      </w:r>
+      <w:r>
+        <w:rPr>
+          <w:b/>
+          <w:bCs/>
+        </w:rPr>
+        <w:t>:</w:t>
+      </w:r>
+      <w:r>
+        <w:rPr>
+          <w:b/>
+          <w:bCs/>
+        </w:rPr>
+        <w:t xml:space="preserve"> </w:t>
+      </w:r>
+      <w:r>
+        <w:t>Figure 3 - This is an overly naïve figure that does not provide any useful information of the model approach.</w:t>
+      </w:r>
+      <w:r>
+        <w:br/>
+      </w:r>
+    </w:p>
+    <w:p>
+      <w:r>
+        <w:rPr>
+          <w:b/>
+          <w:bCs/>
+          <w:color w:val="215E99" w:themeColor="text2" w:themeTint="BF"/>
+        </w:rPr>
+        <w:t>Response</w:t>
+      </w:r>
+      <w:r>
+        <w:rPr>
+          <w:color w:val="215E99" w:themeColor="text2" w:themeTint="BF"/>
+        </w:rPr>
+        <w:t>:</w:t>
+      </w:r>
+    </w:p>
+    <w:p>
+      <w:r>
+        <w:br/>
+      </w:r>
+      <w:r>
+        <w:rPr>
+          <w:b/>
+          <w:bCs/>
+        </w:rPr>
+        <w:t>C</w:t>
+      </w:r>
+      <w:r>
+        <w:rPr>
+          <w:b/>
+          <w:bCs/>
+        </w:rPr>
+        <w:t>51</w:t>
+      </w:r>
+      <w:r>
+        <w:rPr>
+          <w:b/>
+          <w:bCs/>
+        </w:rPr>
+        <w:t>:</w:t>
+      </w:r>
+      <w:r>
+        <w:rPr>
+          <w:b/>
+          <w:bCs/>
+        </w:rPr>
+        <w:t xml:space="preserve"> </w:t>
+      </w:r>
+      <w:r>
+        <w:t>Figure 4 - Even with the long descriptive text, it is a very busy figure not giving a clear idea of what it wants to tell. It seems to be focused on a very limited system with just 2 species which is a bit contradictory to the concept of the paper that speaks about integration across domains and areas. The real challenge and the promise of the paper is about the comprehensive systems view and approach. The figure does not provide any solutions to the larger systems level.</w:t>
+      </w:r>
+      <w:r>
+        <w:br/>
+      </w:r>
+    </w:p>
+    <w:p>
+      <w:r>
+        <w:rPr>
+          <w:b/>
+          <w:bCs/>
+          <w:color w:val="215E99" w:themeColor="text2" w:themeTint="BF"/>
+        </w:rPr>
+        <w:t>Response</w:t>
+      </w:r>
+      <w:r>
+        <w:rPr>
+          <w:color w:val="215E99" w:themeColor="text2" w:themeTint="BF"/>
+        </w:rPr>
+        <w:t>:</w:t>
+      </w:r>
+    </w:p>
+    <w:p>
+      <w:r>
+        <w:br/>
+      </w:r>
+      <w:r>
+        <w:rPr>
+          <w:b/>
+          <w:bCs/>
+        </w:rPr>
+        <w:t>C</w:t>
+      </w:r>
+      <w:r>
+        <w:rPr>
+          <w:b/>
+          <w:bCs/>
+        </w:rPr>
+        <w:t>5</w:t>
+      </w:r>
+      <w:r>
+        <w:rPr>
+          <w:b/>
+          <w:bCs/>
+        </w:rPr>
+        <w:t>2</w:t>
+      </w:r>
+      <w:r>
+        <w:rPr>
+          <w:b/>
+          <w:bCs/>
+        </w:rPr>
+        <w:t>:</w:t>
+      </w:r>
+      <w:r>
+        <w:rPr>
+          <w:b/>
+          <w:bCs/>
+        </w:rPr>
+        <w:t xml:space="preserve"> </w:t>
+      </w:r>
+      <w:r>
+        <w:t xml:space="preserve">Outstanding questions - It is great with this attempt to summarize the messages into the next step or research needs for the future. </w:t>
       </w:r>
       <w:proofErr w:type="gramStart"/>
       <w:r>
-        <w:t>role, but</w:t>
+        <w:t>But,</w:t>
       </w:r>
       <w:proofErr w:type="gramEnd"/>
       <w:r>
-        <w:t xml:space="preserve"> may only present part of the story and other relevant and equally important processes and </w:t>
-      </w:r>
-      <w:proofErr w:type="spellStart"/>
-      <w:r>
-        <w:t>ressponses</w:t>
-      </w:r>
-      <w:proofErr w:type="spellEnd"/>
-      <w:r>
-        <w:t xml:space="preserve"> are completely missing. For example, the equation 2 seems to be of minor importance (as also stated in the box text).</w:t>
-      </w:r>
-      <w:r>
-        <w:br/>
-      </w:r>
-      <w:r>
-        <w:br/>
-        <w:t xml:space="preserve">Box 3 - I acknowledge that heat waves and other climatic extremes causing major impacts on plants and ecosystems will cascade to also have potentially significant </w:t>
-      </w:r>
-      <w:r>
-        <w:lastRenderedPageBreak/>
-        <w:t xml:space="preserve">societal impacts. However, the paper has a strange mismatch in scale with on the one hand quite some detailed description of single species and on the other hand attempts to embrace the entire global society - and these overly complex societal responses are handled by a single box and just 15 lines! This is just not convincing. The societal aspects of these changes may be </w:t>
+        <w:t xml:space="preserve"> these questions should follow logically from the paper, which I do not think they do. I cannot identify for any of the 8 points where this is a logical conclusion from things presented and discussed in the paper. Moreover, these 8 points are quite substantial outstanding questions which speaks against the title of the paper promising the reader an approach to model consequences of heat waves. It seems to me that the authors should </w:t>
       </w:r>
       <w:proofErr w:type="gramStart"/>
       <w:r>
-        <w:t>really complex</w:t>
+        <w:t>consider,</w:t>
       </w:r>
       <w:proofErr w:type="gramEnd"/>
       <w:r>
-        <w:t xml:space="preserve"> and involve severe impacts on anything from changes in classic </w:t>
-      </w:r>
-      <w:proofErr w:type="spellStart"/>
-      <w:r>
-        <w:t>provisionary</w:t>
-      </w:r>
-      <w:proofErr w:type="spellEnd"/>
-      <w:r>
-        <w:t xml:space="preserve"> ecosystems services like food, feed and fibre to economic progress, human </w:t>
-      </w:r>
-      <w:proofErr w:type="spellStart"/>
-      <w:r>
-        <w:t>behavior</w:t>
-      </w:r>
-      <w:proofErr w:type="spellEnd"/>
-      <w:r>
-        <w:t xml:space="preserve">, migration and political unrest. These are really complex changes which the paper does not really acknowledge, and therefore the statement in line 292 that systems modelling can provide us with quantitative tools for </w:t>
-      </w:r>
-      <w:proofErr w:type="spellStart"/>
-      <w:r>
-        <w:t>predictins</w:t>
-      </w:r>
-      <w:proofErr w:type="spellEnd"/>
-      <w:r>
-        <w:t xml:space="preserve"> and decisions may in principle be correct, but we do not get any clear descriptions or approaches (which was the promise in the title of the paper) - or even a glance of what need to be scientifically and </w:t>
-      </w:r>
-      <w:proofErr w:type="spellStart"/>
-      <w:r>
-        <w:t>modelwise</w:t>
-      </w:r>
-      <w:proofErr w:type="spellEnd"/>
-      <w:r>
-        <w:t xml:space="preserve"> developed to get there. It may be relevant to include these aspects, but it has to be carefully described and framed, and the modelling aspects must be treated with the same carefulness as the physical-biological systems.</w:t>
-      </w:r>
-      <w:r>
-        <w:br/>
-      </w:r>
-      <w:r>
-        <w:br/>
-        <w:t>Figure 3 - This is an overly naïve figure that does not provide any useful information of the model approach.</w:t>
-      </w:r>
-      <w:r>
-        <w:br/>
-      </w:r>
-      <w:r>
-        <w:br/>
-        <w:t>Figure 4 - Even with the long descriptive text, it is a very busy figure not giving a clear idea of what it wants to tell. It seems to be focused on a very limited system with just 2 species which is a bit contradictory to the concept of the paper that speaks about integration across domains and areas. The real challenge and the promise of the paper is about the comprehensive systems view and approach. The figure does not provide any solutions to the larger systems level.</w:t>
-      </w:r>
-      <w:r>
-        <w:br/>
-      </w:r>
-      <w:r>
-        <w:br/>
-        <w:t xml:space="preserve">Outstanding questions - It is great with this attempt to summarize the messages into the next step or research needs for the future. </w:t>
+        <w:t xml:space="preserve"> whether they actually </w:t>
       </w:r>
       <w:proofErr w:type="gramStart"/>
       <w:r>
-        <w:t>But,</w:t>
+        <w:t>believes</w:t>
       </w:r>
       <w:proofErr w:type="gramEnd"/>
       <w:r>
-        <w:t xml:space="preserve"> these questions should follow logically from the paper, which I do not think they do. I cannot identify for any of the 8 points where this is a logical conclusion from things presented and discussed in the paper. Moreover, these 8 points are quite substantial outstanding questions which speaks against the title of the paper promising the reader an approach to model consequences of heat waves. It seems to me that the authors should </w:t>
+        <w:t xml:space="preserve"> they can present a model approach, and if so, then present the approach with clear documentation and figures that present the different elements and how they are linked. Or, if such an approach is more wishful thinking and not achievable </w:t>
       </w:r>
       <w:proofErr w:type="gramStart"/>
       <w:r>
-        <w:t>consider,</w:t>
+        <w:t>at the moment</w:t>
       </w:r>
       <w:proofErr w:type="gramEnd"/>
       <w:r>
-        <w:t xml:space="preserve"> whether they actually </w:t>
+        <w:t xml:space="preserve">, then present an open review or "directions" paper on what we know and what we need </w:t>
       </w:r>
       <w:proofErr w:type="gramStart"/>
       <w:r>
-        <w:t>believes</w:t>
+        <w:t>in order to</w:t>
       </w:r>
       <w:proofErr w:type="gramEnd"/>
       <w:r>
-        <w:t xml:space="preserve"> they can present a model approach, and if so, then present the approach with clear documentation and figures that present the different elements and how they are linked. Or, if such an approach is more wishful thinking and not achievable </w:t>
-      </w:r>
-      <w:proofErr w:type="gramStart"/>
-      <w:r>
-        <w:t>at the moment</w:t>
-      </w:r>
-      <w:proofErr w:type="gramEnd"/>
-      <w:r>
-        <w:t xml:space="preserve">, then present an open review or "directions" paper on what we know and what we need </w:t>
-      </w:r>
-      <w:proofErr w:type="gramStart"/>
-      <w:r>
-        <w:t>in order to</w:t>
-      </w:r>
-      <w:proofErr w:type="gramEnd"/>
-      <w:r>
         <w:t xml:space="preserve"> get there with clear identification of the elements we stand on and the steps of progress we should take. This should also include a better integration with ecological science to identify where we need more fundamental understanding that modelling alone cannot provide.</w:t>
+      </w:r>
+    </w:p>
+    <w:p/>
+    <w:p>
+      <w:r>
+        <w:rPr>
+          <w:b/>
+          <w:bCs/>
+          <w:color w:val="215E99" w:themeColor="text2" w:themeTint="BF"/>
+        </w:rPr>
+        <w:t>Response</w:t>
+      </w:r>
+      <w:r>
+        <w:rPr>
+          <w:color w:val="215E99" w:themeColor="text2" w:themeTint="BF"/>
+        </w:rPr>
+        <w:t>:</w:t>
       </w:r>
     </w:p>
     <w:sectPr>

</xml_diff>

<commit_message>
Response to reviewers and thinking about building in TLS to capture rmax or whether or not they are expected to die out by reaching thresholds
</commit_message>
<xml_diff>
--- a/docs/Revision1/Response_to_Reviewers.docx
+++ b/docs/Revision1/Response_to_Reviewers.docx
@@ -189,8 +189,21 @@
           <w:bCs/>
         </w:rPr>
       </w:pPr>
-      <w:r>
-        <w:t>Editorally, I have a number of points I need you to address:</w:t>
+      <w:proofErr w:type="spellStart"/>
+      <w:r>
+        <w:t>Editorally</w:t>
+      </w:r>
+      <w:proofErr w:type="spellEnd"/>
+      <w:r>
+        <w:t xml:space="preserve">, I have </w:t>
+      </w:r>
+      <w:proofErr w:type="gramStart"/>
+      <w:r>
+        <w:t>a number of</w:t>
+      </w:r>
+      <w:proofErr w:type="gramEnd"/>
+      <w:r>
+        <w:t xml:space="preserve"> points I need you to address:</w:t>
       </w:r>
       <w:r>
         <w:br/>
@@ -222,7 +235,21 @@
         <w:t xml:space="preserve"> </w:t>
       </w:r>
       <w:r>
-        <w:t>(1) Many parts of the paper are over the various word counts - every section must be within 10% of the stated limits (except the Abstract, where 120 words is a hard limit). This has been categorised as an Opinion article and it appears you have used the guidelines for a Review article. The main text is 3810 words and needs to be reduced to no more than 2750. You currently have five elements (2 figures and 3 boxes), you must remove one (Box 3 is the obvious candidate). All Boxes need to be reduced to no more than 440 words and the main text figure captions to no more than 250. Box figure captions must be short (i.e. less than 100 words) - they are currently okay.</w:t>
+        <w:t xml:space="preserve">(1) Many parts of the paper are over the various word counts - every section must be within 10% of the stated limits (except the Abstract, where 120 words is a hard limit). This has been categorised as </w:t>
+      </w:r>
+      <w:commentRangeStart w:id="0"/>
+      <w:r>
+        <w:t xml:space="preserve">an Opinion article and it </w:t>
+      </w:r>
+      <w:commentRangeEnd w:id="0"/>
+      <w:r>
+        <w:rPr>
+          <w:rStyle w:val="CommentReference"/>
+        </w:rPr>
+        <w:commentReference w:id="0"/>
+      </w:r>
+      <w:r>
+        <w:t>appears you have used the guidelines for a Review article. The main text is 3810 words and needs to be reduced to no more than 2750. You currently have five elements (2 figures and 3 boxes), you must remove one (Box 3 is the obvious candidate). All Boxes need to be reduced to no more than 440 words and the main text figure captions to no more than 250. Box figure captions must be short (i.e. less than 100 words) - they are currently okay.</w:t>
       </w:r>
     </w:p>
     <w:p/>
@@ -338,7 +365,15 @@
         <w:t xml:space="preserve"> </w:t>
       </w:r>
       <w:r>
-        <w:t>(3) The Supplementary Information is to go. I appreciate that you have put a lot of work into it but it is too extensive for a TREE article. You have essentially an additional paper in there. Either the information is important enough that it is brought into the text as a Box or it isn't important. Very few readers will access it (we have download figures).</w:t>
+        <w:t xml:space="preserve">(3) The Supplementary Information is to go. I appreciate that you have put a lot of work into </w:t>
+      </w:r>
+      <w:proofErr w:type="gramStart"/>
+      <w:r>
+        <w:t>it</w:t>
+      </w:r>
+      <w:proofErr w:type="gramEnd"/>
+      <w:r>
+        <w:t xml:space="preserve"> but it is too extensive for a TREE article. You have essentially an additional paper in there. Either the information is important enough that it is brought into the text as a Box or it isn't important. Very few readers will access it (we have download figures).</w:t>
       </w:r>
     </w:p>
     <w:p/>
@@ -507,12 +542,30 @@
           <w:bCs/>
           <w:u w:val="single"/>
         </w:rPr>
-        <w:t>Major (non-typographical) comments must also be included in your response to reviewers document</w:t>
+        <w:t xml:space="preserve">Major (non-typographical) comments must also be included in your response to </w:t>
+      </w:r>
+      <w:proofErr w:type="gramStart"/>
+      <w:r>
+        <w:rPr>
+          <w:b/>
+          <w:bCs/>
+          <w:u w:val="single"/>
+        </w:rPr>
+        <w:t>reviewers</w:t>
+      </w:r>
+      <w:proofErr w:type="gramEnd"/>
+      <w:r>
+        <w:rPr>
+          <w:b/>
+          <w:bCs/>
+          <w:u w:val="single"/>
+        </w:rPr>
+        <w:t xml:space="preserve"> document</w:t>
       </w:r>
       <w:r>
         <w:t>.  To access this, please log into the Trends in Ecology and Evolution submission system at </w:t>
       </w:r>
-      <w:hyperlink r:id="rId4" w:history="1">
+      <w:hyperlink r:id="rId8" w:history="1">
         <w:r>
           <w:rPr>
             <w:rStyle w:val="Hyperlink"/>
@@ -523,7 +576,7 @@
       <w:r>
         <w:t>, click on 'Submissions Needing Revision', then the blue 'Action links' on the left. You'll see the option 'View Attachments', the relevant file should be here. If you have trouble viewing this manuscript, please contact me at </w:t>
       </w:r>
-      <w:hyperlink r:id="rId5" w:history="1">
+      <w:hyperlink r:id="rId9" w:history="1">
         <w:r>
           <w:rPr>
             <w:rStyle w:val="Hyperlink"/>
@@ -679,7 +732,7 @@
         </w:rPr>
         <w:t xml:space="preserve"> </w:t>
       </w:r>
-      <w:commentRangeStart w:id="0"/>
+      <w:commentRangeStart w:id="1"/>
       <w:r>
         <w:rPr>
           <w:highlight w:val="yellow"/>
@@ -698,15 +751,23 @@
       <w:r>
         <w:t xml:space="preserve"> </w:t>
       </w:r>
-      <w:commentRangeEnd w:id="0"/>
+      <w:commentRangeEnd w:id="1"/>
       <w:r>
         <w:rPr>
           <w:rStyle w:val="CommentReference"/>
         </w:rPr>
-        <w:commentReference w:id="0"/>
-      </w:r>
-      <w:r>
-        <w:t>There is a growing literature on Good Modeling Practice and guidance on model documentation, development, validation, etc. that would be helpful to briefly describe and cite. These issues become even more important when the models will be used for real-world decision-making (often by non-modelers), rather than as research tools.</w:t>
+        <w:commentReference w:id="1"/>
+      </w:r>
+      <w:r>
+        <w:t xml:space="preserve">There is a growing literature on Good </w:t>
+      </w:r>
+      <w:proofErr w:type="spellStart"/>
+      <w:r>
+        <w:t>Modeling</w:t>
+      </w:r>
+      <w:proofErr w:type="spellEnd"/>
+      <w:r>
+        <w:t xml:space="preserve"> Practice and guidance on model documentation, development, validation, etc. that would be helpful to briefly describe and cite. These issues become even more important when the models will be used for real-world decision-making (often by non-modelers), rather than as research tools.</w:t>
       </w:r>
     </w:p>
     <w:p/>
@@ -774,27 +835,55 @@
         <w:rPr>
           <w:highlight w:val="yellow"/>
         </w:rPr>
-        <w:t>mixed feelings about putting all of the case studies in the SI</w:t>
+        <w:t xml:space="preserve">mixed feelings about putting </w:t>
+      </w:r>
+      <w:proofErr w:type="gramStart"/>
+      <w:r>
+        <w:rPr>
+          <w:highlight w:val="yellow"/>
+        </w:rPr>
+        <w:t>all of</w:t>
+      </w:r>
+      <w:proofErr w:type="gramEnd"/>
+      <w:r>
+        <w:rPr>
+          <w:highlight w:val="yellow"/>
+        </w:rPr>
+        <w:t xml:space="preserve"> the case studies in the SI</w:t>
       </w:r>
       <w:r>
         <w:t xml:space="preserve">, which many people will not read. </w:t>
       </w:r>
-      <w:commentRangeStart w:id="1"/>
+      <w:commentRangeStart w:id="2"/>
       <w:r>
         <w:rPr>
           <w:highlight w:val="yellow"/>
         </w:rPr>
-        <w:t>Including the case studies makes the proposed approach much more concrete and compelling. It may be worth considering either including a brief summary of one of the case studies in the main body of the manuscript as "proof of concept"</w:t>
+        <w:t xml:space="preserve">Including the case studies makes the proposed approach much more concrete and compelling. It may be worth considering either including </w:t>
+      </w:r>
+      <w:proofErr w:type="gramStart"/>
+      <w:r>
+        <w:rPr>
+          <w:highlight w:val="yellow"/>
+        </w:rPr>
+        <w:t>a brief summary</w:t>
+      </w:r>
+      <w:proofErr w:type="gramEnd"/>
+      <w:r>
+        <w:rPr>
+          <w:highlight w:val="yellow"/>
+        </w:rPr>
+        <w:t xml:space="preserve"> of one of the case studies in the main body of the manuscript as "proof of concept"</w:t>
       </w:r>
       <w:r>
         <w:t>, referring to the SI for the rest</w:t>
       </w:r>
-      <w:commentRangeEnd w:id="1"/>
+      <w:commentRangeEnd w:id="2"/>
       <w:r>
         <w:rPr>
           <w:rStyle w:val="CommentReference"/>
         </w:rPr>
-        <w:commentReference w:id="1"/>
+        <w:commentReference w:id="2"/>
       </w:r>
       <w:r>
         <w:t>. Alternatively, the case studies could potentially be published as a companion paper to the conceptual manuscript to give them more visibility and demonstrate how the proposed model integration would work in practice.</w:t>
@@ -822,19 +911,33 @@
         </w:rPr>
         <w:t xml:space="preserve"> We agree. Thanks for this comment. While we lack space to include all the examples, and already have the solutions example in the main MS, we </w:t>
       </w:r>
-      <w:commentRangeStart w:id="2"/>
-      <w:r>
-        <w:rPr>
-          <w:color w:val="215E99" w:themeColor="text2" w:themeTint="BF"/>
-        </w:rPr>
-        <w:t xml:space="preserve">have now included the multi-species example in Box 2 and the main manuscript. Including this example with detail should provide greater clarity about how such a systems </w:t>
-      </w:r>
-      <w:commentRangeEnd w:id="2"/>
+      <w:commentRangeStart w:id="3"/>
+      <w:r>
+        <w:rPr>
+          <w:color w:val="215E99" w:themeColor="text2" w:themeTint="BF"/>
+        </w:rPr>
+        <w:t xml:space="preserve">have now included the multi-species example in Box 2 and the main manuscript. Including this example with detail should provide greater clarity about how such a </w:t>
+      </w:r>
+      <w:proofErr w:type="gramStart"/>
+      <w:r>
+        <w:rPr>
+          <w:color w:val="215E99" w:themeColor="text2" w:themeTint="BF"/>
+        </w:rPr>
+        <w:t>systems</w:t>
+      </w:r>
+      <w:proofErr w:type="gramEnd"/>
+      <w:r>
+        <w:rPr>
+          <w:color w:val="215E99" w:themeColor="text2" w:themeTint="BF"/>
+        </w:rPr>
+        <w:t xml:space="preserve"> </w:t>
+      </w:r>
+      <w:commentRangeEnd w:id="3"/>
       <w:r>
         <w:rPr>
           <w:rStyle w:val="CommentReference"/>
         </w:rPr>
-        <w:commentReference w:id="2"/>
+        <w:commentReference w:id="3"/>
       </w:r>
       <w:r>
         <w:rPr>
@@ -936,7 +1039,15 @@
         <w:t xml:space="preserve"> </w:t>
       </w:r>
       <w:r>
-        <w:t>Figure 1, L 15 of caption: "novel integration of existing models in this novel way"; probably don't need both of these novels.</w:t>
+        <w:t xml:space="preserve">Figure 1, L 15 of caption: "novel integration of existing models in this novel way"; probably don't need </w:t>
+      </w:r>
+      <w:proofErr w:type="gramStart"/>
+      <w:r>
+        <w:t>both of these</w:t>
+      </w:r>
+      <w:proofErr w:type="gramEnd"/>
+      <w:r>
+        <w:t xml:space="preserve"> novels.</w:t>
       </w:r>
     </w:p>
     <w:p/>
@@ -1141,16 +1252,16 @@
       <w:r>
         <w:t>L 232 - 233: "</w:t>
       </w:r>
-      <w:commentRangeStart w:id="3"/>
+      <w:commentRangeStart w:id="4"/>
       <w:r>
         <w:t xml:space="preserve">DEB models integrate many processes in a parameter-sparse manner" - With this I must disagree. DEB has 18 parameters, and many of them do not reflect properties that one </w:t>
       </w:r>
-      <w:commentRangeEnd w:id="3"/>
+      <w:commentRangeEnd w:id="4"/>
       <w:r>
         <w:rPr>
           <w:rStyle w:val="CommentReference"/>
         </w:rPr>
-        <w:commentReference w:id="3"/>
+        <w:commentReference w:id="4"/>
       </w:r>
       <w:r>
         <w:t>can measure in actual organisms. This is one of the disadvantages of DEB.</w:t>
@@ -1209,7 +1320,15 @@
         <w:t xml:space="preserve"> </w:t>
       </w:r>
       <w:r>
-        <w:t>L 234 - 236: Although it is possible to estimate parameters without data, the jury is still out as to how robust such estimated parameters actually are.</w:t>
+        <w:t xml:space="preserve">L 234 - 236: Although it is possible to estimate parameters without data, the jury is still out as to how robust such estimated parameters </w:t>
+      </w:r>
+      <w:proofErr w:type="gramStart"/>
+      <w:r>
+        <w:t>actually are</w:t>
+      </w:r>
+      <w:proofErr w:type="gramEnd"/>
+      <w:r>
+        <w:t>.</w:t>
       </w:r>
     </w:p>
     <w:p/>
@@ -1243,7 +1362,14 @@
         <w:rPr>
           <w:color w:val="215E99" w:themeColor="text2" w:themeTint="BF"/>
         </w:rPr>
-        <w:t xml:space="preserve"> to collect data on the specific system one wishes to model, it is unlikely going to be the case all species of interest will have complete information needed for all aspects of modelling. We will need to rely on data imputation approaches to build some models. However, phylogenetically driven imputation approaches have been developed (e.g., Pottier et al. 2025; Buu</w:t>
+        <w:t xml:space="preserve"> to collect data on the specific system one wishes to model, it is unlikely going to be the case all species of interest will have complete information needed for all aspects of modelling. We will need to rely on data imputation approaches to build some models. However, phylogenetically driven imputation approaches have been developed (e.g., Pottier et al. 2025; </w:t>
+      </w:r>
+      <w:proofErr w:type="spellStart"/>
+      <w:r>
+        <w:rPr>
+          <w:color w:val="215E99" w:themeColor="text2" w:themeTint="BF"/>
+        </w:rPr>
+        <w:t>Buu</w:t>
       </w:r>
       <w:r>
         <w:rPr>
@@ -1255,7 +1381,28 @@
         <w:rPr>
           <w:color w:val="215E99" w:themeColor="text2" w:themeTint="BF"/>
         </w:rPr>
-        <w:t xml:space="preserve">gern et al. 2006), and will be a useful in parameterising models where information is lacking for some species making up part of a biological system. </w:t>
+        <w:t>gern</w:t>
+      </w:r>
+      <w:proofErr w:type="spellEnd"/>
+      <w:r>
+        <w:rPr>
+          <w:color w:val="215E99" w:themeColor="text2" w:themeTint="BF"/>
+        </w:rPr>
+        <w:t xml:space="preserve"> et al. 2006</w:t>
+      </w:r>
+      <w:proofErr w:type="gramStart"/>
+      <w:r>
+        <w:rPr>
+          <w:color w:val="215E99" w:themeColor="text2" w:themeTint="BF"/>
+        </w:rPr>
+        <w:t>), and</w:t>
+      </w:r>
+      <w:proofErr w:type="gramEnd"/>
+      <w:r>
+        <w:rPr>
+          <w:color w:val="215E99" w:themeColor="text2" w:themeTint="BF"/>
+        </w:rPr>
+        <w:t xml:space="preserve"> will be a useful in parameterising models where information is lacking for some species making up part of a biological system. </w:t>
       </w:r>
     </w:p>
     <w:p>
@@ -1286,19 +1433,19 @@
       </w:pPr>
     </w:p>
     <w:p>
-      <w:commentRangeStart w:id="4"/>
+      <w:commentRangeStart w:id="5"/>
       <w:r>
         <w:rPr>
           <w:color w:val="215E99" w:themeColor="text2" w:themeTint="BF"/>
         </w:rPr>
         <w:t xml:space="preserve">We have now discussed these in more detail in the concluding remarks section. </w:t>
       </w:r>
-      <w:commentRangeEnd w:id="4"/>
+      <w:commentRangeEnd w:id="5"/>
       <w:r>
         <w:rPr>
           <w:rStyle w:val="CommentReference"/>
         </w:rPr>
-        <w:commentReference w:id="4"/>
+        <w:commentReference w:id="5"/>
       </w:r>
     </w:p>
     <w:p/>
@@ -1332,7 +1479,15 @@
         <w:t xml:space="preserve"> </w:t>
       </w:r>
       <w:r>
-        <w:t>L 276: Suggest to delete "ecological".</w:t>
+        <w:t xml:space="preserve">L 276: Suggest </w:t>
+      </w:r>
+      <w:proofErr w:type="gramStart"/>
+      <w:r>
+        <w:t>to delete</w:t>
+      </w:r>
+      <w:proofErr w:type="gramEnd"/>
+      <w:r>
+        <w:t xml:space="preserve"> "ecological".</w:t>
       </w:r>
     </w:p>
     <w:p/>
@@ -1451,7 +1606,39 @@
         <w:t xml:space="preserve"> </w:t>
       </w:r>
       <w:r>
-        <w:t xml:space="preserve">This is an ambitious review offering an integrated fusion of several relatively new approaches including mechanistic microclimate modeling, biophysical modeling, dynamic energy budgeting, and population/community modeling. Either of these approaches could serve as the basis of their own review, but I appreciate this endeavor to create a blueprint for future efforts in combining these approaches to predict the consequences of extreme heat waves at the individual level and propagate these impacts to entire populations and ecosystems. </w:t>
+        <w:t xml:space="preserve">This is an ambitious review offering an integrated fusion of several relatively new approaches including mechanistic microclimate </w:t>
+      </w:r>
+      <w:proofErr w:type="spellStart"/>
+      <w:r>
+        <w:t>modeling</w:t>
+      </w:r>
+      <w:proofErr w:type="spellEnd"/>
+      <w:r>
+        <w:t xml:space="preserve">, biophysical </w:t>
+      </w:r>
+      <w:proofErr w:type="spellStart"/>
+      <w:r>
+        <w:t>modeling</w:t>
+      </w:r>
+      <w:proofErr w:type="spellEnd"/>
+      <w:r>
+        <w:t xml:space="preserve">, dynamic energy budgeting, and population/community </w:t>
+      </w:r>
+      <w:proofErr w:type="spellStart"/>
+      <w:r>
+        <w:t>modeling</w:t>
+      </w:r>
+      <w:proofErr w:type="spellEnd"/>
+      <w:r>
+        <w:t xml:space="preserve">. Either of these approaches could serve as the basis of their own review, but I appreciate this </w:t>
+      </w:r>
+      <w:proofErr w:type="spellStart"/>
+      <w:r>
+        <w:t>endeavor</w:t>
+      </w:r>
+      <w:proofErr w:type="spellEnd"/>
+      <w:r>
+        <w:t xml:space="preserve"> to create a blueprint for future efforts in combining these approaches to predict the consequences of extreme heat waves at the individual level and propagate these impacts to entire populations and ecosystems. </w:t>
       </w:r>
       <w:r>
         <w:rPr>
@@ -1521,9 +1708,17 @@
         <w:t xml:space="preserve"> </w:t>
       </w:r>
       <w:r>
-        <w:t>Although it was interesting, I felt like the section on the "current state of extreme weather modeling" (L02-L21), could be sacrificed</w:t>
-      </w:r>
-      <w:commentRangeStart w:id="5"/>
+        <w:t xml:space="preserve">Although it was interesting, I felt like the section on the "current state of extreme weather </w:t>
+      </w:r>
+      <w:proofErr w:type="spellStart"/>
+      <w:r>
+        <w:t>modeling</w:t>
+      </w:r>
+      <w:proofErr w:type="spellEnd"/>
+      <w:r>
+        <w:t>" (L02-L21), could be sacrificed</w:t>
+      </w:r>
+      <w:commentRangeStart w:id="6"/>
       <w:r>
         <w:t xml:space="preserve">. There is so much to unpack with </w:t>
       </w:r>
@@ -1536,15 +1731,39 @@
       <w:r>
         <w:t xml:space="preserve"> I think this could be </w:t>
       </w:r>
-      <w:commentRangeEnd w:id="5"/>
+      <w:commentRangeEnd w:id="6"/>
       <w:r>
         <w:rPr>
           <w:rStyle w:val="CommentReference"/>
         </w:rPr>
-        <w:commentReference w:id="5"/>
-      </w:r>
-      <w:r>
-        <w:t xml:space="preserve">more simply a quick justification and review of mechanistic microclimate modeling. Other reviews already discuss mechanistic microclimate modeling (e.g., microclim, etc.), and I think it can be a more succinct review of the general approach and how it can be used to capture extreme temperature conditions at the organismal level. </w:t>
+        <w:commentReference w:id="6"/>
+      </w:r>
+      <w:r>
+        <w:t xml:space="preserve">more simply a quick justification and review of mechanistic microclimate </w:t>
+      </w:r>
+      <w:proofErr w:type="spellStart"/>
+      <w:r>
+        <w:t>modeling</w:t>
+      </w:r>
+      <w:proofErr w:type="spellEnd"/>
+      <w:r>
+        <w:t xml:space="preserve">. Other reviews already discuss mechanistic microclimate </w:t>
+      </w:r>
+      <w:proofErr w:type="spellStart"/>
+      <w:r>
+        <w:t>modeling</w:t>
+      </w:r>
+      <w:proofErr w:type="spellEnd"/>
+      <w:r>
+        <w:t xml:space="preserve"> (e.g., </w:t>
+      </w:r>
+      <w:proofErr w:type="spellStart"/>
+      <w:r>
+        <w:t>microclim</w:t>
+      </w:r>
+      <w:proofErr w:type="spellEnd"/>
+      <w:r>
+        <w:t xml:space="preserve">, etc.), and I think it can be a more succinct review of the general approach and how it can be used to capture extreme temperature conditions at the organismal level. </w:t>
       </w:r>
     </w:p>
     <w:p/>
@@ -1597,7 +1816,7 @@
       <w:r>
         <w:t xml:space="preserve">By reducing the overview of GCMs and LSMs, there could be additional </w:t>
       </w:r>
-      <w:commentRangeStart w:id="6"/>
+      <w:commentRangeStart w:id="7"/>
       <w:r>
         <w:t xml:space="preserve">room for addressing other aspects of this approach that are more relevant. </w:t>
       </w:r>
@@ -1607,18 +1826,32 @@
         </w:rPr>
         <w:t xml:space="preserve">For example, there </w:t>
       </w:r>
-      <w:commentRangeEnd w:id="6"/>
+      <w:commentRangeEnd w:id="7"/>
       <w:r>
         <w:rPr>
           <w:rStyle w:val="CommentReference"/>
         </w:rPr>
-        <w:commentReference w:id="6"/>
+        <w:commentReference w:id="7"/>
       </w:r>
       <w:r>
         <w:rPr>
           <w:highlight w:val="yellow"/>
         </w:rPr>
-        <w:t>is very little on behavioral decision making and habitat selection, both of which are critical adaptive responses for species</w:t>
+        <w:t xml:space="preserve">is very little on </w:t>
+      </w:r>
+      <w:proofErr w:type="spellStart"/>
+      <w:r>
+        <w:rPr>
+          <w:highlight w:val="yellow"/>
+        </w:rPr>
+        <w:t>behavioral</w:t>
+      </w:r>
+      <w:proofErr w:type="spellEnd"/>
+      <w:r>
+        <w:rPr>
+          <w:highlight w:val="yellow"/>
+        </w:rPr>
+        <w:t xml:space="preserve"> decision making and habitat selection, both of which are critical adaptive responses for species</w:t>
       </w:r>
       <w:r>
         <w:t xml:space="preserve">. </w:t>
@@ -1627,7 +1860,49 @@
         <w:rPr>
           <w:highlight w:val="yellow"/>
         </w:rPr>
-        <w:t>Indeed, this is one of the more powerful capabilities of NicheMapper as is shown in the supplemental material (e.g., time spent foraging, nocturnal behavior, etc.), but receives scant attention in the review.</w:t>
+        <w:t xml:space="preserve">Indeed, this is one of the more powerful capabilities of </w:t>
+      </w:r>
+      <w:proofErr w:type="spellStart"/>
+      <w:r>
+        <w:rPr>
+          <w:highlight w:val="yellow"/>
+        </w:rPr>
+        <w:t>NicheMapper</w:t>
+      </w:r>
+      <w:proofErr w:type="spellEnd"/>
+      <w:r>
+        <w:rPr>
+          <w:highlight w:val="yellow"/>
+        </w:rPr>
+        <w:t xml:space="preserve"> as is shown in the supplemental material (e.g., time spent foraging, nocturnal </w:t>
+      </w:r>
+      <w:proofErr w:type="spellStart"/>
+      <w:r>
+        <w:rPr>
+          <w:highlight w:val="yellow"/>
+        </w:rPr>
+        <w:t>behavior</w:t>
+      </w:r>
+      <w:proofErr w:type="spellEnd"/>
+      <w:r>
+        <w:rPr>
+          <w:highlight w:val="yellow"/>
+        </w:rPr>
+        <w:t>, etc.</w:t>
+      </w:r>
+      <w:proofErr w:type="gramStart"/>
+      <w:r>
+        <w:rPr>
+          <w:highlight w:val="yellow"/>
+        </w:rPr>
+        <w:t>), but</w:t>
+      </w:r>
+      <w:proofErr w:type="gramEnd"/>
+      <w:r>
+        <w:rPr>
+          <w:highlight w:val="yellow"/>
+        </w:rPr>
+        <w:t xml:space="preserve"> receives scant attention in the review.</w:t>
       </w:r>
       <w:r>
         <w:t xml:space="preserve"> </w:t>
@@ -1687,19 +1962,33 @@
         </w:rPr>
         <w:t xml:space="preserve">Similarly, there is a fair amount of space devoted to thermal </w:t>
       </w:r>
-      <w:commentRangeStart w:id="7"/>
+      <w:commentRangeStart w:id="8"/>
       <w:r>
         <w:rPr>
           <w:highlight w:val="yellow"/>
         </w:rPr>
-        <w:t xml:space="preserve">load sensivitiy but </w:t>
-      </w:r>
-      <w:commentRangeEnd w:id="7"/>
+        <w:t xml:space="preserve">load </w:t>
+      </w:r>
+      <w:proofErr w:type="spellStart"/>
+      <w:r>
+        <w:rPr>
+          <w:highlight w:val="yellow"/>
+        </w:rPr>
+        <w:t>sensivitiy</w:t>
+      </w:r>
+      <w:proofErr w:type="spellEnd"/>
+      <w:r>
+        <w:rPr>
+          <w:highlight w:val="yellow"/>
+        </w:rPr>
+        <w:t xml:space="preserve"> but </w:t>
+      </w:r>
+      <w:commentRangeEnd w:id="8"/>
       <w:r>
         <w:rPr>
           <w:rStyle w:val="CommentReference"/>
         </w:rPr>
-        <w:commentReference w:id="7"/>
+        <w:commentReference w:id="8"/>
       </w:r>
       <w:r>
         <w:rPr>
@@ -1764,7 +2053,47 @@
         <w:t xml:space="preserve"> </w:t>
       </w:r>
       <w:r>
-        <w:t xml:space="preserve">The biophysical modeling component, as illustrated in the supplementary material, requires a significant amount of parameterization (e.g., solar absorptivities, emmissivities, leaf orientation) as does the microclimate modeling (e.g., percent shade, etc.). I appreciate this is a general criticism (or advantage) of mechanistic modeling, but </w:t>
+        <w:t xml:space="preserve">The biophysical </w:t>
+      </w:r>
+      <w:proofErr w:type="spellStart"/>
+      <w:r>
+        <w:t>modeling</w:t>
+      </w:r>
+      <w:proofErr w:type="spellEnd"/>
+      <w:r>
+        <w:t xml:space="preserve"> component, as illustrated in the supplementary material, requires a significant amount of parameterization (e.g., solar </w:t>
+      </w:r>
+      <w:proofErr w:type="spellStart"/>
+      <w:r>
+        <w:t>absorptivities</w:t>
+      </w:r>
+      <w:proofErr w:type="spellEnd"/>
+      <w:r>
+        <w:t xml:space="preserve">, </w:t>
+      </w:r>
+      <w:proofErr w:type="spellStart"/>
+      <w:r>
+        <w:t>emmissivities</w:t>
+      </w:r>
+      <w:proofErr w:type="spellEnd"/>
+      <w:r>
+        <w:t xml:space="preserve">, leaf orientation) as does the microclimate </w:t>
+      </w:r>
+      <w:proofErr w:type="spellStart"/>
+      <w:r>
+        <w:t>modeling</w:t>
+      </w:r>
+      <w:proofErr w:type="spellEnd"/>
+      <w:r>
+        <w:t xml:space="preserve"> (e.g., percent shade, etc.). I appreciate this is a general criticism (or advantage) of mechanistic </w:t>
+      </w:r>
+      <w:proofErr w:type="spellStart"/>
+      <w:r>
+        <w:t>modeling</w:t>
+      </w:r>
+      <w:proofErr w:type="spellEnd"/>
+      <w:r>
+        <w:t xml:space="preserve">, but </w:t>
       </w:r>
       <w:r>
         <w:rPr>
@@ -1772,19 +2101,19 @@
         </w:rPr>
         <w:t xml:space="preserve">it left me </w:t>
       </w:r>
-      <w:commentRangeStart w:id="8"/>
+      <w:commentRangeStart w:id="9"/>
       <w:r>
         <w:rPr>
           <w:highlight w:val="yellow"/>
         </w:rPr>
         <w:t xml:space="preserve">wondering what types of recommendations you would offer to researchers and conservation </w:t>
       </w:r>
-      <w:commentRangeEnd w:id="8"/>
+      <w:commentRangeEnd w:id="9"/>
       <w:r>
         <w:rPr>
           <w:rStyle w:val="CommentReference"/>
         </w:rPr>
-        <w:commentReference w:id="8"/>
+        <w:commentReference w:id="9"/>
       </w:r>
       <w:r>
         <w:rPr>
@@ -1826,18 +2155,26 @@
         <w:t xml:space="preserve">: </w:t>
       </w:r>
       <w:r>
-        <w:t xml:space="preserve">Given the real world implications of managing these systems and their associated species during periods of </w:t>
-      </w:r>
-      <w:commentRangeStart w:id="9"/>
+        <w:t xml:space="preserve">Given the </w:t>
+      </w:r>
+      <w:proofErr w:type="gramStart"/>
+      <w:r>
+        <w:t>real world</w:t>
+      </w:r>
+      <w:proofErr w:type="gramEnd"/>
+      <w:r>
+        <w:t xml:space="preserve"> implications of managing these systems and their associated species during periods of </w:t>
+      </w:r>
+      <w:commentRangeStart w:id="10"/>
       <w:r>
         <w:t xml:space="preserve">extreme conditions, how can those in authority be assured that these models are realistic? What type of data would be needed at the habitat, organismal, population, and </w:t>
       </w:r>
-      <w:commentRangeEnd w:id="9"/>
+      <w:commentRangeEnd w:id="10"/>
       <w:r>
         <w:rPr>
           <w:rStyle w:val="CommentReference"/>
         </w:rPr>
-        <w:commentReference w:id="9"/>
+        <w:commentReference w:id="10"/>
       </w:r>
       <w:r>
         <w:t>community level? What type of validation would be necessary?</w:t>
@@ -1906,7 +2243,25 @@
         <w:t xml:space="preserve"> </w:t>
       </w:r>
       <w:r>
-        <w:t>The consequences of extreme events including extreme heat and heat waves are truly critical for our future. These types of events are inherently challenging to forecast as well as hard to understand the consequences of because they are rare and because they involve non linear dose-response dynamics. From this perspective, the paper intents to provide inputs to a very important area. So, while I find the subject to be overly important and have deep sympathy for the intentions behind the paper, I am really sorry I cannot be more optimistic than my below review tells. I think the subject has great potential, but the paper is very difficult in its present form.</w:t>
+        <w:t xml:space="preserve">The consequences of extreme events including extreme heat and heat waves are truly critical for our future. These types of events are inherently challenging to forecast as well as hard to understand the consequences of because they are rare and because they involve </w:t>
+      </w:r>
+      <w:proofErr w:type="spellStart"/>
+      <w:proofErr w:type="gramStart"/>
+      <w:r>
+        <w:t>non linear</w:t>
+      </w:r>
+      <w:proofErr w:type="spellEnd"/>
+      <w:proofErr w:type="gramEnd"/>
+      <w:r>
+        <w:t xml:space="preserve"> dose-response dynamics. From this perspective, the paper intents to provide inputs to a very important area. So, while I find the subject to be overly important and have deep sympathy for the intentions behind the paper, I am </w:t>
+      </w:r>
+      <w:proofErr w:type="gramStart"/>
+      <w:r>
+        <w:t>really sorry</w:t>
+      </w:r>
+      <w:proofErr w:type="gramEnd"/>
+      <w:r>
+        <w:t xml:space="preserve"> I cannot be more optimistic than my below review tells. I think the subject has great potential, but the paper is very difficult in its present form.</w:t>
       </w:r>
       <w:r>
         <w:br/>
@@ -1947,7 +2302,21 @@
         <w:rPr>
           <w:color w:val="215E99" w:themeColor="text2" w:themeTint="BF"/>
         </w:rPr>
-        <w:t xml:space="preserve"> Sorry for the confusion. This paper is more of a Review as indicated in our response to the Editor. We have now tried to make the “approach” more concrete by including a hypothetical example from our supplement. This examples involved plants and two insect species and discussed how the modelling frameworks are interconnected within this context. </w:t>
+        <w:t xml:space="preserve"> Sorry for the confusion. This paper is more of a Review as indicated in our response to the Editor. We have now tried to make the “approach” more concrete by including a hypothetical example from our supplement. </w:t>
+      </w:r>
+      <w:proofErr w:type="gramStart"/>
+      <w:r>
+        <w:rPr>
+          <w:color w:val="215E99" w:themeColor="text2" w:themeTint="BF"/>
+        </w:rPr>
+        <w:t>This examples</w:t>
+      </w:r>
+      <w:proofErr w:type="gramEnd"/>
+      <w:r>
+        <w:rPr>
+          <w:color w:val="215E99" w:themeColor="text2" w:themeTint="BF"/>
+        </w:rPr>
+        <w:t xml:space="preserve"> involved plants and two insect species and discussed how the modelling frameworks are interconnected within this context. </w:t>
       </w:r>
     </w:p>
     <w:p>
@@ -2008,7 +2377,15 @@
         <w:t>rather seems to be some arbitrarily chosen examples that end up failing to present a comprehensive and holistic framework, which I would have liked and which I believe the authors have in mind</w:t>
       </w:r>
       <w:r>
-        <w:t xml:space="preserve">. For example, the paper describes how our present understanding and modelling capacities makes it possible to model heat wave impacts across existing domains and disciplines, which is normally siloed. Likely, this is correct, but the cross boundary handling of the different </w:t>
+        <w:t xml:space="preserve">. For example, the paper describes how our present understanding and modelling capacities makes it possible to model heat wave impacts across existing domains and disciplines, which is normally siloed. Likely, this is correct, but the </w:t>
+      </w:r>
+      <w:proofErr w:type="gramStart"/>
+      <w:r>
+        <w:t>cross boundary</w:t>
+      </w:r>
+      <w:proofErr w:type="gramEnd"/>
+      <w:r>
+        <w:t xml:space="preserve"> handling of the different </w:t>
       </w:r>
       <w:r>
         <w:rPr>
@@ -2105,7 +2482,7 @@
         </w:rPr>
         <w:t xml:space="preserve"> We have re-written aspects of the paper and </w:t>
       </w:r>
-      <w:commentRangeStart w:id="10"/>
+      <w:commentRangeStart w:id="11"/>
       <w:r>
         <w:rPr>
           <w:color w:val="215E99" w:themeColor="text2" w:themeTint="BF"/>
@@ -2118,12 +2495,12 @@
         </w:rPr>
         <w:t>to show more clearly how the models are connected.</w:t>
       </w:r>
-      <w:commentRangeEnd w:id="10"/>
+      <w:commentRangeEnd w:id="11"/>
       <w:r>
         <w:rPr>
           <w:rStyle w:val="CommentReference"/>
         </w:rPr>
-        <w:commentReference w:id="10"/>
+        <w:commentReference w:id="11"/>
       </w:r>
     </w:p>
     <w:p>
@@ -2174,7 +2551,14 @@
         <w:rPr>
           <w:highlight w:val="red"/>
         </w:rPr>
-        <w:t>Part of the problem is that our ecological understanding of extremes and their impacts is missing and requires more observations and experiments to provide better biological understanding. This interaction and collaboration between models and observations is completely missing</w:t>
+        <w:t xml:space="preserve">Part of </w:t>
+      </w:r>
+      <w:commentRangeStart w:id="12"/>
+      <w:r>
+        <w:rPr>
+          <w:highlight w:val="red"/>
+        </w:rPr>
+        <w:t>the problem is that our ecological understanding of extremes and their impacts is missing and requires more observations and experiments to provide better biological understanding. This interaction and collaboration between models and observations is completely missing</w:t>
       </w:r>
       <w:r>
         <w:t>.</w:t>
@@ -2182,6 +2566,13 @@
       <w:r>
         <w:br/>
       </w:r>
+      <w:commentRangeEnd w:id="12"/>
+      <w:r>
+        <w:rPr>
+          <w:rStyle w:val="CommentReference"/>
+        </w:rPr>
+        <w:commentReference w:id="12"/>
+      </w:r>
     </w:p>
     <w:p>
       <w:r>
@@ -2238,7 +2629,21 @@
         <w:rPr>
           <w:highlight w:val="red"/>
         </w:rPr>
-        <w:t>It may be that it is not good enough and there is a need for more, new or better coupling, especially when we speak about extremes and heat waves, but this has to be described much more precisely</w:t>
+        <w:t xml:space="preserve">It may be that it is not good enough and there is a need for more, new or better coupling, especially when we speak about extremes and heat waves, but this </w:t>
+      </w:r>
+      <w:proofErr w:type="gramStart"/>
+      <w:r>
+        <w:rPr>
+          <w:highlight w:val="red"/>
+        </w:rPr>
+        <w:t>has to</w:t>
+      </w:r>
+      <w:proofErr w:type="gramEnd"/>
+      <w:r>
+        <w:rPr>
+          <w:highlight w:val="red"/>
+        </w:rPr>
+        <w:t xml:space="preserve"> be described much more precisely</w:t>
       </w:r>
       <w:r>
         <w:t>.</w:t>
@@ -2357,7 +2762,15 @@
         <w:t xml:space="preserve"> </w:t>
       </w:r>
       <w:r>
-        <w:t>Line 62-66 - It is unclear what the challenge with heat waves relative to general temperature increases is and how general climate change driven temperature increases and extreme heat waves are different or connected. Much of the text and descriptions sound more like impacts of general temperature increases, but heat waves have some distinct differences. What specific challenges do you see in the understanding and the modelling, at different scales, and what are you delivering or proposing? Also, how are heat waves different from other extremes? It seems to me that a modelling approach with the characteristics the authors wants to present will include some basic features, solutions or principles which have common characters for extremes, yet also for the specific case having features that are specific for temperature and heat. I would expect some degree of treating the general aspects of extremes as well as the more specific heat aspects.</w:t>
+        <w:t xml:space="preserve">Line 62-66 - It is unclear what the challenge with heat waves relative to general temperature increases is and how general climate change driven temperature increases and extreme heat waves are different or connected. Much of the text and descriptions sound more like impacts of general temperature increases, but heat waves have some distinct differences. What specific challenges do you see in the understanding and the modelling, at different scales, and what are you delivering or proposing? Also, how are heat waves different from other extremes? It seems to me that a modelling approach with the characteristics the authors </w:t>
+      </w:r>
+      <w:proofErr w:type="gramStart"/>
+      <w:r>
+        <w:t>wants</w:t>
+      </w:r>
+      <w:proofErr w:type="gramEnd"/>
+      <w:r>
+        <w:t xml:space="preserve"> to present will include some basic features, solutions or principles which have common characters for extremes, yet also for the specific case having features that are specific for temperature and heat. I would expect some degree of treating the general aspects of extremes as well as the more specific heat aspects.</w:t>
       </w:r>
       <w:r>
         <w:br/>
@@ -2412,7 +2825,15 @@
         <w:t xml:space="preserve"> </w:t>
       </w:r>
       <w:r>
-        <w:t>Line 67-69 - it sounds like current modelling does not integrate detailed process modelling into community and population dimensions. I am sure there are important limitations that needs to be improved and developed, and that heat waves and other extremes provide much understudied cases, but I disagree that such integrations do not exist. Please do not simplify and overstate, but be precise and specific.</w:t>
+        <w:t xml:space="preserve">Line 67-69 - it sounds like current modelling does not integrate detailed process modelling into community and population dimensions. I am sure there are important limitations that needs to be improved and developed, and that heat waves and other extremes provide much understudied cases, but I disagree that such integrations do not exist. Please do not simplify and </w:t>
+      </w:r>
+      <w:proofErr w:type="gramStart"/>
+      <w:r>
+        <w:t>overstate, but</w:t>
+      </w:r>
+      <w:proofErr w:type="gramEnd"/>
+      <w:r>
+        <w:t xml:space="preserve"> be precise and specific.</w:t>
       </w:r>
       <w:r>
         <w:br/>
@@ -2527,7 +2948,15 @@
         <w:t xml:space="preserve"> </w:t>
       </w:r>
       <w:r>
-        <w:t>Line 89-92 - I think there is a confusion or mixing of general thermal adaptation and extreme heat damage. The sentence suggests that individuals mitigate extreme heat through habitat selection, but I think there is a lack of ecological description or understanding here. Most ecosystems and habitats have a history of extremes to which they are adapted. This may involve severe damage to individuals and eventual dieback from which the system may recover and over time disappeared species may return. In a future climate with novel and more severe types and intensities of extremes, these may change the pressure on individuals with dieback and avoidance, but the actual adaptation and new habitat selection is not entirely driven by the extremes, but by the general site specific bio-geo-meteorological conditions. I think the paper would be strengthened by including ecological thinking and theory much better.</w:t>
+        <w:t xml:space="preserve">Line 89-92 - I think there is a confusion or mixing of general thermal adaptation and extreme heat damage. The sentence suggests that individuals mitigate extreme heat through habitat selection, but I think there is a lack of ecological description or understanding here. Most ecosystems and habitats have a history of extremes to which they are adapted. This may involve severe damage to individuals and eventual dieback from which the system may recover and over time disappeared species may return. In a future climate with novel and more severe types and intensities of extremes, these may change the pressure on individuals with dieback and avoidance, but the actual adaptation and new habitat selection is not entirely driven by the extremes, but by the general </w:t>
+      </w:r>
+      <w:proofErr w:type="gramStart"/>
+      <w:r>
+        <w:t>site specific</w:t>
+      </w:r>
+      <w:proofErr w:type="gramEnd"/>
+      <w:r>
+        <w:t xml:space="preserve"> bio-geo-meteorological conditions. I think the paper would be strengthened by including ecological thinking and theory much better.</w:t>
       </w:r>
       <w:r>
         <w:br/>
@@ -2582,7 +3011,15 @@
         <w:t xml:space="preserve"> </w:t>
       </w:r>
       <w:r>
-        <w:t xml:space="preserve">Line 96-98 - Is this integration actually new - or what is new in your presentation? A </w:t>
+        <w:t xml:space="preserve">Line 96-98 - Is this integration </w:t>
+      </w:r>
+      <w:proofErr w:type="gramStart"/>
+      <w:r>
+        <w:t>actually new</w:t>
+      </w:r>
+      <w:proofErr w:type="gramEnd"/>
+      <w:r>
+        <w:t xml:space="preserve"> - or what is new in your presentation? A </w:t>
       </w:r>
       <w:r>
         <w:lastRenderedPageBreak/>
@@ -2641,7 +3078,47 @@
         <w:t xml:space="preserve"> </w:t>
       </w:r>
       <w:r>
-        <w:t>Figure 1 - This is an extremely busy figure. It is really not easy to understand what the message or illustration is? At a first glance it seems to present general connection between basic ecological understanding and dynamics with some arbitrary or selected models, but it is unclear which boxes are models and which are system entities, it is unclear what the dotted lines indicates and it is unclear which aspects of the ecosystem functioning are involved and how they are linked. Are the ecosystem boxes separate from the modelling or are they part of the modelling (which must be the case for many of the models??). And finally, the figure claims to focus on extreme heat - but it is unclear how this is done and how it interacts with other drivers such as especially water and management. The figure is not entirely helpful and it is not clear when you refer to existing models, approaches and concepts and when you present a wish or suggestion for ssomething new.</w:t>
+        <w:t xml:space="preserve">Figure 1 - This is an extremely busy figure. It is </w:t>
+      </w:r>
+      <w:proofErr w:type="gramStart"/>
+      <w:r>
+        <w:t>really not</w:t>
+      </w:r>
+      <w:proofErr w:type="gramEnd"/>
+      <w:r>
+        <w:t xml:space="preserve"> easy to understand what the message or illustration is? At a first glance it seems to present general connection between basic ecological understanding and dynamics with some arbitrary or selected models, but it is unclear which boxes are </w:t>
+      </w:r>
+      <w:proofErr w:type="gramStart"/>
+      <w:r>
+        <w:t>models</w:t>
+      </w:r>
+      <w:proofErr w:type="gramEnd"/>
+      <w:r>
+        <w:t xml:space="preserve"> and which are system entities, it is unclear what the dotted lines </w:t>
+      </w:r>
+      <w:proofErr w:type="gramStart"/>
+      <w:r>
+        <w:t>indicates</w:t>
+      </w:r>
+      <w:proofErr w:type="gramEnd"/>
+      <w:r>
+        <w:t xml:space="preserve"> and it is unclear which aspects of the ecosystem functioning are involved and how they are linked. Are the ecosystem boxes separate from the modelling or are they part of the modelling (which must be the case for many of the models??). And finally, the figure claims to focus on extreme heat - but it is unclear how this is done and how it interacts with other drivers such as especially water and management. The figure is not entirely </w:t>
+      </w:r>
+      <w:proofErr w:type="gramStart"/>
+      <w:r>
+        <w:t>helpful</w:t>
+      </w:r>
+      <w:proofErr w:type="gramEnd"/>
+      <w:r>
+        <w:t xml:space="preserve"> and it is not clear when you refer to existing models, approaches and concepts and when you present a wish or suggestion for </w:t>
+      </w:r>
+      <w:proofErr w:type="spellStart"/>
+      <w:r>
+        <w:t>ssomething</w:t>
+      </w:r>
+      <w:proofErr w:type="spellEnd"/>
+      <w:r>
+        <w:t xml:space="preserve"> new.</w:t>
       </w:r>
       <w:r>
         <w:br/>
@@ -2696,7 +3173,31 @@
         <w:t xml:space="preserve"> </w:t>
       </w:r>
       <w:r>
-        <w:t>Line 101-121 - It is probably all true what is in here, but what is the purpose of spending 20 lines to describe weather modelling in general including the coding language? If weather and meteorological modelling is at all relevant in this context, I would suggest to focus on the aspects of meteorological modelling that are particularly challenged when it comes to extremes and specifically heat waves. I certainly agree that such meteorological modelling of extremes IS a big challenge. Long term and general climate modelling is reasonably good while the translation of the general weather patterns into local and regional extremes are really challenging. But this particular challenge is not what you describe.</w:t>
+        <w:t xml:space="preserve">Line 101-121 - It is probably all true what is in here, but what is the purpose of spending 20 lines to describe weather modelling in general including the coding language? If weather and meteorological modelling is at all relevant in this context, I would suggest </w:t>
+      </w:r>
+      <w:proofErr w:type="gramStart"/>
+      <w:r>
+        <w:t>to focus</w:t>
+      </w:r>
+      <w:proofErr w:type="gramEnd"/>
+      <w:r>
+        <w:t xml:space="preserve"> on the aspects of meteorological modelling that are particularly challenged when it comes to extremes and specifically heat waves. I certainly agree that such meteorological modelling of extremes IS a big challenge. Long term and general climate modelling </w:t>
+      </w:r>
+      <w:proofErr w:type="gramStart"/>
+      <w:r>
+        <w:t>is</w:t>
+      </w:r>
+      <w:proofErr w:type="gramEnd"/>
+      <w:r>
+        <w:t xml:space="preserve"> reasonably good while the translation of the general weather patterns into local and regional extremes are really challenging. But this </w:t>
+      </w:r>
+      <w:proofErr w:type="gramStart"/>
+      <w:r>
+        <w:t>particular challenge</w:t>
+      </w:r>
+      <w:proofErr w:type="gramEnd"/>
+      <w:r>
+        <w:t xml:space="preserve"> is not what you describe.</w:t>
       </w:r>
       <w:r>
         <w:br/>
@@ -2757,7 +3258,15 @@
         <w:t xml:space="preserve"> </w:t>
       </w:r>
       <w:r>
-        <w:t>Line 122-135 - Again, I suggest you include some more specific ecological understanding here. The section looks at extremes mostly from a meteorological point of view, but this may not in itself be relevant if the ecosystems or species do not experience the pressure as extreme. Melinda Smith has a great paper where she distinguish between meteorological extremes and ecological extremes. That would be a relevant and great perspective to include.</w:t>
+        <w:t xml:space="preserve">Line 122-135 - Again, I suggest you include some more specific ecological understanding here. The section looks at extremes mostly from a meteorological point of view, but this may not in itself be relevant if the ecosystems or species do not experience the pressure as extreme. Melinda Smith has a great paper where she </w:t>
+      </w:r>
+      <w:proofErr w:type="gramStart"/>
+      <w:r>
+        <w:t>distinguish</w:t>
+      </w:r>
+      <w:proofErr w:type="gramEnd"/>
+      <w:r>
+        <w:t xml:space="preserve"> between meteorological extremes and ecological extremes. That would be a relevant and great perspective to include.</w:t>
       </w:r>
       <w:r>
         <w:br/>
@@ -2814,16 +3323,16 @@
       <w:r>
         <w:t xml:space="preserve">Line 133-135 - I miss a reference for this latter sentence, or a more comprehensive unfolding of the non-linearity aspects. It is a surprise how little space you offer to the </w:t>
       </w:r>
-      <w:commentRangeStart w:id="11"/>
+      <w:commentRangeStart w:id="13"/>
       <w:r>
         <w:t xml:space="preserve">non-linearity aspects of extremes </w:t>
       </w:r>
-      <w:commentRangeEnd w:id="11"/>
+      <w:commentRangeEnd w:id="13"/>
       <w:r>
         <w:rPr>
           <w:rStyle w:val="CommentReference"/>
         </w:rPr>
-        <w:commentReference w:id="11"/>
+        <w:commentReference w:id="13"/>
       </w:r>
       <w:r>
         <w:t>and how to model them, despite they are crucial characteristics of such events.</w:t>
@@ -2942,7 +3451,15 @@
         <w:t xml:space="preserve"> </w:t>
       </w:r>
       <w:r>
-        <w:t>Line 165-217 - There is a lot about responses of organisms and almost nothing about systems. And all examples given are for individual species. You claim that the papers should go across dimensions - but you give almost no ideas to provide the systems integration. I know that systems consists of individuals, but doing species and individuals right does not automatically lead to correct treatments of systems.</w:t>
+        <w:t xml:space="preserve">Line 165-217 - There is a lot about responses of organisms and almost nothing about systems. And all examples given are for individual species. You claim that the papers should go across dimensions - but you give almost no ideas to provide the systems integration. I know that systems </w:t>
+      </w:r>
+      <w:proofErr w:type="gramStart"/>
+      <w:r>
+        <w:t>consists</w:t>
+      </w:r>
+      <w:proofErr w:type="gramEnd"/>
+      <w:r>
+        <w:t xml:space="preserve"> of individuals, but doing species and individuals right does not automatically lead to correct treatments of systems.</w:t>
       </w:r>
       <w:r>
         <w:br/>
@@ -2997,18 +3514,34 @@
         <w:t xml:space="preserve"> </w:t>
       </w:r>
       <w:r>
-        <w:t xml:space="preserve">Box 1 and Figure 2 - It is an important aspect to include - the mediation of heat waves at the systems level and through interaction with different other drivers. However, the figure is really hard to read and </w:t>
-      </w:r>
-      <w:commentRangeStart w:id="12"/>
-      <w:r>
-        <w:t xml:space="preserve">understand, and to me it is not enough to treat this in a box and figure, but the message has to be integrated into the text as well. You need to include the aspects of mediation into the description and not just rely on the reader being able to see the consequences of these </w:t>
-      </w:r>
-      <w:commentRangeEnd w:id="12"/>
+        <w:t xml:space="preserve">Box 1 and Figure 2 - It is an important aspect to include - the mediation of heat waves at the systems level and through interaction with different other drivers. However, the figure is </w:t>
+      </w:r>
+      <w:proofErr w:type="gramStart"/>
+      <w:r>
+        <w:t>really hard</w:t>
+      </w:r>
+      <w:proofErr w:type="gramEnd"/>
+      <w:r>
+        <w:t xml:space="preserve"> to read and </w:t>
+      </w:r>
+      <w:commentRangeStart w:id="14"/>
+      <w:r>
+        <w:t xml:space="preserve">understand, and to me it is not enough to treat this in a box and figure, but the message </w:t>
+      </w:r>
+      <w:proofErr w:type="gramStart"/>
+      <w:r>
+        <w:t>has to</w:t>
+      </w:r>
+      <w:proofErr w:type="gramEnd"/>
+      <w:r>
+        <w:t xml:space="preserve"> be integrated into the text as well. You need to include the aspects of mediation into the description and not just rely on the reader being able to see the consequences of these </w:t>
+      </w:r>
+      <w:commentRangeEnd w:id="14"/>
       <w:r>
         <w:rPr>
           <w:rStyle w:val="CommentReference"/>
         </w:rPr>
-        <w:commentReference w:id="12"/>
+        <w:commentReference w:id="14"/>
       </w:r>
       <w:r>
         <w:t>aspects just by having it in a box or a figure. The figure text is not at all useful.</w:t>
@@ -3123,16 +3656,24 @@
       <w:r>
         <w:t xml:space="preserve">Line 248-253 - The interaction between </w:t>
       </w:r>
-      <w:commentRangeStart w:id="13"/>
-      <w:r>
-        <w:t xml:space="preserve">temperature and water are really important, also for the case of heat waves, but I think it deserves a bit more attention </w:t>
-      </w:r>
-      <w:commentRangeEnd w:id="13"/>
+      <w:commentRangeStart w:id="15"/>
+      <w:r>
+        <w:t xml:space="preserve">temperature and water are </w:t>
+      </w:r>
+      <w:proofErr w:type="gramStart"/>
+      <w:r>
+        <w:t>really important</w:t>
+      </w:r>
+      <w:proofErr w:type="gramEnd"/>
+      <w:r>
+        <w:t xml:space="preserve">, also for the case of heat waves, but I think it deserves a bit more attention </w:t>
+      </w:r>
+      <w:commentRangeEnd w:id="15"/>
       <w:r>
         <w:rPr>
           <w:rStyle w:val="CommentReference"/>
         </w:rPr>
-        <w:commentReference w:id="13"/>
+        <w:commentReference w:id="15"/>
       </w:r>
       <w:r>
         <w:t>in the paper.</w:t>
@@ -3198,19 +3739,27 @@
       <w:r>
         <w:t>Line 256 - What is the idea behind the use of "</w:t>
       </w:r>
-      <w:commentRangeStart w:id="14"/>
+      <w:commentRangeStart w:id="16"/>
       <w:r>
         <w:t>coexistence" as a key explanatory model? It is true that species interactions are relevant for describing the interaction between two or more species relative to the site conditions at a given site</w:t>
       </w:r>
-      <w:commentRangeEnd w:id="14"/>
+      <w:commentRangeEnd w:id="16"/>
       <w:r>
         <w:rPr>
           <w:rStyle w:val="CommentReference"/>
         </w:rPr>
-        <w:commentReference w:id="14"/>
-      </w:r>
-      <w:r>
-        <w:t xml:space="preserve">. But how is that relevant for the understanding of the overall consequences of extremes and heat waves? I would think coexistence is of core relevance for general site conditions and for more gradual climatic changes, while the sudden and potentially dieback provoking nature of extreme events, also described here by damage and repair, would be different from classic coexistence. Ofcourse, if future heat waves is a novel factor for a given site, the ability of a given specie and community to withstand this pressure is importance, but I do not really see how coexistence is the core logical framework to describe </w:t>
+        <w:commentReference w:id="16"/>
+      </w:r>
+      <w:r>
+        <w:t xml:space="preserve">. But how is that relevant for the understanding of the overall consequences of extremes and heat waves? I would think coexistence is of core relevance for general site conditions and for more gradual climatic changes, while the sudden and potentially dieback provoking nature of extreme events, also described here by damage and repair, would be different from classic coexistence. </w:t>
+      </w:r>
+      <w:proofErr w:type="spellStart"/>
+      <w:r>
+        <w:t>Ofcourse</w:t>
+      </w:r>
+      <w:proofErr w:type="spellEnd"/>
+      <w:r>
+        <w:t xml:space="preserve">, if future heat waves is a novel factor for a given site, the ability of a given specie and community to withstand this pressure is importance, but I do not really see how coexistence is the core logical framework to describe </w:t>
       </w:r>
       <w:r>
         <w:lastRenderedPageBreak/>
@@ -3269,7 +3818,31 @@
         <w:t xml:space="preserve"> </w:t>
       </w:r>
       <w:r>
-        <w:t>Box 2 - I think there is a time perspective missing in the description of heat waves as the driver for natural selection and evolution, and I think these two aspects are mistakenly mixed up. Extreme events may clearly drive selection of genetic variants that has the traits to survive the extreme pressure, but less so for evolution because it is a single and dramatic event. And evolution runs over longer time scales. Further, the consequence of extreme events may not be adaptation and evolution, but simply dieback, disappearence and replacement. Extreme events may cause dieback and complete removal of certain species or a complete exchange of existing species and systems with new and different species and system (e.g. desertification) meaning that survival and/or invasion may be more important. So, many of the aspects mentioned here clearly play an important role, but may only present part of the story and other relevant and equally important processes and ressponses are completely missing. For example, the equation 2 seems to be of minor importance (as also stated in the box text).</w:t>
+        <w:t xml:space="preserve">Box 2 - I think there is a time perspective missing in the description of heat waves as the driver for natural selection and evolution, and I think these two aspects are mistakenly mixed up. Extreme events may clearly drive selection of genetic variants that has the traits to survive the extreme pressure, but less so for evolution because it is a single and dramatic event. And evolution runs over longer time scales. Further, the consequence of extreme events may not be adaptation and evolution, but simply dieback, </w:t>
+      </w:r>
+      <w:proofErr w:type="spellStart"/>
+      <w:r>
+        <w:t>disappearence</w:t>
+      </w:r>
+      <w:proofErr w:type="spellEnd"/>
+      <w:r>
+        <w:t xml:space="preserve"> and replacement. Extreme events may cause dieback and complete removal of certain species or a complete exchange of existing species and systems with new and different species and system (e.g. desertification) meaning that survival and/or invasion may be more important. So, many of the aspects mentioned here clearly play an important </w:t>
+      </w:r>
+      <w:proofErr w:type="gramStart"/>
+      <w:r>
+        <w:t>role, but</w:t>
+      </w:r>
+      <w:proofErr w:type="gramEnd"/>
+      <w:r>
+        <w:t xml:space="preserve"> may only present part of the story and other relevant and equally important processes and </w:t>
+      </w:r>
+      <w:proofErr w:type="spellStart"/>
+      <w:r>
+        <w:t>ressponses</w:t>
+      </w:r>
+      <w:proofErr w:type="spellEnd"/>
+      <w:r>
+        <w:t xml:space="preserve"> are completely missing. For example, the equation 2 seems to be of minor importance (as also stated in the box text).</w:t>
       </w:r>
       <w:r>
         <w:br/>
@@ -3326,19 +3899,67 @@
       <w:r>
         <w:t xml:space="preserve">Box 3 - I acknowledge that heat waves </w:t>
       </w:r>
-      <w:commentRangeStart w:id="15"/>
+      <w:commentRangeStart w:id="17"/>
       <w:r>
         <w:t xml:space="preserve">and other climatic extremes causing major impacts on plants and ecosystems will cascade to also have potentially significant societal impacts. However, the paper has a strange mismatch in scale with on the one hand quite some detailed description of single species and on the other hand attempts to embrace the entire global society - and these overly complex societal responses are handled by a single box and just 15 lines! This is just not convincing. </w:t>
       </w:r>
-      <w:commentRangeEnd w:id="15"/>
+      <w:commentRangeEnd w:id="17"/>
       <w:r>
         <w:rPr>
           <w:rStyle w:val="CommentReference"/>
         </w:rPr>
-        <w:commentReference w:id="15"/>
-      </w:r>
-      <w:r>
-        <w:t>The societal aspects of these changes may be really complex and involve severe impacts on anything from changes in classic provisionary ecosystems services like food, feed and fibre to economic progress, human behavior, migration and political unrest. These are really complex changes which the paper does not really acknowledge, and therefore the statement in line 292 that systems modelling can provide us with quantitative tools for predictins and decisions may in principle be correct, but we do not get any clear descriptions or approaches (which was the promise in the title of the paper) - or even a glance of what need to be scientifically and modelwise developed to get there. It may be relevant to include these aspects, but it has to be carefully described and framed, and the modelling aspects must be treated with the same carefulness as the physical-biological systems.</w:t>
+        <w:commentReference w:id="17"/>
+      </w:r>
+      <w:r>
+        <w:t xml:space="preserve">The societal aspects of these changes may be </w:t>
+      </w:r>
+      <w:proofErr w:type="gramStart"/>
+      <w:r>
+        <w:t>really complex</w:t>
+      </w:r>
+      <w:proofErr w:type="gramEnd"/>
+      <w:r>
+        <w:t xml:space="preserve"> and involve severe impacts on anything from changes in classic </w:t>
+      </w:r>
+      <w:proofErr w:type="spellStart"/>
+      <w:r>
+        <w:t>provisionary</w:t>
+      </w:r>
+      <w:proofErr w:type="spellEnd"/>
+      <w:r>
+        <w:t xml:space="preserve"> ecosystems services like food, feed and fibre to economic progress, human </w:t>
+      </w:r>
+      <w:proofErr w:type="spellStart"/>
+      <w:r>
+        <w:t>behavior</w:t>
+      </w:r>
+      <w:proofErr w:type="spellEnd"/>
+      <w:r>
+        <w:t xml:space="preserve">, migration and political unrest. These are really complex changes which the paper does not really acknowledge, and therefore the statement in line 292 that systems modelling can provide us with quantitative tools for </w:t>
+      </w:r>
+      <w:proofErr w:type="spellStart"/>
+      <w:r>
+        <w:t>predictins</w:t>
+      </w:r>
+      <w:proofErr w:type="spellEnd"/>
+      <w:r>
+        <w:t xml:space="preserve"> and decisions may in principle be correct, but we do not get any clear descriptions or approaches (which was the promise in the title of the paper) - or even a glance of what need to be scientifically and </w:t>
+      </w:r>
+      <w:proofErr w:type="spellStart"/>
+      <w:r>
+        <w:t>modelwise</w:t>
+      </w:r>
+      <w:proofErr w:type="spellEnd"/>
+      <w:r>
+        <w:t xml:space="preserve"> developed to get there. It may be relevant to include these aspects, but it </w:t>
+      </w:r>
+      <w:proofErr w:type="gramStart"/>
+      <w:r>
+        <w:t>has to</w:t>
+      </w:r>
+      <w:proofErr w:type="gramEnd"/>
+      <w:r>
+        <w:t xml:space="preserve"> be carefully described and framed, and the modelling aspects must be treated with the same carefulness as the physical-biological systems.</w:t>
       </w:r>
       <w:r>
         <w:br/>
@@ -3528,32 +4149,72 @@
         <w:t xml:space="preserve"> </w:t>
       </w:r>
       <w:r>
-        <w:t>Outstanding questions - It is great with this attempt to summarize the messages into the next step or research needs for the future. But, these questions should follow logically from the paper, which I do not think they do. I cannot identify for any of the 8 points where this is a logical conclusion from things presented and discussed in the paper. Moreover, these 8 points are quite substantial outstanding questions which speaks against the title of the paper promising the reader an approach to model consequences of heat waves. It seems to me that the authors should consider, whether they actually believe</w:t>
-      </w:r>
-      <w:commentRangeStart w:id="16"/>
-      <w:r>
-        <w:t>s they can present a model approach, and if so, then present the approach with clear documentation and figures that present the different elements and how they are linked</w:t>
-      </w:r>
-      <w:commentRangeEnd w:id="16"/>
+        <w:t xml:space="preserve">Outstanding questions - It is great with this attempt to summarize the messages into the next step or research needs for the future. </w:t>
+      </w:r>
+      <w:proofErr w:type="gramStart"/>
+      <w:r>
+        <w:t>But,</w:t>
+      </w:r>
+      <w:proofErr w:type="gramEnd"/>
+      <w:r>
+        <w:t xml:space="preserve"> these questions should follow logically from the paper, which I do not think they do. I cannot identify for any of the 8 points where this is a logical conclusion from things presented and discussed in the paper. Moreover, these 8 points are quite substantial outstanding questions which speaks against the title of the paper promising the reader an approach to model consequences of heat waves. It seems to me that the authors should </w:t>
+      </w:r>
+      <w:proofErr w:type="gramStart"/>
+      <w:r>
+        <w:t>consider,</w:t>
+      </w:r>
+      <w:proofErr w:type="gramEnd"/>
+      <w:r>
+        <w:t xml:space="preserve"> whether they actually </w:t>
+      </w:r>
+      <w:proofErr w:type="gramStart"/>
+      <w:r>
+        <w:t>believe</w:t>
+      </w:r>
+      <w:commentRangeStart w:id="18"/>
+      <w:r>
+        <w:t>s</w:t>
+      </w:r>
+      <w:proofErr w:type="gramEnd"/>
+      <w:r>
+        <w:t xml:space="preserve"> they can present a model approach, and if so, then present the approach with clear documentation and figures that present the different elements and how they are linked</w:t>
+      </w:r>
+      <w:commentRangeEnd w:id="18"/>
       <w:r>
         <w:rPr>
           <w:rStyle w:val="CommentReference"/>
         </w:rPr>
-        <w:commentReference w:id="16"/>
-      </w:r>
-      <w:r>
-        <w:t xml:space="preserve">. Or, if such an approach is more wishful thinking and not achievable at the moment, then present an open review or "directions" paper on what we know and what we need in order to get there with clear identification of the elements we stand on and the steps of progress we should take. This should also include a better integration with ecological science to identify </w:t>
-      </w:r>
-      <w:commentRangeStart w:id="17"/>
+        <w:commentReference w:id="18"/>
+      </w:r>
+      <w:r>
+        <w:t xml:space="preserve">. Or, if such an approach is more wishful thinking and not achievable </w:t>
+      </w:r>
+      <w:proofErr w:type="gramStart"/>
+      <w:r>
+        <w:t>at the moment</w:t>
+      </w:r>
+      <w:proofErr w:type="gramEnd"/>
+      <w:r>
+        <w:t xml:space="preserve">, then present an open review or "directions" paper on what we know and what we need </w:t>
+      </w:r>
+      <w:proofErr w:type="gramStart"/>
+      <w:r>
+        <w:t>in order to</w:t>
+      </w:r>
+      <w:proofErr w:type="gramEnd"/>
+      <w:r>
+        <w:t xml:space="preserve"> get there with clear identification of the elements we stand on and the steps of progress we should take. This should also include a better integration with ecological science to identify </w:t>
+      </w:r>
+      <w:commentRangeStart w:id="19"/>
       <w:r>
         <w:t>where we need more fundamental understanding that modelling alone cannot provide</w:t>
       </w:r>
-      <w:commentRangeEnd w:id="17"/>
+      <w:commentRangeEnd w:id="19"/>
       <w:r>
         <w:rPr>
           <w:rStyle w:val="CommentReference"/>
         </w:rPr>
-        <w:commentReference w:id="17"/>
+        <w:commentReference w:id="19"/>
       </w:r>
       <w:r>
         <w:t>.</w:t>
@@ -3588,7 +4249,7 @@
 
 <file path=word/comments.xml><?xml version="1.0" encoding="utf-8"?>
 <w:comments xmlns:wpc="http://schemas.microsoft.com/office/word/2010/wordprocessingCanvas" xmlns:cx="http://schemas.microsoft.com/office/drawing/2014/chartex" xmlns:cx1="http://schemas.microsoft.com/office/drawing/2015/9/8/chartex" xmlns:cx2="http://schemas.microsoft.com/office/drawing/2015/10/21/chartex" xmlns:cx3="http://schemas.microsoft.com/office/drawing/2016/5/9/chartex" xmlns:cx4="http://schemas.microsoft.com/office/drawing/2016/5/10/chartex" xmlns:cx5="http://schemas.microsoft.com/office/drawing/2016/5/11/chartex" xmlns:cx6="http://schemas.microsoft.com/office/drawing/2016/5/12/chartex" xmlns:cx7="http://schemas.microsoft.com/office/drawing/2016/5/13/chartex" xmlns:cx8="http://schemas.microsoft.com/office/drawing/2016/5/14/chartex" xmlns:mc="http://schemas.openxmlformats.org/markup-compatibility/2006" xmlns:aink="http://schemas.microsoft.com/office/drawing/2016/ink" xmlns:am3d="http://schemas.microsoft.com/office/drawing/2017/model3d" xmlns:o="urn:schemas-microsoft-com:office:office" xmlns:oel="http://schemas.microsoft.com/office/2019/extlst" xmlns:r="http://schemas.openxmlformats.org/officeDocument/2006/relationships" xmlns:m="http://schemas.openxmlformats.org/officeDocument/2006/math" xmlns:v="urn:schemas-microsoft-com:vml" xmlns:wp14="http://schemas.microsoft.com/office/word/2010/wordprocessingDrawing" xmlns:wp="http://schemas.openxmlformats.org/drawingml/2006/wordprocessingDrawing" xmlns:w10="urn:schemas-microsoft-com:office:word" xmlns:w="http://schemas.openxmlformats.org/wordprocessingml/2006/main" xmlns:w14="http://schemas.microsoft.com/office/word/2010/wordml" xmlns:w15="http://schemas.microsoft.com/office/word/2012/wordml" xmlns:w16cex="http://schemas.microsoft.com/office/word/2018/wordml/cex" xmlns:w16cid="http://schemas.microsoft.com/office/word/2016/wordml/cid" xmlns:w16="http://schemas.microsoft.com/office/word/2018/wordml" xmlns:w16du="http://schemas.microsoft.com/office/word/2023/wordml/word16du" xmlns:w16sdtdh="http://schemas.microsoft.com/office/word/2020/wordml/sdtdatahash" xmlns:w16sdtfl="http://schemas.microsoft.com/office/word/2024/wordml/sdtformatlock" xmlns:w16se="http://schemas.microsoft.com/office/word/2015/wordml/symex" xmlns:wpg="http://schemas.microsoft.com/office/word/2010/wordprocessingGroup" xmlns:wpi="http://schemas.microsoft.com/office/word/2010/wordprocessingInk" xmlns:wne="http://schemas.microsoft.com/office/word/2006/wordml" xmlns:wps="http://schemas.microsoft.com/office/word/2010/wordprocessingShape" mc:Ignorable="w14 w15 w16se w16cid w16 w16cex w16sdtdh w16sdtfl w16du wp14">
-  <w:comment w:id="0" w:author="Daniel Noble" w:date="2025-10-20T10:17:00Z" w:initials="DN">
+  <w:comment w:id="0" w:author="Daniel Noble" w:date="2025-10-20T15:24:00Z" w:initials="DN">
     <w:p>
       <w:pPr>
         <w:pStyle w:val="CommentText"/>
@@ -3600,43 +4261,24 @@
         <w:annotationRef/>
       </w:r>
       <w:r>
-        <w:t>Mike</w:t>
-      </w:r>
-    </w:p>
-  </w:comment>
-  <w:comment w:id="1" w:author="Daniel Noble" w:date="2025-10-20T10:18:00Z" w:initials="DN">
+        <w:t>Here we highlight / review how these models can and are being put together to….</w:t>
+      </w:r>
+    </w:p>
     <w:p>
       <w:pPr>
         <w:pStyle w:val="CommentText"/>
       </w:pPr>
-      <w:r>
-        <w:rPr>
-          <w:rStyle w:val="CommentReference"/>
-        </w:rPr>
-        <w:annotationRef/>
-      </w:r>
-      <w:r>
-        <w:t xml:space="preserve">Do this. </w:t>
-      </w:r>
-    </w:p>
-  </w:comment>
-  <w:comment w:id="2" w:author="Daniel Noble" w:date="2025-10-20T10:20:00Z" w:initials="DN">
+    </w:p>
     <w:p>
       <w:pPr>
         <w:pStyle w:val="CommentText"/>
       </w:pPr>
       <w:r>
-        <w:rPr>
-          <w:rStyle w:val="CommentReference"/>
-        </w:rPr>
-        <w:annotationRef/>
-      </w:r>
-      <w:r>
-        <w:t>Move Multi species examples in main text box for details and then discuss more in text</w:t>
+        <w:t xml:space="preserve">Make less Opinion more like review. </w:t>
       </w:r>
     </w:p>
   </w:comment>
-  <w:comment w:id="3" w:author="Daniel Noble" w:date="2025-10-20T10:20:00Z" w:initials="DN">
+  <w:comment w:id="1" w:author="Daniel Noble" w:date="2025-10-20T10:17:00Z" w:initials="DN">
     <w:p>
       <w:pPr>
         <w:pStyle w:val="CommentText"/>
@@ -3648,109 +4290,46 @@
         <w:annotationRef/>
       </w:r>
       <w:r>
-        <w:t xml:space="preserve">Mike </w:t>
-      </w:r>
-    </w:p>
-  </w:comment>
-  <w:comment w:id="4" w:author="Daniel Noble" w:date="2025-10-20T10:29:00Z" w:initials="DN">
+        <w:t>Mike</w:t>
+      </w:r>
+    </w:p>
     <w:p>
       <w:pPr>
         <w:pStyle w:val="CommentText"/>
       </w:pPr>
-      <w:r>
-        <w:rPr>
-          <w:rStyle w:val="CommentReference"/>
-        </w:rPr>
-        <w:annotationRef/>
-      </w:r>
-      <w:r>
-        <w:t>To do.</w:t>
-      </w:r>
-    </w:p>
-  </w:comment>
-  <w:comment w:id="5" w:author="Daniel Noble" w:date="2025-10-20T10:36:00Z" w:initials="DN">
+    </w:p>
     <w:p>
       <w:pPr>
         <w:pStyle w:val="CommentText"/>
       </w:pPr>
       <w:r>
-        <w:rPr>
-          <w:rStyle w:val="CommentReference"/>
-        </w:rPr>
-        <w:annotationRef/>
-      </w:r>
-      <w:r>
-        <w:t>Agree. Remove</w:t>
-      </w:r>
-    </w:p>
-  </w:comment>
-  <w:comment w:id="6" w:author="Daniel Noble" w:date="2025-10-20T10:37:00Z" w:initials="DN">
+        <w:t xml:space="preserve">Depends on what processes are important. </w:t>
+      </w:r>
+    </w:p>
     <w:p>
       <w:pPr>
         <w:pStyle w:val="CommentText"/>
       </w:pPr>
-      <w:r>
-        <w:rPr>
-          <w:rStyle w:val="CommentReference"/>
-        </w:rPr>
-        <w:annotationRef/>
-      </w:r>
-      <w:r>
-        <w:t>Mike &amp; Dan. Add in more details on behaviour</w:t>
-      </w:r>
-    </w:p>
-  </w:comment>
-  <w:comment w:id="7" w:author="Daniel Noble" w:date="2025-10-20T10:37:00Z" w:initials="DN">
+    </w:p>
     <w:p>
       <w:pPr>
         <w:pStyle w:val="CommentText"/>
       </w:pPr>
       <w:r>
-        <w:rPr>
-          <w:rStyle w:val="CommentReference"/>
-        </w:rPr>
-        <w:annotationRef/>
-      </w:r>
-      <w:r>
-        <w:t xml:space="preserve">Cut down, but maybe work into the example TLS </w:t>
-      </w:r>
-      <w:r>
-        <w:t>build-up</w:t>
-      </w:r>
-      <w:r>
-        <w:t xml:space="preserve"> and state that extreme heat is captured through the TLS framework and can have important implications at later periods in an organisms life cycle even if it’s not made a dramatic impact at one point in time. </w:t>
-      </w:r>
-    </w:p>
-  </w:comment>
-  <w:comment w:id="8" w:author="Daniel Noble" w:date="2025-10-20T10:38:00Z" w:initials="DN">
+        <w:t>Generic coupling of models. Not under negotiation</w:t>
+      </w:r>
+    </w:p>
     <w:p>
       <w:pPr>
         <w:pStyle w:val="CommentText"/>
       </w:pPr>
-      <w:r>
-        <w:rPr>
-          <w:rStyle w:val="CommentReference"/>
-        </w:rPr>
-        <w:annotationRef/>
-      </w:r>
-      <w:r>
-        <w:t xml:space="preserve">Mike. Missing data imputation and trait databases. </w:t>
-      </w:r>
-    </w:p>
-  </w:comment>
-  <w:comment w:id="9" w:author="Daniel Noble" w:date="2025-10-20T10:39:00Z" w:initials="DN">
+    </w:p>
     <w:p>
       <w:pPr>
         <w:pStyle w:val="CommentText"/>
       </w:pPr>
       <w:r>
-        <w:rPr>
-          <w:rStyle w:val="CommentReference"/>
-        </w:rPr>
-        <w:annotationRef/>
-      </w:r>
-      <w:r>
-        <w:t>Mike. I think basically that they need to be validated empirically. And this could be done by testing against existing data. Mike and Dan to discuss.</w:t>
+        <w:t xml:space="preserve">What processes are relevant and different mechanistic models including different processes. Need to be documenting the rational as per procedures of good modelling practice. For example, you may want a microclimate model with snow, but in Australia you </w:t>
       </w:r>
     </w:p>
     <w:p>
@@ -3763,11 +4342,11 @@
         <w:pStyle w:val="CommentText"/>
       </w:pPr>
       <w:r>
-        <w:t>We need to emphasise this more within the paper, concluding remarks and other sections where permitted.</w:t>
+        <w:t xml:space="preserve">Validation. Having a quantitative model gives you a prediction and validate against observation. Interplay between prediction and observation and model updating and re-evaluation. </w:t>
       </w:r>
     </w:p>
   </w:comment>
-  <w:comment w:id="10" w:author="Daniel Noble" w:date="2025-10-20T10:43:00Z" w:initials="DN">
+  <w:comment w:id="2" w:author="Daniel Noble" w:date="2025-10-20T10:18:00Z" w:initials="DN">
     <w:p>
       <w:pPr>
         <w:pStyle w:val="CommentText"/>
@@ -3779,59 +4358,32 @@
         <w:annotationRef/>
       </w:r>
       <w:r>
-        <w:t>Mike, need more detail on the calculation of rmax from DEB.</w:t>
-      </w:r>
-    </w:p>
-  </w:comment>
-  <w:comment w:id="11" w:author="Daniel Noble" w:date="2025-10-20T11:01:00Z" w:initials="DN">
+        <w:t xml:space="preserve">Do this. </w:t>
+      </w:r>
+    </w:p>
     <w:p>
       <w:pPr>
         <w:pStyle w:val="CommentText"/>
       </w:pPr>
-      <w:r>
-        <w:rPr>
-          <w:rStyle w:val="CommentReference"/>
-        </w:rPr>
-        <w:annotationRef/>
-      </w:r>
-      <w:r>
-        <w:t>? This is captured in dose response models…not sure what they mean specifically here by non-linear aspects. Aspects of what specifically?</w:t>
-      </w:r>
-    </w:p>
-  </w:comment>
-  <w:comment w:id="12" w:author="Daniel Noble" w:date="2025-10-20T11:02:00Z" w:initials="DN">
+    </w:p>
     <w:p>
       <w:pPr>
         <w:pStyle w:val="CommentText"/>
       </w:pPr>
-      <w:r>
-        <w:rPr>
-          <w:rStyle w:val="CommentReference"/>
-        </w:rPr>
-        <w:annotationRef/>
-      </w:r>
-      <w:r>
-        <w:t xml:space="preserve">OK, maybe bring these elements OUT of the box and into the main text. Keep boxes for demonstrating the modelling. </w:t>
-      </w:r>
-    </w:p>
-  </w:comment>
-  <w:comment w:id="13" w:author="Daniel Noble" w:date="2025-10-20T11:03:00Z" w:initials="DN">
+    </w:p>
     <w:p>
       <w:pPr>
         <w:pStyle w:val="CommentText"/>
       </w:pPr>
       <w:r>
-        <w:rPr>
-          <w:rStyle w:val="CommentReference"/>
-        </w:rPr>
-        <w:annotationRef/>
-      </w:r>
-      <w:r>
-        <w:t>This is the whole point of the solutions example….Mike, maybe any ideas on how we can do that?</w:t>
+        <w:t xml:space="preserve">Code to reproduce the examples in the paper that links how the models were combined found at: </w:t>
+      </w:r>
+      <w:r>
+        <w:t>https://daniel1noble.github.io/thermal_tol_interactions</w:t>
       </w:r>
     </w:p>
   </w:comment>
-  <w:comment w:id="14" w:author="Daniel Noble" w:date="2025-10-20T11:04:00Z" w:initials="DN">
+  <w:comment w:id="3" w:author="Daniel Noble" w:date="2025-10-20T10:20:00Z" w:initials="DN">
     <w:p>
       <w:pPr>
         <w:pStyle w:val="CommentText"/>
@@ -3843,11 +4395,11 @@
         <w:annotationRef/>
       </w:r>
       <w:r>
-        <w:t>Margie will deal with,.</w:t>
+        <w:t>Move Multi species examples in main text box for details and then discuss more in text</w:t>
       </w:r>
     </w:p>
   </w:comment>
-  <w:comment w:id="15" w:author="Daniel Noble" w:date="2025-10-20T11:05:00Z" w:initials="DN">
+  <w:comment w:id="4" w:author="Daniel Noble" w:date="2025-10-20T10:20:00Z" w:initials="DN">
     <w:p>
       <w:pPr>
         <w:pStyle w:val="CommentText"/>
@@ -3859,11 +4411,11 @@
         <w:annotationRef/>
       </w:r>
       <w:r>
-        <w:t>Remove SES stuff. Include elements within conclusing remarks. Save a box</w:t>
+        <w:t xml:space="preserve">Mike </w:t>
       </w:r>
     </w:p>
   </w:comment>
-  <w:comment w:id="16" w:author="Daniel Noble" w:date="2025-10-20T11:07:00Z" w:initials="DN">
+  <w:comment w:id="5" w:author="Daniel Noble" w:date="2025-10-20T10:29:00Z" w:initials="DN">
     <w:p>
       <w:pPr>
         <w:pStyle w:val="CommentText"/>
@@ -3875,11 +4427,310 @@
         <w:annotationRef/>
       </w:r>
       <w:r>
+        <w:t>To do.</w:t>
+      </w:r>
+    </w:p>
+  </w:comment>
+  <w:comment w:id="6" w:author="Daniel Noble" w:date="2025-10-20T10:36:00Z" w:initials="DN">
+    <w:p>
+      <w:pPr>
+        <w:pStyle w:val="CommentText"/>
+      </w:pPr>
+      <w:r>
+        <w:rPr>
+          <w:rStyle w:val="CommentReference"/>
+        </w:rPr>
+        <w:annotationRef/>
+      </w:r>
+      <w:r>
+        <w:t>Agree. Remove</w:t>
+      </w:r>
+    </w:p>
+  </w:comment>
+  <w:comment w:id="7" w:author="Daniel Noble" w:date="2025-10-20T10:37:00Z" w:initials="DN">
+    <w:p>
+      <w:pPr>
+        <w:pStyle w:val="CommentText"/>
+      </w:pPr>
+      <w:r>
+        <w:rPr>
+          <w:rStyle w:val="CommentReference"/>
+        </w:rPr>
+        <w:annotationRef/>
+      </w:r>
+      <w:r>
+        <w:t>Mike &amp; Dan. Add in more details on behaviour</w:t>
+      </w:r>
+    </w:p>
+  </w:comment>
+  <w:comment w:id="8" w:author="Daniel Noble" w:date="2025-10-20T10:37:00Z" w:initials="DN">
+    <w:p>
+      <w:pPr>
+        <w:pStyle w:val="CommentText"/>
+      </w:pPr>
+      <w:r>
+        <w:rPr>
+          <w:rStyle w:val="CommentReference"/>
+        </w:rPr>
+        <w:annotationRef/>
+      </w:r>
+      <w:r>
+        <w:t xml:space="preserve">Cut </w:t>
+      </w:r>
+      <w:proofErr w:type="gramStart"/>
+      <w:r>
+        <w:t>down, but</w:t>
+      </w:r>
+      <w:proofErr w:type="gramEnd"/>
+      <w:r>
+        <w:t xml:space="preserve"> maybe work into the example TLS </w:t>
+      </w:r>
+      <w:r>
+        <w:t>build-up</w:t>
+      </w:r>
+      <w:r>
+        <w:t xml:space="preserve"> and state that extreme heat is captured through the TLS framework and can have important implications at later periods in an </w:t>
+      </w:r>
+      <w:proofErr w:type="gramStart"/>
+      <w:r>
+        <w:t>organisms</w:t>
+      </w:r>
+      <w:proofErr w:type="gramEnd"/>
+      <w:r>
+        <w:t xml:space="preserve"> life cycle even if it’s not made a dramatic impact at one point in time. </w:t>
+      </w:r>
+    </w:p>
+  </w:comment>
+  <w:comment w:id="9" w:author="Daniel Noble" w:date="2025-10-20T10:38:00Z" w:initials="DN">
+    <w:p>
+      <w:pPr>
+        <w:pStyle w:val="CommentText"/>
+      </w:pPr>
+      <w:r>
+        <w:rPr>
+          <w:rStyle w:val="CommentReference"/>
+        </w:rPr>
+        <w:annotationRef/>
+      </w:r>
+      <w:r>
+        <w:t xml:space="preserve">Mike. Missing data imputation and trait databases. </w:t>
+      </w:r>
+    </w:p>
+  </w:comment>
+  <w:comment w:id="10" w:author="Daniel Noble" w:date="2025-10-20T10:39:00Z" w:initials="DN">
+    <w:p>
+      <w:pPr>
+        <w:pStyle w:val="CommentText"/>
+      </w:pPr>
+      <w:r>
+        <w:rPr>
+          <w:rStyle w:val="CommentReference"/>
+        </w:rPr>
+        <w:annotationRef/>
+      </w:r>
+      <w:r>
+        <w:t>Mike. I think basically that they need to be validated empirically. And this could be done by testing against existing data. Mike and Dan to discuss.</w:t>
+      </w:r>
+    </w:p>
+    <w:p>
+      <w:pPr>
+        <w:pStyle w:val="CommentText"/>
+      </w:pPr>
+    </w:p>
+    <w:p>
+      <w:pPr>
+        <w:pStyle w:val="CommentText"/>
+      </w:pPr>
+      <w:r>
+        <w:t>We need to emphasise this more within the paper, concluding remarks and other sections where permitted.</w:t>
+      </w:r>
+    </w:p>
+  </w:comment>
+  <w:comment w:id="11" w:author="Daniel Noble" w:date="2025-10-20T10:43:00Z" w:initials="DN">
+    <w:p>
+      <w:pPr>
+        <w:pStyle w:val="CommentText"/>
+      </w:pPr>
+      <w:r>
+        <w:rPr>
+          <w:rStyle w:val="CommentReference"/>
+        </w:rPr>
+        <w:annotationRef/>
+      </w:r>
+      <w:r>
+        <w:t xml:space="preserve">Mike, need more detail on the calculation of </w:t>
+      </w:r>
+      <w:proofErr w:type="spellStart"/>
+      <w:r>
+        <w:t>rmax</w:t>
+      </w:r>
+      <w:proofErr w:type="spellEnd"/>
+      <w:r>
+        <w:t xml:space="preserve"> from DEB.</w:t>
+      </w:r>
+    </w:p>
+  </w:comment>
+  <w:comment w:id="12" w:author="Daniel Noble" w:date="2025-10-20T15:17:00Z" w:initials="DN">
+    <w:p>
+      <w:pPr>
+        <w:pStyle w:val="CommentText"/>
+      </w:pPr>
+      <w:r>
+        <w:rPr>
+          <w:rStyle w:val="CommentReference"/>
+        </w:rPr>
+        <w:annotationRef/>
+      </w:r>
+      <w:r>
+        <w:t>Validation. Having a quantitative model gives you a prediction and validate against observation. Interplay between prediction and observation and model updating and re-evaluation.</w:t>
+      </w:r>
+    </w:p>
+    <w:p>
+      <w:pPr>
+        <w:pStyle w:val="CommentText"/>
+      </w:pPr>
+    </w:p>
+    <w:p>
+      <w:pPr>
+        <w:pStyle w:val="CommentText"/>
+      </w:pPr>
+      <w:r>
+        <w:t>Because this approach is going explicitly from individual to population responses it allows us to see how realistic predictions are at the individual to population level. But you</w:t>
+      </w:r>
+      <w:r>
+        <w:t xml:space="preserve"> </w:t>
+      </w:r>
+      <w:r>
+        <w:t xml:space="preserve">can move down into sub-processes to </w:t>
+      </w:r>
+      <w:proofErr w:type="gramStart"/>
+      <w:r>
+        <w:t>see  you</w:t>
+      </w:r>
+      <w:proofErr w:type="gramEnd"/>
+      <w:r>
+        <w:t xml:space="preserve"> can validate subprocesses and then identify where the missing processes / understanding is…</w:t>
+      </w:r>
+    </w:p>
+  </w:comment>
+  <w:comment w:id="13" w:author="Daniel Noble" w:date="2025-10-20T11:01:00Z" w:initials="DN">
+    <w:p>
+      <w:pPr>
+        <w:pStyle w:val="CommentText"/>
+      </w:pPr>
+      <w:r>
+        <w:rPr>
+          <w:rStyle w:val="CommentReference"/>
+        </w:rPr>
+        <w:annotationRef/>
+      </w:r>
+      <w:r>
+        <w:t>? This is captured in dose response models…not sure what they mean specifically here by non-linear aspects. Aspects of what specifically?</w:t>
+      </w:r>
+    </w:p>
+  </w:comment>
+  <w:comment w:id="14" w:author="Daniel Noble" w:date="2025-10-20T11:02:00Z" w:initials="DN">
+    <w:p>
+      <w:pPr>
+        <w:pStyle w:val="CommentText"/>
+      </w:pPr>
+      <w:r>
+        <w:rPr>
+          <w:rStyle w:val="CommentReference"/>
+        </w:rPr>
+        <w:annotationRef/>
+      </w:r>
+      <w:r>
+        <w:t xml:space="preserve">OK, maybe bring these elements OUT of the box and into the main text. Keep boxes for demonstrating the modelling. </w:t>
+      </w:r>
+    </w:p>
+  </w:comment>
+  <w:comment w:id="15" w:author="Daniel Noble" w:date="2025-10-20T11:03:00Z" w:initials="DN">
+    <w:p>
+      <w:pPr>
+        <w:pStyle w:val="CommentText"/>
+      </w:pPr>
+      <w:r>
+        <w:rPr>
+          <w:rStyle w:val="CommentReference"/>
+        </w:rPr>
+        <w:annotationRef/>
+      </w:r>
+      <w:r>
+        <w:t>This is the whole point of the solutions example</w:t>
+      </w:r>
+      <w:proofErr w:type="gramStart"/>
+      <w:r>
+        <w:t>….Mike</w:t>
+      </w:r>
+      <w:proofErr w:type="gramEnd"/>
+      <w:r>
+        <w:t>, maybe any ideas on how we can do that?</w:t>
+      </w:r>
+    </w:p>
+  </w:comment>
+  <w:comment w:id="16" w:author="Daniel Noble" w:date="2025-10-20T11:04:00Z" w:initials="DN">
+    <w:p>
+      <w:pPr>
+        <w:pStyle w:val="CommentText"/>
+      </w:pPr>
+      <w:r>
+        <w:rPr>
+          <w:rStyle w:val="CommentReference"/>
+        </w:rPr>
+        <w:annotationRef/>
+      </w:r>
+      <w:r>
+        <w:t xml:space="preserve">Margie will deal </w:t>
+      </w:r>
+      <w:proofErr w:type="gramStart"/>
+      <w:r>
+        <w:t>with,.</w:t>
+      </w:r>
+      <w:proofErr w:type="gramEnd"/>
+    </w:p>
+  </w:comment>
+  <w:comment w:id="17" w:author="Daniel Noble" w:date="2025-10-20T11:05:00Z" w:initials="DN">
+    <w:p>
+      <w:pPr>
+        <w:pStyle w:val="CommentText"/>
+      </w:pPr>
+      <w:r>
+        <w:rPr>
+          <w:rStyle w:val="CommentReference"/>
+        </w:rPr>
+        <w:annotationRef/>
+      </w:r>
+      <w:r>
+        <w:t xml:space="preserve">Remove SES stuff. Include elements within </w:t>
+      </w:r>
+      <w:proofErr w:type="spellStart"/>
+      <w:r>
+        <w:t>conclusing</w:t>
+      </w:r>
+      <w:proofErr w:type="spellEnd"/>
+      <w:r>
+        <w:t xml:space="preserve"> remarks. Save a box</w:t>
+      </w:r>
+    </w:p>
+  </w:comment>
+  <w:comment w:id="18" w:author="Daniel Noble" w:date="2025-10-20T11:07:00Z" w:initials="DN">
+    <w:p>
+      <w:pPr>
+        <w:pStyle w:val="CommentText"/>
+      </w:pPr>
+      <w:r>
+        <w:rPr>
+          <w:rStyle w:val="CommentReference"/>
+        </w:rPr>
+        <w:annotationRef/>
+      </w:r>
+      <w:r>
         <w:t>OK, move supp into amin MS.</w:t>
       </w:r>
     </w:p>
   </w:comment>
-  <w:comment w:id="17" w:author="Daniel Noble" w:date="2025-10-20T11:08:00Z" w:initials="DN">
+  <w:comment w:id="19" w:author="Daniel Noble" w:date="2025-10-20T11:08:00Z" w:initials="DN">
     <w:p>
       <w:pPr>
         <w:pStyle w:val="CommentText"/>
@@ -3900,6 +4751,7 @@
 
 <file path=word/commentsExtended.xml><?xml version="1.0" encoding="utf-8"?>
 <w15:commentsEx xmlns:wpc="http://schemas.microsoft.com/office/word/2010/wordprocessingCanvas" xmlns:cx="http://schemas.microsoft.com/office/drawing/2014/chartex" xmlns:cx1="http://schemas.microsoft.com/office/drawing/2015/9/8/chartex" xmlns:cx2="http://schemas.microsoft.com/office/drawing/2015/10/21/chartex" xmlns:cx3="http://schemas.microsoft.com/office/drawing/2016/5/9/chartex" xmlns:cx4="http://schemas.microsoft.com/office/drawing/2016/5/10/chartex" xmlns:cx5="http://schemas.microsoft.com/office/drawing/2016/5/11/chartex" xmlns:cx6="http://schemas.microsoft.com/office/drawing/2016/5/12/chartex" xmlns:cx7="http://schemas.microsoft.com/office/drawing/2016/5/13/chartex" xmlns:cx8="http://schemas.microsoft.com/office/drawing/2016/5/14/chartex" xmlns:mc="http://schemas.openxmlformats.org/markup-compatibility/2006" xmlns:aink="http://schemas.microsoft.com/office/drawing/2016/ink" xmlns:am3d="http://schemas.microsoft.com/office/drawing/2017/model3d" xmlns:o="urn:schemas-microsoft-com:office:office" xmlns:oel="http://schemas.microsoft.com/office/2019/extlst" xmlns:r="http://schemas.openxmlformats.org/officeDocument/2006/relationships" xmlns:m="http://schemas.openxmlformats.org/officeDocument/2006/math" xmlns:v="urn:schemas-microsoft-com:vml" xmlns:wp14="http://schemas.microsoft.com/office/word/2010/wordprocessingDrawing" xmlns:wp="http://schemas.openxmlformats.org/drawingml/2006/wordprocessingDrawing" xmlns:w10="urn:schemas-microsoft-com:office:word" xmlns:w="http://schemas.openxmlformats.org/wordprocessingml/2006/main" xmlns:w14="http://schemas.microsoft.com/office/word/2010/wordml" xmlns:w15="http://schemas.microsoft.com/office/word/2012/wordml" xmlns:w16cex="http://schemas.microsoft.com/office/word/2018/wordml/cex" xmlns:w16cid="http://schemas.microsoft.com/office/word/2016/wordml/cid" xmlns:w16="http://schemas.microsoft.com/office/word/2018/wordml" xmlns:w16du="http://schemas.microsoft.com/office/word/2023/wordml/word16du" xmlns:w16sdtdh="http://schemas.microsoft.com/office/word/2020/wordml/sdtdatahash" xmlns:w16sdtfl="http://schemas.microsoft.com/office/word/2024/wordml/sdtformatlock" xmlns:w16se="http://schemas.microsoft.com/office/word/2015/wordml/symex" xmlns:wpg="http://schemas.microsoft.com/office/word/2010/wordprocessingGroup" xmlns:wpi="http://schemas.microsoft.com/office/word/2010/wordprocessingInk" xmlns:wne="http://schemas.microsoft.com/office/word/2006/wordml" xmlns:wps="http://schemas.microsoft.com/office/word/2010/wordprocessingShape" mc:Ignorable="w14 w15 w16se w16cid w16 w16cex w16sdtdh w16sdtfl w16du wp14">
+  <w15:commentEx w15:paraId="17EB1CD9" w15:done="0"/>
   <w15:commentEx w15:paraId="4BA4628D" w15:done="0"/>
   <w15:commentEx w15:paraId="48C896F0" w15:done="0"/>
   <w15:commentEx w15:paraId="273F8D91" w15:done="0"/>
@@ -3911,6 +4763,7 @@
   <w15:commentEx w15:paraId="615A123E" w15:done="0"/>
   <w15:commentEx w15:paraId="59A5E275" w15:done="0"/>
   <w15:commentEx w15:paraId="304C6C7E" w15:done="0"/>
+  <w15:commentEx w15:paraId="6AF3F337" w15:done="0"/>
   <w15:commentEx w15:paraId="39892B8A" w15:done="0"/>
   <w15:commentEx w15:paraId="249458DB" w15:done="0"/>
   <w15:commentEx w15:paraId="1FDF9DC0" w15:done="0"/>
@@ -3923,6 +4776,7 @@
 
 <file path=word/commentsExtensible.xml><?xml version="1.0" encoding="utf-8"?>
 <w16cex:commentsExtensible xmlns:wpc="http://schemas.microsoft.com/office/word/2010/wordprocessingCanvas" xmlns:cx="http://schemas.microsoft.com/office/drawing/2014/chartex" xmlns:cx1="http://schemas.microsoft.com/office/drawing/2015/9/8/chartex" xmlns:cx2="http://schemas.microsoft.com/office/drawing/2015/10/21/chartex" xmlns:cx3="http://schemas.microsoft.com/office/drawing/2016/5/9/chartex" xmlns:cx4="http://schemas.microsoft.com/office/drawing/2016/5/10/chartex" xmlns:cx5="http://schemas.microsoft.com/office/drawing/2016/5/11/chartex" xmlns:cx6="http://schemas.microsoft.com/office/drawing/2016/5/12/chartex" xmlns:cx7="http://schemas.microsoft.com/office/drawing/2016/5/13/chartex" xmlns:cx8="http://schemas.microsoft.com/office/drawing/2016/5/14/chartex" xmlns:cr="http://schemas.microsoft.com/office/comments/2020/reactions" xmlns:mc="http://schemas.openxmlformats.org/markup-compatibility/2006" xmlns:aink="http://schemas.microsoft.com/office/drawing/2016/ink" xmlns:am3d="http://schemas.microsoft.com/office/drawing/2017/model3d" xmlns:o="urn:schemas-microsoft-com:office:office" xmlns:oel="http://schemas.microsoft.com/office/2019/extlst" xmlns:r="http://schemas.openxmlformats.org/officeDocument/2006/relationships" xmlns:m="http://schemas.openxmlformats.org/officeDocument/2006/math" xmlns:v="urn:schemas-microsoft-com:vml" xmlns:wp14="http://schemas.microsoft.com/office/word/2010/wordprocessingDrawing" xmlns:wp="http://schemas.openxmlformats.org/drawingml/2006/wordprocessingDrawing" xmlns:w10="urn:schemas-microsoft-com:office:word" xmlns:w="http://schemas.openxmlformats.org/wordprocessingml/2006/main" xmlns:w14="http://schemas.microsoft.com/office/word/2010/wordml" xmlns:w15="http://schemas.microsoft.com/office/word/2012/wordml" xmlns:w16cex="http://schemas.microsoft.com/office/word/2018/wordml/cex" xmlns:w16cid="http://schemas.microsoft.com/office/word/2016/wordml/cid" xmlns:w16="http://schemas.microsoft.com/office/word/2018/wordml" xmlns:w16du="http://schemas.microsoft.com/office/word/2023/wordml/word16du" xmlns:w16sdtdh="http://schemas.microsoft.com/office/word/2020/wordml/sdtdatahash" xmlns:w16sdtfl="http://schemas.microsoft.com/office/word/2024/wordml/sdtformatlock" xmlns:w16se="http://schemas.microsoft.com/office/word/2015/wordml/symex" xmlns:wpg="http://schemas.microsoft.com/office/word/2010/wordprocessingGroup" xmlns:wpi="http://schemas.microsoft.com/office/word/2010/wordprocessingInk" xmlns:wne="http://schemas.microsoft.com/office/word/2006/wordml" xmlns:wps="http://schemas.microsoft.com/office/word/2010/wordprocessingShape" mc:Ignorable="w14 w15 w16se w16cid w16 w16cex w16sdtdh w16sdtfl cr w16du wp14">
+  <w16cex:commentExtensible w16cex:durableId="42781915" w16cex:dateUtc="2025-10-20T04:24:00Z"/>
   <w16cex:commentExtensible w16cex:durableId="5F1C5BE9" w16cex:dateUtc="2025-10-19T23:17:00Z"/>
   <w16cex:commentExtensible w16cex:durableId="58F63500" w16cex:dateUtc="2025-10-19T23:18:00Z"/>
   <w16cex:commentExtensible w16cex:durableId="75FA94DC" w16cex:dateUtc="2025-10-19T23:20:00Z"/>
@@ -3934,6 +4788,7 @@
   <w16cex:commentExtensible w16cex:durableId="43B238E3" w16cex:dateUtc="2025-10-19T23:38:00Z"/>
   <w16cex:commentExtensible w16cex:durableId="10AD8143" w16cex:dateUtc="2025-10-19T23:39:00Z"/>
   <w16cex:commentExtensible w16cex:durableId="097B4156" w16cex:dateUtc="2025-10-19T23:43:00Z"/>
+  <w16cex:commentExtensible w16cex:durableId="303D7EF9" w16cex:dateUtc="2025-10-20T04:17:00Z"/>
   <w16cex:commentExtensible w16cex:durableId="246EE31D" w16cex:dateUtc="2025-10-20T00:01:00Z"/>
   <w16cex:commentExtensible w16cex:durableId="56029101" w16cex:dateUtc="2025-10-20T00:02:00Z"/>
   <w16cex:commentExtensible w16cex:durableId="36A17A7D" w16cex:dateUtc="2025-10-20T00:03:00Z"/>
@@ -3946,6 +4801,7 @@
 
 <file path=word/commentsIds.xml><?xml version="1.0" encoding="utf-8"?>
 <w16cid:commentsIds xmlns:wpc="http://schemas.microsoft.com/office/word/2010/wordprocessingCanvas" xmlns:cx="http://schemas.microsoft.com/office/drawing/2014/chartex" xmlns:cx1="http://schemas.microsoft.com/office/drawing/2015/9/8/chartex" xmlns:cx2="http://schemas.microsoft.com/office/drawing/2015/10/21/chartex" xmlns:cx3="http://schemas.microsoft.com/office/drawing/2016/5/9/chartex" xmlns:cx4="http://schemas.microsoft.com/office/drawing/2016/5/10/chartex" xmlns:cx5="http://schemas.microsoft.com/office/drawing/2016/5/11/chartex" xmlns:cx6="http://schemas.microsoft.com/office/drawing/2016/5/12/chartex" xmlns:cx7="http://schemas.microsoft.com/office/drawing/2016/5/13/chartex" xmlns:cx8="http://schemas.microsoft.com/office/drawing/2016/5/14/chartex" xmlns:mc="http://schemas.openxmlformats.org/markup-compatibility/2006" xmlns:aink="http://schemas.microsoft.com/office/drawing/2016/ink" xmlns:am3d="http://schemas.microsoft.com/office/drawing/2017/model3d" xmlns:o="urn:schemas-microsoft-com:office:office" xmlns:oel="http://schemas.microsoft.com/office/2019/extlst" xmlns:r="http://schemas.openxmlformats.org/officeDocument/2006/relationships" xmlns:m="http://schemas.openxmlformats.org/officeDocument/2006/math" xmlns:v="urn:schemas-microsoft-com:vml" xmlns:wp14="http://schemas.microsoft.com/office/word/2010/wordprocessingDrawing" xmlns:wp="http://schemas.openxmlformats.org/drawingml/2006/wordprocessingDrawing" xmlns:w10="urn:schemas-microsoft-com:office:word" xmlns:w="http://schemas.openxmlformats.org/wordprocessingml/2006/main" xmlns:w14="http://schemas.microsoft.com/office/word/2010/wordml" xmlns:w15="http://schemas.microsoft.com/office/word/2012/wordml" xmlns:w16cex="http://schemas.microsoft.com/office/word/2018/wordml/cex" xmlns:w16cid="http://schemas.microsoft.com/office/word/2016/wordml/cid" xmlns:w16="http://schemas.microsoft.com/office/word/2018/wordml" xmlns:w16du="http://schemas.microsoft.com/office/word/2023/wordml/word16du" xmlns:w16sdtdh="http://schemas.microsoft.com/office/word/2020/wordml/sdtdatahash" xmlns:w16sdtfl="http://schemas.microsoft.com/office/word/2024/wordml/sdtformatlock" xmlns:w16se="http://schemas.microsoft.com/office/word/2015/wordml/symex" xmlns:wpg="http://schemas.microsoft.com/office/word/2010/wordprocessingGroup" xmlns:wpi="http://schemas.microsoft.com/office/word/2010/wordprocessingInk" xmlns:wne="http://schemas.microsoft.com/office/word/2006/wordml" xmlns:wps="http://schemas.microsoft.com/office/word/2010/wordprocessingShape" mc:Ignorable="w14 w15 w16se w16cid w16 w16cex w16sdtdh w16sdtfl w16du wp14">
+  <w16cid:commentId w16cid:paraId="17EB1CD9" w16cid:durableId="42781915"/>
   <w16cid:commentId w16cid:paraId="4BA4628D" w16cid:durableId="5F1C5BE9"/>
   <w16cid:commentId w16cid:paraId="48C896F0" w16cid:durableId="58F63500"/>
   <w16cid:commentId w16cid:paraId="273F8D91" w16cid:durableId="75FA94DC"/>
@@ -3957,6 +4813,7 @@
   <w16cid:commentId w16cid:paraId="615A123E" w16cid:durableId="43B238E3"/>
   <w16cid:commentId w16cid:paraId="59A5E275" w16cid:durableId="10AD8143"/>
   <w16cid:commentId w16cid:paraId="304C6C7E" w16cid:durableId="097B4156"/>
+  <w16cid:commentId w16cid:paraId="6AF3F337" w16cid:durableId="303D7EF9"/>
   <w16cid:commentId w16cid:paraId="39892B8A" w16cid:durableId="246EE31D"/>
   <w16cid:commentId w16cid:paraId="249458DB" w16cid:durableId="56029101"/>
   <w16cid:commentId w16cid:paraId="1FDF9DC0" w16cid:durableId="36A17A7D"/>

</xml_diff>

<commit_message>
Nearly done all responses and adjusting main MS
</commit_message>
<xml_diff>
--- a/docs/Revision1/Response_to_Reviewers.docx
+++ b/docs/Revision1/Response_to_Reviewers.docx
@@ -273,8 +273,21 @@
           <w:bCs/>
         </w:rPr>
       </w:pPr>
-      <w:r>
-        <w:t>Editorally, I have a number of points I need you to address:</w:t>
+      <w:proofErr w:type="spellStart"/>
+      <w:r>
+        <w:t>Editorally</w:t>
+      </w:r>
+      <w:proofErr w:type="spellEnd"/>
+      <w:r>
+        <w:t xml:space="preserve">, I have </w:t>
+      </w:r>
+      <w:proofErr w:type="gramStart"/>
+      <w:r>
+        <w:t>a number of</w:t>
+      </w:r>
+      <w:proofErr w:type="gramEnd"/>
+      <w:r>
+        <w:t xml:space="preserve"> points I need you to address:</w:t>
       </w:r>
       <w:r>
         <w:br/>
@@ -439,7 +452,21 @@
         <w:rPr>
           <w:color w:val="215E99" w:themeColor="text2" w:themeTint="BF"/>
         </w:rPr>
-        <w:t xml:space="preserve"> Model choice is difficulty to advise on specifically because it will depend on what processes a researcher and modeller deem important for a given system. As such, we have keep this advice a little more general and referred to other reviews on this topic.</w:t>
+        <w:t xml:space="preserve"> Model choice is difficulty to advise on specifically because it will depend on what processes a researcher and modeller deem important for a given system. As such, we have </w:t>
+      </w:r>
+      <w:proofErr w:type="gramStart"/>
+      <w:r>
+        <w:rPr>
+          <w:color w:val="215E99" w:themeColor="text2" w:themeTint="BF"/>
+        </w:rPr>
+        <w:t>keep</w:t>
+      </w:r>
+      <w:proofErr w:type="gramEnd"/>
+      <w:r>
+        <w:rPr>
+          <w:color w:val="215E99" w:themeColor="text2" w:themeTint="BF"/>
+        </w:rPr>
+        <w:t xml:space="preserve"> this advice a little more general and referred to other reviews on this topic.</w:t>
       </w:r>
     </w:p>
     <w:p>
@@ -471,7 +498,15 @@
         <w:t xml:space="preserve"> </w:t>
       </w:r>
       <w:r>
-        <w:t>(3) The Supplementary Information is to go. I appreciate that you have put a lot of work into it but it is too extensive for a TREE article. You have essentially an additional paper in there. Either the information is important enough that it is brought into the text as a Box or it isn't important. Very few readers will access it (we have download figures).</w:t>
+        <w:t xml:space="preserve">(3) The Supplementary Information is to go. I appreciate that you have put a lot of work into </w:t>
+      </w:r>
+      <w:proofErr w:type="gramStart"/>
+      <w:r>
+        <w:t>it</w:t>
+      </w:r>
+      <w:proofErr w:type="gramEnd"/>
+      <w:r>
+        <w:t xml:space="preserve"> but it is too extensive for a TREE article. You have essentially an additional paper in there. Either the information is important enough that it is brought into the text as a Box or it isn't important. Very few readers will access it (we have download figures).</w:t>
       </w:r>
     </w:p>
     <w:p/>
@@ -500,7 +535,21 @@
         <w:rPr>
           <w:color w:val="215E99" w:themeColor="text2" w:themeTint="BF"/>
         </w:rPr>
-        <w:t xml:space="preserve"> More specifically, creating a new Box 1 and Box 2 which work together to demonstrate how a multi-species systems-modelling approach can be achieved. We’ve simply referred to the code to reproduce the examples in the paper now, which we believe is important for transparency and reproducibility.</w:t>
+        <w:t xml:space="preserve"> More specifically, creating a new </w:t>
+      </w:r>
+      <w:proofErr w:type="gramStart"/>
+      <w:r>
+        <w:rPr>
+          <w:color w:val="215E99" w:themeColor="text2" w:themeTint="BF"/>
+        </w:rPr>
+        <w:t>Box</w:t>
+      </w:r>
+      <w:proofErr w:type="gramEnd"/>
+      <w:r>
+        <w:rPr>
+          <w:color w:val="215E99" w:themeColor="text2" w:themeTint="BF"/>
+        </w:rPr>
+        <w:t xml:space="preserve"> 1 and Box 2 which work together to demonstrate how a multi-species systems-modelling approach can be achieved. We’ve simply referred to the code to reproduce the examples in the paper now, which we believe is important for transparency and reproducibility.</w:t>
       </w:r>
     </w:p>
     <w:p>
@@ -592,6 +641,7 @@
     </w:p>
     <w:p/>
     <w:p>
+      <w:commentRangeStart w:id="1"/>
       <w:r>
         <w:rPr>
           <w:b/>
@@ -605,6 +655,19 @@
           <w:color w:val="215E99" w:themeColor="text2" w:themeTint="BF"/>
         </w:rPr>
         <w:t>:</w:t>
+      </w:r>
+      <w:r>
+        <w:rPr>
+          <w:color w:val="215E99" w:themeColor="text2" w:themeTint="BF"/>
+        </w:rPr>
+        <w:t xml:space="preserve"> We agree. We have now re-written the highlights. </w:t>
+      </w:r>
+      <w:commentRangeEnd w:id="1"/>
+      <w:r>
+        <w:rPr>
+          <w:rStyle w:val="CommentReference"/>
+        </w:rPr>
+        <w:commentReference w:id="1"/>
       </w:r>
     </w:p>
     <w:p/>
@@ -647,7 +710,25 @@
           <w:bCs/>
           <w:u w:val="single"/>
         </w:rPr>
-        <w:t>Major (non-typographical) comments must also be included in your response to reviewers document</w:t>
+        <w:t xml:space="preserve">Major (non-typographical) comments must also be included in your response to </w:t>
+      </w:r>
+      <w:proofErr w:type="gramStart"/>
+      <w:r>
+        <w:rPr>
+          <w:b/>
+          <w:bCs/>
+          <w:u w:val="single"/>
+        </w:rPr>
+        <w:t>reviewers</w:t>
+      </w:r>
+      <w:proofErr w:type="gramEnd"/>
+      <w:r>
+        <w:rPr>
+          <w:b/>
+          <w:bCs/>
+          <w:u w:val="single"/>
+        </w:rPr>
+        <w:t xml:space="preserve"> document</w:t>
       </w:r>
       <w:r>
         <w:t>.  To access this, please log into the Trends in Ecology and Evolution submission system at </w:t>
@@ -830,7 +911,7 @@
         </w:rPr>
         <w:t xml:space="preserve"> </w:t>
       </w:r>
-      <w:commentRangeStart w:id="1"/>
+      <w:commentRangeStart w:id="2"/>
       <w:r>
         <w:rPr>
           <w:highlight w:val="yellow"/>
@@ -849,15 +930,23 @@
       <w:r>
         <w:t xml:space="preserve"> </w:t>
       </w:r>
-      <w:commentRangeEnd w:id="1"/>
+      <w:commentRangeEnd w:id="2"/>
       <w:r>
         <w:rPr>
           <w:rStyle w:val="CommentReference"/>
         </w:rPr>
-        <w:commentReference w:id="1"/>
-      </w:r>
-      <w:r>
-        <w:t>There is a growing literature on Good Modeling Practice and guidance on model documentation, development, validation, etc. that would be helpful to briefly describe and cite. These issues become even more important when the models will be used for real-world decision-making (often by non-modelers), rather than as research tools.</w:t>
+        <w:commentReference w:id="2"/>
+      </w:r>
+      <w:r>
+        <w:t xml:space="preserve">There is a growing literature on Good </w:t>
+      </w:r>
+      <w:proofErr w:type="spellStart"/>
+      <w:r>
+        <w:t>Modeling</w:t>
+      </w:r>
+      <w:proofErr w:type="spellEnd"/>
+      <w:r>
+        <w:t xml:space="preserve"> Practice and guidance on model documentation, development, validation, etc. that would be helpful to briefly describe and cite. These issues become even more important when the models will be used for real-world decision-making (often by non-modelers), rather than as research tools.</w:t>
       </w:r>
     </w:p>
     <w:p/>
@@ -1033,17 +1122,45 @@
         <w:rPr>
           <w:highlight w:val="yellow"/>
         </w:rPr>
-        <w:t>mixed feelings about putting all of the case studies in the SI</w:t>
+        <w:t xml:space="preserve">mixed feelings about putting </w:t>
+      </w:r>
+      <w:proofErr w:type="gramStart"/>
+      <w:r>
+        <w:rPr>
+          <w:highlight w:val="yellow"/>
+        </w:rPr>
+        <w:t>all of</w:t>
+      </w:r>
+      <w:proofErr w:type="gramEnd"/>
+      <w:r>
+        <w:rPr>
+          <w:highlight w:val="yellow"/>
+        </w:rPr>
+        <w:t xml:space="preserve"> the case studies in the SI</w:t>
       </w:r>
       <w:r>
         <w:t xml:space="preserve">, which many people will not read. </w:t>
       </w:r>
-      <w:commentRangeStart w:id="2"/>
+      <w:commentRangeStart w:id="3"/>
       <w:r>
         <w:rPr>
           <w:highlight w:val="yellow"/>
         </w:rPr>
-        <w:t xml:space="preserve">Including the case studies makes the proposed approach much more concrete and compelling. It may be worth considering either including a brief summary of one of the case studies in the main body of the manuscript as "proof of </w:t>
+        <w:t xml:space="preserve">Including the case studies makes the proposed approach much more concrete and compelling. It may be worth considering either including </w:t>
+      </w:r>
+      <w:proofErr w:type="gramStart"/>
+      <w:r>
+        <w:rPr>
+          <w:highlight w:val="yellow"/>
+        </w:rPr>
+        <w:t>a brief summary</w:t>
+      </w:r>
+      <w:proofErr w:type="gramEnd"/>
+      <w:r>
+        <w:rPr>
+          <w:highlight w:val="yellow"/>
+        </w:rPr>
+        <w:t xml:space="preserve"> of one of the case studies in the main body of the manuscript as "proof of </w:t>
       </w:r>
       <w:r>
         <w:rPr>
@@ -1055,12 +1172,12 @@
       <w:r>
         <w:t>, referring to the SI for the rest</w:t>
       </w:r>
-      <w:commentRangeEnd w:id="2"/>
+      <w:commentRangeEnd w:id="3"/>
       <w:r>
         <w:rPr>
           <w:rStyle w:val="CommentReference"/>
         </w:rPr>
-        <w:commentReference w:id="2"/>
+        <w:commentReference w:id="3"/>
       </w:r>
       <w:r>
         <w:t>. Alternatively, the case studies could potentially be published as a companion paper to the conceptual manuscript to give them more visibility and demonstrate how the proposed model integration would work in practice.</w:t>
@@ -1100,7 +1217,7 @@
         </w:rPr>
         <w:t xml:space="preserve">We agree. While we lack space to include all the examples, and already have the solutions example in the main MS, we </w:t>
       </w:r>
-      <w:commentRangeStart w:id="3"/>
+      <w:commentRangeStart w:id="4"/>
       <w:r>
         <w:rPr>
           <w:color w:val="215E99" w:themeColor="text2" w:themeTint="BF"/>
@@ -1173,12 +1290,12 @@
         </w:rPr>
         <w:t xml:space="preserve"> </w:t>
       </w:r>
-      <w:commentRangeEnd w:id="3"/>
+      <w:commentRangeEnd w:id="4"/>
       <w:r>
         <w:rPr>
           <w:rStyle w:val="CommentReference"/>
         </w:rPr>
-        <w:commentReference w:id="3"/>
+        <w:commentReference w:id="4"/>
       </w:r>
       <w:r>
         <w:rPr>
@@ -1280,7 +1397,15 @@
         <w:t xml:space="preserve"> </w:t>
       </w:r>
       <w:r>
-        <w:t>Figure 1, L 15 of caption: "novel integration of existing models in this novel way"; probably don't need both of these novels.</w:t>
+        <w:t xml:space="preserve">Figure 1, L 15 of caption: "novel integration of existing models in this novel way"; probably don't need </w:t>
+      </w:r>
+      <w:proofErr w:type="gramStart"/>
+      <w:r>
+        <w:t>both of these</w:t>
+      </w:r>
+      <w:proofErr w:type="gramEnd"/>
+      <w:r>
+        <w:t xml:space="preserve"> novels.</w:t>
       </w:r>
     </w:p>
     <w:p/>
@@ -1496,16 +1621,16 @@
       <w:r>
         <w:t>L 232 - 233: "</w:t>
       </w:r>
-      <w:commentRangeStart w:id="4"/>
+      <w:commentRangeStart w:id="5"/>
       <w:r>
         <w:t xml:space="preserve">DEB models integrate many processes in a parameter-sparse manner" - With this I must disagree. DEB has 18 parameters, and many of them do not reflect properties that one </w:t>
       </w:r>
-      <w:commentRangeEnd w:id="4"/>
+      <w:commentRangeEnd w:id="5"/>
       <w:r>
         <w:rPr>
           <w:rStyle w:val="CommentReference"/>
         </w:rPr>
-        <w:commentReference w:id="4"/>
+        <w:commentReference w:id="5"/>
       </w:r>
       <w:r>
         <w:t>can measure in actual organisms. This is one of the disadvantages of DEB.</w:t>
@@ -1570,7 +1695,15 @@
         <w:t xml:space="preserve"> </w:t>
       </w:r>
       <w:r>
-        <w:t>L 234 - 236: Although it is possible to estimate parameters without data, the jury is still out as to how robust such estimated parameters actually are.</w:t>
+        <w:t xml:space="preserve">L 234 - 236: Although it is possible to estimate parameters without data, the jury is still out as to how robust such estimated parameters </w:t>
+      </w:r>
+      <w:proofErr w:type="gramStart"/>
+      <w:r>
+        <w:t>actually are</w:t>
+      </w:r>
+      <w:proofErr w:type="gramEnd"/>
+      <w:r>
+        <w:t>.</w:t>
       </w:r>
     </w:p>
     <w:p/>
@@ -1661,7 +1794,14 @@
         <w:rPr>
           <w:color w:val="215E99" w:themeColor="text2" w:themeTint="BF"/>
         </w:rPr>
-        <w:t>hylogenetically driven imputation approaches have been developed (e.g., Pottier et al. 2025; Buu</w:t>
+        <w:t xml:space="preserve">hylogenetically driven imputation approaches have been developed (e.g., Pottier et al. 2025; </w:t>
+      </w:r>
+      <w:proofErr w:type="spellStart"/>
+      <w:r>
+        <w:rPr>
+          <w:color w:val="215E99" w:themeColor="text2" w:themeTint="BF"/>
+        </w:rPr>
+        <w:t>Buu</w:t>
       </w:r>
       <w:r>
         <w:rPr>
@@ -1673,7 +1813,14 @@
         <w:rPr>
           <w:color w:val="215E99" w:themeColor="text2" w:themeTint="BF"/>
         </w:rPr>
-        <w:t>gern et al. 2006</w:t>
+        <w:t>gern</w:t>
+      </w:r>
+      <w:proofErr w:type="spellEnd"/>
+      <w:r>
+        <w:rPr>
+          <w:color w:val="215E99" w:themeColor="text2" w:themeTint="BF"/>
+        </w:rPr>
+        <w:t xml:space="preserve"> et al. 2006</w:t>
       </w:r>
       <w:r>
         <w:rPr>
@@ -1772,7 +1919,15 @@
         <w:t xml:space="preserve"> </w:t>
       </w:r>
       <w:r>
-        <w:t>L 276: Suggest to delete "ecological".</w:t>
+        <w:t xml:space="preserve">L 276: Suggest </w:t>
+      </w:r>
+      <w:proofErr w:type="gramStart"/>
+      <w:r>
+        <w:t>to delete</w:t>
+      </w:r>
+      <w:proofErr w:type="gramEnd"/>
+      <w:r>
+        <w:t xml:space="preserve"> "ecological".</w:t>
       </w:r>
     </w:p>
     <w:p/>
@@ -1903,7 +2058,39 @@
         <w:t xml:space="preserve"> </w:t>
       </w:r>
       <w:r>
-        <w:t xml:space="preserve">This is an ambitious review offering an integrated fusion of several relatively new approaches including mechanistic microclimate modeling, biophysical modeling, dynamic energy budgeting, and population/community modeling. Either of these approaches could serve as the basis of their own review, but I appreciate this endeavor to create a blueprint for future efforts in combining these approaches to predict the consequences of extreme heat waves at the individual level and propagate these impacts to entire populations and ecosystems. </w:t>
+        <w:t xml:space="preserve">This is an ambitious review offering an integrated fusion of several relatively new approaches including mechanistic microclimate </w:t>
+      </w:r>
+      <w:proofErr w:type="spellStart"/>
+      <w:r>
+        <w:t>modeling</w:t>
+      </w:r>
+      <w:proofErr w:type="spellEnd"/>
+      <w:r>
+        <w:t xml:space="preserve">, biophysical </w:t>
+      </w:r>
+      <w:proofErr w:type="spellStart"/>
+      <w:r>
+        <w:t>modeling</w:t>
+      </w:r>
+      <w:proofErr w:type="spellEnd"/>
+      <w:r>
+        <w:t xml:space="preserve">, dynamic energy budgeting, and population/community </w:t>
+      </w:r>
+      <w:proofErr w:type="spellStart"/>
+      <w:r>
+        <w:t>modeling</w:t>
+      </w:r>
+      <w:proofErr w:type="spellEnd"/>
+      <w:r>
+        <w:t xml:space="preserve">. Either of these approaches could serve as the basis of their own review, but I appreciate this </w:t>
+      </w:r>
+      <w:proofErr w:type="spellStart"/>
+      <w:r>
+        <w:t>endeavor</w:t>
+      </w:r>
+      <w:proofErr w:type="spellEnd"/>
+      <w:r>
+        <w:t xml:space="preserve"> to create a blueprint for future efforts in combining these approaches to predict the consequences of extreme heat waves at the individual level and propagate these impacts to entire populations and ecosystems. </w:t>
       </w:r>
       <w:r>
         <w:rPr>
@@ -1937,7 +2124,19 @@
         <w:rPr>
           <w:color w:val="215E99" w:themeColor="text2" w:themeTint="BF"/>
         </w:rPr>
-        <w:t xml:space="preserve"> Thank you. We are very happy to hear the reviewer found our approach and the supplement useful and helpful. In accordance with Reviewer 1 and the Editor, we have removed the supplement, but we have brought in one of the very important examples of a three-species system to the main text which we think makes it clearer how a system modelling approach can work. We have referred to the code in the acknowledgements for those interested. </w:t>
+        <w:t xml:space="preserve"> Thank you. We are very happy to hear the reviewer found our approach and the supplement useful and helpful. In accordance with Reviewer 1 and the Editor, we have removed the supplement, but we have brought in one of the very important examples of a three-species system to the main text which we think makes it clearer how a system modelling approach can work. We have referred to the code in the </w:t>
+      </w:r>
+      <w:r>
+        <w:rPr>
+          <w:color w:val="215E99" w:themeColor="text2" w:themeTint="BF"/>
+        </w:rPr>
+        <w:t>paper</w:t>
+      </w:r>
+      <w:r>
+        <w:rPr>
+          <w:color w:val="215E99" w:themeColor="text2" w:themeTint="BF"/>
+        </w:rPr>
+        <w:t xml:space="preserve"> for those interested. </w:t>
       </w:r>
     </w:p>
     <w:p>
@@ -1974,9 +2173,17 @@
         <w:t xml:space="preserve"> </w:t>
       </w:r>
       <w:r>
-        <w:t>Although it was interesting, I felt like the section on the "current state of extreme weather modeling" (L02-L21), could be sacrificed</w:t>
-      </w:r>
-      <w:commentRangeStart w:id="5"/>
+        <w:t xml:space="preserve">Although it was interesting, I felt like the section on the "current state of extreme weather </w:t>
+      </w:r>
+      <w:proofErr w:type="spellStart"/>
+      <w:r>
+        <w:t>modeling</w:t>
+      </w:r>
+      <w:proofErr w:type="spellEnd"/>
+      <w:r>
+        <w:t>" (L02-L21), could be sacrificed</w:t>
+      </w:r>
+      <w:commentRangeStart w:id="6"/>
       <w:r>
         <w:t xml:space="preserve">. There is so much to unpack with </w:t>
       </w:r>
@@ -1989,15 +2196,39 @@
       <w:r>
         <w:t xml:space="preserve"> I think this could be </w:t>
       </w:r>
-      <w:commentRangeEnd w:id="5"/>
+      <w:commentRangeEnd w:id="6"/>
       <w:r>
         <w:rPr>
           <w:rStyle w:val="CommentReference"/>
         </w:rPr>
-        <w:commentReference w:id="5"/>
-      </w:r>
-      <w:r>
-        <w:t xml:space="preserve">more simply a quick justification and review of mechanistic microclimate modeling. Other reviews already discuss mechanistic microclimate modeling (e.g., microclim, etc.), and I think it can be a more succinct review of the general approach and how it can be used to capture extreme temperature conditions at the organismal level. </w:t>
+        <w:commentReference w:id="6"/>
+      </w:r>
+      <w:r>
+        <w:t xml:space="preserve">more simply a quick justification and review of mechanistic microclimate </w:t>
+      </w:r>
+      <w:proofErr w:type="spellStart"/>
+      <w:r>
+        <w:t>modeling</w:t>
+      </w:r>
+      <w:proofErr w:type="spellEnd"/>
+      <w:r>
+        <w:t xml:space="preserve">. Other reviews already discuss mechanistic microclimate </w:t>
+      </w:r>
+      <w:proofErr w:type="spellStart"/>
+      <w:r>
+        <w:t>modeling</w:t>
+      </w:r>
+      <w:proofErr w:type="spellEnd"/>
+      <w:r>
+        <w:t xml:space="preserve"> (e.g., </w:t>
+      </w:r>
+      <w:proofErr w:type="spellStart"/>
+      <w:r>
+        <w:t>microclim</w:t>
+      </w:r>
+      <w:proofErr w:type="spellEnd"/>
+      <w:r>
+        <w:t xml:space="preserve">, etc.), and I think it can be a more succinct review of the general approach and how it can be used to capture extreme temperature conditions at the organismal level. </w:t>
       </w:r>
     </w:p>
     <w:p/>
@@ -2056,7 +2287,7 @@
       <w:r>
         <w:t xml:space="preserve">By reducing the overview of GCMs and LSMs, there could be additional </w:t>
       </w:r>
-      <w:commentRangeStart w:id="6"/>
+      <w:commentRangeStart w:id="7"/>
       <w:r>
         <w:t xml:space="preserve">room for addressing other aspects of this approach that are more relevant. </w:t>
       </w:r>
@@ -2066,18 +2297,32 @@
         </w:rPr>
         <w:t xml:space="preserve">For example, there </w:t>
       </w:r>
-      <w:commentRangeEnd w:id="6"/>
+      <w:commentRangeEnd w:id="7"/>
       <w:r>
         <w:rPr>
           <w:rStyle w:val="CommentReference"/>
         </w:rPr>
-        <w:commentReference w:id="6"/>
+        <w:commentReference w:id="7"/>
       </w:r>
       <w:r>
         <w:rPr>
           <w:highlight w:val="yellow"/>
         </w:rPr>
-        <w:t>is very little on behavioral decision making and habitat selection, both of which are critical adaptive responses for species</w:t>
+        <w:t xml:space="preserve">is very little on </w:t>
+      </w:r>
+      <w:proofErr w:type="spellStart"/>
+      <w:r>
+        <w:rPr>
+          <w:highlight w:val="yellow"/>
+        </w:rPr>
+        <w:t>behavioral</w:t>
+      </w:r>
+      <w:proofErr w:type="spellEnd"/>
+      <w:r>
+        <w:rPr>
+          <w:highlight w:val="yellow"/>
+        </w:rPr>
+        <w:t xml:space="preserve"> decision making and habitat selection, both of which are critical adaptive responses for species</w:t>
       </w:r>
       <w:r>
         <w:t xml:space="preserve">. </w:t>
@@ -2086,7 +2331,49 @@
         <w:rPr>
           <w:highlight w:val="yellow"/>
         </w:rPr>
-        <w:t>Indeed, this is one of the more powerful capabilities of NicheMapper as is shown in the supplemental material (e.g., time spent foraging, nocturnal behavior, etc.), but receives scant attention in the review.</w:t>
+        <w:t xml:space="preserve">Indeed, this is one of the more powerful capabilities of </w:t>
+      </w:r>
+      <w:proofErr w:type="spellStart"/>
+      <w:r>
+        <w:rPr>
+          <w:highlight w:val="yellow"/>
+        </w:rPr>
+        <w:t>NicheMapper</w:t>
+      </w:r>
+      <w:proofErr w:type="spellEnd"/>
+      <w:r>
+        <w:rPr>
+          <w:highlight w:val="yellow"/>
+        </w:rPr>
+        <w:t xml:space="preserve"> as is shown in the supplemental material (e.g., time spent foraging, nocturnal </w:t>
+      </w:r>
+      <w:proofErr w:type="spellStart"/>
+      <w:r>
+        <w:rPr>
+          <w:highlight w:val="yellow"/>
+        </w:rPr>
+        <w:t>behavior</w:t>
+      </w:r>
+      <w:proofErr w:type="spellEnd"/>
+      <w:r>
+        <w:rPr>
+          <w:highlight w:val="yellow"/>
+        </w:rPr>
+        <w:t>, etc.</w:t>
+      </w:r>
+      <w:proofErr w:type="gramStart"/>
+      <w:r>
+        <w:rPr>
+          <w:highlight w:val="yellow"/>
+        </w:rPr>
+        <w:t>), but</w:t>
+      </w:r>
+      <w:proofErr w:type="gramEnd"/>
+      <w:r>
+        <w:rPr>
+          <w:highlight w:val="yellow"/>
+        </w:rPr>
+        <w:t xml:space="preserve"> receives scant attention in the review.</w:t>
       </w:r>
       <w:r>
         <w:t xml:space="preserve"> </w:t>
@@ -2157,19 +2444,33 @@
         </w:rPr>
         <w:t xml:space="preserve">Similarly, there is a fair amount of space devoted to thermal </w:t>
       </w:r>
-      <w:commentRangeStart w:id="7"/>
+      <w:commentRangeStart w:id="8"/>
       <w:r>
         <w:rPr>
           <w:highlight w:val="yellow"/>
         </w:rPr>
-        <w:t xml:space="preserve">load sensivitiy but </w:t>
-      </w:r>
-      <w:commentRangeEnd w:id="7"/>
+        <w:t xml:space="preserve">load </w:t>
+      </w:r>
+      <w:proofErr w:type="spellStart"/>
+      <w:r>
+        <w:rPr>
+          <w:highlight w:val="yellow"/>
+        </w:rPr>
+        <w:t>sensivitiy</w:t>
+      </w:r>
+      <w:proofErr w:type="spellEnd"/>
+      <w:r>
+        <w:rPr>
+          <w:highlight w:val="yellow"/>
+        </w:rPr>
+        <w:t xml:space="preserve"> but </w:t>
+      </w:r>
+      <w:commentRangeEnd w:id="8"/>
       <w:r>
         <w:rPr>
           <w:rStyle w:val="CommentReference"/>
         </w:rPr>
-        <w:commentReference w:id="7"/>
+        <w:commentReference w:id="8"/>
       </w:r>
       <w:r>
         <w:rPr>
@@ -2275,7 +2576,47 @@
         <w:t xml:space="preserve"> </w:t>
       </w:r>
       <w:r>
-        <w:t xml:space="preserve">The biophysical modeling component, as illustrated in the supplementary material, requires a significant amount of parameterization (e.g., solar absorptivities, emmissivities, leaf orientation) as does the microclimate modeling (e.g., percent shade, etc.). I appreciate this is a general criticism (or advantage) of mechanistic modeling, but </w:t>
+        <w:t xml:space="preserve">The biophysical </w:t>
+      </w:r>
+      <w:proofErr w:type="spellStart"/>
+      <w:r>
+        <w:t>modeling</w:t>
+      </w:r>
+      <w:proofErr w:type="spellEnd"/>
+      <w:r>
+        <w:t xml:space="preserve"> component, as illustrated in the supplementary material, requires a significant amount of parameterization (e.g., solar </w:t>
+      </w:r>
+      <w:proofErr w:type="spellStart"/>
+      <w:r>
+        <w:t>absorptivities</w:t>
+      </w:r>
+      <w:proofErr w:type="spellEnd"/>
+      <w:r>
+        <w:t xml:space="preserve">, </w:t>
+      </w:r>
+      <w:proofErr w:type="spellStart"/>
+      <w:r>
+        <w:t>emmissivities</w:t>
+      </w:r>
+      <w:proofErr w:type="spellEnd"/>
+      <w:r>
+        <w:t xml:space="preserve">, leaf orientation) as does the microclimate </w:t>
+      </w:r>
+      <w:proofErr w:type="spellStart"/>
+      <w:r>
+        <w:t>modeling</w:t>
+      </w:r>
+      <w:proofErr w:type="spellEnd"/>
+      <w:r>
+        <w:t xml:space="preserve"> (e.g., percent shade, etc.). I appreciate this is a general criticism (or advantage) of mechanistic </w:t>
+      </w:r>
+      <w:proofErr w:type="spellStart"/>
+      <w:r>
+        <w:t>modeling</w:t>
+      </w:r>
+      <w:proofErr w:type="spellEnd"/>
+      <w:r>
+        <w:t xml:space="preserve">, but </w:t>
       </w:r>
       <w:r>
         <w:rPr>
@@ -2283,19 +2624,19 @@
         </w:rPr>
         <w:t xml:space="preserve">it left me </w:t>
       </w:r>
-      <w:commentRangeStart w:id="8"/>
+      <w:commentRangeStart w:id="9"/>
       <w:r>
         <w:rPr>
           <w:highlight w:val="yellow"/>
         </w:rPr>
         <w:t xml:space="preserve">wondering what types of recommendations you would offer to researchers and conservation </w:t>
       </w:r>
-      <w:commentRangeEnd w:id="8"/>
+      <w:commentRangeEnd w:id="9"/>
       <w:r>
         <w:rPr>
           <w:rStyle w:val="CommentReference"/>
         </w:rPr>
-        <w:commentReference w:id="8"/>
+        <w:commentReference w:id="9"/>
       </w:r>
       <w:r>
         <w:rPr>
@@ -2334,7 +2675,35 @@
           <w:color w:val="215E99" w:themeColor="text2" w:themeTint="BF"/>
         </w:rPr>
         <w:lastRenderedPageBreak/>
-        <w:t>depend on the question on hand and the processes one wants to model. This is somewhat challenging to provide clear recommendations on within the context of our paper. However, we have now made this point clear and also pointed to some references in various placed readers can consult to obtain a more in depth discussion on this point.</w:t>
+        <w:t xml:space="preserve">depend on the question on hand and the processes one wants to model. This is somewhat challenging to provide clear recommendations on within the context of our paper. However, we have now made this point clear </w:t>
+      </w:r>
+      <w:proofErr w:type="gramStart"/>
+      <w:r>
+        <w:rPr>
+          <w:color w:val="215E99" w:themeColor="text2" w:themeTint="BF"/>
+        </w:rPr>
+        <w:t>and also</w:t>
+      </w:r>
+      <w:proofErr w:type="gramEnd"/>
+      <w:r>
+        <w:rPr>
+          <w:color w:val="215E99" w:themeColor="text2" w:themeTint="BF"/>
+        </w:rPr>
+        <w:t xml:space="preserve"> pointed to some references in various placed readers can consult to obtain a more </w:t>
+      </w:r>
+      <w:proofErr w:type="gramStart"/>
+      <w:r>
+        <w:rPr>
+          <w:color w:val="215E99" w:themeColor="text2" w:themeTint="BF"/>
+        </w:rPr>
+        <w:t>in depth</w:t>
+      </w:r>
+      <w:proofErr w:type="gramEnd"/>
+      <w:r>
+        <w:rPr>
+          <w:color w:val="215E99" w:themeColor="text2" w:themeTint="BF"/>
+        </w:rPr>
+        <w:t xml:space="preserve"> discussion on this point.</w:t>
       </w:r>
     </w:p>
     <w:p/>
@@ -2350,18 +2719,26 @@
         <w:t xml:space="preserve">: </w:t>
       </w:r>
       <w:r>
-        <w:t xml:space="preserve">Given the real world implications of managing these systems and their associated species during periods of </w:t>
-      </w:r>
-      <w:commentRangeStart w:id="9"/>
+        <w:t xml:space="preserve">Given the </w:t>
+      </w:r>
+      <w:proofErr w:type="gramStart"/>
+      <w:r>
+        <w:t>real world</w:t>
+      </w:r>
+      <w:proofErr w:type="gramEnd"/>
+      <w:r>
+        <w:t xml:space="preserve"> implications of managing these systems and their associated species during periods of </w:t>
+      </w:r>
+      <w:commentRangeStart w:id="10"/>
       <w:r>
         <w:t xml:space="preserve">extreme conditions, how can those in authority be assured that these models are realistic? What type of data would be needed at the habitat, organismal, population, and </w:t>
       </w:r>
-      <w:commentRangeEnd w:id="9"/>
+      <w:commentRangeEnd w:id="10"/>
       <w:r>
         <w:rPr>
           <w:rStyle w:val="CommentReference"/>
         </w:rPr>
-        <w:commentReference w:id="9"/>
+        <w:commentReference w:id="10"/>
       </w:r>
       <w:r>
         <w:t>community level? What type of validation would be necessary?</w:t>
@@ -2383,6 +2760,12 @@
         </w:rPr>
         <w:t>:</w:t>
       </w:r>
+      <w:r>
+        <w:rPr>
+          <w:color w:val="215E99" w:themeColor="text2" w:themeTint="BF"/>
+        </w:rPr>
+        <w:t xml:space="preserve"> We have added a little more detail about the model selection process at various locations and some suggestions in the concluding remarks, emphasising the importance of model validation. Ultimately, we are proposing a path forward, but it’s up to each research group to validate and update the models for their purpose. It’s hard to give specific advice to this respect as it will depend on what the models are being used for.</w:t>
+      </w:r>
     </w:p>
     <w:p/>
     <w:p>
@@ -2430,7 +2813,25 @@
         <w:t xml:space="preserve"> </w:t>
       </w:r>
       <w:r>
-        <w:t>The consequences of extreme events including extreme heat and heat waves are truly critical for our future. These types of events are inherently challenging to forecast as well as hard to understand the consequences of because they are rare and because they involve non linear dose-response dynamics. From this perspective, the paper intents to provide inputs to a very important area. So, while I find the subject to be overly important and have deep sympathy for the intentions behind the paper, I am really sorry I cannot be more optimistic than my below review tells. I think the subject has great potential, but the paper is very difficult in its present form.</w:t>
+        <w:t xml:space="preserve">The consequences of extreme events including extreme heat and heat waves are truly critical for our future. These types of events are inherently challenging to forecast as well as hard to understand the consequences of because they are rare and because they involve </w:t>
+      </w:r>
+      <w:proofErr w:type="spellStart"/>
+      <w:proofErr w:type="gramStart"/>
+      <w:r>
+        <w:t>non linear</w:t>
+      </w:r>
+      <w:proofErr w:type="spellEnd"/>
+      <w:proofErr w:type="gramEnd"/>
+      <w:r>
+        <w:t xml:space="preserve"> dose-response dynamics. From this perspective, the paper intents to provide inputs to a very important area. So, while I find the subject to be overly important and have deep sympathy for the intentions behind the paper, I am </w:t>
+      </w:r>
+      <w:proofErr w:type="gramStart"/>
+      <w:r>
+        <w:t>really sorry</w:t>
+      </w:r>
+      <w:proofErr w:type="gramEnd"/>
+      <w:r>
+        <w:t xml:space="preserve"> I cannot be more optimistic than my below review tells. I think the subject has great potential, but the paper is very difficult in its present form.</w:t>
       </w:r>
       <w:r>
         <w:br/>
@@ -2471,7 +2872,61 @@
         <w:rPr>
           <w:color w:val="215E99" w:themeColor="text2" w:themeTint="BF"/>
         </w:rPr>
-        <w:t xml:space="preserve"> Sorry for the confusion. This paper is more of a Review as indicated in our response to the Editor. We have now tried to make the “approach” more concrete by including a hypothetical example from our supplement. This examples involved plants and two insect species and discussed how the modelling frameworks are interconnected within this context. </w:t>
+        <w:t xml:space="preserve"> Sorry for the confusion. This paper is more of a Review as indicated in our response to the Editor. We have now tried to make the “approach” more concrete by including a hypothetical example from our supplement. </w:t>
+      </w:r>
+      <w:r>
+        <w:rPr>
+          <w:color w:val="215E99" w:themeColor="text2" w:themeTint="BF"/>
+        </w:rPr>
+        <w:t>This example</w:t>
+      </w:r>
+      <w:r>
+        <w:rPr>
+          <w:color w:val="215E99" w:themeColor="text2" w:themeTint="BF"/>
+        </w:rPr>
+        <w:t xml:space="preserve"> involve</w:t>
+      </w:r>
+      <w:r>
+        <w:rPr>
+          <w:color w:val="215E99" w:themeColor="text2" w:themeTint="BF"/>
+        </w:rPr>
+        <w:t>s</w:t>
+      </w:r>
+      <w:r>
+        <w:rPr>
+          <w:color w:val="215E99" w:themeColor="text2" w:themeTint="BF"/>
+        </w:rPr>
+        <w:t xml:space="preserve"> plants and two insect </w:t>
+      </w:r>
+      <w:r>
+        <w:rPr>
+          <w:color w:val="215E99" w:themeColor="text2" w:themeTint="BF"/>
+        </w:rPr>
+        <w:t>species,</w:t>
+      </w:r>
+      <w:r>
+        <w:rPr>
+          <w:color w:val="215E99" w:themeColor="text2" w:themeTint="BF"/>
+        </w:rPr>
+        <w:t xml:space="preserve"> and </w:t>
+      </w:r>
+      <w:r>
+        <w:rPr>
+          <w:color w:val="215E99" w:themeColor="text2" w:themeTint="BF"/>
+        </w:rPr>
+        <w:t xml:space="preserve">we </w:t>
+      </w:r>
+      <w:r>
+        <w:rPr>
+          <w:color w:val="215E99" w:themeColor="text2" w:themeTint="BF"/>
+        </w:rPr>
+        <w:t xml:space="preserve">discuss how the modelling frameworks are interconnected within this context. </w:t>
+      </w:r>
+      <w:r>
+        <w:rPr>
+          <w:color w:val="215E99" w:themeColor="text2" w:themeTint="BF"/>
+        </w:rPr>
+        <w:t>It also should help provide a foundation for the solutions example.</w:t>
       </w:r>
     </w:p>
     <w:p>
@@ -2522,26 +2977,312 @@
         <w:rPr>
           <w:highlight w:val="red"/>
         </w:rPr>
-        <w:t>but it appears more as a range of wishes, ideas and opinions rather than an "approach", and to a large extent these wishes and ideas are not put into any overall framework guiding the discussions, but rather seems to be some arbitrarily chosen examples that end up failing to present a comprehensive and holistic framework, which I would have liked and which I believe the authors have in mind</w:t>
-      </w:r>
-      <w:r>
-        <w:t xml:space="preserve">. For example, the paper describes how our present understanding and modelling capacities makes it possible to model heat wave impacts across existing domains and disciplines, which is normally siloed. Likely, this is correct, but the cross boundary handling of the different </w:t>
+        <w:t xml:space="preserve">but it appears more as a range of wishes, ideas and opinions rather than an "approach", and to a large extent these wishes and ideas are not put into any overall framework guiding the discussions, but rather seems to be some arbitrarily chosen examples that end up failing to present a </w:t>
       </w:r>
       <w:r>
         <w:rPr>
           <w:highlight w:val="red"/>
         </w:rPr>
-        <w:t xml:space="preserve">aspects and challenges is nevertheless far from trivial, and the paper does not provide any operational ideas on how the different </w:t>
+        <w:lastRenderedPageBreak/>
+        <w:t>comprehensive and holistic framework, which I would have liked and which I believe the authors have in mind</w:t>
+      </w:r>
+      <w:r>
+        <w:t xml:space="preserve">. For example, the paper describes how our present understanding and modelling capacities makes it possible to model heat wave impacts across existing domains and disciplines, which is normally siloed. Likely, this is correct, but the </w:t>
+      </w:r>
+      <w:proofErr w:type="gramStart"/>
+      <w:r>
+        <w:t>cross boundary</w:t>
+      </w:r>
+      <w:proofErr w:type="gramEnd"/>
+      <w:r>
+        <w:t xml:space="preserve"> handling of the different </w:t>
       </w:r>
       <w:r>
         <w:rPr>
           <w:highlight w:val="red"/>
         </w:rPr>
+        <w:t>aspects and challenges is nevertheless far from trivial, and the paper does not provide any operational ideas on how the different domains can interact for a comprehensive and holistic treatment</w:t>
+      </w:r>
+      <w:r>
+        <w:t>. This is illustrated already by the 4 highlights at the very start of the paper which are correct, but also overly broad and generic and without any more specific suggestions for a way forward.</w:t>
+      </w:r>
+      <w:r>
+        <w:br/>
+      </w:r>
+    </w:p>
+    <w:p>
+      <w:r>
+        <w:rPr>
+          <w:b/>
+          <w:bCs/>
+          <w:color w:val="215E99" w:themeColor="text2" w:themeTint="BF"/>
+        </w:rPr>
+        <w:t>Response</w:t>
+      </w:r>
+      <w:r>
+        <w:rPr>
+          <w:color w:val="215E99" w:themeColor="text2" w:themeTint="BF"/>
+        </w:rPr>
+        <w:t>:</w:t>
+      </w:r>
+      <w:r>
+        <w:rPr>
+          <w:color w:val="215E99" w:themeColor="text2" w:themeTint="BF"/>
+        </w:rPr>
+        <w:t xml:space="preserve"> We do not deny a systems-based approach will be challenging. See our concluding remarks section. However, few papers attempt to bring together these models and show how they can be coupled and most only do this on a single species. Despite challenges it is becoming increasingly more feasible to do this with multi-species assemblages and our paper is a call to action for readers to start thinking about it more seriously given the predictive power coupling mechanistic models </w:t>
+      </w:r>
+      <w:r>
+        <w:rPr>
+          <w:color w:val="215E99" w:themeColor="text2" w:themeTint="BF"/>
+        </w:rPr>
+        <w:t xml:space="preserve">across species </w:t>
+      </w:r>
+      <w:r>
+        <w:rPr>
+          <w:color w:val="215E99" w:themeColor="text2" w:themeTint="BF"/>
+        </w:rPr>
+        <w:t xml:space="preserve">may provide. </w:t>
+      </w:r>
+    </w:p>
+    <w:p>
+      <w:r>
+        <w:br/>
+      </w:r>
+      <w:r>
+        <w:rPr>
+          <w:b/>
+          <w:bCs/>
+        </w:rPr>
+        <w:t>C</w:t>
+      </w:r>
+      <w:r>
+        <w:rPr>
+          <w:b/>
+          <w:bCs/>
+        </w:rPr>
+        <w:t>29</w:t>
+      </w:r>
+      <w:r>
+        <w:rPr>
+          <w:b/>
+          <w:bCs/>
+        </w:rPr>
+        <w:t>:</w:t>
+      </w:r>
+      <w:r>
+        <w:rPr>
+          <w:b/>
+          <w:bCs/>
+        </w:rPr>
+        <w:t xml:space="preserve"> </w:t>
+      </w:r>
+      <w:r>
+        <w:rPr>
+          <w:highlight w:val="yellow"/>
+        </w:rPr>
+        <w:t>The abstract sets the stage correctly - we need to integrate models across scales. However, it further claims to show how existing models can be linked, which it does not</w:t>
+      </w:r>
+      <w:r>
+        <w:t>.</w:t>
+      </w:r>
+      <w:r>
+        <w:br/>
+      </w:r>
+    </w:p>
+    <w:p>
+      <w:r>
+        <w:rPr>
+          <w:b/>
+          <w:bCs/>
+          <w:color w:val="215E99" w:themeColor="text2" w:themeTint="BF"/>
+        </w:rPr>
+        <w:t>Response</w:t>
+      </w:r>
+      <w:r>
+        <w:rPr>
+          <w:color w:val="215E99" w:themeColor="text2" w:themeTint="BF"/>
+        </w:rPr>
+        <w:t>:</w:t>
+      </w:r>
+      <w:r>
+        <w:rPr>
+          <w:color w:val="215E99" w:themeColor="text2" w:themeTint="BF"/>
+        </w:rPr>
+        <w:t xml:space="preserve"> We have re-written aspects of the paper and brought from the supplement a clearer example </w:t>
+      </w:r>
+      <w:r>
+        <w:rPr>
+          <w:color w:val="215E99" w:themeColor="text2" w:themeTint="BF"/>
+        </w:rPr>
+        <w:t>to show more clearly how the models are connected</w:t>
+      </w:r>
+      <w:r>
+        <w:rPr>
+          <w:color w:val="215E99" w:themeColor="text2" w:themeTint="BF"/>
+        </w:rPr>
+        <w:t xml:space="preserve"> and how to apply them across species</w:t>
+      </w:r>
+      <w:r>
+        <w:rPr>
+          <w:color w:val="215E99" w:themeColor="text2" w:themeTint="BF"/>
+        </w:rPr>
+        <w:t>.</w:t>
+      </w:r>
+    </w:p>
+    <w:p>
+      <w:r>
+        <w:br/>
+      </w:r>
+      <w:r>
+        <w:rPr>
+          <w:b/>
+          <w:bCs/>
+        </w:rPr>
+        <w:t>C</w:t>
+      </w:r>
+      <w:r>
+        <w:rPr>
+          <w:b/>
+          <w:bCs/>
+        </w:rPr>
+        <w:t>30</w:t>
+      </w:r>
+      <w:r>
+        <w:rPr>
+          <w:b/>
+          <w:bCs/>
+        </w:rPr>
+        <w:t>:</w:t>
+      </w:r>
+      <w:r>
+        <w:rPr>
+          <w:b/>
+          <w:bCs/>
+        </w:rPr>
+        <w:t xml:space="preserve"> </w:t>
+      </w:r>
+      <w:r>
+        <w:t xml:space="preserve">The introduction explains how the underlying causes and ramifications of observed impacts of climate variability and extremes are not fully understood (lines 45-53). This is clearly correct, but the </w:t>
+      </w:r>
+      <w:r>
+        <w:rPr>
+          <w:highlight w:val="red"/>
+        </w:rPr>
+        <w:t>paper lacks to explain how an integrated modelling approach will or can change this problem</w:t>
+      </w:r>
+      <w:r>
+        <w:t xml:space="preserve">, and to provide a clear link to the ecological understanding. There is no doubt that merging and integrating modelling approaches at different scales and domains would offer a strong potential, but this does not in itself provide the understanding we miss, but rather could serve as a strong tool for generating and testing model based hypothesis and create collaboration with and identify questions and understanding to be tested through observations and experiments. </w:t>
+      </w:r>
+      <w:r>
+        <w:rPr>
+          <w:highlight w:val="red"/>
+        </w:rPr>
+        <w:t xml:space="preserve">Part of </w:t>
+      </w:r>
+      <w:commentRangeStart w:id="11"/>
+      <w:r>
+        <w:rPr>
+          <w:highlight w:val="red"/>
+        </w:rPr>
+        <w:t>the problem is that our ecological understanding of extremes and their impacts is missing and requires more observations and experiments to provide better biological understanding. This interaction and collaboration between models and observations is completely missing</w:t>
+      </w:r>
+      <w:r>
+        <w:t>.</w:t>
+      </w:r>
+      <w:r>
+        <w:br/>
+      </w:r>
+      <w:commentRangeEnd w:id="11"/>
+      <w:r>
+        <w:rPr>
+          <w:rStyle w:val="CommentReference"/>
+        </w:rPr>
+        <w:commentReference w:id="11"/>
+      </w:r>
+    </w:p>
+    <w:p>
+      <w:r>
+        <w:rPr>
+          <w:b/>
+          <w:bCs/>
+          <w:color w:val="215E99" w:themeColor="text2" w:themeTint="BF"/>
+        </w:rPr>
+        <w:t>Response</w:t>
+      </w:r>
+      <w:r>
+        <w:rPr>
+          <w:color w:val="215E99" w:themeColor="text2" w:themeTint="BF"/>
+        </w:rPr>
+        <w:t>:</w:t>
+      </w:r>
+      <w:r>
+        <w:rPr>
+          <w:color w:val="215E99" w:themeColor="text2" w:themeTint="BF"/>
+        </w:rPr>
+        <w:t xml:space="preserve"> We have re-written large parts of the introduction and completely re-written our concluding remarks section to address this comment. We have also completely re-focused our Boxes to demonstrate a case study which should make it clearer how such an approach provides a clear link to ecologically relevant outcomes. </w:t>
+      </w:r>
+    </w:p>
+    <w:p>
+      <w:r>
+        <w:br/>
+      </w:r>
+      <w:r>
+        <w:rPr>
+          <w:b/>
+          <w:bCs/>
+        </w:rPr>
+        <w:t>C</w:t>
+      </w:r>
+      <w:r>
+        <w:rPr>
+          <w:b/>
+          <w:bCs/>
+        </w:rPr>
+        <w:t>31</w:t>
+      </w:r>
+      <w:r>
+        <w:rPr>
+          <w:b/>
+          <w:bCs/>
+        </w:rPr>
+        <w:t>:</w:t>
+      </w:r>
+      <w:r>
+        <w:rPr>
+          <w:b/>
+          <w:bCs/>
+        </w:rPr>
+        <w:t xml:space="preserve"> </w:t>
+      </w:r>
+      <w:r>
+        <w:t xml:space="preserve">I do not understand the statement in lines 54-58, and the statement in line 58-59 indicates that coupling of different model concepts does not take place today. I do not think this is correct. Several of the authors are deeply involved in different model </w:t>
+      </w:r>
+      <w:r>
         <w:lastRenderedPageBreak/>
-        <w:t>domains can interact for a comprehensive and holistic treatment</w:t>
-      </w:r>
-      <w:r>
-        <w:t>. This is illustrated already by the 4 highlights at the very start of the paper which are correct, but also overly broad and generic and without any more specific suggestions for a way forward.</w:t>
+        <w:t xml:space="preserve">concepts that to various degrees couple different domains. </w:t>
+      </w:r>
+      <w:r>
+        <w:rPr>
+          <w:highlight w:val="red"/>
+        </w:rPr>
+        <w:t xml:space="preserve">It may be that it is not good enough and there is a need for more, new or better coupling, especially when we speak about extremes and heat waves, but this </w:t>
+      </w:r>
+      <w:proofErr w:type="gramStart"/>
+      <w:r>
+        <w:rPr>
+          <w:highlight w:val="red"/>
+        </w:rPr>
+        <w:t>has to</w:t>
+      </w:r>
+      <w:proofErr w:type="gramEnd"/>
+      <w:r>
+        <w:rPr>
+          <w:highlight w:val="red"/>
+        </w:rPr>
+        <w:t xml:space="preserve"> be described much more precisely</w:t>
+      </w:r>
+      <w:r>
+        <w:t>.</w:t>
       </w:r>
       <w:r>
         <w:br/>
@@ -2562,6 +3303,12 @@
         </w:rPr>
         <w:t>:</w:t>
       </w:r>
+      <w:r>
+        <w:rPr>
+          <w:color w:val="215E99" w:themeColor="text2" w:themeTint="BF"/>
+        </w:rPr>
+        <w:t xml:space="preserve"> Sorry that this was confusing. We have re-worded both these sentences to hopefully make it clearer what we mean.</w:t>
+      </w:r>
     </w:p>
     <w:p>
       <w:r>
@@ -2579,7 +3326,7 @@
           <w:b/>
           <w:bCs/>
         </w:rPr>
-        <w:t>29</w:t>
+        <w:t>32</w:t>
       </w:r>
       <w:r>
         <w:rPr>
@@ -2596,17 +3343,479 @@
         <w:t xml:space="preserve"> </w:t>
       </w:r>
       <w:r>
-        <w:rPr>
+        <w:t>Line 60 - I cannot read from the context and the previous paragraph what "feat" refers to?</w:t>
+      </w:r>
+      <w:r>
+        <w:br/>
+      </w:r>
+    </w:p>
+    <w:p>
+      <w:pPr>
+        <w:rPr>
+          <w:color w:val="215E99" w:themeColor="text2" w:themeTint="BF"/>
+        </w:rPr>
+      </w:pPr>
+      <w:r>
+        <w:rPr>
+          <w:b/>
+          <w:bCs/>
+          <w:color w:val="215E99" w:themeColor="text2" w:themeTint="BF"/>
+        </w:rPr>
+        <w:t>Response</w:t>
+      </w:r>
+      <w:r>
+        <w:rPr>
+          <w:color w:val="215E99" w:themeColor="text2" w:themeTint="BF"/>
+        </w:rPr>
+        <w:t>:</w:t>
+      </w:r>
+      <w:r>
+        <w:rPr>
+          <w:color w:val="215E99" w:themeColor="text2" w:themeTint="BF"/>
+        </w:rPr>
+        <w:t xml:space="preserve"> We have re-written this </w:t>
+      </w:r>
+      <w:r>
+        <w:rPr>
+          <w:color w:val="215E99" w:themeColor="text2" w:themeTint="BF"/>
+        </w:rPr>
+        <w:t>section,</w:t>
+      </w:r>
+      <w:r>
+        <w:rPr>
+          <w:color w:val="215E99" w:themeColor="text2" w:themeTint="BF"/>
+        </w:rPr>
+        <w:t xml:space="preserve"> and this comment is no longer relevant.</w:t>
+      </w:r>
+    </w:p>
+    <w:p>
+      <w:r>
+        <w:br/>
+      </w:r>
+      <w:r>
+        <w:rPr>
+          <w:b/>
+          <w:bCs/>
+        </w:rPr>
+        <w:t>C</w:t>
+      </w:r>
+      <w:r>
+        <w:rPr>
+          <w:b/>
+          <w:bCs/>
+        </w:rPr>
+        <w:t>33</w:t>
+      </w:r>
+      <w:r>
+        <w:rPr>
+          <w:b/>
+          <w:bCs/>
+        </w:rPr>
+        <w:t>:</w:t>
+      </w:r>
+      <w:r>
+        <w:rPr>
+          <w:b/>
+          <w:bCs/>
+        </w:rPr>
+        <w:t xml:space="preserve"> </w:t>
+      </w:r>
+      <w:r>
+        <w:t xml:space="preserve">Line 62-66 - It is unclear what the challenge with heat waves relative to general temperature increases is and how general climate change driven temperature increases and extreme heat waves are different or connected. Much of the text and descriptions sound more like impacts of general temperature increases, but heat waves have some distinct differences. What specific challenges do you see in the understanding and the modelling, at different scales, and what are you delivering or proposing? Also, how are heat waves different from other extremes? It seems to me that a modelling approach with the characteristics the authors </w:t>
+      </w:r>
+      <w:proofErr w:type="gramStart"/>
+      <w:r>
+        <w:t>wants</w:t>
+      </w:r>
+      <w:proofErr w:type="gramEnd"/>
+      <w:r>
+        <w:t xml:space="preserve"> to present will include some basic features, solutions or principles which have common characters for extremes, yet also for the specific case having features that are specific for temperature and heat. I would expect some degree of treating the general aspects of extremes as well as the more specific heat aspects.</w:t>
+      </w:r>
+      <w:r>
+        <w:br/>
+      </w:r>
+    </w:p>
+    <w:p>
+      <w:r>
+        <w:rPr>
+          <w:b/>
+          <w:bCs/>
+          <w:color w:val="215E99" w:themeColor="text2" w:themeTint="BF"/>
+        </w:rPr>
+        <w:t>Response</w:t>
+      </w:r>
+      <w:r>
+        <w:rPr>
+          <w:color w:val="215E99" w:themeColor="text2" w:themeTint="BF"/>
+        </w:rPr>
+        <w:t>:</w:t>
+      </w:r>
+      <w:r>
+        <w:rPr>
+          <w:color w:val="215E99" w:themeColor="text2" w:themeTint="BF"/>
+        </w:rPr>
+        <w:t xml:space="preserve"> A system-based approach that uses physiologically explicit mechanistic models don’t necessarily mean they only work for extremes. They capture all environmental impacts on physiology and translate them to outcomes on the </w:t>
+      </w:r>
+      <w:proofErr w:type="gramStart"/>
+      <w:r>
+        <w:rPr>
+          <w:color w:val="215E99" w:themeColor="text2" w:themeTint="BF"/>
+        </w:rPr>
+        <w:t>life-cycle</w:t>
+      </w:r>
+      <w:proofErr w:type="gramEnd"/>
+      <w:r>
+        <w:rPr>
+          <w:color w:val="215E99" w:themeColor="text2" w:themeTint="BF"/>
+        </w:rPr>
+        <w:t xml:space="preserve">, life-history and fitness. This is the benefit of using physiological models. We have re-organised the introduction and re-worded these lines to hopefully make this </w:t>
+      </w:r>
+      <w:r>
+        <w:rPr>
+          <w:color w:val="215E99" w:themeColor="text2" w:themeTint="BF"/>
+        </w:rPr>
+        <w:t>clearer</w:t>
+      </w:r>
+      <w:r>
+        <w:rPr>
+          <w:color w:val="215E99" w:themeColor="text2" w:themeTint="BF"/>
+        </w:rPr>
+        <w:t xml:space="preserve">. </w:t>
+      </w:r>
+    </w:p>
+    <w:p>
+      <w:r>
+        <w:br/>
+      </w:r>
+      <w:r>
+        <w:rPr>
+          <w:b/>
+          <w:bCs/>
+        </w:rPr>
+        <w:t>C</w:t>
+      </w:r>
+      <w:r>
+        <w:rPr>
+          <w:b/>
+          <w:bCs/>
+        </w:rPr>
+        <w:t>34</w:t>
+      </w:r>
+      <w:r>
+        <w:rPr>
+          <w:b/>
+          <w:bCs/>
+        </w:rPr>
+        <w:t>:</w:t>
+      </w:r>
+      <w:r>
+        <w:rPr>
+          <w:b/>
+          <w:bCs/>
+        </w:rPr>
+        <w:t xml:space="preserve"> </w:t>
+      </w:r>
+      <w:r>
+        <w:t xml:space="preserve">Line 67-69 - it sounds like current modelling does not integrate detailed process modelling into community and population dimensions. I am sure there are important limitations that needs to be improved and developed, and that heat waves and other extremes provide much understudied cases, but I disagree that such integrations do not exist. Please do not simplify and </w:t>
+      </w:r>
+      <w:proofErr w:type="gramStart"/>
+      <w:r>
+        <w:t>overstate, but</w:t>
+      </w:r>
+      <w:proofErr w:type="gramEnd"/>
+      <w:r>
+        <w:t xml:space="preserve"> be precise and specific.</w:t>
+      </w:r>
+      <w:r>
+        <w:br/>
+      </w:r>
+    </w:p>
+    <w:p>
+      <w:r>
+        <w:rPr>
+          <w:b/>
+          <w:bCs/>
+          <w:color w:val="215E99" w:themeColor="text2" w:themeTint="BF"/>
+        </w:rPr>
+        <w:t>Response</w:t>
+      </w:r>
+      <w:r>
+        <w:rPr>
+          <w:color w:val="215E99" w:themeColor="text2" w:themeTint="BF"/>
+        </w:rPr>
+        <w:t>:</w:t>
+      </w:r>
+      <w:r>
+        <w:rPr>
+          <w:color w:val="215E99" w:themeColor="text2" w:themeTint="BF"/>
+        </w:rPr>
+        <w:t xml:space="preserve"> We agree that some integrations already exist (e.g., microclimates to biophysical models), however, these do not capture thermal load sensitivity and often they are only applied at the level of a single species, not a community. Without coupling these various models for a multi-species assemblage, we cannot capture complex interactions and feed backs between species (e.g., changes in microclimates, coexistence etc). We hope the addition of the new case study for </w:t>
+      </w:r>
+      <w:proofErr w:type="gramStart"/>
+      <w:r>
+        <w:rPr>
+          <w:color w:val="215E99" w:themeColor="text2" w:themeTint="BF"/>
+        </w:rPr>
+        <w:t>Box</w:t>
+      </w:r>
+      <w:proofErr w:type="gramEnd"/>
+      <w:r>
+        <w:rPr>
+          <w:color w:val="215E99" w:themeColor="text2" w:themeTint="BF"/>
+        </w:rPr>
+        <w:t xml:space="preserve"> 1 &amp; 2 help and we have re-written the introduction and various other sections to emphasise these points more. </w:t>
+      </w:r>
+    </w:p>
+    <w:p>
+      <w:r>
+        <w:br/>
+      </w:r>
+      <w:r>
+        <w:rPr>
+          <w:b/>
+          <w:bCs/>
+        </w:rPr>
+        <w:t>C</w:t>
+      </w:r>
+      <w:r>
+        <w:rPr>
+          <w:b/>
+          <w:bCs/>
+        </w:rPr>
+        <w:t>35</w:t>
+      </w:r>
+      <w:r>
+        <w:rPr>
+          <w:b/>
+          <w:bCs/>
+        </w:rPr>
+        <w:t>:</w:t>
+      </w:r>
+      <w:r>
+        <w:rPr>
+          <w:b/>
+          <w:bCs/>
+        </w:rPr>
+        <w:t xml:space="preserve"> </w:t>
+      </w:r>
+      <w:r>
+        <w:t xml:space="preserve">Line 70 - "We bring together modelling approaches ….". No, you present some </w:t>
+      </w:r>
+      <w:r>
+        <w:lastRenderedPageBreak/>
+        <w:t>loose ideas and wishes, but I do not see an approach.</w:t>
+      </w:r>
+      <w:r>
+        <w:br/>
+      </w:r>
+    </w:p>
+    <w:p>
+      <w:pPr>
+        <w:rPr>
+          <w:color w:val="215E99" w:themeColor="text2" w:themeTint="BF"/>
+        </w:rPr>
+      </w:pPr>
+      <w:r>
+        <w:rPr>
+          <w:b/>
+          <w:bCs/>
+          <w:color w:val="215E99" w:themeColor="text2" w:themeTint="BF"/>
+        </w:rPr>
+        <w:t>Response</w:t>
+      </w:r>
+      <w:r>
+        <w:rPr>
+          <w:color w:val="215E99" w:themeColor="text2" w:themeTint="BF"/>
+        </w:rPr>
+        <w:t>:</w:t>
+      </w:r>
+      <w:r>
+        <w:rPr>
+          <w:color w:val="215E99" w:themeColor="text2" w:themeTint="BF"/>
+        </w:rPr>
+        <w:t xml:space="preserve"> We have removed this </w:t>
+      </w:r>
+      <w:r>
+        <w:rPr>
+          <w:color w:val="215E99" w:themeColor="text2" w:themeTint="BF"/>
+        </w:rPr>
+        <w:t xml:space="preserve">statement, </w:t>
+      </w:r>
+      <w:r>
+        <w:rPr>
+          <w:color w:val="215E99" w:themeColor="text2" w:themeTint="BF"/>
+        </w:rPr>
+        <w:t xml:space="preserve">but we do indeed </w:t>
+      </w:r>
+      <w:r>
+        <w:rPr>
+          <w:color w:val="215E99" w:themeColor="text2" w:themeTint="BF"/>
+        </w:rPr>
+        <w:t>now showcase</w:t>
+      </w:r>
+      <w:r>
+        <w:rPr>
+          <w:color w:val="215E99" w:themeColor="text2" w:themeTint="BF"/>
+        </w:rPr>
+        <w:t xml:space="preserve"> how to do this explicitly in our boxes</w:t>
+      </w:r>
+      <w:r>
+        <w:rPr>
+          <w:color w:val="215E99" w:themeColor="text2" w:themeTint="BF"/>
+        </w:rPr>
+        <w:t>. These</w:t>
+      </w:r>
+      <w:r>
+        <w:rPr>
+          <w:color w:val="215E99" w:themeColor="text2" w:themeTint="BF"/>
+        </w:rPr>
+        <w:t xml:space="preserve"> were in the supplement in the original version but </w:t>
+      </w:r>
+      <w:r>
+        <w:rPr>
+          <w:color w:val="215E99" w:themeColor="text2" w:themeTint="BF"/>
+        </w:rPr>
+        <w:t xml:space="preserve">are </w:t>
+      </w:r>
+      <w:r>
+        <w:rPr>
+          <w:color w:val="215E99" w:themeColor="text2" w:themeTint="BF"/>
+        </w:rPr>
+        <w:t xml:space="preserve">clearly better placed in the main text. </w:t>
+      </w:r>
+      <w:r>
+        <w:rPr>
+          <w:color w:val="215E99" w:themeColor="text2" w:themeTint="BF"/>
+        </w:rPr>
+        <w:t>Thank you.</w:t>
+      </w:r>
+    </w:p>
+    <w:p>
+      <w:r>
+        <w:br/>
+      </w:r>
+      <w:r>
+        <w:rPr>
+          <w:b/>
+          <w:bCs/>
+        </w:rPr>
+        <w:t>C</w:t>
+      </w:r>
+      <w:r>
+        <w:rPr>
+          <w:b/>
+          <w:bCs/>
+        </w:rPr>
+        <w:t>36</w:t>
+      </w:r>
+      <w:r>
+        <w:rPr>
+          <w:b/>
+          <w:bCs/>
+        </w:rPr>
+        <w:t>:</w:t>
+      </w:r>
+      <w:r>
+        <w:rPr>
+          <w:b/>
+          <w:bCs/>
+        </w:rPr>
+        <w:t xml:space="preserve"> </w:t>
+      </w:r>
+      <w:r>
+        <w:t xml:space="preserve">Line 89-92 - I think there is a confusion or mixing of general thermal adaptation and extreme heat damage. The sentence suggests that individuals mitigate extreme heat through habitat selection, but I think there is a lack of ecological description or understanding here. Most ecosystems and habitats have a history of extremes to which they are adapted. This may involve severe damage to individuals and eventual dieback from which the system may recover and over time disappeared species may return. In a future climate with novel and more severe types and intensities of extremes, these may change the pressure on individuals with dieback and avoidance, but the actual adaptation and new habitat selection is not entirely driven by the extremes, but by the general </w:t>
+      </w:r>
+      <w:proofErr w:type="gramStart"/>
+      <w:r>
+        <w:t>site specific</w:t>
+      </w:r>
+      <w:proofErr w:type="gramEnd"/>
+      <w:r>
+        <w:t xml:space="preserve"> bio-geo-meteorological conditions. I think the paper would be strengthened by including ecological thinking and theory much better.</w:t>
+      </w:r>
+      <w:r>
+        <w:br/>
+      </w:r>
+    </w:p>
+    <w:p>
+      <w:r>
+        <w:rPr>
+          <w:b/>
+          <w:bCs/>
+          <w:color w:val="215E99" w:themeColor="text2" w:themeTint="BF"/>
+        </w:rPr>
+        <w:t>Re</w:t>
+      </w:r>
+      <w:r>
+        <w:rPr>
+          <w:b/>
+          <w:bCs/>
+          <w:color w:val="215E99" w:themeColor="text2" w:themeTint="BF"/>
           <w:highlight w:val="yellow"/>
         </w:rPr>
-        <w:t>The abstract sets the stage correctly - we need to integrate models across scales. However, it further claims to show how existing models can be linked, which it does not</w:t>
-      </w:r>
-      <w:r>
-        <w:t>.</w:t>
-      </w:r>
+        <w:t>spon</w:t>
+      </w:r>
+      <w:r>
+        <w:rPr>
+          <w:b/>
+          <w:bCs/>
+          <w:color w:val="215E99" w:themeColor="text2" w:themeTint="BF"/>
+        </w:rPr>
+        <w:t>se</w:t>
+      </w:r>
+      <w:r>
+        <w:rPr>
+          <w:color w:val="215E99" w:themeColor="text2" w:themeTint="BF"/>
+        </w:rPr>
+        <w:t>:</w:t>
+      </w:r>
+    </w:p>
+    <w:p>
       <w:r>
         <w:br/>
       </w:r>
+      <w:r>
+        <w:rPr>
+          <w:b/>
+          <w:bCs/>
+        </w:rPr>
+        <w:t>C</w:t>
+      </w:r>
+      <w:r>
+        <w:rPr>
+          <w:b/>
+          <w:bCs/>
+        </w:rPr>
+        <w:t>37</w:t>
+      </w:r>
+      <w:r>
+        <w:rPr>
+          <w:b/>
+          <w:bCs/>
+        </w:rPr>
+        <w:t>:</w:t>
+      </w:r>
+      <w:r>
+        <w:rPr>
+          <w:b/>
+          <w:bCs/>
+        </w:rPr>
+        <w:t xml:space="preserve"> </w:t>
+      </w:r>
+      <w:r>
+        <w:t xml:space="preserve">Line 96-98 - Is this integration </w:t>
+      </w:r>
+      <w:proofErr w:type="gramStart"/>
+      <w:r>
+        <w:t>actually new</w:t>
+      </w:r>
+      <w:proofErr w:type="gramEnd"/>
+      <w:r>
+        <w:t xml:space="preserve"> - or what is new in your presentation? A link to experiments and observations would be great.</w:t>
+      </w:r>
+      <w:r>
+        <w:br/>
+      </w:r>
     </w:p>
     <w:p>
       <w:r>
@@ -2627,28 +3836,30 @@
         <w:rPr>
           <w:color w:val="215E99" w:themeColor="text2" w:themeTint="BF"/>
         </w:rPr>
-        <w:t xml:space="preserve"> We have re-written aspects of the paper and </w:t>
-      </w:r>
-      <w:commentRangeStart w:id="10"/>
-      <w:r>
-        <w:rPr>
-          <w:color w:val="215E99" w:themeColor="text2" w:themeTint="BF"/>
-        </w:rPr>
-        <w:t xml:space="preserve">brought from the supplement a clearer example </w:t>
-      </w:r>
-      <w:r>
-        <w:rPr>
-          <w:color w:val="215E99" w:themeColor="text2" w:themeTint="BF"/>
-        </w:rPr>
-        <w:t>to show more clearly how the models are connected.</w:t>
-      </w:r>
-      <w:commentRangeEnd w:id="10"/>
-      <w:r>
-        <w:rPr>
-          <w:rStyle w:val="CommentReference"/>
-        </w:rPr>
-        <w:commentReference w:id="10"/>
-      </w:r>
+        <w:t xml:space="preserve"> We have re-written this part of the </w:t>
+      </w:r>
+      <w:proofErr w:type="gramStart"/>
+      <w:r>
+        <w:rPr>
+          <w:color w:val="215E99" w:themeColor="text2" w:themeTint="BF"/>
+        </w:rPr>
+        <w:t>introduction, and</w:t>
+      </w:r>
+      <w:proofErr w:type="gramEnd"/>
+      <w:r>
+        <w:rPr>
+          <w:color w:val="215E99" w:themeColor="text2" w:themeTint="BF"/>
+        </w:rPr>
+        <w:t xml:space="preserve"> tried to better emphasise what we mean by “integration</w:t>
+      </w:r>
+      <w:proofErr w:type="gramStart"/>
+      <w:r>
+        <w:rPr>
+          <w:color w:val="215E99" w:themeColor="text2" w:themeTint="BF"/>
+        </w:rPr>
+        <w:t>” .</w:t>
+      </w:r>
+      <w:proofErr w:type="gramEnd"/>
     </w:p>
     <w:p>
       <w:r>
@@ -2666,7 +3877,7 @@
           <w:b/>
           <w:bCs/>
         </w:rPr>
-        <w:t>30</w:t>
+        <w:t>38</w:t>
       </w:r>
       <w:r>
         <w:rPr>
@@ -2683,42 +3894,150 @@
         <w:t xml:space="preserve"> </w:t>
       </w:r>
       <w:r>
-        <w:t xml:space="preserve">The introduction explains how the underlying causes and ramifications of observed impacts of climate variability and extremes are not fully understood (lines 45-53). This is clearly correct, but the </w:t>
-      </w:r>
-      <w:r>
-        <w:rPr>
-          <w:highlight w:val="red"/>
-        </w:rPr>
-        <w:t>paper lacks to explain how an integrated modelling approach will or can change this problem</w:t>
-      </w:r>
-      <w:r>
-        <w:t xml:space="preserve">, and to provide a clear link to the ecological understanding. There is no doubt that merging and integrating modelling approaches at different scales and domains would offer a strong potential, but this does not in itself provide the understanding we miss, but rather could serve as a strong tool for generating and testing model based hypothesis and create collaboration with and identify questions and understanding to be tested through observations and experiments. </w:t>
-      </w:r>
-      <w:r>
-        <w:rPr>
-          <w:highlight w:val="red"/>
-        </w:rPr>
-        <w:t xml:space="preserve">Part of </w:t>
-      </w:r>
-      <w:commentRangeStart w:id="11"/>
-      <w:r>
-        <w:rPr>
-          <w:highlight w:val="red"/>
-        </w:rPr>
-        <w:t>the problem is that our ecological understanding of extremes and their impacts is missing and requires more observations and experiments to provide better biological understanding. This interaction and collaboration between models and observations is completely missing</w:t>
-      </w:r>
-      <w:r>
-        <w:t>.</w:t>
+        <w:t xml:space="preserve">Figure 1 - This is an extremely busy figure. It is </w:t>
+      </w:r>
+      <w:proofErr w:type="gramStart"/>
+      <w:r>
+        <w:t>really not</w:t>
+      </w:r>
+      <w:proofErr w:type="gramEnd"/>
+      <w:r>
+        <w:t xml:space="preserve"> easy to understand what the message or illustration is? At a first glance it seems to present general connection between basic ecological understanding and dynamics with some arbitrary or selected models, but it is unclear which boxes are </w:t>
+      </w:r>
+      <w:proofErr w:type="gramStart"/>
+      <w:r>
+        <w:t>models</w:t>
+      </w:r>
+      <w:proofErr w:type="gramEnd"/>
+      <w:r>
+        <w:t xml:space="preserve"> and which are system entities, it is unclear what the dotted lines </w:t>
+      </w:r>
+      <w:proofErr w:type="gramStart"/>
+      <w:r>
+        <w:t>indicates</w:t>
+      </w:r>
+      <w:proofErr w:type="gramEnd"/>
+      <w:r>
+        <w:t xml:space="preserve"> and it is unclear which aspects of the ecosystem functioning are involved and how they are linked. Are the ecosystem boxes separate from the modelling or are they part of the modelling (which must be the case for many of the models??). And finally, the figure claims to focus on extreme heat - but it is unclear how this is done and how it interacts with other drivers such as especially water and management. The figure is not entirely </w:t>
+      </w:r>
+      <w:proofErr w:type="gramStart"/>
+      <w:r>
+        <w:t>helpful</w:t>
+      </w:r>
+      <w:proofErr w:type="gramEnd"/>
+      <w:r>
+        <w:t xml:space="preserve"> and it is not clear when you refer to existing models, approaches and concepts and when you present a wish or suggestion for </w:t>
+      </w:r>
+      <w:proofErr w:type="spellStart"/>
+      <w:r>
+        <w:t>ssomething</w:t>
+      </w:r>
+      <w:proofErr w:type="spellEnd"/>
+      <w:r>
+        <w:t xml:space="preserve"> new.</w:t>
       </w:r>
       <w:r>
         <w:br/>
       </w:r>
-      <w:commentRangeEnd w:id="11"/>
-      <w:r>
-        <w:rPr>
-          <w:rStyle w:val="CommentReference"/>
-        </w:rPr>
-        <w:commentReference w:id="11"/>
+    </w:p>
+    <w:p>
+      <w:r>
+        <w:rPr>
+          <w:b/>
+          <w:bCs/>
+          <w:color w:val="215E99" w:themeColor="text2" w:themeTint="BF"/>
+        </w:rPr>
+        <w:t>R</w:t>
+      </w:r>
+      <w:r>
+        <w:rPr>
+          <w:b/>
+          <w:bCs/>
+          <w:color w:val="215E99" w:themeColor="text2" w:themeTint="BF"/>
+          <w:highlight w:val="yellow"/>
+        </w:rPr>
+        <w:t>espo</w:t>
+      </w:r>
+      <w:r>
+        <w:rPr>
+          <w:b/>
+          <w:bCs/>
+          <w:color w:val="215E99" w:themeColor="text2" w:themeTint="BF"/>
+        </w:rPr>
+        <w:t>nse</w:t>
+      </w:r>
+      <w:r>
+        <w:rPr>
+          <w:color w:val="215E99" w:themeColor="text2" w:themeTint="BF"/>
+        </w:rPr>
+        <w:t>:</w:t>
+      </w:r>
+    </w:p>
+    <w:p>
+      <w:r>
+        <w:br/>
+      </w:r>
+      <w:r>
+        <w:rPr>
+          <w:b/>
+          <w:bCs/>
+        </w:rPr>
+        <w:t>C</w:t>
+      </w:r>
+      <w:r>
+        <w:rPr>
+          <w:b/>
+          <w:bCs/>
+        </w:rPr>
+        <w:t>39</w:t>
+      </w:r>
+      <w:r>
+        <w:rPr>
+          <w:b/>
+          <w:bCs/>
+        </w:rPr>
+        <w:t>:</w:t>
+      </w:r>
+      <w:r>
+        <w:rPr>
+          <w:b/>
+          <w:bCs/>
+        </w:rPr>
+        <w:t xml:space="preserve"> </w:t>
+      </w:r>
+      <w:r>
+        <w:t xml:space="preserve">Line 101-121 - It is probably all true what is in here, but what is the purpose of spending 20 lines to describe weather modelling in general including the coding language? If weather and meteorological modelling is at all relevant in this context, I would suggest </w:t>
+      </w:r>
+      <w:proofErr w:type="gramStart"/>
+      <w:r>
+        <w:t>to focus</w:t>
+      </w:r>
+      <w:proofErr w:type="gramEnd"/>
+      <w:r>
+        <w:t xml:space="preserve"> on the aspects of meteorological modelling that are particularly challenged when it comes to extremes and specifically heat waves. I certainly agree that such meteorological modelling of extremes IS a big challenge. Long term and </w:t>
+      </w:r>
+      <w:r>
+        <w:lastRenderedPageBreak/>
+        <w:t xml:space="preserve">general climate modelling </w:t>
+      </w:r>
+      <w:proofErr w:type="gramStart"/>
+      <w:r>
+        <w:t>is</w:t>
+      </w:r>
+      <w:proofErr w:type="gramEnd"/>
+      <w:r>
+        <w:t xml:space="preserve"> reasonably good while the translation of the general weather patterns into local and regional extremes are really challenging. But this </w:t>
+      </w:r>
+      <w:proofErr w:type="gramStart"/>
+      <w:r>
+        <w:t>particular challenge</w:t>
+      </w:r>
+      <w:proofErr w:type="gramEnd"/>
+      <w:r>
+        <w:t xml:space="preserve"> is not what you describe.</w:t>
+      </w:r>
+      <w:r>
+        <w:br/>
       </w:r>
     </w:p>
     <w:p>
@@ -2736,6 +4055,12 @@
         </w:rPr>
         <w:t>:</w:t>
       </w:r>
+      <w:r>
+        <w:rPr>
+          <w:color w:val="215E99" w:themeColor="text2" w:themeTint="BF"/>
+        </w:rPr>
+        <w:t xml:space="preserve"> We agree, and this was a point brought up also by Reviewer 2. We have now removed the global climate modelling section and kept it’s mention to a minimum focusing on citing already existing reviews in other sections. </w:t>
+      </w:r>
     </w:p>
     <w:p>
       <w:r>
@@ -2753,7 +4078,7 @@
           <w:b/>
           <w:bCs/>
         </w:rPr>
-        <w:t>31</w:t>
+        <w:t>40</w:t>
       </w:r>
       <w:r>
         <w:rPr>
@@ -2770,16 +4095,15 @@
         <w:t xml:space="preserve"> </w:t>
       </w:r>
       <w:r>
-        <w:t xml:space="preserve">I do not understand the statement in lines 54-58, and the statement in line 58-59 indicates that coupling of different model concepts does not take place today. I do not think this is correct. Several of the authors are deeply involved in different model concepts that to various degrees couple different domains. </w:t>
-      </w:r>
-      <w:r>
-        <w:rPr>
-          <w:highlight w:val="red"/>
-        </w:rPr>
-        <w:t>It may be that it is not good enough and there is a need for more, new or better coupling, especially when we speak about extremes and heat waves, but this has to be described much more precisely</w:t>
-      </w:r>
-      <w:r>
-        <w:t>.</w:t>
+        <w:t xml:space="preserve">Line 122-135 - Again, I suggest you include some more specific ecological understanding here. The section looks at extremes mostly from a meteorological point of view, but this may not in itself be relevant if the ecosystems or species do not experience the pressure as extreme. Melinda Smith has a great paper where she </w:t>
+      </w:r>
+      <w:proofErr w:type="gramStart"/>
+      <w:r>
+        <w:t>distinguish</w:t>
+      </w:r>
+      <w:proofErr w:type="gramEnd"/>
+      <w:r>
+        <w:t xml:space="preserve"> between meteorological extremes and ecological extremes. That would be a relevant and great perspective to include.</w:t>
       </w:r>
       <w:r>
         <w:br/>
@@ -2804,7 +4128,7 @@
         <w:rPr>
           <w:color w:val="215E99" w:themeColor="text2" w:themeTint="BF"/>
         </w:rPr>
-        <w:t xml:space="preserve"> Sorry that this was confusing. We have re-worded both these sentences to hopefully make it clearer what we mean.</w:t>
+        <w:t xml:space="preserve"> Thanks. We have completely re-written this entire section and brought a few more examples here. The section that follows (“Translating exposure to organism temperature: biophysics to the rescue”) discusses how species may not actually experience these extremes, and how biophysical models can capture this by modelling behaviour.</w:t>
       </w:r>
     </w:p>
     <w:p>
@@ -2823,7 +4147,7 @@
           <w:b/>
           <w:bCs/>
         </w:rPr>
-        <w:t>32</w:t>
+        <w:t>41</w:t>
       </w:r>
       <w:r>
         <w:rPr>
@@ -2840,13 +4164,80 @@
         <w:t xml:space="preserve"> </w:t>
       </w:r>
       <w:r>
-        <w:t>Line 60 - I cannot read from the context and the previous paragraph what "feat" refers to?</w:t>
+        <w:t>Line 133-135 - I miss a reference for this latter sentence, or a more comprehensive unfolding of the non-linearity aspects. It is a surprise how little space you offer to the non-linearity aspects of extremes and how to model them, despite they are crucial characteristics of such events.</w:t>
       </w:r>
       <w:r>
         <w:br/>
       </w:r>
     </w:p>
     <w:p>
+      <w:r>
+        <w:rPr>
+          <w:b/>
+          <w:bCs/>
+          <w:color w:val="215E99" w:themeColor="text2" w:themeTint="BF"/>
+        </w:rPr>
+        <w:t>Response</w:t>
+      </w:r>
+      <w:r>
+        <w:rPr>
+          <w:color w:val="215E99" w:themeColor="text2" w:themeTint="BF"/>
+        </w:rPr>
+        <w:t>:</w:t>
+      </w:r>
+      <w:r>
+        <w:rPr>
+          <w:color w:val="215E99" w:themeColor="text2" w:themeTint="BF"/>
+        </w:rPr>
+        <w:t xml:space="preserve"> Non-linearities and interactions are expected to emerge as an entire system is modelled, which is what we are advocating. We have mentioned </w:t>
+      </w:r>
+      <w:r>
+        <w:rPr>
+          <w:color w:val="215E99" w:themeColor="text2" w:themeTint="BF"/>
+        </w:rPr>
+        <w:t>non-linearities and interactions in the introduction and concluding remarks sections but have limited space to devote to it otherwise because it is an emergent property of modelling a system. As such, the exact nature of these non-linearities will depend on the system as Reviewer 3 understands.</w:t>
+      </w:r>
+    </w:p>
+    <w:p>
+      <w:r>
+        <w:br/>
+      </w:r>
+      <w:r>
+        <w:rPr>
+          <w:b/>
+          <w:bCs/>
+        </w:rPr>
+        <w:t>C</w:t>
+      </w:r>
+      <w:r>
+        <w:rPr>
+          <w:b/>
+          <w:bCs/>
+        </w:rPr>
+        <w:t>42</w:t>
+      </w:r>
+      <w:r>
+        <w:rPr>
+          <w:b/>
+          <w:bCs/>
+        </w:rPr>
+        <w:t>:</w:t>
+      </w:r>
+      <w:r>
+        <w:rPr>
+          <w:b/>
+          <w:bCs/>
+        </w:rPr>
+        <w:t xml:space="preserve"> </w:t>
+      </w:r>
+      <w:r>
+        <w:t>Line 159-161 - I do not understand what you try to say here? This sounds like what all models do (or try to do). What is the challenge you see here - is it modelling the thermal regime or the plant/system dynamics?</w:t>
+      </w:r>
+      <w:r>
+        <w:br/>
+      </w:r>
+    </w:p>
+    <w:p>
       <w:pPr>
         <w:rPr>
           <w:color w:val="215E99" w:themeColor="text2" w:themeTint="BF"/>
@@ -2870,7 +4261,37 @@
         <w:rPr>
           <w:color w:val="215E99" w:themeColor="text2" w:themeTint="BF"/>
         </w:rPr>
-        <w:t xml:space="preserve"> We have re-written this section and this comment is no longer relevant.</w:t>
+        <w:t xml:space="preserve"> We have re-written this section completely. Hopefully </w:t>
+      </w:r>
+      <w:proofErr w:type="spellStart"/>
+      <w:proofErr w:type="gramStart"/>
+      <w:r>
+        <w:rPr>
+          <w:color w:val="215E99" w:themeColor="text2" w:themeTint="BF"/>
+        </w:rPr>
+        <w:t>it’s</w:t>
+      </w:r>
+      <w:proofErr w:type="spellEnd"/>
+      <w:proofErr w:type="gramEnd"/>
+      <w:r>
+        <w:rPr>
+          <w:color w:val="215E99" w:themeColor="text2" w:themeTint="BF"/>
+        </w:rPr>
+        <w:t xml:space="preserve"> current configuration helps clear up as we emphasise the challenges with modelling the </w:t>
+      </w:r>
+      <w:proofErr w:type="gramStart"/>
+      <w:r>
+        <w:rPr>
+          <w:color w:val="215E99" w:themeColor="text2" w:themeTint="BF"/>
+        </w:rPr>
+        <w:t>feedbacks</w:t>
+      </w:r>
+      <w:proofErr w:type="gramEnd"/>
+      <w:r>
+        <w:rPr>
+          <w:color w:val="215E99" w:themeColor="text2" w:themeTint="BF"/>
+        </w:rPr>
+        <w:t xml:space="preserve"> (see also Box 3).</w:t>
       </w:r>
     </w:p>
     <w:p>
@@ -2889,7 +4310,7 @@
           <w:b/>
           <w:bCs/>
         </w:rPr>
-        <w:t>33</w:t>
+        <w:t>43</w:t>
       </w:r>
       <w:r>
         <w:rPr>
@@ -2906,1058 +4327,15 @@
         <w:t xml:space="preserve"> </w:t>
       </w:r>
       <w:r>
-        <w:t xml:space="preserve">Line 62-66 - It is unclear what the challenge with heat waves relative to general temperature increases is and how general climate change driven temperature increases and extreme heat waves are different or connected. Much of the text and descriptions sound more like impacts of general temperature increases, but heat waves have some </w:t>
-      </w:r>
-      <w:r>
-        <w:lastRenderedPageBreak/>
-        <w:t>distinct differences. What specific challenges do you see in the understanding and the modelling, at different scales, and what are you delivering or proposing? Also, how are heat waves different from other extremes? It seems to me that a modelling approach with the characteristics the authors wants to present will include some basic features, solutions or principles which have common characters for extremes, yet also for the specific case having features that are specific for temperature and heat. I would expect some degree of treating the general aspects of extremes as well as the more specific heat aspects.</w:t>
-      </w:r>
-      <w:r>
-        <w:br/>
-      </w:r>
-    </w:p>
-    <w:p>
-      <w:r>
-        <w:rPr>
-          <w:b/>
-          <w:bCs/>
-          <w:color w:val="215E99" w:themeColor="text2" w:themeTint="BF"/>
-        </w:rPr>
-        <w:t>Response</w:t>
-      </w:r>
-      <w:r>
-        <w:rPr>
-          <w:color w:val="215E99" w:themeColor="text2" w:themeTint="BF"/>
-        </w:rPr>
-        <w:t>:</w:t>
-      </w:r>
-    </w:p>
-    <w:p>
-      <w:r>
-        <w:br/>
-      </w:r>
-      <w:r>
-        <w:rPr>
-          <w:b/>
-          <w:bCs/>
-        </w:rPr>
-        <w:t>C</w:t>
-      </w:r>
-      <w:r>
-        <w:rPr>
-          <w:b/>
-          <w:bCs/>
-        </w:rPr>
-        <w:t>34</w:t>
-      </w:r>
-      <w:r>
-        <w:rPr>
-          <w:b/>
-          <w:bCs/>
-        </w:rPr>
-        <w:t>:</w:t>
-      </w:r>
-      <w:r>
-        <w:rPr>
-          <w:b/>
-          <w:bCs/>
-        </w:rPr>
-        <w:t xml:space="preserve"> </w:t>
-      </w:r>
-      <w:r>
-        <w:t>Line 67-69 - it sounds like current modelling does not integrate detailed process modelling into community and population dimensions. I am sure there are important limitations that needs to be improved and developed, and that heat waves and other extremes provide much understudied cases, but I disagree that such integrations do not exist. Please do not simplify and overstate, but be precise and specific.</w:t>
-      </w:r>
-      <w:r>
-        <w:br/>
-      </w:r>
-    </w:p>
-    <w:p>
-      <w:r>
-        <w:rPr>
-          <w:b/>
-          <w:bCs/>
-          <w:color w:val="215E99" w:themeColor="text2" w:themeTint="BF"/>
-        </w:rPr>
-        <w:t>Response</w:t>
-      </w:r>
-      <w:r>
-        <w:rPr>
-          <w:color w:val="215E99" w:themeColor="text2" w:themeTint="BF"/>
-        </w:rPr>
-        <w:t>:</w:t>
-      </w:r>
-    </w:p>
-    <w:p>
-      <w:r>
-        <w:br/>
-      </w:r>
-      <w:r>
-        <w:rPr>
-          <w:b/>
-          <w:bCs/>
-        </w:rPr>
-        <w:t>C</w:t>
-      </w:r>
-      <w:r>
-        <w:rPr>
-          <w:b/>
-          <w:bCs/>
-        </w:rPr>
-        <w:t>35</w:t>
-      </w:r>
-      <w:r>
-        <w:rPr>
-          <w:b/>
-          <w:bCs/>
-        </w:rPr>
-        <w:t>:</w:t>
-      </w:r>
-      <w:r>
-        <w:rPr>
-          <w:b/>
-          <w:bCs/>
-        </w:rPr>
-        <w:t xml:space="preserve"> </w:t>
-      </w:r>
-      <w:r>
-        <w:t>Line 70 - "We bring together modelling approaches ….". No, you present some loose ideas and wishes, but I do not see an approach.</w:t>
-      </w:r>
-      <w:r>
-        <w:br/>
-      </w:r>
-    </w:p>
-    <w:p>
-      <w:pPr>
-        <w:rPr>
-          <w:color w:val="215E99" w:themeColor="text2" w:themeTint="BF"/>
-        </w:rPr>
-      </w:pPr>
-      <w:r>
-        <w:rPr>
-          <w:b/>
-          <w:bCs/>
-          <w:color w:val="215E99" w:themeColor="text2" w:themeTint="BF"/>
-        </w:rPr>
-        <w:t>Response</w:t>
-      </w:r>
-      <w:r>
-        <w:rPr>
-          <w:color w:val="215E99" w:themeColor="text2" w:themeTint="BF"/>
-        </w:rPr>
-        <w:t>:</w:t>
-      </w:r>
-    </w:p>
-    <w:p>
-      <w:r>
-        <w:br/>
-      </w:r>
-      <w:r>
-        <w:rPr>
-          <w:b/>
-          <w:bCs/>
-        </w:rPr>
-        <w:t>C</w:t>
-      </w:r>
-      <w:r>
-        <w:rPr>
-          <w:b/>
-          <w:bCs/>
-        </w:rPr>
-        <w:t>36</w:t>
-      </w:r>
-      <w:r>
-        <w:rPr>
-          <w:b/>
-          <w:bCs/>
-        </w:rPr>
-        <w:t>:</w:t>
-      </w:r>
-      <w:r>
-        <w:rPr>
-          <w:b/>
-          <w:bCs/>
-        </w:rPr>
-        <w:t xml:space="preserve"> </w:t>
-      </w:r>
-      <w:r>
-        <w:t>Line 89-92 - I think there is a confusion or mixing of general thermal adaptation and extreme heat damage. The sentence suggests that individuals mitigate extreme heat through habitat selection, but I think there is a lack of ecological description or understanding here. Most ecosystems and habitats have a history of extremes to which they are adapted. This may involve severe damage to individuals and eventual dieback from which the system may recover and over time disappeared species may return. In a future climate with novel and more severe types and intensities of extremes, these may change the pressure on individuals with dieback and avoidance, but the actual adaptation and new habitat selection is not entirely driven by the extremes, but by the general site specific bio-geo-meteorological conditions. I think the paper would be strengthened by including ecological thinking and theory much better.</w:t>
-      </w:r>
-      <w:r>
-        <w:br/>
-      </w:r>
-    </w:p>
-    <w:p>
-      <w:r>
-        <w:rPr>
-          <w:b/>
-          <w:bCs/>
-          <w:color w:val="215E99" w:themeColor="text2" w:themeTint="BF"/>
-        </w:rPr>
-        <w:t>Response</w:t>
-      </w:r>
-      <w:r>
-        <w:rPr>
-          <w:color w:val="215E99" w:themeColor="text2" w:themeTint="BF"/>
-        </w:rPr>
-        <w:t>:</w:t>
-      </w:r>
-    </w:p>
-    <w:p>
-      <w:r>
-        <w:br/>
-      </w:r>
-      <w:r>
-        <w:rPr>
-          <w:b/>
-          <w:bCs/>
-        </w:rPr>
-        <w:t>C</w:t>
-      </w:r>
-      <w:r>
-        <w:rPr>
-          <w:b/>
-          <w:bCs/>
-        </w:rPr>
-        <w:t>37</w:t>
-      </w:r>
-      <w:r>
-        <w:rPr>
-          <w:b/>
-          <w:bCs/>
-        </w:rPr>
-        <w:t>:</w:t>
-      </w:r>
-      <w:r>
-        <w:rPr>
-          <w:b/>
-          <w:bCs/>
-        </w:rPr>
-        <w:t xml:space="preserve"> </w:t>
-      </w:r>
-      <w:r>
-        <w:t>Line 96-98 - Is this integration actually new - or what is new in your presentation? A link to experiments and observations would be great.</w:t>
-      </w:r>
-      <w:r>
-        <w:br/>
-      </w:r>
-    </w:p>
-    <w:p>
-      <w:r>
-        <w:rPr>
-          <w:b/>
-          <w:bCs/>
-          <w:color w:val="215E99" w:themeColor="text2" w:themeTint="BF"/>
-        </w:rPr>
-        <w:t>Response</w:t>
-      </w:r>
-      <w:r>
-        <w:rPr>
-          <w:color w:val="215E99" w:themeColor="text2" w:themeTint="BF"/>
-        </w:rPr>
-        <w:t>:</w:t>
-      </w:r>
-    </w:p>
-    <w:p>
-      <w:r>
-        <w:br/>
-      </w:r>
-      <w:r>
-        <w:rPr>
-          <w:b/>
-          <w:bCs/>
-        </w:rPr>
-        <w:t>C</w:t>
-      </w:r>
-      <w:r>
-        <w:rPr>
-          <w:b/>
-          <w:bCs/>
-        </w:rPr>
-        <w:t>38</w:t>
-      </w:r>
-      <w:r>
-        <w:rPr>
-          <w:b/>
-          <w:bCs/>
-        </w:rPr>
-        <w:t>:</w:t>
-      </w:r>
-      <w:r>
-        <w:rPr>
-          <w:b/>
-          <w:bCs/>
-        </w:rPr>
-        <w:t xml:space="preserve"> </w:t>
-      </w:r>
-      <w:r>
-        <w:t xml:space="preserve">Figure 1 - This is an extremely busy figure. It is really not easy to understand what the message or illustration is? At a first glance it seems to present general connection between basic ecological understanding and dynamics with some arbitrary or selected models, but it is unclear which boxes are models and which are system entities, it is </w:t>
-      </w:r>
-      <w:r>
-        <w:lastRenderedPageBreak/>
-        <w:t>unclear what the dotted lines indicates and it is unclear which aspects of the ecosystem functioning are involved and how they are linked. Are the ecosystem boxes separate from the modelling or are they part of the modelling (which must be the case for many of the models??). And finally, the figure claims to focus on extreme heat - but it is unclear how this is done and how it interacts with other drivers such as especially water and management. The figure is not entirely helpful and it is not clear when you refer to existing models, approaches and concepts and when you present a wish or suggestion for ssomething new.</w:t>
-      </w:r>
-      <w:r>
-        <w:br/>
-      </w:r>
-    </w:p>
-    <w:p>
-      <w:r>
-        <w:rPr>
-          <w:b/>
-          <w:bCs/>
-          <w:color w:val="215E99" w:themeColor="text2" w:themeTint="BF"/>
-        </w:rPr>
-        <w:t>Response</w:t>
-      </w:r>
-      <w:r>
-        <w:rPr>
-          <w:color w:val="215E99" w:themeColor="text2" w:themeTint="BF"/>
-        </w:rPr>
-        <w:t>:</w:t>
-      </w:r>
-    </w:p>
-    <w:p>
-      <w:r>
-        <w:br/>
-      </w:r>
-      <w:r>
-        <w:rPr>
-          <w:b/>
-          <w:bCs/>
-        </w:rPr>
-        <w:t>C</w:t>
-      </w:r>
-      <w:r>
-        <w:rPr>
-          <w:b/>
-          <w:bCs/>
-        </w:rPr>
-        <w:t>39</w:t>
-      </w:r>
-      <w:r>
-        <w:rPr>
-          <w:b/>
-          <w:bCs/>
-        </w:rPr>
-        <w:t>:</w:t>
-      </w:r>
-      <w:r>
-        <w:rPr>
-          <w:b/>
-          <w:bCs/>
-        </w:rPr>
-        <w:t xml:space="preserve"> </w:t>
-      </w:r>
-      <w:r>
-        <w:t>Line 101-121 - It is probably all true what is in here, but what is the purpose of spending 20 lines to describe weather modelling in general including the coding language? If weather and meteorological modelling is at all relevant in this context, I would suggest to focus on the aspects of meteorological modelling that are particularly challenged when it comes to extremes and specifically heat waves. I certainly agree that such meteorological modelling of extremes IS a big challenge. Long term and general climate modelling is reasonably good while the translation of the general weather patterns into local and regional extremes are really challenging. But this particular challenge is not what you describe.</w:t>
-      </w:r>
-      <w:r>
-        <w:br/>
-      </w:r>
-    </w:p>
-    <w:p>
-      <w:r>
-        <w:rPr>
-          <w:b/>
-          <w:bCs/>
-          <w:color w:val="215E99" w:themeColor="text2" w:themeTint="BF"/>
-        </w:rPr>
-        <w:t>Response</w:t>
-      </w:r>
-      <w:r>
-        <w:rPr>
-          <w:color w:val="215E99" w:themeColor="text2" w:themeTint="BF"/>
-        </w:rPr>
-        <w:t>:</w:t>
-      </w:r>
-      <w:r>
-        <w:rPr>
-          <w:color w:val="215E99" w:themeColor="text2" w:themeTint="BF"/>
-        </w:rPr>
-        <w:t xml:space="preserve"> We agree, and this was a point brought up also by Reviewer 2. We have now removed the global climate modelling section and kept it’s mention to a minimum focusing on citing already existing reviews in other sections. </w:t>
-      </w:r>
-    </w:p>
-    <w:p>
-      <w:r>
-        <w:br/>
-      </w:r>
-      <w:r>
-        <w:rPr>
-          <w:b/>
-          <w:bCs/>
-        </w:rPr>
-        <w:t>C</w:t>
-      </w:r>
-      <w:r>
-        <w:rPr>
-          <w:b/>
-          <w:bCs/>
-        </w:rPr>
-        <w:t>40</w:t>
-      </w:r>
-      <w:r>
-        <w:rPr>
-          <w:b/>
-          <w:bCs/>
-        </w:rPr>
-        <w:t>:</w:t>
-      </w:r>
-      <w:r>
-        <w:rPr>
-          <w:b/>
-          <w:bCs/>
-        </w:rPr>
-        <w:t xml:space="preserve"> </w:t>
-      </w:r>
-      <w:r>
-        <w:t>Line 122-135 - Again, I suggest you include some more specific ecological understanding here. The section looks at extremes mostly from a meteorological point of view, but this may not in itself be relevant if the ecosystems or species do not experience the pressure as extreme. Melinda Smith has a great paper where she distinguish between meteorological extremes and ecological extremes. That would be a relevant and great perspective to include.</w:t>
-      </w:r>
-      <w:r>
-        <w:br/>
-      </w:r>
-    </w:p>
-    <w:p>
-      <w:r>
-        <w:rPr>
-          <w:b/>
-          <w:bCs/>
-          <w:color w:val="215E99" w:themeColor="text2" w:themeTint="BF"/>
-        </w:rPr>
-        <w:t>Response</w:t>
-      </w:r>
-      <w:r>
-        <w:rPr>
-          <w:color w:val="215E99" w:themeColor="text2" w:themeTint="BF"/>
-        </w:rPr>
-        <w:t>:</w:t>
-      </w:r>
-      <w:r>
-        <w:rPr>
-          <w:color w:val="215E99" w:themeColor="text2" w:themeTint="BF"/>
-        </w:rPr>
-        <w:t xml:space="preserve"> Thanks. We have completely re-written this entire section and brought a few more examples here. The section that follows (“Translating exposure to organism temperature: biophysics to the rescue”) discusses how species may not actually experience these extremes, and how biophysical models can capture this by modelling behaviour.</w:t>
-      </w:r>
-    </w:p>
-    <w:p>
-      <w:r>
-        <w:br/>
-      </w:r>
-      <w:r>
-        <w:rPr>
-          <w:b/>
-          <w:bCs/>
-        </w:rPr>
-        <w:t>C</w:t>
-      </w:r>
-      <w:r>
-        <w:rPr>
-          <w:b/>
-          <w:bCs/>
-        </w:rPr>
-        <w:t>41</w:t>
-      </w:r>
-      <w:r>
-        <w:rPr>
-          <w:b/>
-          <w:bCs/>
-        </w:rPr>
-        <w:t>:</w:t>
-      </w:r>
-      <w:r>
-        <w:rPr>
-          <w:b/>
-          <w:bCs/>
-        </w:rPr>
-        <w:t xml:space="preserve"> </w:t>
-      </w:r>
-      <w:r>
-        <w:t xml:space="preserve">Line 133-135 - I miss a reference for this latter sentence, or a more comprehensive unfolding of the non-linearity aspects. It is a surprise how little space you offer to the </w:t>
-      </w:r>
-      <w:commentRangeStart w:id="12"/>
-      <w:r>
-        <w:t xml:space="preserve">non-linearity aspects of extremes </w:t>
-      </w:r>
-      <w:commentRangeEnd w:id="12"/>
-      <w:r>
-        <w:rPr>
-          <w:rStyle w:val="CommentReference"/>
-        </w:rPr>
-        <w:commentReference w:id="12"/>
-      </w:r>
-      <w:r>
-        <w:t>and how to model them, despite they are crucial characteristics of such events.</w:t>
-      </w:r>
-      <w:r>
-        <w:br/>
-      </w:r>
-    </w:p>
-    <w:p>
-      <w:r>
-        <w:rPr>
-          <w:b/>
-          <w:bCs/>
-          <w:color w:val="215E99" w:themeColor="text2" w:themeTint="BF"/>
-        </w:rPr>
-        <w:t>Response</w:t>
-      </w:r>
-      <w:r>
-        <w:rPr>
-          <w:color w:val="215E99" w:themeColor="text2" w:themeTint="BF"/>
-        </w:rPr>
-        <w:t>:</w:t>
-      </w:r>
-    </w:p>
-    <w:p>
-      <w:r>
-        <w:br/>
-      </w:r>
-      <w:r>
-        <w:rPr>
-          <w:b/>
-          <w:bCs/>
-        </w:rPr>
-        <w:t>C</w:t>
-      </w:r>
-      <w:r>
-        <w:rPr>
-          <w:b/>
-          <w:bCs/>
-        </w:rPr>
-        <w:t>42</w:t>
-      </w:r>
-      <w:r>
-        <w:rPr>
-          <w:b/>
-          <w:bCs/>
-        </w:rPr>
-        <w:t>:</w:t>
-      </w:r>
-      <w:r>
-        <w:rPr>
-          <w:b/>
-          <w:bCs/>
-        </w:rPr>
-        <w:t xml:space="preserve"> </w:t>
-      </w:r>
-      <w:r>
-        <w:t xml:space="preserve">Line 159-161 - I do not understand what you try to say here? This sounds like what all models do (or try to do). What is the challenge you see here - is it modelling the </w:t>
-      </w:r>
-      <w:r>
-        <w:lastRenderedPageBreak/>
-        <w:t>thermal regime or the plant/system dynamics?</w:t>
-      </w:r>
-      <w:r>
-        <w:br/>
-      </w:r>
-    </w:p>
-    <w:p>
-      <w:pPr>
-        <w:rPr>
-          <w:color w:val="215E99" w:themeColor="text2" w:themeTint="BF"/>
-        </w:rPr>
-      </w:pPr>
-      <w:r>
-        <w:rPr>
-          <w:b/>
-          <w:bCs/>
-          <w:color w:val="215E99" w:themeColor="text2" w:themeTint="BF"/>
-        </w:rPr>
-        <w:t>Response</w:t>
-      </w:r>
-      <w:r>
-        <w:rPr>
-          <w:color w:val="215E99" w:themeColor="text2" w:themeTint="BF"/>
-        </w:rPr>
-        <w:t>:</w:t>
-      </w:r>
-    </w:p>
-    <w:p>
-      <w:r>
-        <w:br/>
-      </w:r>
-      <w:r>
-        <w:rPr>
-          <w:b/>
-          <w:bCs/>
-        </w:rPr>
-        <w:t>C</w:t>
-      </w:r>
-      <w:r>
-        <w:rPr>
-          <w:b/>
-          <w:bCs/>
-        </w:rPr>
-        <w:t>43</w:t>
-      </w:r>
-      <w:r>
-        <w:rPr>
-          <w:b/>
-          <w:bCs/>
-        </w:rPr>
-        <w:t>:</w:t>
-      </w:r>
-      <w:r>
-        <w:rPr>
-          <w:b/>
-          <w:bCs/>
-        </w:rPr>
-        <w:t xml:space="preserve"> </w:t>
-      </w:r>
-      <w:r>
-        <w:t>Line 165-217 - There is a lot about responses of organisms and almost nothing about systems. And all examples given are for individual species. You claim that the papers should go across dimensions - but you give almost no ideas to provide the systems integration. I know that systems consists of individuals, but doing species and individuals right does not automatically lead to correct treatments of systems.</w:t>
-      </w:r>
-      <w:r>
-        <w:br/>
-      </w:r>
-    </w:p>
-    <w:p>
-      <w:r>
-        <w:rPr>
-          <w:b/>
-          <w:bCs/>
-          <w:color w:val="215E99" w:themeColor="text2" w:themeTint="BF"/>
-        </w:rPr>
-        <w:t>Response</w:t>
-      </w:r>
-      <w:r>
-        <w:rPr>
-          <w:color w:val="215E99" w:themeColor="text2" w:themeTint="BF"/>
-        </w:rPr>
-        <w:t>:</w:t>
-      </w:r>
-    </w:p>
-    <w:p>
-      <w:r>
-        <w:br/>
-      </w:r>
-      <w:r>
-        <w:rPr>
-          <w:b/>
-          <w:bCs/>
-        </w:rPr>
-        <w:t>C</w:t>
-      </w:r>
-      <w:r>
-        <w:rPr>
-          <w:b/>
-          <w:bCs/>
-        </w:rPr>
-        <w:t>44</w:t>
-      </w:r>
-      <w:r>
-        <w:rPr>
-          <w:b/>
-          <w:bCs/>
-        </w:rPr>
-        <w:t>:</w:t>
-      </w:r>
-      <w:r>
-        <w:rPr>
-          <w:b/>
-          <w:bCs/>
-        </w:rPr>
-        <w:t xml:space="preserve"> </w:t>
-      </w:r>
-      <w:r>
-        <w:t xml:space="preserve">Box 1 and Figure 2 - It is an important aspect to include - the mediation of heat waves at the systems level and through interaction with different other drivers. However, the figure is really hard to read and </w:t>
-      </w:r>
-      <w:commentRangeStart w:id="13"/>
-      <w:r>
-        <w:t xml:space="preserve">understand, and to me it is not enough to treat this in a box and figure, but the message has to be integrated into the text as well. You need to include the aspects of mediation into the description and not just rely on the reader being able to see the consequences of these </w:t>
-      </w:r>
-      <w:commentRangeEnd w:id="13"/>
-      <w:r>
-        <w:rPr>
-          <w:rStyle w:val="CommentReference"/>
-        </w:rPr>
-        <w:commentReference w:id="13"/>
-      </w:r>
-      <w:r>
-        <w:t>aspects just by having it in a box or a figure. The figure text is not at all useful.</w:t>
-      </w:r>
-      <w:r>
-        <w:br/>
-      </w:r>
-    </w:p>
-    <w:p>
-      <w:r>
-        <w:rPr>
-          <w:b/>
-          <w:bCs/>
-          <w:color w:val="215E99" w:themeColor="text2" w:themeTint="BF"/>
-        </w:rPr>
-        <w:t>Response</w:t>
-      </w:r>
-      <w:r>
-        <w:rPr>
-          <w:color w:val="215E99" w:themeColor="text2" w:themeTint="BF"/>
-        </w:rPr>
-        <w:t>:</w:t>
-      </w:r>
-    </w:p>
-    <w:p>
-      <w:r>
-        <w:br/>
-      </w:r>
-      <w:r>
-        <w:rPr>
-          <w:b/>
-          <w:bCs/>
-        </w:rPr>
-        <w:t>C</w:t>
-      </w:r>
-      <w:r>
-        <w:rPr>
-          <w:b/>
-          <w:bCs/>
-        </w:rPr>
-        <w:t>45</w:t>
-      </w:r>
-      <w:r>
-        <w:rPr>
-          <w:b/>
-          <w:bCs/>
-        </w:rPr>
-        <w:t>:</w:t>
-      </w:r>
-      <w:r>
-        <w:rPr>
-          <w:b/>
-          <w:bCs/>
-        </w:rPr>
-        <w:t xml:space="preserve"> </w:t>
-      </w:r>
-      <w:r>
-        <w:t>Glossary - hmmm - not clear why you bring this and why exactly those words are explained?</w:t>
-      </w:r>
-      <w:r>
-        <w:br/>
-      </w:r>
-    </w:p>
-    <w:p>
-      <w:r>
-        <w:rPr>
-          <w:b/>
-          <w:bCs/>
-          <w:color w:val="215E99" w:themeColor="text2" w:themeTint="BF"/>
-        </w:rPr>
-        <w:t>Response</w:t>
-      </w:r>
-      <w:r>
-        <w:rPr>
-          <w:color w:val="215E99" w:themeColor="text2" w:themeTint="BF"/>
-        </w:rPr>
-        <w:t>:</w:t>
-      </w:r>
-    </w:p>
-    <w:p>
-      <w:r>
-        <w:br/>
-      </w:r>
-      <w:r>
-        <w:rPr>
-          <w:b/>
-          <w:bCs/>
-        </w:rPr>
-        <w:t>C</w:t>
-      </w:r>
-      <w:r>
-        <w:rPr>
-          <w:b/>
-          <w:bCs/>
-        </w:rPr>
-        <w:t>46</w:t>
-      </w:r>
-      <w:r>
-        <w:rPr>
-          <w:b/>
-          <w:bCs/>
-        </w:rPr>
-        <w:t>:</w:t>
-      </w:r>
-      <w:r>
-        <w:rPr>
-          <w:b/>
-          <w:bCs/>
-        </w:rPr>
-        <w:t xml:space="preserve"> </w:t>
-      </w:r>
-      <w:r>
-        <w:t xml:space="preserve">Line 248-253 - The interaction between </w:t>
-      </w:r>
-      <w:commentRangeStart w:id="14"/>
-      <w:r>
-        <w:t xml:space="preserve">temperature and water are really important, also for the case of heat waves, but I think it deserves a bit more attention </w:t>
-      </w:r>
-      <w:commentRangeEnd w:id="14"/>
-      <w:r>
-        <w:rPr>
-          <w:rStyle w:val="CommentReference"/>
-        </w:rPr>
-        <w:commentReference w:id="14"/>
-      </w:r>
-      <w:r>
-        <w:t>in the paper.</w:t>
-      </w:r>
-      <w:r>
-        <w:br/>
-      </w:r>
-    </w:p>
-    <w:p>
-      <w:r>
-        <w:rPr>
-          <w:b/>
-          <w:bCs/>
-          <w:color w:val="215E99" w:themeColor="text2" w:themeTint="BF"/>
-        </w:rPr>
-        <w:t>Response</w:t>
-      </w:r>
-      <w:r>
-        <w:rPr>
-          <w:color w:val="215E99" w:themeColor="text2" w:themeTint="BF"/>
-        </w:rPr>
-        <w:t>:</w:t>
-      </w:r>
-      <w:r>
-        <w:rPr>
-          <w:color w:val="215E99" w:themeColor="text2" w:themeTint="BF"/>
-        </w:rPr>
-        <w:t xml:space="preserve"> </w:t>
-      </w:r>
-    </w:p>
-    <w:p>
-      <w:r>
-        <w:br/>
-      </w:r>
-      <w:r>
-        <w:rPr>
-          <w:b/>
-          <w:bCs/>
-        </w:rPr>
-        <w:t>C</w:t>
-      </w:r>
-      <w:r>
-        <w:rPr>
-          <w:b/>
-          <w:bCs/>
-        </w:rPr>
-        <w:t>47</w:t>
-      </w:r>
-      <w:r>
-        <w:rPr>
-          <w:b/>
-          <w:bCs/>
-        </w:rPr>
-        <w:t>:</w:t>
-      </w:r>
-      <w:r>
-        <w:rPr>
-          <w:b/>
-          <w:bCs/>
-        </w:rPr>
-        <w:t xml:space="preserve"> </w:t>
-      </w:r>
-      <w:r>
-        <w:t>Line 256 - What is the idea behind the use of "</w:t>
-      </w:r>
-      <w:commentRangeStart w:id="15"/>
-      <w:r>
-        <w:t>coexistence" as a key explanatory model? It is true that species interactions are relevant for describing the interaction between two or more species relative to the site conditions at a given site</w:t>
-      </w:r>
-      <w:commentRangeEnd w:id="15"/>
-      <w:r>
-        <w:rPr>
-          <w:rStyle w:val="CommentReference"/>
-        </w:rPr>
-        <w:commentReference w:id="15"/>
-      </w:r>
-      <w:r>
-        <w:t>. But how is that relevant for the understanding of the overall consequences of extremes and heat waves? I would think coexistence is of core relevance for general site conditions and for more gradual climatic changes, while the sudden and potentially dieback provoking nature of extreme events, also described here by damage and repair, would be different from classic coexistence. Ofcourse, if future heat waves is a novel factor for a given site, the ability of a given specie and community to withstand this pressure is importance, but I do not really see how coexistence is the core logical framework to describe systems responses to heat waves (or other extremes). The authors may have a point, but it must be described.</w:t>
-      </w:r>
-      <w:r>
-        <w:br/>
-      </w:r>
-    </w:p>
-    <w:p>
-      <w:r>
-        <w:rPr>
-          <w:b/>
-          <w:bCs/>
-          <w:color w:val="215E99" w:themeColor="text2" w:themeTint="BF"/>
-        </w:rPr>
-        <w:t>Response</w:t>
-      </w:r>
-      <w:r>
-        <w:rPr>
-          <w:color w:val="215E99" w:themeColor="text2" w:themeTint="BF"/>
-        </w:rPr>
-        <w:t>:</w:t>
-      </w:r>
-    </w:p>
-    <w:p>
-      <w:r>
-        <w:lastRenderedPageBreak/>
-        <w:br/>
-      </w:r>
-      <w:r>
-        <w:rPr>
-          <w:b/>
-          <w:bCs/>
-        </w:rPr>
-        <w:t>C</w:t>
-      </w:r>
-      <w:r>
-        <w:rPr>
-          <w:b/>
-          <w:bCs/>
-        </w:rPr>
-        <w:t>48</w:t>
-      </w:r>
-      <w:r>
-        <w:rPr>
-          <w:b/>
-          <w:bCs/>
-        </w:rPr>
-        <w:t>:</w:t>
-      </w:r>
-      <w:r>
-        <w:rPr>
-          <w:b/>
-          <w:bCs/>
-        </w:rPr>
-        <w:t xml:space="preserve"> </w:t>
-      </w:r>
-      <w:r>
-        <w:t>Box 2 - I think there is a time perspective missing in the description of heat waves as the driver for natural selection and evolution, and I think these two aspects are mistakenly mixed up. Extreme events may clearly drive selection of genetic variants that has the traits to survive the extreme pressure, but less so for evolution because it is a single and dramatic event. And evolution runs over longer time scales. Further, the consequence of extreme events may not be adaptation and evolution, but simply dieback, disappearence and replacement. Extreme events may cause dieback and complete removal of certain species or a complete exchange of existing species and systems with new and different species and system (e.g. desertification) meaning that survival and/or invasion may be more important. So, many of the aspects mentioned here clearly play an important role, but may only present part of the story and other relevant and equally important processes and ressponses are completely missing. For example, the equation 2 seems to be of minor importance (as also stated in the box text).</w:t>
-      </w:r>
-      <w:r>
-        <w:br/>
-      </w:r>
-    </w:p>
-    <w:p>
-      <w:r>
-        <w:rPr>
-          <w:b/>
-          <w:bCs/>
-          <w:color w:val="215E99" w:themeColor="text2" w:themeTint="BF"/>
-        </w:rPr>
-        <w:t>Response</w:t>
-      </w:r>
-      <w:r>
-        <w:rPr>
-          <w:color w:val="215E99" w:themeColor="text2" w:themeTint="BF"/>
-        </w:rPr>
-        <w:t>:</w:t>
-      </w:r>
-      <w:r>
-        <w:rPr>
-          <w:color w:val="215E99" w:themeColor="text2" w:themeTint="BF"/>
-        </w:rPr>
-        <w:t xml:space="preserve"> Sorry, we are not quite sure what Reviewer 3 means here</w:t>
-      </w:r>
-      <w:r>
-        <w:rPr>
-          <w:color w:val="215E99" w:themeColor="text2" w:themeTint="BF"/>
-        </w:rPr>
-        <w:t>, and we respectfully disagree with some statements</w:t>
-      </w:r>
-      <w:r>
-        <w:rPr>
-          <w:color w:val="215E99" w:themeColor="text2" w:themeTint="BF"/>
-        </w:rPr>
-        <w:t xml:space="preserve">. Evolution can happen over ecological timescales, and extreme events have been shown to lead to rapid evolutionary change (for a recent review see: </w:t>
-      </w:r>
-      <w:r>
-        <w:rPr>
-          <w:color w:val="215E99" w:themeColor="text2" w:themeTint="BF"/>
-        </w:rPr>
-        <w:t>Baeckens, S. and Donihue, C.M., 2025. Evolutionary consequences of extreme climate events. Current Biology, 35(17), R850-R864</w:t>
-      </w:r>
-      <w:r>
-        <w:rPr>
-          <w:color w:val="215E99" w:themeColor="text2" w:themeTint="BF"/>
-        </w:rPr>
-        <w:t xml:space="preserve">). </w:t>
-      </w:r>
-      <w:r>
-        <w:rPr>
-          <w:color w:val="215E99" w:themeColor="text2" w:themeTint="BF"/>
-        </w:rPr>
-        <w:t xml:space="preserve">We do not disagree with Reviewer 3 that that dieback is not an example of evolutionary adaptation, but this example is not one we discuss, so it is unclear how it pertains to Box 3. </w:t>
-      </w:r>
-      <w:r>
-        <w:rPr>
-          <w:color w:val="215E99" w:themeColor="text2" w:themeTint="BF"/>
-        </w:rPr>
-        <w:t xml:space="preserve">Any systems modelling approach needs to eventually identify ways to incorporate eco-evolutionary feedback. Short term evolutionary shifts resulting from extreme climates not only are a </w:t>
-      </w:r>
-      <w:r>
-        <w:rPr>
-          <w:color w:val="215E99" w:themeColor="text2" w:themeTint="BF"/>
-        </w:rPr>
-        <w:t>strong selective episode</w:t>
-      </w:r>
-      <w:r>
-        <w:rPr>
-          <w:color w:val="215E99" w:themeColor="text2" w:themeTint="BF"/>
-        </w:rPr>
-        <w:t xml:space="preserve"> but impact genetic variance which can affect how a system responds in the future. </w:t>
-      </w:r>
-      <w:r>
-        <w:rPr>
-          <w:color w:val="215E99" w:themeColor="text2" w:themeTint="BF"/>
-        </w:rPr>
-        <w:t>There are very clear examples where this is the case, including some classic work (e.g. Bumpus, 1987).</w:t>
-      </w:r>
-    </w:p>
-    <w:p>
-      <w:r>
-        <w:br/>
-      </w:r>
-      <w:r>
-        <w:rPr>
-          <w:b/>
-          <w:bCs/>
-        </w:rPr>
-        <w:t>C</w:t>
-      </w:r>
-      <w:r>
-        <w:rPr>
-          <w:b/>
-          <w:bCs/>
-        </w:rPr>
-        <w:t>49</w:t>
-      </w:r>
-      <w:r>
-        <w:rPr>
-          <w:b/>
-          <w:bCs/>
-        </w:rPr>
-        <w:t>:</w:t>
-      </w:r>
-      <w:r>
-        <w:rPr>
-          <w:b/>
-          <w:bCs/>
-        </w:rPr>
-        <w:t xml:space="preserve"> </w:t>
-      </w:r>
-      <w:r>
-        <w:t xml:space="preserve">Box 3 - I acknowledge that heat waves </w:t>
-      </w:r>
-      <w:commentRangeStart w:id="16"/>
-      <w:r>
-        <w:t xml:space="preserve">and other climatic extremes causing major impacts on plants and ecosystems will cascade to also have potentially significant societal impacts. However, the paper has a strange mismatch in scale with on the one hand quite some detailed description of single species and on the other hand attempts to embrace the entire global society - and these overly complex societal responses are handled by a single box and just 15 lines! This is just not convincing. </w:t>
-      </w:r>
-      <w:commentRangeEnd w:id="16"/>
-      <w:r>
-        <w:rPr>
-          <w:rStyle w:val="CommentReference"/>
-        </w:rPr>
-        <w:commentReference w:id="16"/>
-      </w:r>
-      <w:r>
-        <w:t>The societal aspects of these changes may be really complex and involve severe impacts on anything from changes in classic provisionary ecosystems services like food, feed and fibre to economic progress, human behavior, migration and political unrest. These are really complex changes which the paper does not really acknowledge, and therefore the statement in line 292 that systems modelling can provide us with quantitative tools for predictins and decisions may in principle be correct, but we do not get any clear descriptions or approaches (which was the promise in the title of the paper) - or even a glance of what need to be scientifically and modelwise developed to get there. It may be relevant to include these aspects, but it has to be carefully described and framed, and the modelling aspects must be treated with the same carefulness as the physical-biological systems.</w:t>
+        <w:t xml:space="preserve">Line 165-217 - There is a lot about responses of organisms and almost nothing about systems. And all examples given are for individual species. You claim that the papers should go across dimensions - but you give almost no ideas to provide the systems integration. I know that systems </w:t>
+      </w:r>
+      <w:proofErr w:type="gramStart"/>
+      <w:r>
+        <w:t>consists</w:t>
+      </w:r>
+      <w:proofErr w:type="gramEnd"/>
+      <w:r>
+        <w:t xml:space="preserve"> of individuals, but doing species and individuals right does not automatically lead to correct treatments of systems.</w:t>
       </w:r>
       <w:r>
         <w:br/>
@@ -3983,7 +4361,704 @@
         <w:rPr>
           <w:color w:val="215E99" w:themeColor="text2" w:themeTint="BF"/>
         </w:rPr>
-        <w:t xml:space="preserve"> We agree. We have now removed the SES discussion from the paper and focused on the biological models. We make brief mention in the introduction and concluding remarks section about the implications for socioecological modelling. Instead we use this extra box </w:t>
+        <w:t xml:space="preserve"> This is precisely the point. Most studies focus on single species and our argument in the paper is that we need to move beyond that to start modelling entire systems. We have very limited examples of truly systems-based modelling, and it has major benefits in allowing </w:t>
+      </w:r>
+      <w:r>
+        <w:rPr>
+          <w:color w:val="215E99" w:themeColor="text2" w:themeTint="BF"/>
+        </w:rPr>
+        <w:t xml:space="preserve">us </w:t>
+      </w:r>
+      <w:r>
+        <w:rPr>
+          <w:color w:val="215E99" w:themeColor="text2" w:themeTint="BF"/>
+        </w:rPr>
+        <w:t>to capture feedback between species within a system. We have re-written our manuscript to hopefully emphasise this point better. In addition, our boxes now demonstrate more clearly how to go across systems (at least in a hypothetical sense, but this is a review paper after all, not an empirical study).</w:t>
+      </w:r>
+    </w:p>
+    <w:p>
+      <w:r>
+        <w:br/>
+      </w:r>
+      <w:r>
+        <w:rPr>
+          <w:b/>
+          <w:bCs/>
+        </w:rPr>
+        <w:t>C</w:t>
+      </w:r>
+      <w:r>
+        <w:rPr>
+          <w:b/>
+          <w:bCs/>
+        </w:rPr>
+        <w:t>44</w:t>
+      </w:r>
+      <w:r>
+        <w:rPr>
+          <w:b/>
+          <w:bCs/>
+        </w:rPr>
+        <w:t>:</w:t>
+      </w:r>
+      <w:r>
+        <w:rPr>
+          <w:b/>
+          <w:bCs/>
+        </w:rPr>
+        <w:t xml:space="preserve"> </w:t>
+      </w:r>
+      <w:r>
+        <w:t xml:space="preserve">Box 1 and Figure 2 - It is an important aspect to include - the mediation of heat waves at the systems level and through interaction with different other drivers. However, the figure is </w:t>
+      </w:r>
+      <w:proofErr w:type="gramStart"/>
+      <w:r>
+        <w:t>really hard</w:t>
+      </w:r>
+      <w:proofErr w:type="gramEnd"/>
+      <w:r>
+        <w:t xml:space="preserve"> to read and understand, and to me it is not enough to treat this in a box and figure, but the message </w:t>
+      </w:r>
+      <w:proofErr w:type="gramStart"/>
+      <w:r>
+        <w:t>has to</w:t>
+      </w:r>
+      <w:proofErr w:type="gramEnd"/>
+      <w:r>
+        <w:t xml:space="preserve"> be integrated into the text as well. You need to include the aspects of mediation into the description and not just rely on the reader being able to see the consequences of these aspects just by having it in a box or a figure. The figure text is not at all useful.</w:t>
+      </w:r>
+      <w:r>
+        <w:br/>
+      </w:r>
+    </w:p>
+    <w:p>
+      <w:r>
+        <w:rPr>
+          <w:b/>
+          <w:bCs/>
+          <w:color w:val="215E99" w:themeColor="text2" w:themeTint="BF"/>
+        </w:rPr>
+        <w:t>Response</w:t>
+      </w:r>
+      <w:r>
+        <w:rPr>
+          <w:color w:val="215E99" w:themeColor="text2" w:themeTint="BF"/>
+        </w:rPr>
+        <w:t>:</w:t>
+      </w:r>
+      <w:r>
+        <w:rPr>
+          <w:color w:val="215E99" w:themeColor="text2" w:themeTint="BF"/>
+        </w:rPr>
+        <w:t xml:space="preserve"> Agreed. We have now completely removed this box and associated figure and rather </w:t>
+      </w:r>
+      <w:r>
+        <w:rPr>
+          <w:color w:val="215E99" w:themeColor="text2" w:themeTint="BF"/>
+        </w:rPr>
+        <w:t>refer</w:t>
+      </w:r>
+      <w:r>
+        <w:rPr>
+          <w:color w:val="215E99" w:themeColor="text2" w:themeTint="BF"/>
+        </w:rPr>
+        <w:t xml:space="preserve"> to these mediators in the thermal load sensitivity section. </w:t>
+      </w:r>
+    </w:p>
+    <w:p>
+      <w:r>
+        <w:br/>
+      </w:r>
+      <w:r>
+        <w:rPr>
+          <w:b/>
+          <w:bCs/>
+        </w:rPr>
+        <w:t>C</w:t>
+      </w:r>
+      <w:r>
+        <w:rPr>
+          <w:b/>
+          <w:bCs/>
+        </w:rPr>
+        <w:t>45</w:t>
+      </w:r>
+      <w:r>
+        <w:rPr>
+          <w:b/>
+          <w:bCs/>
+        </w:rPr>
+        <w:t>:</w:t>
+      </w:r>
+      <w:r>
+        <w:rPr>
+          <w:b/>
+          <w:bCs/>
+        </w:rPr>
+        <w:t xml:space="preserve"> </w:t>
+      </w:r>
+      <w:r>
+        <w:t>Glossary - hmmm - not clear why you bring this and why exactly those words are explained?</w:t>
+      </w:r>
+      <w:r>
+        <w:br/>
+      </w:r>
+    </w:p>
+    <w:p>
+      <w:r>
+        <w:rPr>
+          <w:b/>
+          <w:bCs/>
+          <w:color w:val="215E99" w:themeColor="text2" w:themeTint="BF"/>
+        </w:rPr>
+        <w:t>Response</w:t>
+      </w:r>
+      <w:r>
+        <w:rPr>
+          <w:color w:val="215E99" w:themeColor="text2" w:themeTint="BF"/>
+        </w:rPr>
+        <w:t>:</w:t>
+      </w:r>
+      <w:r>
+        <w:rPr>
+          <w:color w:val="215E99" w:themeColor="text2" w:themeTint="BF"/>
+        </w:rPr>
+        <w:t xml:space="preserve"> TREE requires a glossary which is why we have it. We have chosen these terms because they are the key terms used within fields that may not be familiar to readers outside those fields. </w:t>
+      </w:r>
+      <w:r>
+        <w:rPr>
+          <w:color w:val="215E99" w:themeColor="text2" w:themeTint="BF"/>
+        </w:rPr>
+        <w:t xml:space="preserve">If there are others Reviewer 3 feels are more important that we may have </w:t>
+      </w:r>
+      <w:r>
+        <w:rPr>
+          <w:color w:val="215E99" w:themeColor="text2" w:themeTint="BF"/>
+        </w:rPr>
+        <w:t>missed,</w:t>
+      </w:r>
+      <w:r>
+        <w:rPr>
+          <w:color w:val="215E99" w:themeColor="text2" w:themeTint="BF"/>
+        </w:rPr>
+        <w:t xml:space="preserve"> we are happy to add those or replace with existing terms. </w:t>
+      </w:r>
+    </w:p>
+    <w:p>
+      <w:r>
+        <w:br/>
+      </w:r>
+      <w:r>
+        <w:rPr>
+          <w:b/>
+          <w:bCs/>
+        </w:rPr>
+        <w:t>C</w:t>
+      </w:r>
+      <w:r>
+        <w:rPr>
+          <w:b/>
+          <w:bCs/>
+        </w:rPr>
+        <w:t>46</w:t>
+      </w:r>
+      <w:r>
+        <w:rPr>
+          <w:b/>
+          <w:bCs/>
+        </w:rPr>
+        <w:t>:</w:t>
+      </w:r>
+      <w:r>
+        <w:rPr>
+          <w:b/>
+          <w:bCs/>
+        </w:rPr>
+        <w:t xml:space="preserve"> </w:t>
+      </w:r>
+      <w:r>
+        <w:t xml:space="preserve">Line 248-253 - The interaction between </w:t>
+      </w:r>
+      <w:commentRangeStart w:id="12"/>
+      <w:r>
+        <w:t xml:space="preserve">temperature and water are </w:t>
+      </w:r>
+      <w:proofErr w:type="gramStart"/>
+      <w:r>
+        <w:t>really important</w:t>
+      </w:r>
+      <w:proofErr w:type="gramEnd"/>
+      <w:r>
+        <w:t xml:space="preserve">, also for the case of heat waves, but I think it deserves a bit more attention </w:t>
+      </w:r>
+      <w:commentRangeEnd w:id="12"/>
+      <w:r>
+        <w:rPr>
+          <w:rStyle w:val="CommentReference"/>
+        </w:rPr>
+        <w:commentReference w:id="12"/>
+      </w:r>
+      <w:r>
+        <w:t>in the paper.</w:t>
+      </w:r>
+      <w:r>
+        <w:br/>
+      </w:r>
+    </w:p>
+    <w:p>
+      <w:r>
+        <w:rPr>
+          <w:b/>
+          <w:bCs/>
+          <w:color w:val="215E99" w:themeColor="text2" w:themeTint="BF"/>
+        </w:rPr>
+        <w:t>Response</w:t>
+      </w:r>
+      <w:r>
+        <w:rPr>
+          <w:color w:val="215E99" w:themeColor="text2" w:themeTint="BF"/>
+        </w:rPr>
+        <w:t>:</w:t>
+      </w:r>
+      <w:r>
+        <w:rPr>
+          <w:color w:val="215E99" w:themeColor="text2" w:themeTint="BF"/>
+        </w:rPr>
+        <w:t xml:space="preserve"> </w:t>
+      </w:r>
+      <w:r>
+        <w:rPr>
+          <w:color w:val="215E99" w:themeColor="text2" w:themeTint="BF"/>
+        </w:rPr>
+        <w:t xml:space="preserve">We have tried to better emphasise that water will be important by bringing in water budget models and discussing responses to both water and temperature. In addition, Figure 4 deals with </w:t>
+      </w:r>
+      <w:r>
+        <w:rPr>
+          <w:b/>
+          <w:bCs/>
+          <w:i/>
+          <w:iCs/>
+          <w:color w:val="215E99" w:themeColor="text2" w:themeTint="BF"/>
+        </w:rPr>
+        <w:t>both</w:t>
+      </w:r>
+      <w:r>
+        <w:rPr>
+          <w:color w:val="215E99" w:themeColor="text2" w:themeTint="BF"/>
+        </w:rPr>
+        <w:t xml:space="preserve"> water and temperature within the context of identifying solutions to deal with extreme heat.</w:t>
+      </w:r>
+    </w:p>
+    <w:p>
+      <w:r>
+        <w:br/>
+      </w:r>
+      <w:r>
+        <w:rPr>
+          <w:b/>
+          <w:bCs/>
+        </w:rPr>
+        <w:t>C</w:t>
+      </w:r>
+      <w:r>
+        <w:rPr>
+          <w:b/>
+          <w:bCs/>
+        </w:rPr>
+        <w:t>47</w:t>
+      </w:r>
+      <w:r>
+        <w:rPr>
+          <w:b/>
+          <w:bCs/>
+        </w:rPr>
+        <w:t>:</w:t>
+      </w:r>
+      <w:r>
+        <w:rPr>
+          <w:b/>
+          <w:bCs/>
+        </w:rPr>
+        <w:t xml:space="preserve"> </w:t>
+      </w:r>
+      <w:r>
+        <w:t>Line 256 - What is the idea behind the use of "</w:t>
+      </w:r>
+      <w:commentRangeStart w:id="13"/>
+      <w:r>
+        <w:t>coexistence" as a key explanatory model? It is true that species interactions are relevant for describing the interaction between two or more species relative to the site conditions at a given site</w:t>
+      </w:r>
+      <w:commentRangeEnd w:id="13"/>
+      <w:r>
+        <w:rPr>
+          <w:rStyle w:val="CommentReference"/>
+        </w:rPr>
+        <w:commentReference w:id="13"/>
+      </w:r>
+      <w:r>
+        <w:t xml:space="preserve">. But how is that relevant for the understanding of the overall consequences of extremes and heat waves? I would think coexistence is of core relevance for general site conditions and for more gradual climatic changes, while the sudden and potentially dieback provoking nature of extreme events, also described here by damage and repair, would be different from classic coexistence. </w:t>
+      </w:r>
+      <w:proofErr w:type="spellStart"/>
+      <w:r>
+        <w:t>Ofcourse</w:t>
+      </w:r>
+      <w:proofErr w:type="spellEnd"/>
+      <w:r>
+        <w:t xml:space="preserve">, if future heat waves is a novel factor for a given site, the ability of a given specie and community to withstand this pressure is importance, but I do not really see how coexistence is the core logical framework to describe systems responses to heat waves (or other extremes). The authors may have a point, </w:t>
+      </w:r>
+      <w:r>
+        <w:lastRenderedPageBreak/>
+        <w:t>but it must be described.</w:t>
+      </w:r>
+      <w:r>
+        <w:br/>
+      </w:r>
+    </w:p>
+    <w:p>
+      <w:r>
+        <w:rPr>
+          <w:b/>
+          <w:bCs/>
+          <w:color w:val="215E99" w:themeColor="text2" w:themeTint="BF"/>
+        </w:rPr>
+        <w:t>Re</w:t>
+      </w:r>
+      <w:r>
+        <w:rPr>
+          <w:b/>
+          <w:bCs/>
+          <w:color w:val="215E99" w:themeColor="text2" w:themeTint="BF"/>
+          <w:highlight w:val="yellow"/>
+        </w:rPr>
+        <w:t>spon</w:t>
+      </w:r>
+      <w:r>
+        <w:rPr>
+          <w:b/>
+          <w:bCs/>
+          <w:color w:val="215E99" w:themeColor="text2" w:themeTint="BF"/>
+        </w:rPr>
+        <w:t>se</w:t>
+      </w:r>
+      <w:r>
+        <w:rPr>
+          <w:color w:val="215E99" w:themeColor="text2" w:themeTint="BF"/>
+        </w:rPr>
+        <w:t>:</w:t>
+      </w:r>
+    </w:p>
+    <w:p>
+      <w:r>
+        <w:br/>
+      </w:r>
+      <w:r>
+        <w:rPr>
+          <w:b/>
+          <w:bCs/>
+        </w:rPr>
+        <w:t>C</w:t>
+      </w:r>
+      <w:r>
+        <w:rPr>
+          <w:b/>
+          <w:bCs/>
+        </w:rPr>
+        <w:t>48</w:t>
+      </w:r>
+      <w:r>
+        <w:rPr>
+          <w:b/>
+          <w:bCs/>
+        </w:rPr>
+        <w:t>:</w:t>
+      </w:r>
+      <w:r>
+        <w:rPr>
+          <w:b/>
+          <w:bCs/>
+        </w:rPr>
+        <w:t xml:space="preserve"> </w:t>
+      </w:r>
+      <w:r>
+        <w:t xml:space="preserve">Box 2 - I think there is a time perspective missing in the description of heat waves as the driver for natural selection and evolution, and I think these two aspects are mistakenly mixed up. Extreme events may clearly drive selection of genetic variants that has the traits to survive the extreme pressure, but less so for evolution because it is a single and dramatic event. And evolution runs over longer time scales. Further, the consequence of extreme events may not be adaptation and evolution, but simply dieback, </w:t>
+      </w:r>
+      <w:proofErr w:type="spellStart"/>
+      <w:r>
+        <w:t>disappearence</w:t>
+      </w:r>
+      <w:proofErr w:type="spellEnd"/>
+      <w:r>
+        <w:t xml:space="preserve"> and replacement. Extreme events may cause dieback and complete removal of certain species or a complete exchange of existing species and systems with new and different species and system (e.g. desertification) meaning that survival and/or invasion may be more important. So, many of the aspects mentioned here clearly play an important </w:t>
+      </w:r>
+      <w:proofErr w:type="gramStart"/>
+      <w:r>
+        <w:t>role, but</w:t>
+      </w:r>
+      <w:proofErr w:type="gramEnd"/>
+      <w:r>
+        <w:t xml:space="preserve"> may only present part of the story and other relevant and equally important processes and </w:t>
+      </w:r>
+      <w:proofErr w:type="spellStart"/>
+      <w:r>
+        <w:t>ressponses</w:t>
+      </w:r>
+      <w:proofErr w:type="spellEnd"/>
+      <w:r>
+        <w:t xml:space="preserve"> are completely missing. For example, the equation 2 seems to be of minor importance (as also stated in the box text).</w:t>
+      </w:r>
+      <w:r>
+        <w:br/>
+      </w:r>
+    </w:p>
+    <w:p>
+      <w:r>
+        <w:rPr>
+          <w:b/>
+          <w:bCs/>
+          <w:color w:val="215E99" w:themeColor="text2" w:themeTint="BF"/>
+        </w:rPr>
+        <w:t>Response</w:t>
+      </w:r>
+      <w:r>
+        <w:rPr>
+          <w:color w:val="215E99" w:themeColor="text2" w:themeTint="BF"/>
+        </w:rPr>
+        <w:t>:</w:t>
+      </w:r>
+      <w:r>
+        <w:rPr>
+          <w:color w:val="215E99" w:themeColor="text2" w:themeTint="BF"/>
+        </w:rPr>
+        <w:t xml:space="preserve"> Sorry, we are not quite sure what Reviewer 3 means here</w:t>
+      </w:r>
+      <w:r>
+        <w:rPr>
+          <w:color w:val="215E99" w:themeColor="text2" w:themeTint="BF"/>
+        </w:rPr>
+        <w:t>, and we respectfully disagree with some statements</w:t>
+      </w:r>
+      <w:r>
+        <w:rPr>
+          <w:color w:val="215E99" w:themeColor="text2" w:themeTint="BF"/>
+        </w:rPr>
+        <w:t xml:space="preserve">. Evolution can happen over ecological timescales, and extreme events have been shown to lead to rapid evolutionary change (for a recent review see: </w:t>
+      </w:r>
+      <w:r>
+        <w:rPr>
+          <w:color w:val="215E99" w:themeColor="text2" w:themeTint="BF"/>
+        </w:rPr>
+        <w:t>Baeckens, S. and Donihue, C.M., 2025. Evolutionary consequences of extreme climate events. Current Biology, 35(17), R850-R864</w:t>
+      </w:r>
+      <w:r>
+        <w:rPr>
+          <w:color w:val="215E99" w:themeColor="text2" w:themeTint="BF"/>
+        </w:rPr>
+        <w:t xml:space="preserve">). </w:t>
+      </w:r>
+      <w:r>
+        <w:rPr>
+          <w:color w:val="215E99" w:themeColor="text2" w:themeTint="BF"/>
+        </w:rPr>
+        <w:t xml:space="preserve">We do not disagree with Reviewer 3 that that dieback is not an example of evolutionary adaptation, but this example is not one we discuss, so it is unclear how it pertains to Box 3. </w:t>
+      </w:r>
+      <w:r>
+        <w:rPr>
+          <w:color w:val="215E99" w:themeColor="text2" w:themeTint="BF"/>
+        </w:rPr>
+        <w:t xml:space="preserve">Any systems modelling approach needs to eventually identify ways to incorporate eco-evolutionary feedback. Short term evolutionary shifts </w:t>
+      </w:r>
+      <w:r>
+        <w:rPr>
+          <w:color w:val="215E99" w:themeColor="text2" w:themeTint="BF"/>
+        </w:rPr>
+        <w:t xml:space="preserve">or plastic responses </w:t>
+      </w:r>
+      <w:r>
+        <w:rPr>
+          <w:color w:val="215E99" w:themeColor="text2" w:themeTint="BF"/>
+        </w:rPr>
+        <w:t xml:space="preserve">resulting from extreme climates not only </w:t>
+      </w:r>
+      <w:r>
+        <w:rPr>
+          <w:color w:val="215E99" w:themeColor="text2" w:themeTint="BF"/>
+        </w:rPr>
+        <w:t xml:space="preserve">depend (and impact) on selection strength </w:t>
+      </w:r>
+      <w:r>
+        <w:rPr>
+          <w:color w:val="215E99" w:themeColor="text2" w:themeTint="BF"/>
+        </w:rPr>
+        <w:t xml:space="preserve">but </w:t>
+      </w:r>
+      <w:r>
+        <w:rPr>
+          <w:color w:val="215E99" w:themeColor="text2" w:themeTint="BF"/>
+        </w:rPr>
+        <w:t>also</w:t>
+      </w:r>
+      <w:r>
+        <w:rPr>
+          <w:color w:val="215E99" w:themeColor="text2" w:themeTint="BF"/>
+        </w:rPr>
+        <w:t xml:space="preserve"> </w:t>
+      </w:r>
+      <w:r>
+        <w:rPr>
+          <w:color w:val="215E99" w:themeColor="text2" w:themeTint="BF"/>
+        </w:rPr>
+        <w:t xml:space="preserve">phenotypic and </w:t>
+      </w:r>
+      <w:r>
+        <w:rPr>
+          <w:color w:val="215E99" w:themeColor="text2" w:themeTint="BF"/>
+        </w:rPr>
+        <w:t xml:space="preserve">genetic variance which can affect how a system responds in the future. </w:t>
+      </w:r>
+      <w:r>
+        <w:rPr>
+          <w:color w:val="215E99" w:themeColor="text2" w:themeTint="BF"/>
+        </w:rPr>
+        <w:t>We agree however that this box needed to be more focused and emphasis a few of these important points better. It also needed to be shortened so we have re-written the text in this box (now Box 3).</w:t>
+      </w:r>
+    </w:p>
+    <w:p>
+      <w:r>
+        <w:br/>
+      </w:r>
+      <w:r>
+        <w:rPr>
+          <w:b/>
+          <w:bCs/>
+        </w:rPr>
+        <w:t>C</w:t>
+      </w:r>
+      <w:r>
+        <w:rPr>
+          <w:b/>
+          <w:bCs/>
+        </w:rPr>
+        <w:t>49</w:t>
+      </w:r>
+      <w:r>
+        <w:rPr>
+          <w:b/>
+          <w:bCs/>
+        </w:rPr>
+        <w:t>:</w:t>
+      </w:r>
+      <w:r>
+        <w:rPr>
+          <w:b/>
+          <w:bCs/>
+        </w:rPr>
+        <w:t xml:space="preserve"> </w:t>
+      </w:r>
+      <w:r>
+        <w:t xml:space="preserve">Box 3 - I acknowledge that heat waves </w:t>
+      </w:r>
+      <w:commentRangeStart w:id="14"/>
+      <w:r>
+        <w:t xml:space="preserve">and other climatic extremes causing major impacts on plants and ecosystems will cascade to also have potentially significant societal impacts. However, the paper has a strange mismatch in scale with on the one hand quite some detailed description of single species and on the other hand attempts to embrace the entire global society - and these overly complex societal responses are handled by a single box and just 15 lines! This is just not convincing. </w:t>
+      </w:r>
+      <w:commentRangeEnd w:id="14"/>
+      <w:r>
+        <w:rPr>
+          <w:rStyle w:val="CommentReference"/>
+        </w:rPr>
+        <w:commentReference w:id="14"/>
+      </w:r>
+      <w:r>
+        <w:t xml:space="preserve">The societal aspects of these changes may be </w:t>
+      </w:r>
+      <w:proofErr w:type="gramStart"/>
+      <w:r>
+        <w:t>really complex</w:t>
+      </w:r>
+      <w:proofErr w:type="gramEnd"/>
+      <w:r>
+        <w:t xml:space="preserve"> and involve severe impacts on anything from changes in classic </w:t>
+      </w:r>
+      <w:proofErr w:type="spellStart"/>
+      <w:r>
+        <w:t>provisionary</w:t>
+      </w:r>
+      <w:proofErr w:type="spellEnd"/>
+      <w:r>
+        <w:t xml:space="preserve"> ecosystems services like food, feed and fibre to economic progress, human </w:t>
+      </w:r>
+      <w:proofErr w:type="spellStart"/>
+      <w:r>
+        <w:t>behavior</w:t>
+      </w:r>
+      <w:proofErr w:type="spellEnd"/>
+      <w:r>
+        <w:t xml:space="preserve">, migration and political unrest. These are really complex changes which the paper does not really acknowledge, and therefore the statement in line 292 that systems modelling can provide us with quantitative tools for </w:t>
+      </w:r>
+      <w:proofErr w:type="spellStart"/>
+      <w:r>
+        <w:t>predictins</w:t>
+      </w:r>
+      <w:proofErr w:type="spellEnd"/>
+      <w:r>
+        <w:t xml:space="preserve"> and decisions may in principle be correct, but we do not get any clear descriptions or approaches (which was the promise in the title of the paper) - or even a </w:t>
+      </w:r>
+      <w:r>
+        <w:lastRenderedPageBreak/>
+        <w:t xml:space="preserve">glance of what need to be scientifically and </w:t>
+      </w:r>
+      <w:proofErr w:type="spellStart"/>
+      <w:r>
+        <w:t>modelwise</w:t>
+      </w:r>
+      <w:proofErr w:type="spellEnd"/>
+      <w:r>
+        <w:t xml:space="preserve"> developed to get there. It may be relevant to include these aspects, but it </w:t>
+      </w:r>
+      <w:proofErr w:type="gramStart"/>
+      <w:r>
+        <w:t>has to</w:t>
+      </w:r>
+      <w:proofErr w:type="gramEnd"/>
+      <w:r>
+        <w:t xml:space="preserve"> be carefully described and framed, and the modelling aspects must be treated with the same carefulness as the physical-biological systems.</w:t>
+      </w:r>
+      <w:r>
+        <w:br/>
+      </w:r>
+    </w:p>
+    <w:p>
+      <w:r>
+        <w:rPr>
+          <w:b/>
+          <w:bCs/>
+          <w:color w:val="215E99" w:themeColor="text2" w:themeTint="BF"/>
+        </w:rPr>
+        <w:t>Response</w:t>
+      </w:r>
+      <w:r>
+        <w:rPr>
+          <w:color w:val="215E99" w:themeColor="text2" w:themeTint="BF"/>
+        </w:rPr>
+        <w:t>:</w:t>
+      </w:r>
+      <w:r>
+        <w:rPr>
+          <w:color w:val="215E99" w:themeColor="text2" w:themeTint="BF"/>
+        </w:rPr>
+        <w:t xml:space="preserve"> We agree. We have now removed the SES discussion from the paper and focused on the biological models. We make brief mention in the introduction and concluding remarks section about the implications for socioecological modelling. </w:t>
+      </w:r>
+      <w:r>
+        <w:rPr>
+          <w:color w:val="215E99" w:themeColor="text2" w:themeTint="BF"/>
+        </w:rPr>
+        <w:t>Instead,</w:t>
+      </w:r>
+      <w:r>
+        <w:rPr>
+          <w:color w:val="215E99" w:themeColor="text2" w:themeTint="BF"/>
+        </w:rPr>
+        <w:t xml:space="preserve"> we use this extra box </w:t>
       </w:r>
       <w:r>
         <w:rPr>
@@ -4153,32 +5228,72 @@
         <w:t xml:space="preserve"> </w:t>
       </w:r>
       <w:r>
-        <w:t>Outstanding questions - It is great with this attempt to summarize the messages into the next step or research needs for the future. But, these questions should follow logically from the paper, which I do not think they do. I cannot identify for any of the 8 points where this is a logical conclusion from things presented and discussed in the paper. Moreover, these 8 points are quite substantial outstanding questions which speaks against the title of the paper promising the reader an approach to model consequences of heat waves. It seems to me that the authors should consider, whether they actually believe</w:t>
-      </w:r>
-      <w:commentRangeStart w:id="17"/>
-      <w:r>
-        <w:t>s they can present a model approach, and if so, then present the approach with clear documentation and figures that present the different elements and how they are linked</w:t>
-      </w:r>
-      <w:commentRangeEnd w:id="17"/>
+        <w:t xml:space="preserve">Outstanding questions - It is great with this attempt to summarize the messages into the next step or research needs for the future. </w:t>
+      </w:r>
+      <w:proofErr w:type="gramStart"/>
+      <w:r>
+        <w:t>But,</w:t>
+      </w:r>
+      <w:proofErr w:type="gramEnd"/>
+      <w:r>
+        <w:t xml:space="preserve"> these questions should follow logically from the paper, which I do not think they do. I cannot identify for any of the 8 points where this is a logical conclusion from things presented and discussed in the paper. Moreover, these 8 points are quite substantial outstanding questions which speaks against the title of the paper promising the reader an approach to model consequences of heat waves. It seems to me that the authors should </w:t>
+      </w:r>
+      <w:proofErr w:type="gramStart"/>
+      <w:r>
+        <w:t>consider,</w:t>
+      </w:r>
+      <w:proofErr w:type="gramEnd"/>
+      <w:r>
+        <w:t xml:space="preserve"> whether they actually </w:t>
+      </w:r>
+      <w:proofErr w:type="gramStart"/>
+      <w:r>
+        <w:t>believe</w:t>
+      </w:r>
+      <w:commentRangeStart w:id="15"/>
+      <w:r>
+        <w:t>s</w:t>
+      </w:r>
+      <w:proofErr w:type="gramEnd"/>
+      <w:r>
+        <w:t xml:space="preserve"> they can present a model approach, and if so, then present the approach with clear documentation and figures that present the different elements and how they are linked</w:t>
+      </w:r>
+      <w:commentRangeEnd w:id="15"/>
       <w:r>
         <w:rPr>
           <w:rStyle w:val="CommentReference"/>
         </w:rPr>
-        <w:commentReference w:id="17"/>
-      </w:r>
-      <w:r>
-        <w:t xml:space="preserve">. Or, if such an approach is more wishful thinking and not achievable at the moment, then present an open review or "directions" paper on what we know and what we need in order to get there with clear identification of the elements we stand on and the steps of progress we should take. This should also include a better integration with ecological science to identify </w:t>
-      </w:r>
-      <w:commentRangeStart w:id="18"/>
+        <w:commentReference w:id="15"/>
+      </w:r>
+      <w:r>
+        <w:t xml:space="preserve">. Or, if such an approach is more wishful thinking and not achievable </w:t>
+      </w:r>
+      <w:proofErr w:type="gramStart"/>
+      <w:r>
+        <w:t>at the moment</w:t>
+      </w:r>
+      <w:proofErr w:type="gramEnd"/>
+      <w:r>
+        <w:t xml:space="preserve">, then present an open review or "directions" paper on what we know and what we need </w:t>
+      </w:r>
+      <w:proofErr w:type="gramStart"/>
+      <w:r>
+        <w:t>in order to</w:t>
+      </w:r>
+      <w:proofErr w:type="gramEnd"/>
+      <w:r>
+        <w:t xml:space="preserve"> get there with clear identification of the elements we stand on and the steps of progress we should take. This should also include a better integration with ecological science to identify </w:t>
+      </w:r>
+      <w:commentRangeStart w:id="16"/>
       <w:r>
         <w:t>where we need more fundamental understanding that modelling alone cannot provide</w:t>
       </w:r>
-      <w:commentRangeEnd w:id="18"/>
+      <w:commentRangeEnd w:id="16"/>
       <w:r>
         <w:rPr>
           <w:rStyle w:val="CommentReference"/>
         </w:rPr>
-        <w:commentReference w:id="18"/>
+        <w:commentReference w:id="16"/>
       </w:r>
       <w:r>
         <w:t>.</w:t>
@@ -4199,6 +5314,36 @@
           <w:color w:val="215E99" w:themeColor="text2" w:themeTint="BF"/>
         </w:rPr>
         <w:t>:</w:t>
+      </w:r>
+      <w:r>
+        <w:rPr>
+          <w:color w:val="215E99" w:themeColor="text2" w:themeTint="BF"/>
+        </w:rPr>
+        <w:t xml:space="preserve"> We have now re-written and re-focuse</w:t>
+      </w:r>
+      <w:r>
+        <w:rPr>
+          <w:color w:val="215E99" w:themeColor="text2" w:themeTint="BF"/>
+        </w:rPr>
+        <w:t>d</w:t>
+      </w:r>
+      <w:r>
+        <w:rPr>
+          <w:color w:val="215E99" w:themeColor="text2" w:themeTint="BF"/>
+        </w:rPr>
+        <w:t xml:space="preserve"> our outstanding questions</w:t>
+      </w:r>
+      <w:r>
+        <w:rPr>
+          <w:color w:val="215E99" w:themeColor="text2" w:themeTint="BF"/>
+        </w:rPr>
+        <w:t xml:space="preserve"> to address this comment</w:t>
+      </w:r>
+      <w:r>
+        <w:rPr>
+          <w:color w:val="215E99" w:themeColor="text2" w:themeTint="BF"/>
+        </w:rPr>
+        <w:t xml:space="preserve">. </w:t>
       </w:r>
     </w:p>
     <w:sectPr>
@@ -4242,7 +5387,7 @@
       </w:r>
     </w:p>
   </w:comment>
-  <w:comment w:id="1" w:author="Daniel Noble" w:date="2025-10-20T10:17:00Z" w:initials="DN">
+  <w:comment w:id="1" w:author="Daniel Noble" w:date="2025-10-29T13:50:00Z" w:initials="DN">
     <w:p>
       <w:pPr>
         <w:pStyle w:val="CommentText"/>
@@ -4254,81 +5399,95 @@
         <w:annotationRef/>
       </w:r>
       <w:r>
-        <w:t>Mike</w:t>
-      </w:r>
-    </w:p>
+        <w:t xml:space="preserve">Adrienne to </w:t>
+      </w:r>
+      <w:r>
+        <w:t>do</w:t>
+      </w:r>
+    </w:p>
+  </w:comment>
+  <w:comment w:id="2" w:author="Daniel Noble" w:date="2025-10-20T10:17:00Z" w:initials="DN">
     <w:p>
       <w:pPr>
         <w:pStyle w:val="CommentText"/>
       </w:pPr>
+      <w:r>
+        <w:rPr>
+          <w:rStyle w:val="CommentReference"/>
+        </w:rPr>
+        <w:annotationRef/>
+      </w:r>
+      <w:r>
+        <w:t>Mike</w:t>
+      </w:r>
     </w:p>
     <w:p>
       <w:pPr>
         <w:pStyle w:val="CommentText"/>
       </w:pPr>
-      <w:r>
-        <w:t xml:space="preserve">Depends on what processes are important. </w:t>
-      </w:r>
     </w:p>
     <w:p>
       <w:pPr>
         <w:pStyle w:val="CommentText"/>
       </w:pPr>
+      <w:r>
+        <w:t xml:space="preserve">Depends on what processes are important. </w:t>
+      </w:r>
     </w:p>
     <w:p>
       <w:pPr>
         <w:pStyle w:val="CommentText"/>
       </w:pPr>
-      <w:r>
-        <w:t>Generic coupling of models. Not under negotiation</w:t>
-      </w:r>
     </w:p>
     <w:p>
       <w:pPr>
         <w:pStyle w:val="CommentText"/>
       </w:pPr>
+      <w:r>
+        <w:t>Generic coupling of models. Not under negotiation</w:t>
+      </w:r>
     </w:p>
     <w:p>
       <w:pPr>
         <w:pStyle w:val="CommentText"/>
       </w:pPr>
-      <w:r>
-        <w:t xml:space="preserve">What processes are relevant and different mechanistic models including different processes. Need to be documenting the rational as per procedures of good modelling practice. For example, you may want a microclimate model with snow, but in Australia you </w:t>
-      </w:r>
     </w:p>
     <w:p>
       <w:pPr>
         <w:pStyle w:val="CommentText"/>
       </w:pPr>
+      <w:r>
+        <w:t xml:space="preserve">What processes are relevant and different mechanistic models including different processes. Need to be documenting the rational as per procedures of good modelling practice. For example, you may want a microclimate model with snow, but in Australia you </w:t>
+      </w:r>
     </w:p>
     <w:p>
       <w:pPr>
         <w:pStyle w:val="CommentText"/>
       </w:pPr>
-      <w:r>
-        <w:t xml:space="preserve">Validation. Having a quantitative model gives you a prediction and validate against observation. Interplay between prediction and observation and model updating and re-evaluation. </w:t>
-      </w:r>
-    </w:p>
-  </w:comment>
-  <w:comment w:id="2" w:author="Daniel Noble" w:date="2025-10-20T10:18:00Z" w:initials="DN">
+    </w:p>
     <w:p>
       <w:pPr>
         <w:pStyle w:val="CommentText"/>
       </w:pPr>
       <w:r>
-        <w:rPr>
-          <w:rStyle w:val="CommentReference"/>
-        </w:rPr>
-        <w:annotationRef/>
-      </w:r>
-      <w:r>
-        <w:t xml:space="preserve">Do this. </w:t>
-      </w:r>
-    </w:p>
+        <w:t xml:space="preserve">Validation. Having a quantitative model gives you a prediction and validate against observation. Interplay between prediction and observation and model updating and re-evaluation. </w:t>
+      </w:r>
+    </w:p>
+  </w:comment>
+  <w:comment w:id="3" w:author="Daniel Noble" w:date="2025-10-20T10:18:00Z" w:initials="DN">
     <w:p>
       <w:pPr>
         <w:pStyle w:val="CommentText"/>
       </w:pPr>
+      <w:r>
+        <w:rPr>
+          <w:rStyle w:val="CommentReference"/>
+        </w:rPr>
+        <w:annotationRef/>
+      </w:r>
+      <w:r>
+        <w:t xml:space="preserve">Do this. </w:t>
+      </w:r>
     </w:p>
     <w:p>
       <w:pPr>
@@ -4339,27 +5498,16 @@
       <w:pPr>
         <w:pStyle w:val="CommentText"/>
       </w:pPr>
-      <w:r>
-        <w:t xml:space="preserve">Code to reproduce the examples in the paper that links how the models were combined found at: </w:t>
-      </w:r>
-      <w:r>
-        <w:t>https://daniel1noble.github.io/thermal_tol_interactions</w:t>
-      </w:r>
-    </w:p>
-  </w:comment>
-  <w:comment w:id="3" w:author="Daniel Noble" w:date="2025-10-20T10:20:00Z" w:initials="DN">
+    </w:p>
     <w:p>
       <w:pPr>
         <w:pStyle w:val="CommentText"/>
       </w:pPr>
       <w:r>
-        <w:rPr>
-          <w:rStyle w:val="CommentReference"/>
-        </w:rPr>
-        <w:annotationRef/>
-      </w:r>
-      <w:r>
-        <w:t>Move Multi species examples in main text box for details and then discuss more in text</w:t>
+        <w:t xml:space="preserve">Code to reproduce the examples in the paper that links how the models were combined found at: </w:t>
+      </w:r>
+      <w:r>
+        <w:t>https://daniel1noble.github.io/thermal_tol_interactions</w:t>
       </w:r>
     </w:p>
   </w:comment>
@@ -4375,11 +5523,11 @@
         <w:annotationRef/>
       </w:r>
       <w:r>
-        <w:t xml:space="preserve">Mike </w:t>
+        <w:t>Move Multi species examples in main text box for details and then discuss more in text</w:t>
       </w:r>
     </w:p>
   </w:comment>
-  <w:comment w:id="5" w:author="Daniel Noble" w:date="2025-10-20T10:36:00Z" w:initials="DN">
+  <w:comment w:id="5" w:author="Daniel Noble" w:date="2025-10-20T10:20:00Z" w:initials="DN">
     <w:p>
       <w:pPr>
         <w:pStyle w:val="CommentText"/>
@@ -4391,11 +5539,11 @@
         <w:annotationRef/>
       </w:r>
       <w:r>
-        <w:t>Agree. Remove</w:t>
+        <w:t xml:space="preserve">Mike </w:t>
       </w:r>
     </w:p>
   </w:comment>
-  <w:comment w:id="6" w:author="Daniel Noble" w:date="2025-10-20T10:37:00Z" w:initials="DN">
+  <w:comment w:id="6" w:author="Daniel Noble" w:date="2025-10-20T10:36:00Z" w:initials="DN">
     <w:p>
       <w:pPr>
         <w:pStyle w:val="CommentText"/>
@@ -4407,7 +5555,7 @@
         <w:annotationRef/>
       </w:r>
       <w:r>
-        <w:t>Mike &amp; Dan. Add in more details on behaviour</w:t>
+        <w:t>Agree. Remove</w:t>
       </w:r>
     </w:p>
   </w:comment>
@@ -4423,17 +5571,11 @@
         <w:annotationRef/>
       </w:r>
       <w:r>
-        <w:t xml:space="preserve">Cut down, but maybe work into the example TLS </w:t>
-      </w:r>
-      <w:r>
-        <w:t>build-up</w:t>
-      </w:r>
-      <w:r>
-        <w:t xml:space="preserve"> and state that extreme heat is captured through the TLS framework and can have important implications at later periods in an organisms life cycle even if it’s not made a dramatic impact at one point in time. </w:t>
+        <w:t>Mike &amp; Dan. Add in more details on behaviour</w:t>
       </w:r>
     </w:p>
   </w:comment>
-  <w:comment w:id="8" w:author="Daniel Noble" w:date="2025-10-20T10:38:00Z" w:initials="DN">
+  <w:comment w:id="8" w:author="Daniel Noble" w:date="2025-10-20T10:37:00Z" w:initials="DN">
     <w:p>
       <w:pPr>
         <w:pStyle w:val="CommentText"/>
@@ -4445,11 +5587,33 @@
         <w:annotationRef/>
       </w:r>
       <w:r>
-        <w:t xml:space="preserve">Mike. Missing data imputation and trait databases. </w:t>
+        <w:t xml:space="preserve">Cut </w:t>
+      </w:r>
+      <w:proofErr w:type="gramStart"/>
+      <w:r>
+        <w:t>down, but</w:t>
+      </w:r>
+      <w:proofErr w:type="gramEnd"/>
+      <w:r>
+        <w:t xml:space="preserve"> maybe work into the example TLS </w:t>
+      </w:r>
+      <w:r>
+        <w:t>build-up</w:t>
+      </w:r>
+      <w:r>
+        <w:t xml:space="preserve"> and state that extreme heat is captured through the TLS framework and can have important implications at later periods in an </w:t>
+      </w:r>
+      <w:proofErr w:type="gramStart"/>
+      <w:r>
+        <w:t>organisms</w:t>
+      </w:r>
+      <w:proofErr w:type="gramEnd"/>
+      <w:r>
+        <w:t xml:space="preserve"> life cycle even if it’s not made a dramatic impact at one point in time. </w:t>
       </w:r>
     </w:p>
   </w:comment>
-  <w:comment w:id="9" w:author="Daniel Noble" w:date="2025-10-20T10:39:00Z" w:initials="DN">
+  <w:comment w:id="9" w:author="Daniel Noble" w:date="2025-10-20T10:38:00Z" w:initials="DN">
     <w:p>
       <w:pPr>
         <w:pStyle w:val="CommentText"/>
@@ -4461,36 +5625,36 @@
         <w:annotationRef/>
       </w:r>
       <w:r>
-        <w:t>Mike. I think basically that they need to be validated empirically. And this could be done by testing against existing data. Mike and Dan to discuss.</w:t>
-      </w:r>
-    </w:p>
+        <w:t xml:space="preserve">Mike. Missing data imputation and trait databases. </w:t>
+      </w:r>
+    </w:p>
+  </w:comment>
+  <w:comment w:id="10" w:author="Daniel Noble" w:date="2025-10-20T10:39:00Z" w:initials="DN">
     <w:p>
       <w:pPr>
         <w:pStyle w:val="CommentText"/>
       </w:pPr>
+      <w:r>
+        <w:rPr>
+          <w:rStyle w:val="CommentReference"/>
+        </w:rPr>
+        <w:annotationRef/>
+      </w:r>
+      <w:r>
+        <w:t>Mike. I think basically that they need to be validated empirically. And this could be done by testing against existing data. Mike and Dan to discuss.</w:t>
+      </w:r>
     </w:p>
     <w:p>
       <w:pPr>
         <w:pStyle w:val="CommentText"/>
       </w:pPr>
-      <w:r>
-        <w:t>We need to emphasise this more within the paper, concluding remarks and other sections where permitted.</w:t>
-      </w:r>
-    </w:p>
-  </w:comment>
-  <w:comment w:id="10" w:author="Daniel Noble" w:date="2025-10-20T10:43:00Z" w:initials="DN">
+    </w:p>
     <w:p>
       <w:pPr>
         <w:pStyle w:val="CommentText"/>
       </w:pPr>
       <w:r>
-        <w:rPr>
-          <w:rStyle w:val="CommentReference"/>
-        </w:rPr>
-        <w:annotationRef/>
-      </w:r>
-      <w:r>
-        <w:t>Mike, need more detail on the calculation of rmax from DEB.</w:t>
+        <w:t>We need to emphasise this more within the paper, concluding remarks and other sections where permitted.</w:t>
       </w:r>
     </w:p>
   </w:comment>
@@ -4525,11 +5689,19 @@
         <w:t xml:space="preserve"> </w:t>
       </w:r>
       <w:r>
-        <w:t>can move down into sub-processes to see  you can validate subprocesses and then identify where the missing processes / understanding is…</w:t>
+        <w:t xml:space="preserve">can move down into sub-processes to </w:t>
+      </w:r>
+      <w:proofErr w:type="gramStart"/>
+      <w:r>
+        <w:t>see  you</w:t>
+      </w:r>
+      <w:proofErr w:type="gramEnd"/>
+      <w:r>
+        <w:t xml:space="preserve"> can validate subprocesses and then identify where the missing processes / understanding is…</w:t>
       </w:r>
     </w:p>
   </w:comment>
-  <w:comment w:id="12" w:author="Daniel Noble" w:date="2025-10-20T11:01:00Z" w:initials="DN">
+  <w:comment w:id="12" w:author="Daniel Noble" w:date="2025-10-20T11:03:00Z" w:initials="DN">
     <w:p>
       <w:pPr>
         <w:pStyle w:val="CommentText"/>
@@ -4541,11 +5713,19 @@
         <w:annotationRef/>
       </w:r>
       <w:r>
-        <w:t>? This is captured in dose response models…not sure what they mean specifically here by non-linear aspects. Aspects of what specifically?</w:t>
+        <w:t>This is the whole point of the solutions example</w:t>
+      </w:r>
+      <w:proofErr w:type="gramStart"/>
+      <w:r>
+        <w:t>….Mike</w:t>
+      </w:r>
+      <w:proofErr w:type="gramEnd"/>
+      <w:r>
+        <w:t>, maybe any ideas on how we can do that?</w:t>
       </w:r>
     </w:p>
   </w:comment>
-  <w:comment w:id="13" w:author="Daniel Noble" w:date="2025-10-20T11:02:00Z" w:initials="DN">
+  <w:comment w:id="13" w:author="Daniel Noble" w:date="2025-10-20T11:04:00Z" w:initials="DN">
     <w:p>
       <w:pPr>
         <w:pStyle w:val="CommentText"/>
@@ -4557,11 +5737,16 @@
         <w:annotationRef/>
       </w:r>
       <w:r>
-        <w:t xml:space="preserve">OK, maybe bring these elements OUT of the box and into the main text. Keep boxes for demonstrating the modelling. </w:t>
-      </w:r>
+        <w:t xml:space="preserve">Margie will deal </w:t>
+      </w:r>
+      <w:proofErr w:type="gramStart"/>
+      <w:r>
+        <w:t>with,.</w:t>
+      </w:r>
+      <w:proofErr w:type="gramEnd"/>
     </w:p>
   </w:comment>
-  <w:comment w:id="14" w:author="Daniel Noble" w:date="2025-10-20T11:03:00Z" w:initials="DN">
+  <w:comment w:id="14" w:author="Daniel Noble" w:date="2025-10-20T11:05:00Z" w:initials="DN">
     <w:p>
       <w:pPr>
         <w:pStyle w:val="CommentText"/>
@@ -4573,11 +5758,19 @@
         <w:annotationRef/>
       </w:r>
       <w:r>
-        <w:t>This is the whole point of the solutions example….Mike, maybe any ideas on how we can do that?</w:t>
+        <w:t xml:space="preserve">Remove SES stuff. Include elements within </w:t>
+      </w:r>
+      <w:proofErr w:type="spellStart"/>
+      <w:r>
+        <w:t>conclusing</w:t>
+      </w:r>
+      <w:proofErr w:type="spellEnd"/>
+      <w:r>
+        <w:t xml:space="preserve"> remarks. Save a box</w:t>
       </w:r>
     </w:p>
   </w:comment>
-  <w:comment w:id="15" w:author="Daniel Noble" w:date="2025-10-20T11:04:00Z" w:initials="DN">
+  <w:comment w:id="15" w:author="Daniel Noble" w:date="2025-10-20T11:07:00Z" w:initials="DN">
     <w:p>
       <w:pPr>
         <w:pStyle w:val="CommentText"/>
@@ -4589,43 +5782,11 @@
         <w:annotationRef/>
       </w:r>
       <w:r>
-        <w:t>Margie will deal with,.</w:t>
+        <w:t>OK, move supp into amin MS.</w:t>
       </w:r>
     </w:p>
   </w:comment>
-  <w:comment w:id="16" w:author="Daniel Noble" w:date="2025-10-20T11:05:00Z" w:initials="DN">
-    <w:p>
-      <w:pPr>
-        <w:pStyle w:val="CommentText"/>
-      </w:pPr>
-      <w:r>
-        <w:rPr>
-          <w:rStyle w:val="CommentReference"/>
-        </w:rPr>
-        <w:annotationRef/>
-      </w:r>
-      <w:r>
-        <w:t>Remove SES stuff. Include elements within conclusing remarks. Save a box</w:t>
-      </w:r>
-    </w:p>
-  </w:comment>
-  <w:comment w:id="17" w:author="Daniel Noble" w:date="2025-10-20T11:07:00Z" w:initials="DN">
-    <w:p>
-      <w:pPr>
-        <w:pStyle w:val="CommentText"/>
-      </w:pPr>
-      <w:r>
-        <w:rPr>
-          <w:rStyle w:val="CommentReference"/>
-        </w:rPr>
-        <w:annotationRef/>
-      </w:r>
-      <w:r>
-        <w:t>OK, move supp into amin MS.</w:t>
-      </w:r>
-    </w:p>
-  </w:comment>
-  <w:comment w:id="18" w:author="Daniel Noble" w:date="2025-10-20T11:08:00Z" w:initials="DN">
+  <w:comment w:id="16" w:author="Daniel Noble" w:date="2025-10-20T11:08:00Z" w:initials="DN">
     <w:p>
       <w:pPr>
         <w:pStyle w:val="CommentText"/>
@@ -4647,6 +5808,7 @@
 <file path=word/commentsExtended.xml><?xml version="1.0" encoding="utf-8"?>
 <w15:commentsEx xmlns:wpc="http://schemas.microsoft.com/office/word/2010/wordprocessingCanvas" xmlns:cx="http://schemas.microsoft.com/office/drawing/2014/chartex" xmlns:cx1="http://schemas.microsoft.com/office/drawing/2015/9/8/chartex" xmlns:cx2="http://schemas.microsoft.com/office/drawing/2015/10/21/chartex" xmlns:cx3="http://schemas.microsoft.com/office/drawing/2016/5/9/chartex" xmlns:cx4="http://schemas.microsoft.com/office/drawing/2016/5/10/chartex" xmlns:cx5="http://schemas.microsoft.com/office/drawing/2016/5/11/chartex" xmlns:cx6="http://schemas.microsoft.com/office/drawing/2016/5/12/chartex" xmlns:cx7="http://schemas.microsoft.com/office/drawing/2016/5/13/chartex" xmlns:cx8="http://schemas.microsoft.com/office/drawing/2016/5/14/chartex" xmlns:mc="http://schemas.openxmlformats.org/markup-compatibility/2006" xmlns:aink="http://schemas.microsoft.com/office/drawing/2016/ink" xmlns:am3d="http://schemas.microsoft.com/office/drawing/2017/model3d" xmlns:o="urn:schemas-microsoft-com:office:office" xmlns:oel="http://schemas.microsoft.com/office/2019/extlst" xmlns:r="http://schemas.openxmlformats.org/officeDocument/2006/relationships" xmlns:m="http://schemas.openxmlformats.org/officeDocument/2006/math" xmlns:v="urn:schemas-microsoft-com:vml" xmlns:wp14="http://schemas.microsoft.com/office/word/2010/wordprocessingDrawing" xmlns:wp="http://schemas.openxmlformats.org/drawingml/2006/wordprocessingDrawing" xmlns:w10="urn:schemas-microsoft-com:office:word" xmlns:w="http://schemas.openxmlformats.org/wordprocessingml/2006/main" xmlns:w14="http://schemas.microsoft.com/office/word/2010/wordml" xmlns:w15="http://schemas.microsoft.com/office/word/2012/wordml" xmlns:w16cex="http://schemas.microsoft.com/office/word/2018/wordml/cex" xmlns:w16cid="http://schemas.microsoft.com/office/word/2016/wordml/cid" xmlns:w16="http://schemas.microsoft.com/office/word/2018/wordml" xmlns:w16du="http://schemas.microsoft.com/office/word/2023/wordml/word16du" xmlns:w16sdtdh="http://schemas.microsoft.com/office/word/2020/wordml/sdtdatahash" xmlns:w16sdtfl="http://schemas.microsoft.com/office/word/2024/wordml/sdtformatlock" xmlns:w16se="http://schemas.microsoft.com/office/word/2015/wordml/symex" xmlns:wpg="http://schemas.microsoft.com/office/word/2010/wordprocessingGroup" xmlns:wpi="http://schemas.microsoft.com/office/word/2010/wordprocessingInk" xmlns:wne="http://schemas.microsoft.com/office/word/2006/wordml" xmlns:wps="http://schemas.microsoft.com/office/word/2010/wordprocessingShape" mc:Ignorable="w14 w15 w16se w16cid w16 w16cex w16sdtdh w16sdtfl w16du wp14">
   <w15:commentEx w15:paraId="17EB1CD9" w15:done="0"/>
+  <w15:commentEx w15:paraId="463249D9" w15:done="0"/>
   <w15:commentEx w15:paraId="4BA4628D" w15:done="0"/>
   <w15:commentEx w15:paraId="48C896F0" w15:done="0"/>
   <w15:commentEx w15:paraId="273F8D91" w15:done="0"/>
@@ -4656,10 +5818,7 @@
   <w15:commentEx w15:paraId="1D091547" w15:done="0"/>
   <w15:commentEx w15:paraId="615A123E" w15:done="0"/>
   <w15:commentEx w15:paraId="59A5E275" w15:done="0"/>
-  <w15:commentEx w15:paraId="304C6C7E" w15:done="0"/>
   <w15:commentEx w15:paraId="6AF3F337" w15:done="0"/>
-  <w15:commentEx w15:paraId="39892B8A" w15:done="0"/>
-  <w15:commentEx w15:paraId="249458DB" w15:done="0"/>
   <w15:commentEx w15:paraId="1FDF9DC0" w15:done="0"/>
   <w15:commentEx w15:paraId="0B40A28B" w15:done="0"/>
   <w15:commentEx w15:paraId="7BAE651A" w15:done="0"/>
@@ -4671,6 +5830,7 @@
 <file path=word/commentsExtensible.xml><?xml version="1.0" encoding="utf-8"?>
 <w16cex:commentsExtensible xmlns:wpc="http://schemas.microsoft.com/office/word/2010/wordprocessingCanvas" xmlns:cx="http://schemas.microsoft.com/office/drawing/2014/chartex" xmlns:cx1="http://schemas.microsoft.com/office/drawing/2015/9/8/chartex" xmlns:cx2="http://schemas.microsoft.com/office/drawing/2015/10/21/chartex" xmlns:cx3="http://schemas.microsoft.com/office/drawing/2016/5/9/chartex" xmlns:cx4="http://schemas.microsoft.com/office/drawing/2016/5/10/chartex" xmlns:cx5="http://schemas.microsoft.com/office/drawing/2016/5/11/chartex" xmlns:cx6="http://schemas.microsoft.com/office/drawing/2016/5/12/chartex" xmlns:cx7="http://schemas.microsoft.com/office/drawing/2016/5/13/chartex" xmlns:cx8="http://schemas.microsoft.com/office/drawing/2016/5/14/chartex" xmlns:cr="http://schemas.microsoft.com/office/comments/2020/reactions" xmlns:mc="http://schemas.openxmlformats.org/markup-compatibility/2006" xmlns:aink="http://schemas.microsoft.com/office/drawing/2016/ink" xmlns:am3d="http://schemas.microsoft.com/office/drawing/2017/model3d" xmlns:o="urn:schemas-microsoft-com:office:office" xmlns:oel="http://schemas.microsoft.com/office/2019/extlst" xmlns:r="http://schemas.openxmlformats.org/officeDocument/2006/relationships" xmlns:m="http://schemas.openxmlformats.org/officeDocument/2006/math" xmlns:v="urn:schemas-microsoft-com:vml" xmlns:wp14="http://schemas.microsoft.com/office/word/2010/wordprocessingDrawing" xmlns:wp="http://schemas.openxmlformats.org/drawingml/2006/wordprocessingDrawing" xmlns:w10="urn:schemas-microsoft-com:office:word" xmlns:w="http://schemas.openxmlformats.org/wordprocessingml/2006/main" xmlns:w14="http://schemas.microsoft.com/office/word/2010/wordml" xmlns:w15="http://schemas.microsoft.com/office/word/2012/wordml" xmlns:w16cex="http://schemas.microsoft.com/office/word/2018/wordml/cex" xmlns:w16cid="http://schemas.microsoft.com/office/word/2016/wordml/cid" xmlns:w16="http://schemas.microsoft.com/office/word/2018/wordml" xmlns:w16du="http://schemas.microsoft.com/office/word/2023/wordml/word16du" xmlns:w16sdtdh="http://schemas.microsoft.com/office/word/2020/wordml/sdtdatahash" xmlns:w16sdtfl="http://schemas.microsoft.com/office/word/2024/wordml/sdtformatlock" xmlns:w16se="http://schemas.microsoft.com/office/word/2015/wordml/symex" xmlns:wpg="http://schemas.microsoft.com/office/word/2010/wordprocessingGroup" xmlns:wpi="http://schemas.microsoft.com/office/word/2010/wordprocessingInk" xmlns:wne="http://schemas.microsoft.com/office/word/2006/wordml" xmlns:wps="http://schemas.microsoft.com/office/word/2010/wordprocessingShape" mc:Ignorable="w14 w15 w16se w16cid w16 w16cex w16sdtdh w16sdtfl cr w16du wp14">
   <w16cex:commentExtensible w16cex:durableId="42781915" w16cex:dateUtc="2025-10-20T04:24:00Z"/>
+  <w16cex:commentExtensible w16cex:durableId="44397A9F" w16cex:dateUtc="2025-10-29T02:50:00Z"/>
   <w16cex:commentExtensible w16cex:durableId="5F1C5BE9" w16cex:dateUtc="2025-10-19T23:17:00Z"/>
   <w16cex:commentExtensible w16cex:durableId="58F63500" w16cex:dateUtc="2025-10-19T23:18:00Z"/>
   <w16cex:commentExtensible w16cex:durableId="75FA94DC" w16cex:dateUtc="2025-10-19T23:20:00Z"/>
@@ -4680,10 +5840,7 @@
   <w16cex:commentExtensible w16cex:durableId="44A3E27F" w16cex:dateUtc="2025-10-19T23:37:00Z"/>
   <w16cex:commentExtensible w16cex:durableId="43B238E3" w16cex:dateUtc="2025-10-19T23:38:00Z"/>
   <w16cex:commentExtensible w16cex:durableId="10AD8143" w16cex:dateUtc="2025-10-19T23:39:00Z"/>
-  <w16cex:commentExtensible w16cex:durableId="097B4156" w16cex:dateUtc="2025-10-19T23:43:00Z"/>
   <w16cex:commentExtensible w16cex:durableId="303D7EF9" w16cex:dateUtc="2025-10-20T04:17:00Z"/>
-  <w16cex:commentExtensible w16cex:durableId="246EE31D" w16cex:dateUtc="2025-10-20T00:01:00Z"/>
-  <w16cex:commentExtensible w16cex:durableId="56029101" w16cex:dateUtc="2025-10-20T00:02:00Z"/>
   <w16cex:commentExtensible w16cex:durableId="36A17A7D" w16cex:dateUtc="2025-10-20T00:03:00Z"/>
   <w16cex:commentExtensible w16cex:durableId="0381864F" w16cex:dateUtc="2025-10-20T00:04:00Z"/>
   <w16cex:commentExtensible w16cex:durableId="2E8D20A9" w16cex:dateUtc="2025-10-20T00:05:00Z"/>
@@ -4695,6 +5852,7 @@
 <file path=word/commentsIds.xml><?xml version="1.0" encoding="utf-8"?>
 <w16cid:commentsIds xmlns:wpc="http://schemas.microsoft.com/office/word/2010/wordprocessingCanvas" xmlns:cx="http://schemas.microsoft.com/office/drawing/2014/chartex" xmlns:cx1="http://schemas.microsoft.com/office/drawing/2015/9/8/chartex" xmlns:cx2="http://schemas.microsoft.com/office/drawing/2015/10/21/chartex" xmlns:cx3="http://schemas.microsoft.com/office/drawing/2016/5/9/chartex" xmlns:cx4="http://schemas.microsoft.com/office/drawing/2016/5/10/chartex" xmlns:cx5="http://schemas.microsoft.com/office/drawing/2016/5/11/chartex" xmlns:cx6="http://schemas.microsoft.com/office/drawing/2016/5/12/chartex" xmlns:cx7="http://schemas.microsoft.com/office/drawing/2016/5/13/chartex" xmlns:cx8="http://schemas.microsoft.com/office/drawing/2016/5/14/chartex" xmlns:mc="http://schemas.openxmlformats.org/markup-compatibility/2006" xmlns:aink="http://schemas.microsoft.com/office/drawing/2016/ink" xmlns:am3d="http://schemas.microsoft.com/office/drawing/2017/model3d" xmlns:o="urn:schemas-microsoft-com:office:office" xmlns:oel="http://schemas.microsoft.com/office/2019/extlst" xmlns:r="http://schemas.openxmlformats.org/officeDocument/2006/relationships" xmlns:m="http://schemas.openxmlformats.org/officeDocument/2006/math" xmlns:v="urn:schemas-microsoft-com:vml" xmlns:wp14="http://schemas.microsoft.com/office/word/2010/wordprocessingDrawing" xmlns:wp="http://schemas.openxmlformats.org/drawingml/2006/wordprocessingDrawing" xmlns:w10="urn:schemas-microsoft-com:office:word" xmlns:w="http://schemas.openxmlformats.org/wordprocessingml/2006/main" xmlns:w14="http://schemas.microsoft.com/office/word/2010/wordml" xmlns:w15="http://schemas.microsoft.com/office/word/2012/wordml" xmlns:w16cex="http://schemas.microsoft.com/office/word/2018/wordml/cex" xmlns:w16cid="http://schemas.microsoft.com/office/word/2016/wordml/cid" xmlns:w16="http://schemas.microsoft.com/office/word/2018/wordml" xmlns:w16du="http://schemas.microsoft.com/office/word/2023/wordml/word16du" xmlns:w16sdtdh="http://schemas.microsoft.com/office/word/2020/wordml/sdtdatahash" xmlns:w16sdtfl="http://schemas.microsoft.com/office/word/2024/wordml/sdtformatlock" xmlns:w16se="http://schemas.microsoft.com/office/word/2015/wordml/symex" xmlns:wpg="http://schemas.microsoft.com/office/word/2010/wordprocessingGroup" xmlns:wpi="http://schemas.microsoft.com/office/word/2010/wordprocessingInk" xmlns:wne="http://schemas.microsoft.com/office/word/2006/wordml" xmlns:wps="http://schemas.microsoft.com/office/word/2010/wordprocessingShape" mc:Ignorable="w14 w15 w16se w16cid w16 w16cex w16sdtdh w16sdtfl w16du wp14">
   <w16cid:commentId w16cid:paraId="17EB1CD9" w16cid:durableId="42781915"/>
+  <w16cid:commentId w16cid:paraId="463249D9" w16cid:durableId="44397A9F"/>
   <w16cid:commentId w16cid:paraId="4BA4628D" w16cid:durableId="5F1C5BE9"/>
   <w16cid:commentId w16cid:paraId="48C896F0" w16cid:durableId="58F63500"/>
   <w16cid:commentId w16cid:paraId="273F8D91" w16cid:durableId="75FA94DC"/>
@@ -4704,10 +5862,7 @@
   <w16cid:commentId w16cid:paraId="1D091547" w16cid:durableId="44A3E27F"/>
   <w16cid:commentId w16cid:paraId="615A123E" w16cid:durableId="43B238E3"/>
   <w16cid:commentId w16cid:paraId="59A5E275" w16cid:durableId="10AD8143"/>
-  <w16cid:commentId w16cid:paraId="304C6C7E" w16cid:durableId="097B4156"/>
   <w16cid:commentId w16cid:paraId="6AF3F337" w16cid:durableId="303D7EF9"/>
-  <w16cid:commentId w16cid:paraId="39892B8A" w16cid:durableId="246EE31D"/>
-  <w16cid:commentId w16cid:paraId="249458DB" w16cid:durableId="56029101"/>
   <w16cid:commentId w16cid:paraId="1FDF9DC0" w16cid:durableId="36A17A7D"/>
   <w16cid:commentId w16cid:paraId="0B40A28B" w16cid:durableId="0381864F"/>
   <w16cid:commentId w16cid:paraId="7BAE651A" w16cid:durableId="2E8D20A9"/>

</xml_diff>

<commit_message>
Updated MS and Responses
</commit_message>
<xml_diff>
--- a/docs/Revision1/Response_to_Reviewers.docx
+++ b/docs/Revision1/Response_to_Reviewers.docx
@@ -3744,30 +3744,33 @@
           <w:bCs/>
           <w:color w:val="215E99" w:themeColor="text2" w:themeTint="BF"/>
         </w:rPr>
-        <w:t>Re</w:t>
-      </w:r>
-      <w:r>
-        <w:rPr>
-          <w:b/>
-          <w:bCs/>
-          <w:color w:val="215E99" w:themeColor="text2" w:themeTint="BF"/>
-          <w:highlight w:val="yellow"/>
-        </w:rPr>
-        <w:t>spon</w:t>
-      </w:r>
-      <w:r>
-        <w:rPr>
-          <w:b/>
-          <w:bCs/>
-          <w:color w:val="215E99" w:themeColor="text2" w:themeTint="BF"/>
-        </w:rPr>
-        <w:t>se</w:t>
-      </w:r>
-      <w:r>
-        <w:rPr>
-          <w:color w:val="215E99" w:themeColor="text2" w:themeTint="BF"/>
-        </w:rPr>
-        <w:t>:</w:t>
+        <w:t>Response</w:t>
+      </w:r>
+      <w:r>
+        <w:rPr>
+          <w:color w:val="215E99" w:themeColor="text2" w:themeTint="BF"/>
+        </w:rPr>
+        <w:t>:</w:t>
+      </w:r>
+      <w:r>
+        <w:rPr>
+          <w:color w:val="215E99" w:themeColor="text2" w:themeTint="BF"/>
+        </w:rPr>
+        <w:t xml:space="preserve"> Throughout we have discussed the ways that extreme heat can be mitigated through behavioural plasticity. Also, we don’t disagree that organisms will be adapted to their environment. All the points are captured </w:t>
+      </w:r>
+      <w:proofErr w:type="gramStart"/>
+      <w:r>
+        <w:rPr>
+          <w:color w:val="215E99" w:themeColor="text2" w:themeTint="BF"/>
+        </w:rPr>
+        <w:t>by:</w:t>
+      </w:r>
+      <w:proofErr w:type="gramEnd"/>
+      <w:r>
+        <w:rPr>
+          <w:color w:val="215E99" w:themeColor="text2" w:themeTint="BF"/>
+        </w:rPr>
+        <w:t xml:space="preserve"> 1) modelling how organisms behaviourally respond (which we have better shown how to do) and 2) the differences in their thermal sensitivity, which makes some species more susceptible to extreme heat compared with others. Hopefully our revisions help address these points but if there are more specific examples the Reviewer is thinking we’re happy to incorporate them.</w:t>
       </w:r>
     </w:p>
     <w:p>
@@ -3947,30 +3950,74 @@
           <w:bCs/>
           <w:color w:val="215E99" w:themeColor="text2" w:themeTint="BF"/>
         </w:rPr>
-        <w:t>R</w:t>
-      </w:r>
-      <w:r>
-        <w:rPr>
-          <w:b/>
-          <w:bCs/>
-          <w:color w:val="215E99" w:themeColor="text2" w:themeTint="BF"/>
-          <w:highlight w:val="yellow"/>
-        </w:rPr>
-        <w:t>espo</w:t>
-      </w:r>
-      <w:r>
-        <w:rPr>
-          <w:b/>
-          <w:bCs/>
-          <w:color w:val="215E99" w:themeColor="text2" w:themeTint="BF"/>
-        </w:rPr>
-        <w:t>nse</w:t>
-      </w:r>
-      <w:r>
-        <w:rPr>
-          <w:color w:val="215E99" w:themeColor="text2" w:themeTint="BF"/>
-        </w:rPr>
-        <w:t>:</w:t>
+        <w:t>Response</w:t>
+      </w:r>
+      <w:r>
+        <w:rPr>
+          <w:color w:val="215E99" w:themeColor="text2" w:themeTint="BF"/>
+        </w:rPr>
+        <w:t>:</w:t>
+      </w:r>
+      <w:r>
+        <w:rPr>
+          <w:color w:val="215E99" w:themeColor="text2" w:themeTint="BF"/>
+        </w:rPr>
+        <w:t xml:space="preserve"> W</w:t>
+      </w:r>
+      <w:r>
+        <w:rPr>
+          <w:color w:val="215E99" w:themeColor="text2" w:themeTint="BF"/>
+        </w:rPr>
+        <w:t>e believe this figure</w:t>
+      </w:r>
+      <w:r>
+        <w:rPr>
+          <w:color w:val="215E99" w:themeColor="text2" w:themeTint="BF"/>
+        </w:rPr>
+        <w:t xml:space="preserve"> </w:t>
+      </w:r>
+      <w:r>
+        <w:rPr>
+          <w:color w:val="215E99" w:themeColor="text2" w:themeTint="BF"/>
+        </w:rPr>
+        <w:t>capture</w:t>
+      </w:r>
+      <w:r>
+        <w:rPr>
+          <w:color w:val="215E99" w:themeColor="text2" w:themeTint="BF"/>
+        </w:rPr>
+        <w:t>s</w:t>
+      </w:r>
+      <w:r>
+        <w:rPr>
+          <w:color w:val="215E99" w:themeColor="text2" w:themeTint="BF"/>
+        </w:rPr>
+        <w:t xml:space="preserve"> the broad classes of models we discuss and how they are interconnected</w:t>
+      </w:r>
+      <w:r>
+        <w:rPr>
+          <w:color w:val="215E99" w:themeColor="text2" w:themeTint="BF"/>
+        </w:rPr>
+        <w:t xml:space="preserve"> so would like to keep it as an overarching introduction and </w:t>
+      </w:r>
+      <w:r>
+        <w:rPr>
+          <w:color w:val="215E99" w:themeColor="text2" w:themeTint="BF"/>
+        </w:rPr>
+        <w:lastRenderedPageBreak/>
+        <w:t>guide to the review. However, we agree it could be simplified. We have now tried to simplify by creating defined boxes which categorise the different classes of models</w:t>
+      </w:r>
+      <w:r>
+        <w:rPr>
+          <w:color w:val="215E99" w:themeColor="text2" w:themeTint="BF"/>
+        </w:rPr>
+        <w:t>, reducing arrows</w:t>
+      </w:r>
+      <w:r>
+        <w:rPr>
+          <w:color w:val="215E99" w:themeColor="text2" w:themeTint="BF"/>
+        </w:rPr>
+        <w:t xml:space="preserve">, and re-writing the legend to hopefully make the figure easier to follow. </w:t>
       </w:r>
     </w:p>
     <w:p>
@@ -4014,241 +4061,238 @@
       </w:r>
       <w:proofErr w:type="gramEnd"/>
       <w:r>
-        <w:t xml:space="preserve"> on the aspects of meteorological modelling that are particularly challenged when it comes to extremes and specifically heat waves. I certainly agree that such meteorological modelling of extremes IS a big challenge. Long term and </w:t>
-      </w:r>
-      <w:r>
+        <w:t xml:space="preserve"> on the aspects of meteorological modelling that are particularly challenged when it comes to extremes and specifically heat waves. I certainly agree that such meteorological modelling of extremes IS a big challenge. Long term and general climate modelling </w:t>
+      </w:r>
+      <w:proofErr w:type="gramStart"/>
+      <w:r>
+        <w:t>is</w:t>
+      </w:r>
+      <w:proofErr w:type="gramEnd"/>
+      <w:r>
+        <w:t xml:space="preserve"> reasonably good while the translation of the general weather patterns into local and regional extremes are really challenging. But this </w:t>
+      </w:r>
+      <w:proofErr w:type="gramStart"/>
+      <w:r>
+        <w:t>particular challenge</w:t>
+      </w:r>
+      <w:proofErr w:type="gramEnd"/>
+      <w:r>
+        <w:t xml:space="preserve"> is not what you describe.</w:t>
+      </w:r>
+      <w:r>
+        <w:br/>
+      </w:r>
+    </w:p>
+    <w:p>
+      <w:r>
+        <w:rPr>
+          <w:b/>
+          <w:bCs/>
+          <w:color w:val="215E99" w:themeColor="text2" w:themeTint="BF"/>
+        </w:rPr>
+        <w:t>Response</w:t>
+      </w:r>
+      <w:r>
+        <w:rPr>
+          <w:color w:val="215E99" w:themeColor="text2" w:themeTint="BF"/>
+        </w:rPr>
+        <w:t>:</w:t>
+      </w:r>
+      <w:r>
+        <w:rPr>
+          <w:color w:val="215E99" w:themeColor="text2" w:themeTint="BF"/>
+        </w:rPr>
+        <w:t xml:space="preserve"> We agree, and this was a point brought up also by Reviewer 2. We have now removed the global climate modelling section and kept it’s mention to a minimum focusing on citing already existing reviews in other sections. </w:t>
+      </w:r>
+    </w:p>
+    <w:p>
+      <w:r>
+        <w:br/>
+      </w:r>
+      <w:r>
+        <w:rPr>
+          <w:b/>
+          <w:bCs/>
+        </w:rPr>
+        <w:t>C</w:t>
+      </w:r>
+      <w:r>
+        <w:rPr>
+          <w:b/>
+          <w:bCs/>
+        </w:rPr>
+        <w:t>40</w:t>
+      </w:r>
+      <w:r>
+        <w:rPr>
+          <w:b/>
+          <w:bCs/>
+        </w:rPr>
+        <w:t>:</w:t>
+      </w:r>
+      <w:r>
+        <w:rPr>
+          <w:b/>
+          <w:bCs/>
+        </w:rPr>
+        <w:t xml:space="preserve"> </w:t>
+      </w:r>
+      <w:r>
+        <w:t xml:space="preserve">Line 122-135 - Again, I suggest you include some more specific ecological understanding here. The section looks at extremes mostly from a meteorological point of view, but this may not in itself be relevant if the ecosystems or species do not experience the pressure as extreme. Melinda Smith has a great paper where she </w:t>
+      </w:r>
+      <w:proofErr w:type="gramStart"/>
+      <w:r>
+        <w:t>distinguish</w:t>
+      </w:r>
+      <w:proofErr w:type="gramEnd"/>
+      <w:r>
+        <w:t xml:space="preserve"> between meteorological extremes and ecological extremes. That would be a relevant and great perspective to include.</w:t>
+      </w:r>
+      <w:r>
+        <w:br/>
+      </w:r>
+    </w:p>
+    <w:p>
+      <w:r>
+        <w:rPr>
+          <w:b/>
+          <w:bCs/>
+          <w:color w:val="215E99" w:themeColor="text2" w:themeTint="BF"/>
+        </w:rPr>
+        <w:t>Response</w:t>
+      </w:r>
+      <w:r>
+        <w:rPr>
+          <w:color w:val="215E99" w:themeColor="text2" w:themeTint="BF"/>
+        </w:rPr>
+        <w:t>:</w:t>
+      </w:r>
+      <w:r>
+        <w:rPr>
+          <w:color w:val="215E99" w:themeColor="text2" w:themeTint="BF"/>
+        </w:rPr>
+        <w:t xml:space="preserve"> Thanks. We have completely re-written this entire section and brought a few more examples here. The section that follows (“Translating exposure to organism temperature: biophysics to the rescue”) discusses how species may not actually experience these extremes, and how biophysical models can capture this by modelling behaviour.</w:t>
+      </w:r>
+    </w:p>
+    <w:p>
+      <w:r>
+        <w:br/>
+      </w:r>
+      <w:r>
+        <w:rPr>
+          <w:b/>
+          <w:bCs/>
+        </w:rPr>
+        <w:t>C</w:t>
+      </w:r>
+      <w:r>
+        <w:rPr>
+          <w:b/>
+          <w:bCs/>
+        </w:rPr>
+        <w:t>41</w:t>
+      </w:r>
+      <w:r>
+        <w:rPr>
+          <w:b/>
+          <w:bCs/>
+        </w:rPr>
+        <w:t>:</w:t>
+      </w:r>
+      <w:r>
+        <w:rPr>
+          <w:b/>
+          <w:bCs/>
+        </w:rPr>
+        <w:t xml:space="preserve"> </w:t>
+      </w:r>
+      <w:r>
+        <w:t>Line 133-135 - I miss a reference for this latter sentence, or a more comprehensive unfolding of the non-linearity aspects. It is a surprise how little space you offer to the non-linearity aspects of extremes and how to model them, despite they are crucial characteristics of such events.</w:t>
+      </w:r>
+      <w:r>
+        <w:br/>
+      </w:r>
+    </w:p>
+    <w:p>
+      <w:r>
+        <w:rPr>
+          <w:b/>
+          <w:bCs/>
+          <w:color w:val="215E99" w:themeColor="text2" w:themeTint="BF"/>
+        </w:rPr>
+        <w:t>Response</w:t>
+      </w:r>
+      <w:r>
+        <w:rPr>
+          <w:color w:val="215E99" w:themeColor="text2" w:themeTint="BF"/>
+        </w:rPr>
+        <w:t>:</w:t>
+      </w:r>
+      <w:r>
+        <w:rPr>
+          <w:color w:val="215E99" w:themeColor="text2" w:themeTint="BF"/>
+        </w:rPr>
+        <w:t xml:space="preserve"> Non-linearities and interactions are expected to emerge as an entire system is modelled, which is what we are advocating. We have mentioned </w:t>
+      </w:r>
+      <w:r>
+        <w:rPr>
+          <w:color w:val="215E99" w:themeColor="text2" w:themeTint="BF"/>
+        </w:rPr>
+        <w:t>non-linearities and interactions in the introduction and concluding remarks sections but have limited space to devote to it otherwise because it is an emergent property of modelling a system. As such, the exact nature of these non-linearities will depend on the system as Reviewer 3 understands.</w:t>
+      </w:r>
+    </w:p>
+    <w:p>
+      <w:r>
+        <w:br/>
+      </w:r>
+      <w:r>
+        <w:rPr>
+          <w:b/>
+          <w:bCs/>
+        </w:rPr>
+        <w:t>C</w:t>
+      </w:r>
+      <w:r>
+        <w:rPr>
+          <w:b/>
+          <w:bCs/>
+        </w:rPr>
+        <w:t>42</w:t>
+      </w:r>
+      <w:r>
+        <w:rPr>
+          <w:b/>
+          <w:bCs/>
+        </w:rPr>
+        <w:t>:</w:t>
+      </w:r>
+      <w:r>
+        <w:rPr>
+          <w:b/>
+          <w:bCs/>
+        </w:rPr>
+        <w:t xml:space="preserve"> </w:t>
+      </w:r>
+      <w:r>
+        <w:t>Line 159-161 - I do not understand what you try to say here? This sounds like what all models do (or try to do). What is the challenge you see here - is it modelling the thermal regime or the plant/system dynamics?</w:t>
+      </w:r>
+      <w:r>
+        <w:br/>
+      </w:r>
+    </w:p>
+    <w:p>
+      <w:pPr>
+        <w:rPr>
+          <w:color w:val="215E99" w:themeColor="text2" w:themeTint="BF"/>
+        </w:rPr>
+      </w:pPr>
+      <w:r>
+        <w:rPr>
+          <w:b/>
+          <w:bCs/>
+          <w:color w:val="215E99" w:themeColor="text2" w:themeTint="BF"/>
+        </w:rPr>
         <w:lastRenderedPageBreak/>
-        <w:t xml:space="preserve">general climate modelling </w:t>
-      </w:r>
-      <w:proofErr w:type="gramStart"/>
-      <w:r>
-        <w:t>is</w:t>
-      </w:r>
-      <w:proofErr w:type="gramEnd"/>
-      <w:r>
-        <w:t xml:space="preserve"> reasonably good while the translation of the general weather patterns into local and regional extremes are really challenging. But this </w:t>
-      </w:r>
-      <w:proofErr w:type="gramStart"/>
-      <w:r>
-        <w:t>particular challenge</w:t>
-      </w:r>
-      <w:proofErr w:type="gramEnd"/>
-      <w:r>
-        <w:t xml:space="preserve"> is not what you describe.</w:t>
-      </w:r>
-      <w:r>
-        <w:br/>
-      </w:r>
-    </w:p>
-    <w:p>
-      <w:r>
-        <w:rPr>
-          <w:b/>
-          <w:bCs/>
-          <w:color w:val="215E99" w:themeColor="text2" w:themeTint="BF"/>
-        </w:rPr>
-        <w:t>Response</w:t>
-      </w:r>
-      <w:r>
-        <w:rPr>
-          <w:color w:val="215E99" w:themeColor="text2" w:themeTint="BF"/>
-        </w:rPr>
-        <w:t>:</w:t>
-      </w:r>
-      <w:r>
-        <w:rPr>
-          <w:color w:val="215E99" w:themeColor="text2" w:themeTint="BF"/>
-        </w:rPr>
-        <w:t xml:space="preserve"> We agree, and this was a point brought up also by Reviewer 2. We have now removed the global climate modelling section and kept it’s mention to a minimum focusing on citing already existing reviews in other sections. </w:t>
-      </w:r>
-    </w:p>
-    <w:p>
-      <w:r>
-        <w:br/>
-      </w:r>
-      <w:r>
-        <w:rPr>
-          <w:b/>
-          <w:bCs/>
-        </w:rPr>
-        <w:t>C</w:t>
-      </w:r>
-      <w:r>
-        <w:rPr>
-          <w:b/>
-          <w:bCs/>
-        </w:rPr>
-        <w:t>40</w:t>
-      </w:r>
-      <w:r>
-        <w:rPr>
-          <w:b/>
-          <w:bCs/>
-        </w:rPr>
-        <w:t>:</w:t>
-      </w:r>
-      <w:r>
-        <w:rPr>
-          <w:b/>
-          <w:bCs/>
-        </w:rPr>
-        <w:t xml:space="preserve"> </w:t>
-      </w:r>
-      <w:r>
-        <w:t xml:space="preserve">Line 122-135 - Again, I suggest you include some more specific ecological understanding here. The section looks at extremes mostly from a meteorological point of view, but this may not in itself be relevant if the ecosystems or species do not experience the pressure as extreme. Melinda Smith has a great paper where she </w:t>
-      </w:r>
-      <w:proofErr w:type="gramStart"/>
-      <w:r>
-        <w:t>distinguish</w:t>
-      </w:r>
-      <w:proofErr w:type="gramEnd"/>
-      <w:r>
-        <w:t xml:space="preserve"> between meteorological extremes and ecological extremes. That would be a relevant and great perspective to include.</w:t>
-      </w:r>
-      <w:r>
-        <w:br/>
-      </w:r>
-    </w:p>
-    <w:p>
-      <w:r>
-        <w:rPr>
-          <w:b/>
-          <w:bCs/>
-          <w:color w:val="215E99" w:themeColor="text2" w:themeTint="BF"/>
-        </w:rPr>
-        <w:t>Response</w:t>
-      </w:r>
-      <w:r>
-        <w:rPr>
-          <w:color w:val="215E99" w:themeColor="text2" w:themeTint="BF"/>
-        </w:rPr>
-        <w:t>:</w:t>
-      </w:r>
-      <w:r>
-        <w:rPr>
-          <w:color w:val="215E99" w:themeColor="text2" w:themeTint="BF"/>
-        </w:rPr>
-        <w:t xml:space="preserve"> Thanks. We have completely re-written this entire section and brought a few more examples here. The section that follows (“Translating exposure to organism temperature: biophysics to the rescue”) discusses how species may not actually experience these extremes, and how biophysical models can capture this by modelling behaviour.</w:t>
-      </w:r>
-    </w:p>
-    <w:p>
-      <w:r>
-        <w:br/>
-      </w:r>
-      <w:r>
-        <w:rPr>
-          <w:b/>
-          <w:bCs/>
-        </w:rPr>
-        <w:t>C</w:t>
-      </w:r>
-      <w:r>
-        <w:rPr>
-          <w:b/>
-          <w:bCs/>
-        </w:rPr>
-        <w:t>41</w:t>
-      </w:r>
-      <w:r>
-        <w:rPr>
-          <w:b/>
-          <w:bCs/>
-        </w:rPr>
-        <w:t>:</w:t>
-      </w:r>
-      <w:r>
-        <w:rPr>
-          <w:b/>
-          <w:bCs/>
-        </w:rPr>
-        <w:t xml:space="preserve"> </w:t>
-      </w:r>
-      <w:r>
-        <w:t>Line 133-135 - I miss a reference for this latter sentence, or a more comprehensive unfolding of the non-linearity aspects. It is a surprise how little space you offer to the non-linearity aspects of extremes and how to model them, despite they are crucial characteristics of such events.</w:t>
-      </w:r>
-      <w:r>
-        <w:br/>
-      </w:r>
-    </w:p>
-    <w:p>
-      <w:r>
-        <w:rPr>
-          <w:b/>
-          <w:bCs/>
-          <w:color w:val="215E99" w:themeColor="text2" w:themeTint="BF"/>
-        </w:rPr>
-        <w:t>Response</w:t>
-      </w:r>
-      <w:r>
-        <w:rPr>
-          <w:color w:val="215E99" w:themeColor="text2" w:themeTint="BF"/>
-        </w:rPr>
-        <w:t>:</w:t>
-      </w:r>
-      <w:r>
-        <w:rPr>
-          <w:color w:val="215E99" w:themeColor="text2" w:themeTint="BF"/>
-        </w:rPr>
-        <w:t xml:space="preserve"> Non-linearities and interactions are expected to emerge as an entire system is modelled, which is what we are advocating. We have mentioned </w:t>
-      </w:r>
-      <w:r>
-        <w:rPr>
-          <w:color w:val="215E99" w:themeColor="text2" w:themeTint="BF"/>
-        </w:rPr>
-        <w:t>non-linearities and interactions in the introduction and concluding remarks sections but have limited space to devote to it otherwise because it is an emergent property of modelling a system. As such, the exact nature of these non-linearities will depend on the system as Reviewer 3 understands.</w:t>
-      </w:r>
-    </w:p>
-    <w:p>
-      <w:r>
-        <w:br/>
-      </w:r>
-      <w:r>
-        <w:rPr>
-          <w:b/>
-          <w:bCs/>
-        </w:rPr>
-        <w:t>C</w:t>
-      </w:r>
-      <w:r>
-        <w:rPr>
-          <w:b/>
-          <w:bCs/>
-        </w:rPr>
-        <w:t>42</w:t>
-      </w:r>
-      <w:r>
-        <w:rPr>
-          <w:b/>
-          <w:bCs/>
-        </w:rPr>
-        <w:t>:</w:t>
-      </w:r>
-      <w:r>
-        <w:rPr>
-          <w:b/>
-          <w:bCs/>
-        </w:rPr>
-        <w:t xml:space="preserve"> </w:t>
-      </w:r>
-      <w:r>
-        <w:t>Line 159-161 - I do not understand what you try to say here? This sounds like what all models do (or try to do). What is the challenge you see here - is it modelling the thermal regime or the plant/system dynamics?</w:t>
-      </w:r>
-      <w:r>
-        <w:br/>
-      </w:r>
-    </w:p>
-    <w:p>
-      <w:pPr>
-        <w:rPr>
-          <w:color w:val="215E99" w:themeColor="text2" w:themeTint="BF"/>
-        </w:rPr>
-      </w:pPr>
-      <w:r>
-        <w:rPr>
-          <w:b/>
-          <w:bCs/>
-          <w:color w:val="215E99" w:themeColor="text2" w:themeTint="BF"/>
-        </w:rPr>
         <w:t>Response</w:t>
       </w:r>
       <w:r>
@@ -4348,7 +4392,6 @@
           <w:bCs/>
           <w:color w:val="215E99" w:themeColor="text2" w:themeTint="BF"/>
         </w:rPr>
-        <w:lastRenderedPageBreak/>
         <w:t>Response</w:t>
       </w:r>
       <w:r>
@@ -4686,7 +4729,11 @@
       </w:r>
       <w:commentRangeStart w:id="13"/>
       <w:r>
-        <w:t>coexistence" as a key explanatory model? It is true that species interactions are relevant for describing the interaction between two or more species relative to the site conditions at a given site</w:t>
+        <w:t xml:space="preserve">coexistence" as a key explanatory </w:t>
+      </w:r>
+      <w:r>
+        <w:lastRenderedPageBreak/>
+        <w:t>model? It is true that species interactions are relevant for describing the interaction between two or more species relative to the site conditions at a given site</w:t>
       </w:r>
       <w:commentRangeEnd w:id="13"/>
       <w:r>
@@ -4704,11 +4751,326 @@
       </w:r>
       <w:proofErr w:type="spellEnd"/>
       <w:r>
-        <w:t xml:space="preserve">, if future heat waves is a novel factor for a given site, the ability of a given specie and community to withstand this pressure is importance, but I do not really see how coexistence is the core logical framework to describe systems responses to heat waves (or other extremes). The authors may have a point, </w:t>
+        <w:t>, if future heat waves is a novel factor for a given site, the ability of a given specie and community to withstand this pressure is importance, but I do not really see how coexistence is the core logical framework to describe systems responses to heat waves (or other extremes). The authors may have a point, but it must be described.</w:t>
+      </w:r>
+      <w:r>
+        <w:br/>
+      </w:r>
+    </w:p>
+    <w:p>
+      <w:r>
+        <w:rPr>
+          <w:b/>
+          <w:bCs/>
+          <w:color w:val="215E99" w:themeColor="text2" w:themeTint="BF"/>
+        </w:rPr>
+        <w:t>Re</w:t>
+      </w:r>
+      <w:r>
+        <w:rPr>
+          <w:b/>
+          <w:bCs/>
+          <w:color w:val="215E99" w:themeColor="text2" w:themeTint="BF"/>
+          <w:highlight w:val="yellow"/>
+        </w:rPr>
+        <w:t>spon</w:t>
+      </w:r>
+      <w:r>
+        <w:rPr>
+          <w:b/>
+          <w:bCs/>
+          <w:color w:val="215E99" w:themeColor="text2" w:themeTint="BF"/>
+        </w:rPr>
+        <w:t>se</w:t>
+      </w:r>
+      <w:r>
+        <w:rPr>
+          <w:color w:val="215E99" w:themeColor="text2" w:themeTint="BF"/>
+        </w:rPr>
+        <w:t>:</w:t>
+      </w:r>
+      <w:r>
+        <w:rPr>
+          <w:color w:val="215E99" w:themeColor="text2" w:themeTint="BF"/>
+        </w:rPr>
+        <w:t xml:space="preserve"> MARGIE ADD RESPONSE</w:t>
+      </w:r>
+    </w:p>
+    <w:p>
+      <w:r>
+        <w:br/>
+      </w:r>
+      <w:r>
+        <w:rPr>
+          <w:b/>
+          <w:bCs/>
+        </w:rPr>
+        <w:t>C</w:t>
+      </w:r>
+      <w:r>
+        <w:rPr>
+          <w:b/>
+          <w:bCs/>
+        </w:rPr>
+        <w:t>48</w:t>
+      </w:r>
+      <w:r>
+        <w:rPr>
+          <w:b/>
+          <w:bCs/>
+        </w:rPr>
+        <w:t>:</w:t>
+      </w:r>
+      <w:r>
+        <w:rPr>
+          <w:b/>
+          <w:bCs/>
+        </w:rPr>
+        <w:t xml:space="preserve"> </w:t>
+      </w:r>
+      <w:r>
+        <w:t xml:space="preserve">Box 2 - I think there is a time perspective missing in the description of heat waves as the driver for natural selection and evolution, and I think these two aspects are mistakenly mixed up. Extreme events may clearly drive selection of genetic variants that has the traits to survive the extreme pressure, but less so for evolution because it is a single and dramatic event. And evolution runs over longer time scales. Further, the consequence of extreme events may not be adaptation and evolution, but simply dieback, </w:t>
+      </w:r>
+      <w:proofErr w:type="spellStart"/>
+      <w:r>
+        <w:t>disappearence</w:t>
+      </w:r>
+      <w:proofErr w:type="spellEnd"/>
+      <w:r>
+        <w:t xml:space="preserve"> and replacement. Extreme events may cause dieback and complete removal of certain species or a complete exchange of existing species and systems with new and different species and system (e.g. desertification) meaning that survival and/or invasion may be more important. So, many of the aspects mentioned here clearly play an important </w:t>
+      </w:r>
+      <w:proofErr w:type="gramStart"/>
+      <w:r>
+        <w:t>role, but</w:t>
+      </w:r>
+      <w:proofErr w:type="gramEnd"/>
+      <w:r>
+        <w:t xml:space="preserve"> may only present part of the story and other relevant and equally important processes and </w:t>
+      </w:r>
+      <w:proofErr w:type="spellStart"/>
+      <w:r>
+        <w:t>ressponses</w:t>
+      </w:r>
+      <w:proofErr w:type="spellEnd"/>
+      <w:r>
+        <w:t xml:space="preserve"> are completely missing. For example, the equation 2 seems to be of minor importance (as also stated in the box text).</w:t>
+      </w:r>
+      <w:r>
+        <w:br/>
+      </w:r>
+    </w:p>
+    <w:p>
+      <w:r>
+        <w:rPr>
+          <w:b/>
+          <w:bCs/>
+          <w:color w:val="215E99" w:themeColor="text2" w:themeTint="BF"/>
+        </w:rPr>
+        <w:t>Response</w:t>
+      </w:r>
+      <w:r>
+        <w:rPr>
+          <w:color w:val="215E99" w:themeColor="text2" w:themeTint="BF"/>
+        </w:rPr>
+        <w:t>:</w:t>
+      </w:r>
+      <w:r>
+        <w:rPr>
+          <w:color w:val="215E99" w:themeColor="text2" w:themeTint="BF"/>
+        </w:rPr>
+        <w:t xml:space="preserve"> Sorry, we are not quite sure what Reviewer 3 means here</w:t>
+      </w:r>
+      <w:r>
+        <w:rPr>
+          <w:color w:val="215E99" w:themeColor="text2" w:themeTint="BF"/>
+        </w:rPr>
+        <w:t>, and we respectfully disagree with some statements</w:t>
+      </w:r>
+      <w:r>
+        <w:rPr>
+          <w:color w:val="215E99" w:themeColor="text2" w:themeTint="BF"/>
+        </w:rPr>
+        <w:t xml:space="preserve">. Evolution can happen over ecological timescales, and extreme events have been shown to lead to rapid evolutionary change (for a recent review see: </w:t>
+      </w:r>
+      <w:r>
+        <w:rPr>
+          <w:color w:val="215E99" w:themeColor="text2" w:themeTint="BF"/>
+        </w:rPr>
+        <w:t>Baeckens, S. and Donihue, C.M., 2025. Evolutionary consequences of extreme climate events. Current Biology, 35(17), R850-R864</w:t>
+      </w:r>
+      <w:r>
+        <w:rPr>
+          <w:color w:val="215E99" w:themeColor="text2" w:themeTint="BF"/>
+        </w:rPr>
+        <w:t xml:space="preserve">). </w:t>
+      </w:r>
+      <w:r>
+        <w:rPr>
+          <w:color w:val="215E99" w:themeColor="text2" w:themeTint="BF"/>
+        </w:rPr>
+        <w:t xml:space="preserve">We do not disagree with Reviewer 3 that that dieback is not an example of evolutionary adaptation, but this example is not one we discuss, so it is unclear how it pertains to Box 3. </w:t>
+      </w:r>
+      <w:r>
+        <w:rPr>
+          <w:color w:val="215E99" w:themeColor="text2" w:themeTint="BF"/>
+        </w:rPr>
+        <w:t xml:space="preserve">Any systems modelling approach needs to eventually identify ways to incorporate eco-evolutionary feedback. Short term evolutionary shifts </w:t>
+      </w:r>
+      <w:r>
+        <w:rPr>
+          <w:color w:val="215E99" w:themeColor="text2" w:themeTint="BF"/>
+        </w:rPr>
+        <w:t xml:space="preserve">or plastic responses </w:t>
+      </w:r>
+      <w:r>
+        <w:rPr>
+          <w:color w:val="215E99" w:themeColor="text2" w:themeTint="BF"/>
+        </w:rPr>
+        <w:t xml:space="preserve">resulting from extreme climates not only </w:t>
+      </w:r>
+      <w:r>
+        <w:rPr>
+          <w:color w:val="215E99" w:themeColor="text2" w:themeTint="BF"/>
+        </w:rPr>
+        <w:t xml:space="preserve">depend (and impact) on selection strength </w:t>
+      </w:r>
+      <w:r>
+        <w:rPr>
+          <w:color w:val="215E99" w:themeColor="text2" w:themeTint="BF"/>
+        </w:rPr>
+        <w:t xml:space="preserve">but </w:t>
+      </w:r>
+      <w:r>
+        <w:rPr>
+          <w:color w:val="215E99" w:themeColor="text2" w:themeTint="BF"/>
+        </w:rPr>
+        <w:t>also</w:t>
+      </w:r>
+      <w:r>
+        <w:rPr>
+          <w:color w:val="215E99" w:themeColor="text2" w:themeTint="BF"/>
+        </w:rPr>
+        <w:t xml:space="preserve"> </w:t>
+      </w:r>
+      <w:r>
+        <w:rPr>
+          <w:color w:val="215E99" w:themeColor="text2" w:themeTint="BF"/>
+        </w:rPr>
+        <w:t xml:space="preserve">phenotypic and </w:t>
+      </w:r>
+      <w:r>
+        <w:rPr>
+          <w:color w:val="215E99" w:themeColor="text2" w:themeTint="BF"/>
+        </w:rPr>
+        <w:t xml:space="preserve">genetic variance which can affect how a system responds in the future. </w:t>
+      </w:r>
+      <w:r>
+        <w:rPr>
+          <w:color w:val="215E99" w:themeColor="text2" w:themeTint="BF"/>
+        </w:rPr>
+        <w:t>We agree however that this box needed to be more focused and emphasis a few of these important points better. It also needed to be shortened so we have re-written the text in this box (now Box 3).</w:t>
+      </w:r>
+    </w:p>
+    <w:p>
+      <w:r>
+        <w:br/>
+      </w:r>
+      <w:r>
+        <w:rPr>
+          <w:b/>
+          <w:bCs/>
+        </w:rPr>
+        <w:t>C</w:t>
+      </w:r>
+      <w:r>
+        <w:rPr>
+          <w:b/>
+          <w:bCs/>
+        </w:rPr>
+        <w:t>49</w:t>
+      </w:r>
+      <w:r>
+        <w:rPr>
+          <w:b/>
+          <w:bCs/>
+        </w:rPr>
+        <w:t>:</w:t>
+      </w:r>
+      <w:r>
+        <w:rPr>
+          <w:b/>
+          <w:bCs/>
+        </w:rPr>
+        <w:t xml:space="preserve"> </w:t>
+      </w:r>
+      <w:r>
+        <w:t xml:space="preserve">Box 3 - I acknowledge that heat waves </w:t>
+      </w:r>
+      <w:commentRangeStart w:id="14"/>
+      <w:r>
+        <w:t xml:space="preserve">and other climatic extremes causing major impacts on plants and ecosystems will cascade to also have potentially significant societal impacts. However, the paper has a strange mismatch in scale with on the one </w:t>
       </w:r>
       <w:r>
         <w:lastRenderedPageBreak/>
-        <w:t>but it must be described.</w:t>
+        <w:t xml:space="preserve">hand quite some detailed description of single species and on the other hand attempts to embrace the entire global society - and these overly complex societal responses are handled by a single box and just 15 lines! This is just not convincing. </w:t>
+      </w:r>
+      <w:commentRangeEnd w:id="14"/>
+      <w:r>
+        <w:rPr>
+          <w:rStyle w:val="CommentReference"/>
+        </w:rPr>
+        <w:commentReference w:id="14"/>
+      </w:r>
+      <w:r>
+        <w:t xml:space="preserve">The societal aspects of these changes may be </w:t>
+      </w:r>
+      <w:proofErr w:type="gramStart"/>
+      <w:r>
+        <w:t>really complex</w:t>
+      </w:r>
+      <w:proofErr w:type="gramEnd"/>
+      <w:r>
+        <w:t xml:space="preserve"> and involve severe impacts on anything from changes in classic </w:t>
+      </w:r>
+      <w:proofErr w:type="spellStart"/>
+      <w:r>
+        <w:t>provisionary</w:t>
+      </w:r>
+      <w:proofErr w:type="spellEnd"/>
+      <w:r>
+        <w:t xml:space="preserve"> ecosystems services like food, feed and fibre to economic progress, human </w:t>
+      </w:r>
+      <w:proofErr w:type="spellStart"/>
+      <w:r>
+        <w:t>behavior</w:t>
+      </w:r>
+      <w:proofErr w:type="spellEnd"/>
+      <w:r>
+        <w:t xml:space="preserve">, migration and political unrest. These are really complex changes which the paper does not really acknowledge, and therefore the statement in line 292 that systems modelling can provide us with quantitative tools for </w:t>
+      </w:r>
+      <w:proofErr w:type="spellStart"/>
+      <w:r>
+        <w:t>predictins</w:t>
+      </w:r>
+      <w:proofErr w:type="spellEnd"/>
+      <w:r>
+        <w:t xml:space="preserve"> and decisions may in principle be correct, but we do not get any clear descriptions or approaches (which was the promise in the title of the paper) - or even a glance of what need to be scientifically and </w:t>
+      </w:r>
+      <w:proofErr w:type="spellStart"/>
+      <w:r>
+        <w:t>modelwise</w:t>
+      </w:r>
+      <w:proofErr w:type="spellEnd"/>
+      <w:r>
+        <w:t xml:space="preserve"> developed to get there. It may be relevant to include these aspects, but it </w:t>
+      </w:r>
+      <w:proofErr w:type="gramStart"/>
+      <w:r>
+        <w:t>has to</w:t>
+      </w:r>
+      <w:proofErr w:type="gramEnd"/>
+      <w:r>
+        <w:t xml:space="preserve"> be carefully described and framed, and the modelling aspects must be treated with the same carefulness as the physical-biological systems.</w:t>
       </w:r>
       <w:r>
         <w:br/>
@@ -4721,30 +5083,37 @@
           <w:bCs/>
           <w:color w:val="215E99" w:themeColor="text2" w:themeTint="BF"/>
         </w:rPr>
-        <w:t>Re</w:t>
-      </w:r>
-      <w:r>
-        <w:rPr>
-          <w:b/>
-          <w:bCs/>
-          <w:color w:val="215E99" w:themeColor="text2" w:themeTint="BF"/>
-          <w:highlight w:val="yellow"/>
-        </w:rPr>
-        <w:t>spon</w:t>
-      </w:r>
-      <w:r>
-        <w:rPr>
-          <w:b/>
-          <w:bCs/>
-          <w:color w:val="215E99" w:themeColor="text2" w:themeTint="BF"/>
-        </w:rPr>
-        <w:t>se</w:t>
-      </w:r>
-      <w:r>
-        <w:rPr>
-          <w:color w:val="215E99" w:themeColor="text2" w:themeTint="BF"/>
-        </w:rPr>
-        <w:t>:</w:t>
+        <w:t>Response</w:t>
+      </w:r>
+      <w:r>
+        <w:rPr>
+          <w:color w:val="215E99" w:themeColor="text2" w:themeTint="BF"/>
+        </w:rPr>
+        <w:t>:</w:t>
+      </w:r>
+      <w:r>
+        <w:rPr>
+          <w:color w:val="215E99" w:themeColor="text2" w:themeTint="BF"/>
+        </w:rPr>
+        <w:t xml:space="preserve"> We agree. We have now removed the SES discussion from the paper and focused on the biological models. We make brief mention in the introduction and concluding remarks section about the implications for socioecological modelling. </w:t>
+      </w:r>
+      <w:r>
+        <w:rPr>
+          <w:color w:val="215E99" w:themeColor="text2" w:themeTint="BF"/>
+        </w:rPr>
+        <w:t>Instead,</w:t>
+      </w:r>
+      <w:r>
+        <w:rPr>
+          <w:color w:val="215E99" w:themeColor="text2" w:themeTint="BF"/>
+        </w:rPr>
+        <w:t xml:space="preserve"> we use this extra box </w:t>
+      </w:r>
+      <w:r>
+        <w:rPr>
+          <w:color w:val="215E99" w:themeColor="text2" w:themeTint="BF"/>
+        </w:rPr>
+        <w:t xml:space="preserve">bring in a concrete demonstration of how models in the major classes can be coupled across species. </w:t>
       </w:r>
     </w:p>
     <w:p>
@@ -4763,7 +5132,7 @@
           <w:b/>
           <w:bCs/>
         </w:rPr>
-        <w:t>48</w:t>
+        <w:t>50</w:t>
       </w:r>
       <w:r>
         <w:rPr>
@@ -4780,36 +5149,207 @@
         <w:t xml:space="preserve"> </w:t>
       </w:r>
       <w:r>
-        <w:t xml:space="preserve">Box 2 - I think there is a time perspective missing in the description of heat waves as the driver for natural selection and evolution, and I think these two aspects are mistakenly mixed up. Extreme events may clearly drive selection of genetic variants that has the traits to survive the extreme pressure, but less so for evolution because it is a single and dramatic event. And evolution runs over longer time scales. Further, the consequence of extreme events may not be adaptation and evolution, but simply dieback, </w:t>
-      </w:r>
-      <w:proofErr w:type="spellStart"/>
-      <w:r>
-        <w:t>disappearence</w:t>
-      </w:r>
-      <w:proofErr w:type="spellEnd"/>
-      <w:r>
-        <w:t xml:space="preserve"> and replacement. Extreme events may cause dieback and complete removal of certain species or a complete exchange of existing species and systems with new and different species and system (e.g. desertification) meaning that survival and/or invasion may be more important. So, many of the aspects mentioned here clearly play an important </w:t>
+        <w:t>Figure 3 - This is an overly naïve figure that does not provide any useful information of the model approach.</w:t>
+      </w:r>
+      <w:r>
+        <w:br/>
+      </w:r>
+    </w:p>
+    <w:p>
+      <w:r>
+        <w:rPr>
+          <w:b/>
+          <w:bCs/>
+          <w:color w:val="215E99" w:themeColor="text2" w:themeTint="BF"/>
+        </w:rPr>
+        <w:t>Response</w:t>
+      </w:r>
+      <w:r>
+        <w:rPr>
+          <w:color w:val="215E99" w:themeColor="text2" w:themeTint="BF"/>
+        </w:rPr>
+        <w:t>:</w:t>
+      </w:r>
+      <w:r>
+        <w:rPr>
+          <w:color w:val="215E99" w:themeColor="text2" w:themeTint="BF"/>
+        </w:rPr>
+        <w:t xml:space="preserve"> </w:t>
+      </w:r>
+      <w:r>
+        <w:rPr>
+          <w:color w:val="215E99" w:themeColor="text2" w:themeTint="BF"/>
+        </w:rPr>
+        <w:t>Agree. We have removed this figure and the SES box.</w:t>
+      </w:r>
+    </w:p>
+    <w:p>
+      <w:r>
+        <w:br/>
+      </w:r>
+      <w:r>
+        <w:rPr>
+          <w:b/>
+          <w:bCs/>
+        </w:rPr>
+        <w:t>C</w:t>
+      </w:r>
+      <w:r>
+        <w:rPr>
+          <w:b/>
+          <w:bCs/>
+        </w:rPr>
+        <w:t>51</w:t>
+      </w:r>
+      <w:r>
+        <w:rPr>
+          <w:b/>
+          <w:bCs/>
+        </w:rPr>
+        <w:t>:</w:t>
+      </w:r>
+      <w:r>
+        <w:rPr>
+          <w:b/>
+          <w:bCs/>
+        </w:rPr>
+        <w:t xml:space="preserve"> </w:t>
+      </w:r>
+      <w:r>
+        <w:t>Figure 4 - Even with the long descriptive text, it is a very busy figure not giving a clear idea of what it wants to tell. It seems to be focused on a very limited system with just 2 species which is a bit contradictory to the concept of the paper that speaks about integration across domains and areas. The real challenge and the promise of the paper is about the comprehensive systems view and approach. The figure does not provide any solutions to the larger systems level.</w:t>
+      </w:r>
+      <w:r>
+        <w:br/>
+      </w:r>
+    </w:p>
+    <w:p>
+      <w:r>
+        <w:rPr>
+          <w:b/>
+          <w:bCs/>
+          <w:color w:val="215E99" w:themeColor="text2" w:themeTint="BF"/>
+        </w:rPr>
+        <w:t>Response</w:t>
+      </w:r>
+      <w:r>
+        <w:rPr>
+          <w:color w:val="215E99" w:themeColor="text2" w:themeTint="BF"/>
+        </w:rPr>
+        <w:t>:</w:t>
+      </w:r>
+      <w:r>
+        <w:rPr>
+          <w:color w:val="215E99" w:themeColor="text2" w:themeTint="BF"/>
+        </w:rPr>
+        <w:t xml:space="preserve"> We have now included more detail about the modelling approaches from the supplement in two new boxes. Hopefully this makes the figure emerge more clearly now. We have also tried to simplify it.</w:t>
+      </w:r>
+    </w:p>
+    <w:p>
+      <w:r>
+        <w:br/>
+      </w:r>
+      <w:r>
+        <w:rPr>
+          <w:b/>
+          <w:bCs/>
+        </w:rPr>
+        <w:t>C</w:t>
+      </w:r>
+      <w:r>
+        <w:rPr>
+          <w:b/>
+          <w:bCs/>
+        </w:rPr>
+        <w:t>52</w:t>
+      </w:r>
+      <w:r>
+        <w:rPr>
+          <w:b/>
+          <w:bCs/>
+        </w:rPr>
+        <w:t>:</w:t>
+      </w:r>
+      <w:r>
+        <w:rPr>
+          <w:b/>
+          <w:bCs/>
+        </w:rPr>
+        <w:t xml:space="preserve"> </w:t>
+      </w:r>
+      <w:r>
+        <w:t xml:space="preserve">Outstanding questions - It is great with this attempt to summarize the messages into the next step or research needs for the future. </w:t>
       </w:r>
       <w:proofErr w:type="gramStart"/>
       <w:r>
-        <w:t>role, but</w:t>
+        <w:t>But,</w:t>
       </w:r>
       <w:proofErr w:type="gramEnd"/>
       <w:r>
-        <w:t xml:space="preserve"> may only present part of the story and other relevant and equally important processes and </w:t>
-      </w:r>
-      <w:proofErr w:type="spellStart"/>
-      <w:r>
-        <w:t>ressponses</w:t>
-      </w:r>
-      <w:proofErr w:type="spellEnd"/>
-      <w:r>
-        <w:t xml:space="preserve"> are completely missing. For example, the equation 2 seems to be of minor importance (as also stated in the box text).</w:t>
-      </w:r>
-      <w:r>
-        <w:br/>
-      </w:r>
-    </w:p>
+        <w:t xml:space="preserve"> these questions should follow logically from the paper, which I do not think they do. I cannot identify for any of the 8 points where this is a logical conclusion from things presented and discussed in the paper. Moreover, these 8 points are quite substantial outstanding questions which speaks against the title of the paper promising the reader an approach to model consequences of heat waves. It seems to me that the authors should </w:t>
+      </w:r>
+      <w:proofErr w:type="gramStart"/>
+      <w:r>
+        <w:t>consider,</w:t>
+      </w:r>
+      <w:proofErr w:type="gramEnd"/>
+      <w:r>
+        <w:t xml:space="preserve"> whether they actually </w:t>
+      </w:r>
+      <w:proofErr w:type="gramStart"/>
+      <w:r>
+        <w:t>believe</w:t>
+      </w:r>
+      <w:commentRangeStart w:id="15"/>
+      <w:r>
+        <w:t>s</w:t>
+      </w:r>
+      <w:proofErr w:type="gramEnd"/>
+      <w:r>
+        <w:t xml:space="preserve"> they can present a model approach, and if so, then present the approach with clear documentation and figures that present the different elements and how they are linked</w:t>
+      </w:r>
+      <w:commentRangeEnd w:id="15"/>
+      <w:r>
+        <w:rPr>
+          <w:rStyle w:val="CommentReference"/>
+        </w:rPr>
+        <w:commentReference w:id="15"/>
+      </w:r>
+      <w:r>
+        <w:t xml:space="preserve">. Or, if such an approach is more wishful thinking and not achievable </w:t>
+      </w:r>
+      <w:proofErr w:type="gramStart"/>
+      <w:r>
+        <w:lastRenderedPageBreak/>
+        <w:t>at the moment</w:t>
+      </w:r>
+      <w:proofErr w:type="gramEnd"/>
+      <w:r>
+        <w:t xml:space="preserve">, then present an open review or "directions" paper on what we know and what we need </w:t>
+      </w:r>
+      <w:proofErr w:type="gramStart"/>
+      <w:r>
+        <w:t>in order to</w:t>
+      </w:r>
+      <w:proofErr w:type="gramEnd"/>
+      <w:r>
+        <w:t xml:space="preserve"> get there with clear identification of the elements we stand on and the steps of progress we should take. This should also include a better integration with ecological science to identify </w:t>
+      </w:r>
+      <w:commentRangeStart w:id="16"/>
+      <w:r>
+        <w:t>where we need more fundamental understanding that modelling alone cannot provide</w:t>
+      </w:r>
+      <w:commentRangeEnd w:id="16"/>
+      <w:r>
+        <w:rPr>
+          <w:rStyle w:val="CommentReference"/>
+        </w:rPr>
+        <w:commentReference w:id="16"/>
+      </w:r>
+      <w:r>
+        <w:t>.</w:t>
+      </w:r>
+    </w:p>
+    <w:p/>
     <w:p>
       <w:r>
         <w:rPr>
@@ -4829,521 +5369,45 @@
         <w:rPr>
           <w:color w:val="215E99" w:themeColor="text2" w:themeTint="BF"/>
         </w:rPr>
-        <w:t xml:space="preserve"> Sorry, we are not quite sure what Reviewer 3 means here</w:t>
-      </w:r>
-      <w:r>
-        <w:rPr>
-          <w:color w:val="215E99" w:themeColor="text2" w:themeTint="BF"/>
-        </w:rPr>
-        <w:t>, and we respectfully disagree with some statements</w:t>
-      </w:r>
-      <w:r>
-        <w:rPr>
-          <w:color w:val="215E99" w:themeColor="text2" w:themeTint="BF"/>
-        </w:rPr>
-        <w:t xml:space="preserve">. Evolution can happen over ecological timescales, and extreme events have been shown to lead to rapid evolutionary change (for a recent review see: </w:t>
-      </w:r>
-      <w:r>
-        <w:rPr>
-          <w:color w:val="215E99" w:themeColor="text2" w:themeTint="BF"/>
-        </w:rPr>
-        <w:t>Baeckens, S. and Donihue, C.M., 2025. Evolutionary consequences of extreme climate events. Current Biology, 35(17), R850-R864</w:t>
-      </w:r>
-      <w:r>
-        <w:rPr>
-          <w:color w:val="215E99" w:themeColor="text2" w:themeTint="BF"/>
-        </w:rPr>
-        <w:t xml:space="preserve">). </w:t>
-      </w:r>
-      <w:r>
-        <w:rPr>
-          <w:color w:val="215E99" w:themeColor="text2" w:themeTint="BF"/>
-        </w:rPr>
-        <w:t xml:space="preserve">We do not disagree with Reviewer 3 that that dieback is not an example of evolutionary adaptation, but this example is not one we discuss, so it is unclear how it pertains to Box 3. </w:t>
-      </w:r>
-      <w:r>
-        <w:rPr>
-          <w:color w:val="215E99" w:themeColor="text2" w:themeTint="BF"/>
-        </w:rPr>
-        <w:t xml:space="preserve">Any systems modelling approach needs to eventually identify ways to incorporate eco-evolutionary feedback. Short term evolutionary shifts </w:t>
-      </w:r>
-      <w:r>
-        <w:rPr>
-          <w:color w:val="215E99" w:themeColor="text2" w:themeTint="BF"/>
-        </w:rPr>
-        <w:t xml:space="preserve">or plastic responses </w:t>
-      </w:r>
-      <w:r>
-        <w:rPr>
-          <w:color w:val="215E99" w:themeColor="text2" w:themeTint="BF"/>
-        </w:rPr>
-        <w:t xml:space="preserve">resulting from extreme climates not only </w:t>
-      </w:r>
-      <w:r>
-        <w:rPr>
-          <w:color w:val="215E99" w:themeColor="text2" w:themeTint="BF"/>
-        </w:rPr>
-        <w:t xml:space="preserve">depend (and impact) on selection strength </w:t>
-      </w:r>
-      <w:r>
-        <w:rPr>
-          <w:color w:val="215E99" w:themeColor="text2" w:themeTint="BF"/>
-        </w:rPr>
-        <w:t xml:space="preserve">but </w:t>
-      </w:r>
-      <w:r>
-        <w:rPr>
-          <w:color w:val="215E99" w:themeColor="text2" w:themeTint="BF"/>
-        </w:rPr>
-        <w:t>also</w:t>
-      </w:r>
-      <w:r>
-        <w:rPr>
-          <w:color w:val="215E99" w:themeColor="text2" w:themeTint="BF"/>
-        </w:rPr>
-        <w:t xml:space="preserve"> </w:t>
-      </w:r>
-      <w:r>
-        <w:rPr>
-          <w:color w:val="215E99" w:themeColor="text2" w:themeTint="BF"/>
-        </w:rPr>
-        <w:t xml:space="preserve">phenotypic and </w:t>
-      </w:r>
-      <w:r>
-        <w:rPr>
-          <w:color w:val="215E99" w:themeColor="text2" w:themeTint="BF"/>
-        </w:rPr>
-        <w:t xml:space="preserve">genetic variance which can affect how a system responds in the future. </w:t>
-      </w:r>
-      <w:r>
-        <w:rPr>
-          <w:color w:val="215E99" w:themeColor="text2" w:themeTint="BF"/>
-        </w:rPr>
-        <w:t>We agree however that this box needed to be more focused and emphasis a few of these important points better. It also needed to be shortened so we have re-written the text in this box (now Box 3).</w:t>
-      </w:r>
-    </w:p>
-    <w:p>
-      <w:r>
-        <w:br/>
-      </w:r>
-      <w:r>
-        <w:rPr>
-          <w:b/>
-          <w:bCs/>
-        </w:rPr>
-        <w:t>C</w:t>
-      </w:r>
-      <w:r>
-        <w:rPr>
-          <w:b/>
-          <w:bCs/>
-        </w:rPr>
-        <w:t>49</w:t>
-      </w:r>
-      <w:r>
-        <w:rPr>
-          <w:b/>
-          <w:bCs/>
-        </w:rPr>
-        <w:t>:</w:t>
-      </w:r>
-      <w:r>
-        <w:rPr>
-          <w:b/>
-          <w:bCs/>
-        </w:rPr>
-        <w:t xml:space="preserve"> </w:t>
-      </w:r>
-      <w:r>
-        <w:t xml:space="preserve">Box 3 - I acknowledge that heat waves </w:t>
-      </w:r>
-      <w:commentRangeStart w:id="14"/>
-      <w:r>
-        <w:t xml:space="preserve">and other climatic extremes causing major impacts on plants and ecosystems will cascade to also have potentially significant societal impacts. However, the paper has a strange mismatch in scale with on the one hand quite some detailed description of single species and on the other hand attempts to embrace the entire global society - and these overly complex societal responses are handled by a single box and just 15 lines! This is just not convincing. </w:t>
-      </w:r>
-      <w:commentRangeEnd w:id="14"/>
+        <w:t xml:space="preserve"> We have now re-written and re-</w:t>
+      </w:r>
+      <w:commentRangeStart w:id="17"/>
+      <w:r>
+        <w:rPr>
+          <w:color w:val="215E99" w:themeColor="text2" w:themeTint="BF"/>
+        </w:rPr>
+        <w:t>focuse</w:t>
+      </w:r>
+      <w:r>
+        <w:rPr>
+          <w:color w:val="215E99" w:themeColor="text2" w:themeTint="BF"/>
+        </w:rPr>
+        <w:t>d</w:t>
+      </w:r>
+      <w:r>
+        <w:rPr>
+          <w:color w:val="215E99" w:themeColor="text2" w:themeTint="BF"/>
+        </w:rPr>
+        <w:t xml:space="preserve"> our outstanding questions</w:t>
+      </w:r>
+      <w:r>
+        <w:rPr>
+          <w:color w:val="215E99" w:themeColor="text2" w:themeTint="BF"/>
+        </w:rPr>
+        <w:t xml:space="preserve"> to address this comment</w:t>
+      </w:r>
+      <w:r>
+        <w:rPr>
+          <w:color w:val="215E99" w:themeColor="text2" w:themeTint="BF"/>
+        </w:rPr>
+        <w:t xml:space="preserve">. </w:t>
+      </w:r>
+      <w:commentRangeEnd w:id="17"/>
       <w:r>
         <w:rPr>
           <w:rStyle w:val="CommentReference"/>
         </w:rPr>
-        <w:commentReference w:id="14"/>
-      </w:r>
-      <w:r>
-        <w:t xml:space="preserve">The societal aspects of these changes may be </w:t>
-      </w:r>
-      <w:proofErr w:type="gramStart"/>
-      <w:r>
-        <w:t>really complex</w:t>
-      </w:r>
-      <w:proofErr w:type="gramEnd"/>
-      <w:r>
-        <w:t xml:space="preserve"> and involve severe impacts on anything from changes in classic </w:t>
-      </w:r>
-      <w:proofErr w:type="spellStart"/>
-      <w:r>
-        <w:t>provisionary</w:t>
-      </w:r>
-      <w:proofErr w:type="spellEnd"/>
-      <w:r>
-        <w:t xml:space="preserve"> ecosystems services like food, feed and fibre to economic progress, human </w:t>
-      </w:r>
-      <w:proofErr w:type="spellStart"/>
-      <w:r>
-        <w:t>behavior</w:t>
-      </w:r>
-      <w:proofErr w:type="spellEnd"/>
-      <w:r>
-        <w:t xml:space="preserve">, migration and political unrest. These are really complex changes which the paper does not really acknowledge, and therefore the statement in line 292 that systems modelling can provide us with quantitative tools for </w:t>
-      </w:r>
-      <w:proofErr w:type="spellStart"/>
-      <w:r>
-        <w:t>predictins</w:t>
-      </w:r>
-      <w:proofErr w:type="spellEnd"/>
-      <w:r>
-        <w:t xml:space="preserve"> and decisions may in principle be correct, but we do not get any clear descriptions or approaches (which was the promise in the title of the paper) - or even a </w:t>
-      </w:r>
-      <w:r>
-        <w:lastRenderedPageBreak/>
-        <w:t xml:space="preserve">glance of what need to be scientifically and </w:t>
-      </w:r>
-      <w:proofErr w:type="spellStart"/>
-      <w:r>
-        <w:t>modelwise</w:t>
-      </w:r>
-      <w:proofErr w:type="spellEnd"/>
-      <w:r>
-        <w:t xml:space="preserve"> developed to get there. It may be relevant to include these aspects, but it </w:t>
-      </w:r>
-      <w:proofErr w:type="gramStart"/>
-      <w:r>
-        <w:t>has to</w:t>
-      </w:r>
-      <w:proofErr w:type="gramEnd"/>
-      <w:r>
-        <w:t xml:space="preserve"> be carefully described and framed, and the modelling aspects must be treated with the same carefulness as the physical-biological systems.</w:t>
-      </w:r>
-      <w:r>
-        <w:br/>
-      </w:r>
-    </w:p>
-    <w:p>
-      <w:r>
-        <w:rPr>
-          <w:b/>
-          <w:bCs/>
-          <w:color w:val="215E99" w:themeColor="text2" w:themeTint="BF"/>
-        </w:rPr>
-        <w:t>Response</w:t>
-      </w:r>
-      <w:r>
-        <w:rPr>
-          <w:color w:val="215E99" w:themeColor="text2" w:themeTint="BF"/>
-        </w:rPr>
-        <w:t>:</w:t>
-      </w:r>
-      <w:r>
-        <w:rPr>
-          <w:color w:val="215E99" w:themeColor="text2" w:themeTint="BF"/>
-        </w:rPr>
-        <w:t xml:space="preserve"> We agree. We have now removed the SES discussion from the paper and focused on the biological models. We make brief mention in the introduction and concluding remarks section about the implications for socioecological modelling. </w:t>
-      </w:r>
-      <w:r>
-        <w:rPr>
-          <w:color w:val="215E99" w:themeColor="text2" w:themeTint="BF"/>
-        </w:rPr>
-        <w:t>Instead,</w:t>
-      </w:r>
-      <w:r>
-        <w:rPr>
-          <w:color w:val="215E99" w:themeColor="text2" w:themeTint="BF"/>
-        </w:rPr>
-        <w:t xml:space="preserve"> we use this extra box </w:t>
-      </w:r>
-      <w:r>
-        <w:rPr>
-          <w:color w:val="215E99" w:themeColor="text2" w:themeTint="BF"/>
-        </w:rPr>
-        <w:t xml:space="preserve">bring in a concrete demonstration of how models in the major classes can be coupled across species. </w:t>
-      </w:r>
-    </w:p>
-    <w:p>
-      <w:r>
-        <w:br/>
-      </w:r>
-      <w:r>
-        <w:rPr>
-          <w:b/>
-          <w:bCs/>
-        </w:rPr>
-        <w:t>C</w:t>
-      </w:r>
-      <w:r>
-        <w:rPr>
-          <w:b/>
-          <w:bCs/>
-        </w:rPr>
-        <w:t>50</w:t>
-      </w:r>
-      <w:r>
-        <w:rPr>
-          <w:b/>
-          <w:bCs/>
-        </w:rPr>
-        <w:t>:</w:t>
-      </w:r>
-      <w:r>
-        <w:rPr>
-          <w:b/>
-          <w:bCs/>
-        </w:rPr>
-        <w:t xml:space="preserve"> </w:t>
-      </w:r>
-      <w:r>
-        <w:t>Figure 3 - This is an overly naïve figure that does not provide any useful information of the model approach.</w:t>
-      </w:r>
-      <w:r>
-        <w:br/>
-      </w:r>
-    </w:p>
-    <w:p>
-      <w:r>
-        <w:rPr>
-          <w:b/>
-          <w:bCs/>
-          <w:color w:val="215E99" w:themeColor="text2" w:themeTint="BF"/>
-        </w:rPr>
-        <w:t>Response</w:t>
-      </w:r>
-      <w:r>
-        <w:rPr>
-          <w:color w:val="215E99" w:themeColor="text2" w:themeTint="BF"/>
-        </w:rPr>
-        <w:t>:</w:t>
-      </w:r>
-      <w:r>
-        <w:rPr>
-          <w:color w:val="215E99" w:themeColor="text2" w:themeTint="BF"/>
-        </w:rPr>
-        <w:t xml:space="preserve"> </w:t>
-      </w:r>
-      <w:r>
-        <w:rPr>
-          <w:color w:val="215E99" w:themeColor="text2" w:themeTint="BF"/>
-        </w:rPr>
-        <w:t>Agree. We have removed this figure and the SES box.</w:t>
-      </w:r>
-    </w:p>
-    <w:p>
-      <w:r>
-        <w:br/>
-      </w:r>
-      <w:r>
-        <w:rPr>
-          <w:b/>
-          <w:bCs/>
-        </w:rPr>
-        <w:t>C</w:t>
-      </w:r>
-      <w:r>
-        <w:rPr>
-          <w:b/>
-          <w:bCs/>
-        </w:rPr>
-        <w:t>51</w:t>
-      </w:r>
-      <w:r>
-        <w:rPr>
-          <w:b/>
-          <w:bCs/>
-        </w:rPr>
-        <w:t>:</w:t>
-      </w:r>
-      <w:r>
-        <w:rPr>
-          <w:b/>
-          <w:bCs/>
-        </w:rPr>
-        <w:t xml:space="preserve"> </w:t>
-      </w:r>
-      <w:r>
-        <w:t>Figure 4 - Even with the long descriptive text, it is a very busy figure not giving a clear idea of what it wants to tell. It seems to be focused on a very limited system with just 2 species which is a bit contradictory to the concept of the paper that speaks about integration across domains and areas. The real challenge and the promise of the paper is about the comprehensive systems view and approach. The figure does not provide any solutions to the larger systems level.</w:t>
-      </w:r>
-      <w:r>
-        <w:br/>
-      </w:r>
-    </w:p>
-    <w:p>
-      <w:r>
-        <w:rPr>
-          <w:b/>
-          <w:bCs/>
-          <w:color w:val="215E99" w:themeColor="text2" w:themeTint="BF"/>
-        </w:rPr>
-        <w:t>Response</w:t>
-      </w:r>
-      <w:r>
-        <w:rPr>
-          <w:color w:val="215E99" w:themeColor="text2" w:themeTint="BF"/>
-        </w:rPr>
-        <w:t>:</w:t>
-      </w:r>
-      <w:r>
-        <w:rPr>
-          <w:color w:val="215E99" w:themeColor="text2" w:themeTint="BF"/>
-        </w:rPr>
-        <w:t xml:space="preserve"> We have now included more detail about the modelling approaches from the supplement in two new boxes. Hopefully this makes the figure emerge more clearly now. We have also tried to simplify it.</w:t>
-      </w:r>
-    </w:p>
-    <w:p>
-      <w:r>
-        <w:br/>
-      </w:r>
-      <w:r>
-        <w:rPr>
-          <w:b/>
-          <w:bCs/>
-        </w:rPr>
-        <w:t>C</w:t>
-      </w:r>
-      <w:r>
-        <w:rPr>
-          <w:b/>
-          <w:bCs/>
-        </w:rPr>
-        <w:t>52</w:t>
-      </w:r>
-      <w:r>
-        <w:rPr>
-          <w:b/>
-          <w:bCs/>
-        </w:rPr>
-        <w:t>:</w:t>
-      </w:r>
-      <w:r>
-        <w:rPr>
-          <w:b/>
-          <w:bCs/>
-        </w:rPr>
-        <w:t xml:space="preserve"> </w:t>
-      </w:r>
-      <w:r>
-        <w:t xml:space="preserve">Outstanding questions - It is great with this attempt to summarize the messages into the next step or research needs for the future. </w:t>
-      </w:r>
-      <w:proofErr w:type="gramStart"/>
-      <w:r>
-        <w:t>But,</w:t>
-      </w:r>
-      <w:proofErr w:type="gramEnd"/>
-      <w:r>
-        <w:t xml:space="preserve"> these questions should follow logically from the paper, which I do not think they do. I cannot identify for any of the 8 points where this is a logical conclusion from things presented and discussed in the paper. Moreover, these 8 points are quite substantial outstanding questions which speaks against the title of the paper promising the reader an approach to model consequences of heat waves. It seems to me that the authors should </w:t>
-      </w:r>
-      <w:proofErr w:type="gramStart"/>
-      <w:r>
-        <w:t>consider,</w:t>
-      </w:r>
-      <w:proofErr w:type="gramEnd"/>
-      <w:r>
-        <w:t xml:space="preserve"> whether they actually </w:t>
-      </w:r>
-      <w:proofErr w:type="gramStart"/>
-      <w:r>
-        <w:t>believe</w:t>
-      </w:r>
-      <w:commentRangeStart w:id="15"/>
-      <w:r>
-        <w:t>s</w:t>
-      </w:r>
-      <w:proofErr w:type="gramEnd"/>
-      <w:r>
-        <w:t xml:space="preserve"> they can present a model approach, and if so, then present the approach with clear documentation and figures that present the different elements and how they are linked</w:t>
-      </w:r>
-      <w:commentRangeEnd w:id="15"/>
-      <w:r>
-        <w:rPr>
-          <w:rStyle w:val="CommentReference"/>
-        </w:rPr>
-        <w:commentReference w:id="15"/>
-      </w:r>
-      <w:r>
-        <w:t xml:space="preserve">. Or, if such an approach is more wishful thinking and not achievable </w:t>
-      </w:r>
-      <w:proofErr w:type="gramStart"/>
-      <w:r>
-        <w:t>at the moment</w:t>
-      </w:r>
-      <w:proofErr w:type="gramEnd"/>
-      <w:r>
-        <w:t xml:space="preserve">, then present an open review or "directions" paper on what we know and what we need </w:t>
-      </w:r>
-      <w:proofErr w:type="gramStart"/>
-      <w:r>
-        <w:t>in order to</w:t>
-      </w:r>
-      <w:proofErr w:type="gramEnd"/>
-      <w:r>
-        <w:t xml:space="preserve"> get there with clear identification of the elements we stand on and the steps of progress we should take. This should also include a better integration with ecological science to identify </w:t>
-      </w:r>
-      <w:commentRangeStart w:id="16"/>
-      <w:r>
-        <w:t>where we need more fundamental understanding that modelling alone cannot provide</w:t>
-      </w:r>
-      <w:commentRangeEnd w:id="16"/>
-      <w:r>
-        <w:rPr>
-          <w:rStyle w:val="CommentReference"/>
-        </w:rPr>
-        <w:commentReference w:id="16"/>
-      </w:r>
-      <w:r>
-        <w:t>.</w:t>
-      </w:r>
-    </w:p>
-    <w:p/>
-    <w:p>
-      <w:r>
-        <w:rPr>
-          <w:b/>
-          <w:bCs/>
-          <w:color w:val="215E99" w:themeColor="text2" w:themeTint="BF"/>
-        </w:rPr>
-        <w:t>Response</w:t>
-      </w:r>
-      <w:r>
-        <w:rPr>
-          <w:color w:val="215E99" w:themeColor="text2" w:themeTint="BF"/>
-        </w:rPr>
-        <w:t>:</w:t>
-      </w:r>
-      <w:r>
-        <w:rPr>
-          <w:color w:val="215E99" w:themeColor="text2" w:themeTint="BF"/>
-        </w:rPr>
-        <w:t xml:space="preserve"> We have now re-written and re-focuse</w:t>
-      </w:r>
-      <w:r>
-        <w:rPr>
-          <w:color w:val="215E99" w:themeColor="text2" w:themeTint="BF"/>
-        </w:rPr>
-        <w:t>d</w:t>
-      </w:r>
-      <w:r>
-        <w:rPr>
-          <w:color w:val="215E99" w:themeColor="text2" w:themeTint="BF"/>
-        </w:rPr>
-        <w:t xml:space="preserve"> our outstanding questions</w:t>
-      </w:r>
-      <w:r>
-        <w:rPr>
-          <w:color w:val="215E99" w:themeColor="text2" w:themeTint="BF"/>
-        </w:rPr>
-        <w:t xml:space="preserve"> to address this comment</w:t>
-      </w:r>
-      <w:r>
-        <w:rPr>
-          <w:color w:val="215E99" w:themeColor="text2" w:themeTint="BF"/>
-        </w:rPr>
-        <w:t xml:space="preserve">. </w:t>
+        <w:commentReference w:id="17"/>
       </w:r>
     </w:p>
     <w:sectPr>
@@ -5393,16 +5457,25 @@
         <w:pStyle w:val="CommentText"/>
       </w:pPr>
       <w:r>
+        <w:t>Margie/</w:t>
+      </w:r>
+      <w:r>
         <w:rPr>
           <w:rStyle w:val="CommentReference"/>
         </w:rPr>
         <w:annotationRef/>
       </w:r>
       <w:r>
-        <w:t xml:space="preserve">Adrienne to </w:t>
-      </w:r>
-      <w:r>
-        <w:t>do</w:t>
+        <w:t>Adrienne</w:t>
+      </w:r>
+      <w:r>
+        <w:t>/Belinda</w:t>
+      </w:r>
+      <w:r>
+        <w:t xml:space="preserve"> to do</w:t>
+      </w:r>
+      <w:r>
+        <w:t>?</w:t>
       </w:r>
     </w:p>
   </w:comment>
@@ -5539,7 +5612,18 @@
         <w:annotationRef/>
       </w:r>
       <w:r>
-        <w:t xml:space="preserve">Mike </w:t>
+        <w:t>Mike</w:t>
+      </w:r>
+      <w:r>
+        <w:t xml:space="preserve">, anything else you want to </w:t>
+      </w:r>
+      <w:proofErr w:type="gramStart"/>
+      <w:r>
+        <w:t>add?</w:t>
+      </w:r>
+      <w:proofErr w:type="gramEnd"/>
+      <w:r>
+        <w:t xml:space="preserve"> I just literally re-worded which seemed easier</w:t>
       </w:r>
     </w:p>
   </w:comment>
@@ -5625,7 +5709,10 @@
         <w:annotationRef/>
       </w:r>
       <w:r>
-        <w:t xml:space="preserve">Mike. Missing data imputation and trait databases. </w:t>
+        <w:t>Mike. Missing data imputation and trait databases</w:t>
+      </w:r>
+      <w:r>
+        <w:t>?</w:t>
       </w:r>
     </w:p>
   </w:comment>
@@ -5799,6 +5886,25 @@
       </w:r>
       <w:r>
         <w:t>Mike and Margie</w:t>
+      </w:r>
+    </w:p>
+  </w:comment>
+  <w:comment w:id="17" w:author="Daniel Noble" w:date="2025-11-03T15:13:00Z" w:initials="DN">
+    <w:p>
+      <w:pPr>
+        <w:pStyle w:val="CommentText"/>
+      </w:pPr>
+      <w:r>
+        <w:rPr>
+          <w:rStyle w:val="CommentReference"/>
+        </w:rPr>
+        <w:annotationRef/>
+      </w:r>
+      <w:r>
+        <w:t xml:space="preserve">Adrienne, Margie, Mike and Belinda, can you have a crack as clearly my questions </w:t>
+      </w:r>
+      <w:r>
+        <w:t>suck!</w:t>
       </w:r>
     </w:p>
   </w:comment>
@@ -5824,6 +5930,7 @@
   <w15:commentEx w15:paraId="7BAE651A" w15:done="0"/>
   <w15:commentEx w15:paraId="2AB32F9F" w15:done="0"/>
   <w15:commentEx w15:paraId="0E99FA75" w15:done="0"/>
+  <w15:commentEx w15:paraId="653CA79B" w15:done="0"/>
 </w15:commentsEx>
 </file>
 
@@ -5846,6 +5953,7 @@
   <w16cex:commentExtensible w16cex:durableId="2E8D20A9" w16cex:dateUtc="2025-10-20T00:05:00Z"/>
   <w16cex:commentExtensible w16cex:durableId="1CB81C40" w16cex:dateUtc="2025-10-20T00:07:00Z"/>
   <w16cex:commentExtensible w16cex:durableId="7B829E7D" w16cex:dateUtc="2025-10-20T00:08:00Z"/>
+  <w16cex:commentExtensible w16cex:durableId="68CEBBD7" w16cex:dateUtc="2025-11-03T04:13:00Z"/>
 </w16cex:commentsExtensible>
 </file>
 
@@ -5868,6 +5976,7 @@
   <w16cid:commentId w16cid:paraId="7BAE651A" w16cid:durableId="2E8D20A9"/>
   <w16cid:commentId w16cid:paraId="2AB32F9F" w16cid:durableId="1CB81C40"/>
   <w16cid:commentId w16cid:paraId="0E99FA75" w16cid:durableId="7B829E7D"/>
+  <w16cid:commentId w16cid:paraId="653CA79B" w16cid:durableId="68CEBBD7"/>
 </w16cid:commentsIds>
 </file>
 

</xml_diff>

<commit_message>
Fixed up responses based on feedback from Adrienne and Margie
</commit_message>
<xml_diff>
--- a/docs/Revision1/Response_to_Reviewers.docx
+++ b/docs/Revision1/Response_to_Reviewers.docx
@@ -73,7 +73,19 @@
         <w:rPr>
           <w:color w:val="215E99" w:themeColor="text2" w:themeTint="BF"/>
         </w:rPr>
-        <w:t>be more forward thinking, challenges going forward and some advice on building models</w:t>
+        <w:t xml:space="preserve">be more forward thinking, </w:t>
+      </w:r>
+      <w:r>
+        <w:rPr>
+          <w:color w:val="215E99" w:themeColor="text2" w:themeTint="BF"/>
+        </w:rPr>
+        <w:t xml:space="preserve">highlighting </w:t>
+      </w:r>
+      <w:r>
+        <w:rPr>
+          <w:color w:val="215E99" w:themeColor="text2" w:themeTint="BF"/>
+        </w:rPr>
+        <w:t>challenges going forward and some advice on building models</w:t>
       </w:r>
       <w:r>
         <w:rPr>
@@ -130,7 +142,7 @@
         <w:rPr>
           <w:color w:val="215E99" w:themeColor="text2" w:themeTint="BF"/>
         </w:rPr>
-        <w:t xml:space="preserve"> (new Box 1). Organism temperatures can then be used in physiological models to estimate life cycles, survival in response to extreme heat insults and</w:t>
+        <w:t xml:space="preserve"> (new Box 1). Organism temperatures can then be used in physiological models to estimate life cycles, survival in response to extreme heat and</w:t>
       </w:r>
       <w:r>
         <w:rPr>
@@ -226,6 +238,11 @@
     </w:p>
     <w:p/>
     <w:p>
+      <w:pPr>
+        <w:rPr>
+          <w:color w:val="215E99" w:themeColor="text2" w:themeTint="BF"/>
+        </w:rPr>
+      </w:pPr>
       <w:r>
         <w:rPr>
           <w:b/>
@@ -244,25 +261,13 @@
         <w:rPr>
           <w:color w:val="215E99" w:themeColor="text2" w:themeTint="BF"/>
         </w:rPr>
-        <w:t xml:space="preserve"> We have tried to adjust our figures and figure legends </w:t>
-      </w:r>
-      <w:r>
-        <w:rPr>
-          <w:color w:val="215E99" w:themeColor="text2" w:themeTint="BF"/>
-        </w:rPr>
-        <w:t xml:space="preserve">as best as we can </w:t>
-      </w:r>
-      <w:r>
-        <w:rPr>
-          <w:color w:val="215E99" w:themeColor="text2" w:themeTint="BF"/>
-        </w:rPr>
-        <w:t xml:space="preserve">to hopefully make them easier to understand. </w:t>
-      </w:r>
-      <w:r>
-        <w:rPr>
-          <w:color w:val="215E99" w:themeColor="text2" w:themeTint="BF"/>
-        </w:rPr>
-        <w:t>It wasn’t always clear from reviewer 3’s comments what stood out as unclear specifically, but we agree some simplifications can be made.</w:t>
+        <w:t xml:space="preserve"> </w:t>
+      </w:r>
+      <w:r>
+        <w:rPr>
+          <w:color w:val="215E99" w:themeColor="text2" w:themeTint="BF"/>
+        </w:rPr>
+        <w:t>We have tried to adjust our figures and figure legends as best as we can to hopefully make them easier to understand. It wasn’t always clear from reviewer 3’s comments what stood out as unclear specifically, but we focused on the general point and sought places where simplifications could be made and did so.</w:t>
       </w:r>
     </w:p>
     <w:p/>
@@ -434,7 +439,7 @@
         <w:rPr>
           <w:color w:val="215E99" w:themeColor="text2" w:themeTint="BF"/>
         </w:rPr>
-        <w:t xml:space="preserve"> Thank you. Good suggestion. We have now re-written our concluding Remarks section to encapsulate </w:t>
+        <w:t xml:space="preserve"> Thank you. Good suggestion. We have now re-written our concluding Remarks section </w:t>
       </w:r>
       <w:r>
         <w:rPr>
@@ -452,104 +457,146 @@
         <w:rPr>
           <w:color w:val="215E99" w:themeColor="text2" w:themeTint="BF"/>
         </w:rPr>
-        <w:t xml:space="preserve"> Model choice is difficulty to advise on specifically because it will depend on what processes a researcher and modeller deem important for a given system. As such, we have </w:t>
+        <w:t xml:space="preserve"> Model choice is difficult to advise on specifically because it will depend on what processes a researcher and modeller deem important for a given system. As such, we have </w:t>
+      </w:r>
+      <w:r>
+        <w:rPr>
+          <w:color w:val="215E99" w:themeColor="text2" w:themeTint="BF"/>
+        </w:rPr>
+        <w:t>kept</w:t>
+      </w:r>
+      <w:r>
+        <w:rPr>
+          <w:color w:val="215E99" w:themeColor="text2" w:themeTint="BF"/>
+        </w:rPr>
+        <w:t xml:space="preserve"> this advice a little more general and referred to other reviews on this topic.</w:t>
+      </w:r>
+    </w:p>
+    <w:p>
+      <w:r>
+        <w:br/>
+      </w:r>
+      <w:r>
+        <w:rPr>
+          <w:b/>
+          <w:bCs/>
+        </w:rPr>
+        <w:t>C</w:t>
+      </w:r>
+      <w:r>
+        <w:rPr>
+          <w:b/>
+          <w:bCs/>
+        </w:rPr>
+        <w:t>6</w:t>
+      </w:r>
+      <w:r>
+        <w:rPr>
+          <w:b/>
+          <w:bCs/>
+        </w:rPr>
+        <w:t>:</w:t>
+      </w:r>
+      <w:r>
+        <w:t xml:space="preserve"> </w:t>
+      </w:r>
+      <w:r>
+        <w:t xml:space="preserve">(3) The Supplementary Information is to go. I appreciate that you have put a lot of work into </w:t>
       </w:r>
       <w:proofErr w:type="gramStart"/>
       <w:r>
-        <w:rPr>
-          <w:color w:val="215E99" w:themeColor="text2" w:themeTint="BF"/>
-        </w:rPr>
-        <w:t>keep</w:t>
+        <w:t>it</w:t>
       </w:r>
       <w:proofErr w:type="gramEnd"/>
       <w:r>
-        <w:rPr>
-          <w:color w:val="215E99" w:themeColor="text2" w:themeTint="BF"/>
-        </w:rPr>
-        <w:t xml:space="preserve"> this advice a little more general and referred to other reviews on this topic.</w:t>
-      </w:r>
-    </w:p>
-    <w:p>
-      <w:r>
-        <w:br/>
-      </w:r>
-      <w:r>
-        <w:rPr>
-          <w:b/>
-          <w:bCs/>
-        </w:rPr>
-        <w:t>C</w:t>
-      </w:r>
-      <w:r>
-        <w:rPr>
-          <w:b/>
-          <w:bCs/>
-        </w:rPr>
-        <w:t>6</w:t>
-      </w:r>
-      <w:r>
-        <w:rPr>
-          <w:b/>
-          <w:bCs/>
-        </w:rPr>
-        <w:t>:</w:t>
-      </w:r>
-      <w:r>
+        <w:t xml:space="preserve"> but it is too extensive for a TREE article. You have essentially an additional paper in there. Either the information is important enough that it is brought into the text as a Box or it isn't important. Very few readers will access it (we have download figures).</w:t>
+      </w:r>
+    </w:p>
+    <w:p/>
+    <w:p>
+      <w:r>
+        <w:rPr>
+          <w:b/>
+          <w:bCs/>
+          <w:color w:val="215E99" w:themeColor="text2" w:themeTint="BF"/>
+        </w:rPr>
+        <w:t>Response</w:t>
+      </w:r>
+      <w:r>
+        <w:rPr>
+          <w:color w:val="215E99" w:themeColor="text2" w:themeTint="BF"/>
+        </w:rPr>
+        <w:t>:</w:t>
+      </w:r>
+      <w:r>
+        <w:rPr>
+          <w:color w:val="215E99" w:themeColor="text2" w:themeTint="BF"/>
+        </w:rPr>
+        <w:t xml:space="preserve"> We have moved the crucial elements out of the supplement in the main manuscript now.</w:t>
+      </w:r>
+      <w:r>
+        <w:rPr>
+          <w:color w:val="215E99" w:themeColor="text2" w:themeTint="BF"/>
+        </w:rPr>
+        <w:t xml:space="preserve"> More specifically, creating a new </w:t>
+      </w:r>
+      <w:proofErr w:type="gramStart"/>
+      <w:r>
+        <w:rPr>
+          <w:color w:val="215E99" w:themeColor="text2" w:themeTint="BF"/>
+        </w:rPr>
+        <w:t>Box</w:t>
+      </w:r>
+      <w:proofErr w:type="gramEnd"/>
+      <w:r>
+        <w:rPr>
+          <w:color w:val="215E99" w:themeColor="text2" w:themeTint="BF"/>
+        </w:rPr>
+        <w:t xml:space="preserve"> 1 and Box 2 which work together to demonstrate how a multi-species systems-modelling approach can be achieved. We’ve simply referred to the code</w:t>
+      </w:r>
+      <w:r>
+        <w:rPr>
+          <w:color w:val="215E99" w:themeColor="text2" w:themeTint="BF"/>
+        </w:rPr>
+        <w:t>,</w:t>
+      </w:r>
+      <w:r>
+        <w:rPr>
+          <w:color w:val="215E99" w:themeColor="text2" w:themeTint="BF"/>
+        </w:rPr>
         <w:t xml:space="preserve"> </w:t>
       </w:r>
       <w:r>
-        <w:t xml:space="preserve">(3) The Supplementary Information is to go. I appreciate that you have put a lot of work into </w:t>
-      </w:r>
-      <w:proofErr w:type="gramStart"/>
-      <w:r>
-        <w:t>it</w:t>
-      </w:r>
-      <w:proofErr w:type="gramEnd"/>
-      <w:r>
-        <w:t xml:space="preserve"> but it is too extensive for a TREE article. You have essentially an additional paper in there. Either the information is important enough that it is brought into the text as a Box or it isn't important. Very few readers will access it (we have download figures).</w:t>
-      </w:r>
-    </w:p>
-    <w:p/>
-    <w:p>
-      <w:r>
-        <w:rPr>
-          <w:b/>
-          <w:bCs/>
-          <w:color w:val="215E99" w:themeColor="text2" w:themeTint="BF"/>
-        </w:rPr>
-        <w:t>Response</w:t>
-      </w:r>
-      <w:r>
-        <w:rPr>
-          <w:color w:val="215E99" w:themeColor="text2" w:themeTint="BF"/>
-        </w:rPr>
-        <w:t>:</w:t>
-      </w:r>
-      <w:r>
-        <w:rPr>
-          <w:color w:val="215E99" w:themeColor="text2" w:themeTint="BF"/>
-        </w:rPr>
-        <w:t xml:space="preserve"> We have moved the crucial elements out of the supplement in the main manuscript now.</w:t>
-      </w:r>
-      <w:r>
-        <w:rPr>
-          <w:color w:val="215E99" w:themeColor="text2" w:themeTint="BF"/>
-        </w:rPr>
-        <w:t xml:space="preserve"> More specifically, creating a new </w:t>
-      </w:r>
-      <w:proofErr w:type="gramStart"/>
-      <w:r>
-        <w:rPr>
-          <w:color w:val="215E99" w:themeColor="text2" w:themeTint="BF"/>
-        </w:rPr>
-        <w:t>Box</w:t>
-      </w:r>
-      <w:proofErr w:type="gramEnd"/>
-      <w:r>
-        <w:rPr>
-          <w:color w:val="215E99" w:themeColor="text2" w:themeTint="BF"/>
-        </w:rPr>
-        <w:t xml:space="preserve"> 1 and Box 2 which work together to demonstrate how a multi-species systems-modelling approach can be achieved. We’ve simply referred to the code to reproduce the examples in the paper now, which we believe is important for transparency and reproducibility.</w:t>
+        <w:rPr>
+          <w:color w:val="215E99" w:themeColor="text2" w:themeTint="BF"/>
+        </w:rPr>
+        <w:t xml:space="preserve">lodged on </w:t>
+      </w:r>
+      <w:proofErr w:type="spellStart"/>
+      <w:r>
+        <w:rPr>
+          <w:color w:val="215E99" w:themeColor="text2" w:themeTint="BF"/>
+        </w:rPr>
+        <w:t>G</w:t>
+      </w:r>
+      <w:r>
+        <w:rPr>
+          <w:color w:val="215E99" w:themeColor="text2" w:themeTint="BF"/>
+        </w:rPr>
+        <w:t>ithub</w:t>
+      </w:r>
+      <w:proofErr w:type="spellEnd"/>
+      <w:r>
+        <w:rPr>
+          <w:color w:val="215E99" w:themeColor="text2" w:themeTint="BF"/>
+        </w:rPr>
+        <w:t xml:space="preserve">, </w:t>
+      </w:r>
+      <w:r>
+        <w:rPr>
+          <w:color w:val="215E99" w:themeColor="text2" w:themeTint="BF"/>
+        </w:rPr>
+        <w:t>to reproduce the examples in the paper now, which we believe is important for transparency and reproducibility.</w:t>
       </w:r>
     </w:p>
     <w:p>
@@ -992,7 +1039,19 @@
         <w:rPr>
           <w:color w:val="215E99" w:themeColor="text2" w:themeTint="BF"/>
         </w:rPr>
-        <w:t>Given the breadth of models we are discussing, and the fact that we have kept them fairly focused to major categories, we cannot provide detailed advice here because what model to choose will depend on: 1) the question(s) of interest; 2) the organism</w:t>
+        <w:t xml:space="preserve">Given the breadth of models we are discussing, and the fact that we have kept them fairly </w:t>
+      </w:r>
+      <w:r>
+        <w:rPr>
+          <w:color w:val="215E99" w:themeColor="text2" w:themeTint="BF"/>
+        </w:rPr>
+        <w:t>high level</w:t>
+      </w:r>
+      <w:r>
+        <w:rPr>
+          <w:color w:val="215E99" w:themeColor="text2" w:themeTint="BF"/>
+        </w:rPr>
+        <w:t>, we cannot provide detailed advice here because what model to choose will depend on: 1) the question(s) of interest; 2) the organism</w:t>
       </w:r>
       <w:r>
         <w:rPr>
@@ -1738,7 +1797,19 @@
         <w:rPr>
           <w:color w:val="215E99" w:themeColor="text2" w:themeTint="BF"/>
         </w:rPr>
-        <w:t xml:space="preserve"> to collect data on the specific system one wishes to model, it is unlikely going to be the case all species of interest will have complete information needed for all aspects of modelling. </w:t>
+        <w:t xml:space="preserve"> to collect data on the specific system one wishes to model, it is unlikely going to be the case </w:t>
+      </w:r>
+      <w:r>
+        <w:rPr>
+          <w:color w:val="215E99" w:themeColor="text2" w:themeTint="BF"/>
+        </w:rPr>
+        <w:t xml:space="preserve">that </w:t>
+      </w:r>
+      <w:r>
+        <w:rPr>
+          <w:color w:val="215E99" w:themeColor="text2" w:themeTint="BF"/>
+        </w:rPr>
+        <w:t xml:space="preserve">all species of interest will have complete information needed for all aspects of modelling. </w:t>
       </w:r>
     </w:p>
     <w:p>
@@ -1858,7 +1929,31 @@
         <w:rPr>
           <w:color w:val="215E99" w:themeColor="text2" w:themeTint="BF"/>
         </w:rPr>
-        <w:t>here is no question that models will need to be tested empirically (as we have mentioned). While imperfect, we believe that having a quantitative model that provide</w:t>
+        <w:t>here is no question that models will need to be tested empirically (</w:t>
+      </w:r>
+      <w:r>
+        <w:rPr>
+          <w:color w:val="215E99" w:themeColor="text2" w:themeTint="BF"/>
+        </w:rPr>
+        <w:t>and</w:t>
+      </w:r>
+      <w:r>
+        <w:rPr>
+          <w:color w:val="215E99" w:themeColor="text2" w:themeTint="BF"/>
+        </w:rPr>
+        <w:t xml:space="preserve"> we have mentioned</w:t>
+      </w:r>
+      <w:r>
+        <w:rPr>
+          <w:color w:val="215E99" w:themeColor="text2" w:themeTint="BF"/>
+        </w:rPr>
+        <w:t xml:space="preserve"> this in the text</w:t>
+      </w:r>
+      <w:r>
+        <w:rPr>
+          <w:color w:val="215E99" w:themeColor="text2" w:themeTint="BF"/>
+        </w:rPr>
+        <w:t>). While imperfect, we believe that having a quantitative model that provide</w:t>
       </w:r>
       <w:r>
         <w:rPr>
@@ -2650,6 +2745,11 @@
     </w:p>
     <w:p/>
     <w:p>
+      <w:pPr>
+        <w:rPr>
+          <w:color w:val="215E99" w:themeColor="text2" w:themeTint="BF"/>
+        </w:rPr>
+      </w:pPr>
       <w:r>
         <w:rPr>
           <w:b/>
@@ -2668,14 +2768,16 @@
         <w:rPr>
           <w:color w:val="215E99" w:themeColor="text2" w:themeTint="BF"/>
         </w:rPr>
-        <w:t xml:space="preserve"> We have removed the socio-ecological example from the paper given the suggestion by Reviewer 3 and focused the paper mainly on the biological predictions which we think is more appropriate. Choosing the right level of detail in the model will </w:t>
-      </w:r>
+        <w:t xml:space="preserve"> We have removed the socio-ecological example from the paper given the suggestion by Reviewer 3 and focused the paper mainly on the biological predictions which we think is more appropriate. </w:t>
+      </w:r>
+    </w:p>
+    <w:p>
       <w:r>
         <w:rPr>
           <w:color w:val="215E99" w:themeColor="text2" w:themeTint="BF"/>
         </w:rPr>
         <w:lastRenderedPageBreak/>
-        <w:t xml:space="preserve">depend on the question on hand and the processes one wants to model. This is somewhat challenging to provide clear recommendations on within the context of our paper. However, we have now made this point clear </w:t>
+        <w:t xml:space="preserve">Choosing the right level of detail in any model depends on the question on hand and the processes one wants to model. Thus, it is somewhat challenging to provide clear recommendations within the context of our paper. However, we have now made this point clear </w:t>
       </w:r>
       <w:proofErr w:type="gramStart"/>
       <w:r>
@@ -2689,21 +2791,25 @@
         <w:rPr>
           <w:color w:val="215E99" w:themeColor="text2" w:themeTint="BF"/>
         </w:rPr>
-        <w:t xml:space="preserve"> pointed to some references in various placed readers can consult to obtain a more </w:t>
-      </w:r>
-      <w:proofErr w:type="gramStart"/>
-      <w:r>
-        <w:rPr>
-          <w:color w:val="215E99" w:themeColor="text2" w:themeTint="BF"/>
-        </w:rPr>
-        <w:t>in depth</w:t>
-      </w:r>
-      <w:proofErr w:type="gramEnd"/>
-      <w:r>
-        <w:rPr>
-          <w:color w:val="215E99" w:themeColor="text2" w:themeTint="BF"/>
-        </w:rPr>
-        <w:t xml:space="preserve"> discussion on this point.</w:t>
+        <w:t xml:space="preserve"> pointed to some references in various place</w:t>
+      </w:r>
+      <w:r>
+        <w:rPr>
+          <w:color w:val="215E99" w:themeColor="text2" w:themeTint="BF"/>
+        </w:rPr>
+        <w:t>s that</w:t>
+      </w:r>
+      <w:r>
+        <w:rPr>
+          <w:color w:val="215E99" w:themeColor="text2" w:themeTint="BF"/>
+        </w:rPr>
+        <w:t xml:space="preserve"> readers can consult to obtain a more in-depth discussion on this point</w:t>
+      </w:r>
+      <w:r>
+        <w:rPr>
+          <w:color w:val="215E99" w:themeColor="text2" w:themeTint="BF"/>
+        </w:rPr>
+        <w:t>.</w:t>
       </w:r>
     </w:p>
     <w:p/>
@@ -3454,7 +3560,19 @@
         <w:rPr>
           <w:color w:val="215E99" w:themeColor="text2" w:themeTint="BF"/>
         </w:rPr>
-        <w:t xml:space="preserve"> A system-based approach that uses physiologically explicit mechanistic models don’t necessarily mean they only work for extremes. They capture all environmental impacts on physiology and translate them to outcomes on the </w:t>
+        <w:t xml:space="preserve"> A system-based approach that uses physiologically explicit mechanistic models </w:t>
+      </w:r>
+      <w:r>
+        <w:rPr>
+          <w:color w:val="215E99" w:themeColor="text2" w:themeTint="BF"/>
+        </w:rPr>
+        <w:t>doesn’t</w:t>
+      </w:r>
+      <w:r>
+        <w:rPr>
+          <w:color w:val="215E99" w:themeColor="text2" w:themeTint="BF"/>
+        </w:rPr>
+        <w:t xml:space="preserve"> necessarily mean they only work for extremes. They capture all environmental impacts on physiology and translate them to outcomes on the </w:t>
       </w:r>
       <w:proofErr w:type="gramStart"/>
       <w:r>
@@ -3549,21 +3667,33 @@
         <w:rPr>
           <w:color w:val="215E99" w:themeColor="text2" w:themeTint="BF"/>
         </w:rPr>
-        <w:t xml:space="preserve"> We agree that some integrations already exist (e.g., microclimates to biophysical models), however, these do not capture thermal load sensitivity and often they are only applied at the level of a single species, not a community. Without coupling these various models for a multi-species assemblage, we cannot capture complex interactions and feed backs between species (e.g., changes in microclimates, coexistence etc). We hope the addition of the new case study for </w:t>
+        <w:t xml:space="preserve"> We agree that some integrations already exist (e.g., microclimates to biophysical models), however, these do not capture thermal load sensitivity and often they are only applied at the level of a single species, not a community. Without coupling these various models for a multi-species assemblage, we cannot capture complex interactions and </w:t>
       </w:r>
       <w:proofErr w:type="gramStart"/>
       <w:r>
         <w:rPr>
           <w:color w:val="215E99" w:themeColor="text2" w:themeTint="BF"/>
         </w:rPr>
-        <w:t>Box</w:t>
+        <w:t>feedbacks</w:t>
       </w:r>
       <w:proofErr w:type="gramEnd"/>
       <w:r>
         <w:rPr>
           <w:color w:val="215E99" w:themeColor="text2" w:themeTint="BF"/>
         </w:rPr>
-        <w:t xml:space="preserve"> 1 &amp; 2 help and we have re-written the introduction and various other sections to emphasise these points more. </w:t>
+        <w:t xml:space="preserve"> between species (e.g., changes in microclimates, coexistence etc). We hope the addition of the new case study for Box 1 &amp; 2 help</w:t>
+      </w:r>
+      <w:r>
+        <w:rPr>
+          <w:color w:val="215E99" w:themeColor="text2" w:themeTint="BF"/>
+        </w:rPr>
+        <w:t>s</w:t>
+      </w:r>
+      <w:r>
+        <w:rPr>
+          <w:color w:val="215E99" w:themeColor="text2" w:themeTint="BF"/>
+        </w:rPr>
+        <w:t xml:space="preserve"> and we have re-written the introduction and various other sections to emphasise these points more. </w:t>
       </w:r>
     </w:p>
     <w:p>
@@ -3770,7 +3900,27 @@
         <w:rPr>
           <w:color w:val="215E99" w:themeColor="text2" w:themeTint="BF"/>
         </w:rPr>
-        <w:t xml:space="preserve"> 1) modelling how organisms behaviourally respond (which we have better shown how to do) and 2) the differences in their thermal sensitivity, which makes some species more susceptible to extreme heat compared with others. Hopefully our revisions help address these points but if there are more specific examples the Reviewer is thinking we’re happy to incorporate them.</w:t>
+        <w:t xml:space="preserve"> 1) modelling how organisms behaviourally respond (which we have better shown how to do) and 2) the differences in their thermal sensitivity, which makes some species more susceptible to extreme heat compared with others. Hopefully our revisions help address these points but if there are more specific examples the Reviewer is thinking </w:t>
+      </w:r>
+      <w:proofErr w:type="gramStart"/>
+      <w:r>
+        <w:rPr>
+          <w:color w:val="215E99" w:themeColor="text2" w:themeTint="BF"/>
+        </w:rPr>
+        <w:t>of</w:t>
+      </w:r>
+      <w:proofErr w:type="gramEnd"/>
+      <w:r>
+        <w:rPr>
+          <w:color w:val="215E99" w:themeColor="text2" w:themeTint="BF"/>
+        </w:rPr>
+        <w:t xml:space="preserve"> </w:t>
+      </w:r>
+      <w:r>
+        <w:rPr>
+          <w:color w:val="215E99" w:themeColor="text2" w:themeTint="BF"/>
+        </w:rPr>
+        <w:t>we’re happy to incorporate them.</w:t>
       </w:r>
     </w:p>
     <w:p>
@@ -3839,35 +3989,129 @@
         <w:rPr>
           <w:color w:val="215E99" w:themeColor="text2" w:themeTint="BF"/>
         </w:rPr>
-        <w:t xml:space="preserve"> We have re-written this part of the </w:t>
+        <w:t xml:space="preserve"> We have re-written this part of the introduction and tried to better emphasise what we mean by “integration</w:t>
       </w:r>
       <w:proofErr w:type="gramStart"/>
       <w:r>
         <w:rPr>
           <w:color w:val="215E99" w:themeColor="text2" w:themeTint="BF"/>
         </w:rPr>
-        <w:t>introduction, and</w:t>
+        <w:t>” .</w:t>
       </w:r>
       <w:proofErr w:type="gramEnd"/>
-      <w:r>
-        <w:rPr>
-          <w:color w:val="215E99" w:themeColor="text2" w:themeTint="BF"/>
-        </w:rPr>
-        <w:t xml:space="preserve"> tried to better emphasise what we mean by “integration</w:t>
+    </w:p>
+    <w:p>
+      <w:r>
+        <w:br/>
+      </w:r>
+      <w:r>
+        <w:rPr>
+          <w:b/>
+          <w:bCs/>
+        </w:rPr>
+        <w:t>C</w:t>
+      </w:r>
+      <w:r>
+        <w:rPr>
+          <w:b/>
+          <w:bCs/>
+        </w:rPr>
+        <w:t>38</w:t>
+      </w:r>
+      <w:r>
+        <w:rPr>
+          <w:b/>
+          <w:bCs/>
+        </w:rPr>
+        <w:t>:</w:t>
+      </w:r>
+      <w:r>
+        <w:rPr>
+          <w:b/>
+          <w:bCs/>
+        </w:rPr>
+        <w:t xml:space="preserve"> </w:t>
+      </w:r>
+      <w:r>
+        <w:t xml:space="preserve">Figure 1 - This is an extremely busy figure. It is </w:t>
       </w:r>
       <w:proofErr w:type="gramStart"/>
       <w:r>
-        <w:rPr>
-          <w:color w:val="215E99" w:themeColor="text2" w:themeTint="BF"/>
-        </w:rPr>
-        <w:t>” .</w:t>
+        <w:t>really not</w:t>
       </w:r>
       <w:proofErr w:type="gramEnd"/>
-    </w:p>
-    <w:p>
+      <w:r>
+        <w:t xml:space="preserve"> easy to understand what the message or illustration is? At a first glance it seems to present general connection between basic ecological understanding and dynamics with some arbitrary or selected models, but it is unclear which boxes are </w:t>
+      </w:r>
+      <w:proofErr w:type="gramStart"/>
+      <w:r>
+        <w:t>models</w:t>
+      </w:r>
+      <w:proofErr w:type="gramEnd"/>
+      <w:r>
+        <w:t xml:space="preserve"> and which are system entities, it is unclear what the dotted lines </w:t>
+      </w:r>
+      <w:proofErr w:type="gramStart"/>
+      <w:r>
+        <w:t>indicates</w:t>
+      </w:r>
+      <w:proofErr w:type="gramEnd"/>
+      <w:r>
+        <w:t xml:space="preserve"> and it is unclear which aspects of the ecosystem functioning are involved and how they are linked. Are the ecosystem boxes separate from the modelling or are they part of the modelling (which must be the case for many of the models??). And finally, the figure claims to focus on extreme heat - but it is unclear how this is done and how it interacts with other drivers such as especially water and management. The figure is not entirely </w:t>
+      </w:r>
+      <w:proofErr w:type="gramStart"/>
+      <w:r>
+        <w:t>helpful</w:t>
+      </w:r>
+      <w:proofErr w:type="gramEnd"/>
+      <w:r>
+        <w:t xml:space="preserve"> and it is not clear when you refer to existing models, approaches and concepts and when you present a wish or suggestion for </w:t>
+      </w:r>
+      <w:proofErr w:type="spellStart"/>
+      <w:r>
+        <w:t>ssomething</w:t>
+      </w:r>
+      <w:proofErr w:type="spellEnd"/>
+      <w:r>
+        <w:t xml:space="preserve"> new.</w:t>
+      </w:r>
       <w:r>
         <w:br/>
       </w:r>
+    </w:p>
+    <w:p>
+      <w:r>
+        <w:rPr>
+          <w:b/>
+          <w:bCs/>
+          <w:color w:val="215E99" w:themeColor="text2" w:themeTint="BF"/>
+        </w:rPr>
+        <w:t>Response</w:t>
+      </w:r>
+      <w:r>
+        <w:rPr>
+          <w:color w:val="215E99" w:themeColor="text2" w:themeTint="BF"/>
+        </w:rPr>
+        <w:t>:</w:t>
+      </w:r>
+      <w:r>
+        <w:rPr>
+          <w:color w:val="215E99" w:themeColor="text2" w:themeTint="BF"/>
+        </w:rPr>
+        <w:t xml:space="preserve"> We believe this figure captures the broad classes of models we discuss and how they are interconnected so would like to keep it as an overarching introduction and </w:t>
+      </w:r>
+      <w:r>
+        <w:rPr>
+          <w:color w:val="215E99" w:themeColor="text2" w:themeTint="BF"/>
+        </w:rPr>
+        <w:lastRenderedPageBreak/>
+        <w:t xml:space="preserve">guide to the review. However, we agree it could be simplified. We have now tried to simplify by creating defined boxes which categorise the different classes of models, reducing arrows, and re-writing the legend to hopefully make the figure easier to follow. </w:t>
+      </w:r>
+    </w:p>
+    <w:p>
+      <w:r>
+        <w:br/>
+      </w:r>
       <w:r>
         <w:rPr>
           <w:b/>
@@ -3880,7 +4124,7 @@
           <w:b/>
           <w:bCs/>
         </w:rPr>
-        <w:t>38</w:t>
+        <w:t>39</w:t>
       </w:r>
       <w:r>
         <w:rPr>
@@ -3897,47 +4141,100 @@
         <w:t xml:space="preserve"> </w:t>
       </w:r>
       <w:r>
-        <w:t xml:space="preserve">Figure 1 - This is an extremely busy figure. It is </w:t>
+        <w:t xml:space="preserve">Line 101-121 - It is probably all true what is in here, but what is the purpose of spending 20 lines to describe weather modelling in general including the coding language? If weather and meteorological modelling is at all relevant in this context, I would suggest </w:t>
       </w:r>
       <w:proofErr w:type="gramStart"/>
       <w:r>
-        <w:t>really not</w:t>
+        <w:t>to focus</w:t>
       </w:r>
       <w:proofErr w:type="gramEnd"/>
       <w:r>
-        <w:t xml:space="preserve"> easy to understand what the message or illustration is? At a first glance it seems to present general connection between basic ecological understanding and dynamics with some arbitrary or selected models, but it is unclear which boxes are </w:t>
+        <w:t xml:space="preserve"> on the aspects of meteorological modelling that are particularly challenged when it comes to extremes and specifically heat waves. I certainly agree that such meteorological modelling of extremes IS a big challenge. Long term and general climate modelling </w:t>
       </w:r>
       <w:proofErr w:type="gramStart"/>
       <w:r>
-        <w:t>models</w:t>
+        <w:t>is</w:t>
       </w:r>
       <w:proofErr w:type="gramEnd"/>
       <w:r>
-        <w:t xml:space="preserve"> and which are system entities, it is unclear what the dotted lines </w:t>
+        <w:t xml:space="preserve"> reasonably good while the translation of the general weather patterns into local and regional extremes are really challenging. But this </w:t>
       </w:r>
       <w:proofErr w:type="gramStart"/>
       <w:r>
-        <w:t>indicates</w:t>
+        <w:t>particular challenge</w:t>
       </w:r>
       <w:proofErr w:type="gramEnd"/>
       <w:r>
-        <w:t xml:space="preserve"> and it is unclear which aspects of the ecosystem functioning are involved and how they are linked. Are the ecosystem boxes separate from the modelling or are they part of the modelling (which must be the case for many of the models??). And finally, the figure claims to focus on extreme heat - but it is unclear how this is done and how it interacts with other drivers such as especially water and management. The figure is not entirely </w:t>
+        <w:t xml:space="preserve"> is not what you describe.</w:t>
+      </w:r>
+      <w:r>
+        <w:br/>
+      </w:r>
+    </w:p>
+    <w:p>
+      <w:r>
+        <w:rPr>
+          <w:b/>
+          <w:bCs/>
+          <w:color w:val="215E99" w:themeColor="text2" w:themeTint="BF"/>
+        </w:rPr>
+        <w:t>Response</w:t>
+      </w:r>
+      <w:r>
+        <w:rPr>
+          <w:color w:val="215E99" w:themeColor="text2" w:themeTint="BF"/>
+        </w:rPr>
+        <w:t>:</w:t>
+      </w:r>
+      <w:r>
+        <w:rPr>
+          <w:color w:val="215E99" w:themeColor="text2" w:themeTint="BF"/>
+        </w:rPr>
+        <w:t xml:space="preserve"> We agree, and this was a point brought up also by Reviewer 2. We have now removed the global climate modelling section and kept it’s mention to a minimum focusing on citing already existing reviews in other sections. </w:t>
+      </w:r>
+    </w:p>
+    <w:p>
+      <w:r>
+        <w:br/>
+      </w:r>
+      <w:r>
+        <w:rPr>
+          <w:b/>
+          <w:bCs/>
+        </w:rPr>
+        <w:t>C</w:t>
+      </w:r>
+      <w:r>
+        <w:rPr>
+          <w:b/>
+          <w:bCs/>
+        </w:rPr>
+        <w:t>40</w:t>
+      </w:r>
+      <w:r>
+        <w:rPr>
+          <w:b/>
+          <w:bCs/>
+        </w:rPr>
+        <w:t>:</w:t>
+      </w:r>
+      <w:r>
+        <w:rPr>
+          <w:b/>
+          <w:bCs/>
+        </w:rPr>
+        <w:t xml:space="preserve"> </w:t>
+      </w:r>
+      <w:r>
+        <w:t xml:space="preserve">Line 122-135 - Again, I suggest you include some more specific ecological understanding here. The section looks at extremes mostly from a meteorological point of view, but this may not in itself be relevant if the ecosystems or species do not experience the pressure as extreme. Melinda Smith has a great paper where she </w:t>
       </w:r>
       <w:proofErr w:type="gramStart"/>
       <w:r>
-        <w:t>helpful</w:t>
+        <w:t>distinguish</w:t>
       </w:r>
       <w:proofErr w:type="gramEnd"/>
       <w:r>
-        <w:t xml:space="preserve"> and it is not clear when you refer to existing models, approaches and concepts and when you present a wish or suggestion for </w:t>
-      </w:r>
-      <w:proofErr w:type="spellStart"/>
-      <w:r>
-        <w:t>ssomething</w:t>
-      </w:r>
-      <w:proofErr w:type="spellEnd"/>
-      <w:r>
-        <w:t xml:space="preserve"> new.</w:t>
+        <w:t xml:space="preserve"> between meteorological extremes and ecological extremes. That would be a relevant and great perspective to include.</w:t>
       </w:r>
       <w:r>
         <w:br/>
@@ -3962,128 +4259,130 @@
         <w:rPr>
           <w:color w:val="215E99" w:themeColor="text2" w:themeTint="BF"/>
         </w:rPr>
-        <w:t xml:space="preserve"> W</w:t>
-      </w:r>
-      <w:r>
-        <w:rPr>
-          <w:color w:val="215E99" w:themeColor="text2" w:themeTint="BF"/>
-        </w:rPr>
-        <w:t>e believe this figure</w:t>
-      </w:r>
-      <w:r>
-        <w:rPr>
-          <w:color w:val="215E99" w:themeColor="text2" w:themeTint="BF"/>
+        <w:t xml:space="preserve"> Thanks. We have completely re-written this entire section and brought a few more examples here. The section that follows (“Translating exposure to organism temperature: biophysics to the rescue”) discusses how species may not actually experience these extremes, and how biophysical models can capture this by modelling behaviour.</w:t>
+      </w:r>
+    </w:p>
+    <w:p>
+      <w:r>
+        <w:br/>
+      </w:r>
+      <w:r>
+        <w:rPr>
+          <w:b/>
+          <w:bCs/>
+        </w:rPr>
+        <w:t>C</w:t>
+      </w:r>
+      <w:r>
+        <w:rPr>
+          <w:b/>
+          <w:bCs/>
+        </w:rPr>
+        <w:t>41</w:t>
+      </w:r>
+      <w:r>
+        <w:rPr>
+          <w:b/>
+          <w:bCs/>
+        </w:rPr>
+        <w:t>:</w:t>
+      </w:r>
+      <w:r>
+        <w:rPr>
+          <w:b/>
+          <w:bCs/>
         </w:rPr>
         <w:t xml:space="preserve"> </w:t>
       </w:r>
       <w:r>
-        <w:rPr>
-          <w:color w:val="215E99" w:themeColor="text2" w:themeTint="BF"/>
-        </w:rPr>
-        <w:t>capture</w:t>
-      </w:r>
-      <w:r>
-        <w:rPr>
-          <w:color w:val="215E99" w:themeColor="text2" w:themeTint="BF"/>
-        </w:rPr>
-        <w:t>s</w:t>
-      </w:r>
-      <w:r>
-        <w:rPr>
-          <w:color w:val="215E99" w:themeColor="text2" w:themeTint="BF"/>
-        </w:rPr>
-        <w:t xml:space="preserve"> the broad classes of models we discuss and how they are interconnected</w:t>
-      </w:r>
-      <w:r>
-        <w:rPr>
-          <w:color w:val="215E99" w:themeColor="text2" w:themeTint="BF"/>
-        </w:rPr>
-        <w:t xml:space="preserve"> so would like to keep it as an overarching introduction and </w:t>
-      </w:r>
-      <w:r>
-        <w:rPr>
-          <w:color w:val="215E99" w:themeColor="text2" w:themeTint="BF"/>
-        </w:rPr>
+        <w:t>Line 133-135 - I miss a reference for this latter sentence, or a more comprehensive unfolding of the non-linearity aspects. It is a surprise how little space you offer to the non-linearity aspects of extremes and how to model them, despite they are crucial characteristics of such events.</w:t>
+      </w:r>
+      <w:r>
+        <w:br/>
+      </w:r>
+    </w:p>
+    <w:p>
+      <w:pPr>
+        <w:rPr>
+          <w:color w:val="215E99" w:themeColor="text2" w:themeTint="BF"/>
+        </w:rPr>
+      </w:pPr>
+      <w:r>
+        <w:rPr>
+          <w:b/>
+          <w:bCs/>
+          <w:color w:val="215E99" w:themeColor="text2" w:themeTint="BF"/>
+        </w:rPr>
+        <w:t>Response</w:t>
+      </w:r>
+      <w:r>
+        <w:rPr>
+          <w:color w:val="215E99" w:themeColor="text2" w:themeTint="BF"/>
+        </w:rPr>
+        <w:t>:</w:t>
+      </w:r>
+      <w:r>
+        <w:rPr>
+          <w:color w:val="215E99" w:themeColor="text2" w:themeTint="BF"/>
+        </w:rPr>
+        <w:t xml:space="preserve"> </w:t>
+      </w:r>
+      <w:r>
+        <w:rPr>
+          <w:color w:val="215E99" w:themeColor="text2" w:themeTint="BF"/>
+        </w:rPr>
+        <w:t>Non-linearities and interactions are expected to emerge as an entire system is modelled, which is what we are advocating. We have mentioned non-linearities and interactions in the introduction and provided references for examples of how these are being incorporated in models. We also mention them in our concluding remarks sections but have limited space to devote to it otherwise because it is an emergent property of modelling a system. As such, the exact nature of these non-linearities will depend on the system as Reviewer 3 understands.</w:t>
+      </w:r>
+    </w:p>
+    <w:p>
+      <w:r>
+        <w:br/>
+      </w:r>
+      <w:r>
+        <w:rPr>
+          <w:b/>
+          <w:bCs/>
+        </w:rPr>
+        <w:t>C</w:t>
+      </w:r>
+      <w:r>
+        <w:rPr>
+          <w:b/>
+          <w:bCs/>
+        </w:rPr>
+        <w:t>42</w:t>
+      </w:r>
+      <w:r>
+        <w:rPr>
+          <w:b/>
+          <w:bCs/>
+        </w:rPr>
+        <w:t>:</w:t>
+      </w:r>
+      <w:r>
+        <w:rPr>
+          <w:b/>
+          <w:bCs/>
+        </w:rPr>
+        <w:t xml:space="preserve"> </w:t>
+      </w:r>
+      <w:r>
+        <w:t xml:space="preserve">Line 159-161 - I do not understand what you try to say here? This sounds like what all models do (or try to do). What is the challenge you see here - is it modelling the </w:t>
+      </w:r>
+      <w:r>
         <w:lastRenderedPageBreak/>
-        <w:t>guide to the review. However, we agree it could be simplified. We have now tried to simplify by creating defined boxes which categorise the different classes of models</w:t>
-      </w:r>
-      <w:r>
-        <w:rPr>
-          <w:color w:val="215E99" w:themeColor="text2" w:themeTint="BF"/>
-        </w:rPr>
-        <w:t>, reducing arrows</w:t>
-      </w:r>
-      <w:r>
-        <w:rPr>
-          <w:color w:val="215E99" w:themeColor="text2" w:themeTint="BF"/>
-        </w:rPr>
-        <w:t xml:space="preserve">, and re-writing the legend to hopefully make the figure easier to follow. </w:t>
-      </w:r>
-    </w:p>
-    <w:p>
+        <w:t>thermal regime or the plant/system dynamics?</w:t>
+      </w:r>
       <w:r>
         <w:br/>
       </w:r>
-      <w:r>
-        <w:rPr>
-          <w:b/>
-          <w:bCs/>
-        </w:rPr>
-        <w:t>C</w:t>
-      </w:r>
-      <w:r>
-        <w:rPr>
-          <w:b/>
-          <w:bCs/>
-        </w:rPr>
-        <w:t>39</w:t>
-      </w:r>
-      <w:r>
-        <w:rPr>
-          <w:b/>
-          <w:bCs/>
-        </w:rPr>
-        <w:t>:</w:t>
-      </w:r>
-      <w:r>
-        <w:rPr>
-          <w:b/>
-          <w:bCs/>
-        </w:rPr>
-        <w:t xml:space="preserve"> </w:t>
-      </w:r>
-      <w:r>
-        <w:t xml:space="preserve">Line 101-121 - It is probably all true what is in here, but what is the purpose of spending 20 lines to describe weather modelling in general including the coding language? If weather and meteorological modelling is at all relevant in this context, I would suggest </w:t>
-      </w:r>
-      <w:proofErr w:type="gramStart"/>
-      <w:r>
-        <w:t>to focus</w:t>
-      </w:r>
-      <w:proofErr w:type="gramEnd"/>
-      <w:r>
-        <w:t xml:space="preserve"> on the aspects of meteorological modelling that are particularly challenged when it comes to extremes and specifically heat waves. I certainly agree that such meteorological modelling of extremes IS a big challenge. Long term and general climate modelling </w:t>
-      </w:r>
-      <w:proofErr w:type="gramStart"/>
-      <w:r>
-        <w:t>is</w:t>
-      </w:r>
-      <w:proofErr w:type="gramEnd"/>
-      <w:r>
-        <w:t xml:space="preserve"> reasonably good while the translation of the general weather patterns into local and regional extremes are really challenging. But this </w:t>
-      </w:r>
-      <w:proofErr w:type="gramStart"/>
-      <w:r>
-        <w:t>particular challenge</w:t>
-      </w:r>
-      <w:proofErr w:type="gramEnd"/>
-      <w:r>
-        <w:t xml:space="preserve"> is not what you describe.</w:t>
-      </w:r>
-      <w:r>
-        <w:br/>
-      </w:r>
-    </w:p>
-    <w:p>
+    </w:p>
+    <w:p>
+      <w:pPr>
+        <w:rPr>
+          <w:color w:val="215E99" w:themeColor="text2" w:themeTint="BF"/>
+        </w:rPr>
+      </w:pPr>
       <w:r>
         <w:rPr>
           <w:b/>
@@ -4102,226 +4401,19 @@
         <w:rPr>
           <w:color w:val="215E99" w:themeColor="text2" w:themeTint="BF"/>
         </w:rPr>
-        <w:t xml:space="preserve"> We agree, and this was a point brought up also by Reviewer 2. We have now removed the global climate modelling section and kept it’s mention to a minimum focusing on citing already existing reviews in other sections. </w:t>
-      </w:r>
-    </w:p>
-    <w:p>
-      <w:r>
-        <w:br/>
-      </w:r>
-      <w:r>
-        <w:rPr>
-          <w:b/>
-          <w:bCs/>
-        </w:rPr>
-        <w:t>C</w:t>
-      </w:r>
-      <w:r>
-        <w:rPr>
-          <w:b/>
-          <w:bCs/>
-        </w:rPr>
-        <w:t>40</w:t>
-      </w:r>
-      <w:r>
-        <w:rPr>
-          <w:b/>
-          <w:bCs/>
-        </w:rPr>
-        <w:t>:</w:t>
-      </w:r>
-      <w:r>
-        <w:rPr>
-          <w:b/>
-          <w:bCs/>
-        </w:rPr>
-        <w:t xml:space="preserve"> </w:t>
-      </w:r>
-      <w:r>
-        <w:t xml:space="preserve">Line 122-135 - Again, I suggest you include some more specific ecological understanding here. The section looks at extremes mostly from a meteorological point of view, but this may not in itself be relevant if the ecosystems or species do not experience the pressure as extreme. Melinda Smith has a great paper where she </w:t>
-      </w:r>
-      <w:proofErr w:type="gramStart"/>
-      <w:r>
-        <w:t>distinguish</w:t>
-      </w:r>
-      <w:proofErr w:type="gramEnd"/>
-      <w:r>
-        <w:t xml:space="preserve"> between meteorological extremes and ecological extremes. That would be a relevant and great perspective to include.</w:t>
-      </w:r>
-      <w:r>
-        <w:br/>
-      </w:r>
-    </w:p>
-    <w:p>
-      <w:r>
-        <w:rPr>
-          <w:b/>
-          <w:bCs/>
-          <w:color w:val="215E99" w:themeColor="text2" w:themeTint="BF"/>
-        </w:rPr>
-        <w:t>Response</w:t>
-      </w:r>
-      <w:r>
-        <w:rPr>
-          <w:color w:val="215E99" w:themeColor="text2" w:themeTint="BF"/>
-        </w:rPr>
-        <w:t>:</w:t>
-      </w:r>
-      <w:r>
-        <w:rPr>
-          <w:color w:val="215E99" w:themeColor="text2" w:themeTint="BF"/>
-        </w:rPr>
-        <w:t xml:space="preserve"> Thanks. We have completely re-written this entire section and brought a few more examples here. The section that follows (“Translating exposure to organism temperature: biophysics to the rescue”) discusses how species may not actually experience these extremes, and how biophysical models can capture this by modelling behaviour.</w:t>
-      </w:r>
-    </w:p>
-    <w:p>
-      <w:r>
-        <w:br/>
-      </w:r>
-      <w:r>
-        <w:rPr>
-          <w:b/>
-          <w:bCs/>
-        </w:rPr>
-        <w:t>C</w:t>
-      </w:r>
-      <w:r>
-        <w:rPr>
-          <w:b/>
-          <w:bCs/>
-        </w:rPr>
-        <w:t>41</w:t>
-      </w:r>
-      <w:r>
-        <w:rPr>
-          <w:b/>
-          <w:bCs/>
-        </w:rPr>
-        <w:t>:</w:t>
-      </w:r>
-      <w:r>
-        <w:rPr>
-          <w:b/>
-          <w:bCs/>
-        </w:rPr>
-        <w:t xml:space="preserve"> </w:t>
-      </w:r>
-      <w:r>
-        <w:t>Line 133-135 - I miss a reference for this latter sentence, or a more comprehensive unfolding of the non-linearity aspects. It is a surprise how little space you offer to the non-linearity aspects of extremes and how to model them, despite they are crucial characteristics of such events.</w:t>
-      </w:r>
-      <w:r>
-        <w:br/>
-      </w:r>
-    </w:p>
-    <w:p>
-      <w:r>
-        <w:rPr>
-          <w:b/>
-          <w:bCs/>
-          <w:color w:val="215E99" w:themeColor="text2" w:themeTint="BF"/>
-        </w:rPr>
-        <w:t>Response</w:t>
-      </w:r>
-      <w:r>
-        <w:rPr>
-          <w:color w:val="215E99" w:themeColor="text2" w:themeTint="BF"/>
-        </w:rPr>
-        <w:t>:</w:t>
-      </w:r>
-      <w:r>
-        <w:rPr>
-          <w:color w:val="215E99" w:themeColor="text2" w:themeTint="BF"/>
-        </w:rPr>
-        <w:t xml:space="preserve"> Non-linearities and interactions are expected to emerge as an entire system is modelled, which is what we are advocating. We have mentioned </w:t>
-      </w:r>
-      <w:r>
-        <w:rPr>
-          <w:color w:val="215E99" w:themeColor="text2" w:themeTint="BF"/>
-        </w:rPr>
-        <w:t>non-linearities and interactions in the introduction and concluding remarks sections but have limited space to devote to it otherwise because it is an emergent property of modelling a system. As such, the exact nature of these non-linearities will depend on the system as Reviewer 3 understands.</w:t>
-      </w:r>
-    </w:p>
-    <w:p>
-      <w:r>
-        <w:br/>
-      </w:r>
-      <w:r>
-        <w:rPr>
-          <w:b/>
-          <w:bCs/>
-        </w:rPr>
-        <w:t>C</w:t>
-      </w:r>
-      <w:r>
-        <w:rPr>
-          <w:b/>
-          <w:bCs/>
-        </w:rPr>
-        <w:t>42</w:t>
-      </w:r>
-      <w:r>
-        <w:rPr>
-          <w:b/>
-          <w:bCs/>
-        </w:rPr>
-        <w:t>:</w:t>
-      </w:r>
-      <w:r>
-        <w:rPr>
-          <w:b/>
-          <w:bCs/>
-        </w:rPr>
-        <w:t xml:space="preserve"> </w:t>
-      </w:r>
-      <w:r>
-        <w:t>Line 159-161 - I do not understand what you try to say here? This sounds like what all models do (or try to do). What is the challenge you see here - is it modelling the thermal regime or the plant/system dynamics?</w:t>
-      </w:r>
-      <w:r>
-        <w:br/>
-      </w:r>
-    </w:p>
-    <w:p>
-      <w:pPr>
-        <w:rPr>
-          <w:color w:val="215E99" w:themeColor="text2" w:themeTint="BF"/>
-        </w:rPr>
-      </w:pPr>
-      <w:r>
-        <w:rPr>
-          <w:b/>
-          <w:bCs/>
-          <w:color w:val="215E99" w:themeColor="text2" w:themeTint="BF"/>
-        </w:rPr>
-        <w:lastRenderedPageBreak/>
-        <w:t>Response</w:t>
-      </w:r>
-      <w:r>
-        <w:rPr>
-          <w:color w:val="215E99" w:themeColor="text2" w:themeTint="BF"/>
-        </w:rPr>
-        <w:t>:</w:t>
-      </w:r>
-      <w:r>
-        <w:rPr>
-          <w:color w:val="215E99" w:themeColor="text2" w:themeTint="BF"/>
-        </w:rPr>
-        <w:t xml:space="preserve"> We have re-written this section completely. Hopefully </w:t>
-      </w:r>
-      <w:proofErr w:type="spellStart"/>
-      <w:proofErr w:type="gramStart"/>
-      <w:r>
-        <w:rPr>
-          <w:color w:val="215E99" w:themeColor="text2" w:themeTint="BF"/>
-        </w:rPr>
-        <w:t>it’s</w:t>
-      </w:r>
-      <w:proofErr w:type="spellEnd"/>
-      <w:proofErr w:type="gramEnd"/>
-      <w:r>
-        <w:rPr>
-          <w:color w:val="215E99" w:themeColor="text2" w:themeTint="BF"/>
-        </w:rPr>
-        <w:t xml:space="preserve"> current configuration helps clear up as we emphasise the challenges with modelling the </w:t>
+        <w:t xml:space="preserve"> We have re-written this section completely. Hopefully its current configuration helps clear </w:t>
+      </w:r>
+      <w:r>
+        <w:rPr>
+          <w:color w:val="215E99" w:themeColor="text2" w:themeTint="BF"/>
+        </w:rPr>
+        <w:t xml:space="preserve">this </w:t>
+      </w:r>
+      <w:r>
+        <w:rPr>
+          <w:color w:val="215E99" w:themeColor="text2" w:themeTint="BF"/>
+        </w:rPr>
+        <w:t xml:space="preserve">up as we emphasise the challenges with modelling the </w:t>
       </w:r>
       <w:proofErr w:type="gramStart"/>
       <w:r>
@@ -4694,6 +4786,7 @@
     </w:p>
     <w:p>
       <w:r>
+        <w:lastRenderedPageBreak/>
         <w:br/>
       </w:r>
       <w:r>
@@ -4729,29 +4822,399 @@
       </w:r>
       <w:commentRangeStart w:id="13"/>
       <w:r>
-        <w:t xml:space="preserve">coexistence" as a key explanatory </w:t>
+        <w:t>coexistence" as a key explanatory model? It is true that species interactions are relevant for describing the interaction between two or more species relative to the site conditions at a given site</w:t>
+      </w:r>
+      <w:commentRangeEnd w:id="13"/>
+      <w:r>
+        <w:rPr>
+          <w:rStyle w:val="CommentReference"/>
+        </w:rPr>
+        <w:commentReference w:id="13"/>
+      </w:r>
+      <w:r>
+        <w:t xml:space="preserve">. But how is that relevant for the understanding of the overall consequences of extremes and heat waves? I would think coexistence is of core relevance for general site conditions and for more gradual climatic changes, while the sudden and potentially dieback provoking nature of extreme events, also described here by damage and repair, would be different from classic coexistence. </w:t>
+      </w:r>
+      <w:proofErr w:type="spellStart"/>
+      <w:r>
+        <w:t>Ofcourse</w:t>
+      </w:r>
+      <w:proofErr w:type="spellEnd"/>
+      <w:r>
+        <w:t>, if future heat waves is a novel factor for a given site, the ability of a given specie and community to withstand this pressure is importance, but I do not really see how coexistence is the core logical framework to describe systems responses to heat waves (or other extremes). The authors may have a point, but it must be described.</w:t>
+      </w:r>
+      <w:r>
+        <w:br/>
+      </w:r>
+    </w:p>
+    <w:p>
+      <w:pPr>
+        <w:rPr>
+          <w:color w:val="215E99" w:themeColor="text2" w:themeTint="BF"/>
+        </w:rPr>
+      </w:pPr>
+      <w:r>
+        <w:rPr>
+          <w:b/>
+          <w:bCs/>
+          <w:color w:val="215E99" w:themeColor="text2" w:themeTint="BF"/>
+        </w:rPr>
+        <w:t>Response</w:t>
+      </w:r>
+      <w:r>
+        <w:rPr>
+          <w:color w:val="215E99" w:themeColor="text2" w:themeTint="BF"/>
+        </w:rPr>
+        <w:t>:</w:t>
+      </w:r>
+      <w:r>
+        <w:rPr>
+          <w:color w:val="215E99" w:themeColor="text2" w:themeTint="BF"/>
+        </w:rPr>
+        <w:t xml:space="preserve"> </w:t>
+      </w:r>
+      <w:r>
+        <w:rPr>
+          <w:color w:val="215E99" w:themeColor="text2" w:themeTint="BF"/>
+        </w:rPr>
+        <w:t xml:space="preserve">Yes, as you note, coexistence theory is more often used to understand how well species pairs will persist within sites or across gradients but that is not to say these frameworks are not also used to understand the impacts of pulse events (like heat waves) on community diversity, it just hasn’t been applied in that way, to our knowledge. </w:t>
+      </w:r>
+    </w:p>
+    <w:p>
+      <w:pPr>
+        <w:rPr>
+          <w:color w:val="215E99" w:themeColor="text2" w:themeTint="BF"/>
+        </w:rPr>
+      </w:pPr>
+    </w:p>
+    <w:p>
+      <w:pPr>
+        <w:rPr>
+          <w:color w:val="215E99" w:themeColor="text2" w:themeTint="BF"/>
+        </w:rPr>
+      </w:pPr>
+      <w:r>
+        <w:rPr>
+          <w:color w:val="215E99" w:themeColor="text2" w:themeTint="BF"/>
+        </w:rPr>
+        <w:t>Your point is a good one.  Knowing if two species can technically coexist in a specific location is not that important for our framework.  The coexistence framework provided by Modern Coexistence Theory (MCT), however, can and has been used to answer many more questions than that.  So, it is the coexistence framework and more importantly the modelling tools to have been developed as extensions of MCT that we suggest are useful for studying community diversity</w:t>
+      </w:r>
+      <w:r>
+        <w:rPr>
+          <w:color w:val="215E99" w:themeColor="text2" w:themeTint="BF"/>
+        </w:rPr>
+        <w:t xml:space="preserve"> when thinking about the effects of extreme heat</w:t>
+      </w:r>
+      <w:r>
+        <w:rPr>
+          <w:color w:val="215E99" w:themeColor="text2" w:themeTint="BF"/>
+        </w:rPr>
+        <w:t xml:space="preserve">.  </w:t>
+      </w:r>
+    </w:p>
+    <w:p>
+      <w:pPr>
+        <w:rPr>
+          <w:color w:val="215E99" w:themeColor="text2" w:themeTint="BF"/>
+        </w:rPr>
+      </w:pPr>
+    </w:p>
+    <w:p>
+      <w:r>
+        <w:rPr>
+          <w:color w:val="215E99" w:themeColor="text2" w:themeTint="BF"/>
+        </w:rPr>
+        <w:t xml:space="preserve">As we now explain in the main text, modern modelling tools have been developed within the MCT framework to look at community diversity in whole networks based, for example of dynamical population growth models (Bimler et al. 2024), to tease apart stabilising and destabilising processes and to understanding how microclimate changes the probability that a species will succeed in a given community or not (Bowler et al. 2022).  It is these extensions of MCT that we find so useful. We have now explained our rational for bringing coexistence theory into this discussion more clearly in the text.  </w:t>
+      </w:r>
+    </w:p>
+    <w:p>
+      <w:r>
+        <w:br/>
+      </w:r>
+      <w:r>
+        <w:rPr>
+          <w:b/>
+          <w:bCs/>
+        </w:rPr>
+        <w:t>C</w:t>
+      </w:r>
+      <w:r>
+        <w:rPr>
+          <w:b/>
+          <w:bCs/>
+        </w:rPr>
+        <w:t>48</w:t>
+      </w:r>
+      <w:r>
+        <w:rPr>
+          <w:b/>
+          <w:bCs/>
+        </w:rPr>
+        <w:t>:</w:t>
+      </w:r>
+      <w:r>
+        <w:rPr>
+          <w:b/>
+          <w:bCs/>
+        </w:rPr>
+        <w:t xml:space="preserve"> </w:t>
+      </w:r>
+      <w:r>
+        <w:t xml:space="preserve">Box 2 - I think there is a time perspective missing in the description of heat waves as the driver for natural selection and evolution, and I think these two aspects are mistakenly mixed up. Extreme events may clearly drive selection of genetic variants that has the traits to survive the extreme pressure, but less so for evolution because it is a single and dramatic event. And evolution runs over longer time scales. Further, the consequence of extreme events may not be adaptation and evolution, but simply dieback, </w:t>
+      </w:r>
+      <w:proofErr w:type="spellStart"/>
+      <w:r>
+        <w:t>disappearence</w:t>
+      </w:r>
+      <w:proofErr w:type="spellEnd"/>
+      <w:r>
+        <w:t xml:space="preserve"> and replacement. Extreme events may cause dieback and complete removal of certain species or a complete exchange of existing species and systems with new and different species and system (e.g. desertification) meaning that survival and/or invasion may be more important. So, many of the aspects mentioned here clearly play an important </w:t>
+      </w:r>
+      <w:proofErr w:type="gramStart"/>
+      <w:r>
+        <w:t>role, but</w:t>
+      </w:r>
+      <w:proofErr w:type="gramEnd"/>
+      <w:r>
+        <w:t xml:space="preserve"> may only present part of the story and other relevant and equally important processes and </w:t>
+      </w:r>
+      <w:proofErr w:type="spellStart"/>
+      <w:r>
+        <w:t>ressponses</w:t>
+      </w:r>
+      <w:proofErr w:type="spellEnd"/>
+      <w:r>
+        <w:t xml:space="preserve"> are completely missing. For </w:t>
       </w:r>
       <w:r>
         <w:lastRenderedPageBreak/>
-        <w:t>model? It is true that species interactions are relevant for describing the interaction between two or more species relative to the site conditions at a given site</w:t>
-      </w:r>
-      <w:commentRangeEnd w:id="13"/>
+        <w:t>example, the equation 2 seems to be of minor importance (as also stated in the box text).</w:t>
+      </w:r>
+      <w:r>
+        <w:br/>
+      </w:r>
+    </w:p>
+    <w:p>
+      <w:pPr>
+        <w:rPr>
+          <w:color w:val="215E99" w:themeColor="text2" w:themeTint="BF"/>
+        </w:rPr>
+      </w:pPr>
+      <w:r>
+        <w:rPr>
+          <w:b/>
+          <w:bCs/>
+          <w:color w:val="215E99" w:themeColor="text2" w:themeTint="BF"/>
+        </w:rPr>
+        <w:t>Response</w:t>
+      </w:r>
+      <w:r>
+        <w:rPr>
+          <w:color w:val="215E99" w:themeColor="text2" w:themeTint="BF"/>
+        </w:rPr>
+        <w:t>:</w:t>
+      </w:r>
+      <w:r>
+        <w:rPr>
+          <w:color w:val="215E99" w:themeColor="text2" w:themeTint="BF"/>
+        </w:rPr>
+        <w:t xml:space="preserve"> Sorry, we are not quite sure what Reviewer 3 means here. Evolution can happen over ecological timescales, and extreme events have been shown to lead to rapid evolutionary change (for a recent review see: </w:t>
+      </w:r>
+      <w:r>
+        <w:rPr>
+          <w:color w:val="215E99" w:themeColor="text2" w:themeTint="BF"/>
+        </w:rPr>
+        <w:t>Baeckens, S. and Donihue, C.M., 2025. Evolutionary consequences of extreme climate events. Current Biology, 35(17), R850-R864</w:t>
+      </w:r>
+      <w:r>
+        <w:rPr>
+          <w:color w:val="215E99" w:themeColor="text2" w:themeTint="BF"/>
+        </w:rPr>
+        <w:t xml:space="preserve">). </w:t>
+      </w:r>
+      <w:r>
+        <w:rPr>
+          <w:color w:val="215E99" w:themeColor="text2" w:themeTint="BF"/>
+        </w:rPr>
+        <w:t xml:space="preserve">We do not disagree with Reviewer 3 that that dieback is not an example of evolutionary adaptation, but this example is not one we discuss, so it is unclear how it pertains to Box 3. </w:t>
+      </w:r>
+    </w:p>
+    <w:p>
+      <w:pPr>
+        <w:rPr>
+          <w:color w:val="215E99" w:themeColor="text2" w:themeTint="BF"/>
+        </w:rPr>
+      </w:pPr>
+    </w:p>
+    <w:p>
+      <w:r>
+        <w:rPr>
+          <w:color w:val="215E99" w:themeColor="text2" w:themeTint="BF"/>
+        </w:rPr>
+        <w:t xml:space="preserve">Any systems modelling approach needs to eventually identify ways to incorporate eco-evolutionary feedback. Short term evolutionary shifts </w:t>
+      </w:r>
+      <w:r>
+        <w:rPr>
+          <w:color w:val="215E99" w:themeColor="text2" w:themeTint="BF"/>
+        </w:rPr>
+        <w:t xml:space="preserve">or plastic responses </w:t>
+      </w:r>
+      <w:r>
+        <w:rPr>
+          <w:color w:val="215E99" w:themeColor="text2" w:themeTint="BF"/>
+        </w:rPr>
+        <w:t xml:space="preserve">resulting from extreme climates not only </w:t>
+      </w:r>
+      <w:r>
+        <w:rPr>
+          <w:color w:val="215E99" w:themeColor="text2" w:themeTint="BF"/>
+        </w:rPr>
+        <w:t xml:space="preserve">depend (and impact) on selection strength </w:t>
+      </w:r>
+      <w:r>
+        <w:rPr>
+          <w:color w:val="215E99" w:themeColor="text2" w:themeTint="BF"/>
+        </w:rPr>
+        <w:t xml:space="preserve">but </w:t>
+      </w:r>
+      <w:r>
+        <w:rPr>
+          <w:color w:val="215E99" w:themeColor="text2" w:themeTint="BF"/>
+        </w:rPr>
+        <w:t>also</w:t>
+      </w:r>
+      <w:r>
+        <w:rPr>
+          <w:color w:val="215E99" w:themeColor="text2" w:themeTint="BF"/>
+        </w:rPr>
+        <w:t xml:space="preserve"> </w:t>
+      </w:r>
+      <w:r>
+        <w:rPr>
+          <w:color w:val="215E99" w:themeColor="text2" w:themeTint="BF"/>
+        </w:rPr>
+        <w:t xml:space="preserve">phenotypic and </w:t>
+      </w:r>
+      <w:r>
+        <w:rPr>
+          <w:color w:val="215E99" w:themeColor="text2" w:themeTint="BF"/>
+        </w:rPr>
+        <w:t xml:space="preserve">genetic variance which can affect how a system responds in the future. </w:t>
+      </w:r>
+      <w:r>
+        <w:rPr>
+          <w:color w:val="215E99" w:themeColor="text2" w:themeTint="BF"/>
+        </w:rPr>
+        <w:t>We agree however that this box needed to be more focused and emphasis</w:t>
+      </w:r>
+      <w:r>
+        <w:rPr>
+          <w:color w:val="215E99" w:themeColor="text2" w:themeTint="BF"/>
+        </w:rPr>
+        <w:t>e</w:t>
+      </w:r>
+      <w:r>
+        <w:rPr>
+          <w:color w:val="215E99" w:themeColor="text2" w:themeTint="BF"/>
+        </w:rPr>
+        <w:t xml:space="preserve"> a few of these important points better. It also needed to be shortened so we have re-written the text in this box (now Box 3).</w:t>
+      </w:r>
+    </w:p>
+    <w:p>
+      <w:r>
+        <w:br/>
+      </w:r>
+      <w:r>
+        <w:rPr>
+          <w:b/>
+          <w:bCs/>
+        </w:rPr>
+        <w:t>C</w:t>
+      </w:r>
+      <w:r>
+        <w:rPr>
+          <w:b/>
+          <w:bCs/>
+        </w:rPr>
+        <w:t>49</w:t>
+      </w:r>
+      <w:r>
+        <w:rPr>
+          <w:b/>
+          <w:bCs/>
+        </w:rPr>
+        <w:t>:</w:t>
+      </w:r>
+      <w:r>
+        <w:rPr>
+          <w:b/>
+          <w:bCs/>
+        </w:rPr>
+        <w:t xml:space="preserve"> </w:t>
+      </w:r>
+      <w:r>
+        <w:t xml:space="preserve">Box 3 - I acknowledge that heat waves </w:t>
+      </w:r>
+      <w:commentRangeStart w:id="14"/>
+      <w:r>
+        <w:t xml:space="preserve">and other climatic extremes causing major impacts on plants and ecosystems will cascade to also have potentially significant societal impacts. However, the paper has a strange mismatch in scale with on the one hand quite some detailed description of single species and on the other hand attempts to embrace the entire global society - and these overly complex societal responses are handled by a single box and just 15 lines! This is just not convincing. </w:t>
+      </w:r>
+      <w:commentRangeEnd w:id="14"/>
       <w:r>
         <w:rPr>
           <w:rStyle w:val="CommentReference"/>
         </w:rPr>
-        <w:commentReference w:id="13"/>
-      </w:r>
-      <w:r>
-        <w:t xml:space="preserve">. But how is that relevant for the understanding of the overall consequences of extremes and heat waves? I would think coexistence is of core relevance for general site conditions and for more gradual climatic changes, while the sudden and potentially dieback provoking nature of extreme events, also described here by damage and repair, would be different from classic coexistence. </w:t>
+        <w:commentReference w:id="14"/>
+      </w:r>
+      <w:r>
+        <w:t xml:space="preserve">The societal aspects of these changes may be </w:t>
+      </w:r>
+      <w:proofErr w:type="gramStart"/>
+      <w:r>
+        <w:t>really complex</w:t>
+      </w:r>
+      <w:proofErr w:type="gramEnd"/>
+      <w:r>
+        <w:t xml:space="preserve"> and involve severe impacts on anything from changes in classic </w:t>
       </w:r>
       <w:proofErr w:type="spellStart"/>
       <w:r>
-        <w:t>Ofcourse</w:t>
+        <w:t>provisionary</w:t>
       </w:r>
       <w:proofErr w:type="spellEnd"/>
       <w:r>
-        <w:t>, if future heat waves is a novel factor for a given site, the ability of a given specie and community to withstand this pressure is importance, but I do not really see how coexistence is the core logical framework to describe systems responses to heat waves (or other extremes). The authors may have a point, but it must be described.</w:t>
+        <w:t xml:space="preserve"> ecosystems services like food, feed and fibre to economic progress, human </w:t>
+      </w:r>
+      <w:proofErr w:type="spellStart"/>
+      <w:r>
+        <w:t>behavior</w:t>
+      </w:r>
+      <w:proofErr w:type="spellEnd"/>
+      <w:r>
+        <w:t xml:space="preserve">, migration and political unrest. These are really complex changes which the paper does not really acknowledge, and therefore the statement in line 292 that systems modelling can provide us with quantitative tools for </w:t>
+      </w:r>
+      <w:proofErr w:type="spellStart"/>
+      <w:r>
+        <w:t>predictins</w:t>
+      </w:r>
+      <w:proofErr w:type="spellEnd"/>
+      <w:r>
+        <w:t xml:space="preserve"> and decisions may in principle be correct, but we do not get any clear descriptions or approaches (which was the promise in the title of the paper) - or even a glance of what need to be scientifically and </w:t>
+      </w:r>
+      <w:proofErr w:type="spellStart"/>
+      <w:r>
+        <w:t>modelwise</w:t>
+      </w:r>
+      <w:proofErr w:type="spellEnd"/>
+      <w:r>
+        <w:t xml:space="preserve"> developed to get there. It may be relevant to include these aspects, but it </w:t>
+      </w:r>
+      <w:proofErr w:type="gramStart"/>
+      <w:r>
+        <w:t>has to</w:t>
+      </w:r>
+      <w:proofErr w:type="gramEnd"/>
+      <w:r>
+        <w:t xml:space="preserve"> be carefully described and framed, and the modelling aspects must be treated with the same carefulness as the physical-biological systems.</w:t>
       </w:r>
       <w:r>
         <w:br/>
@@ -4764,36 +5227,37 @@
           <w:bCs/>
           <w:color w:val="215E99" w:themeColor="text2" w:themeTint="BF"/>
         </w:rPr>
-        <w:t>Re</w:t>
-      </w:r>
-      <w:r>
-        <w:rPr>
-          <w:b/>
-          <w:bCs/>
-          <w:color w:val="215E99" w:themeColor="text2" w:themeTint="BF"/>
-          <w:highlight w:val="yellow"/>
-        </w:rPr>
-        <w:t>spon</w:t>
-      </w:r>
-      <w:r>
-        <w:rPr>
-          <w:b/>
-          <w:bCs/>
-          <w:color w:val="215E99" w:themeColor="text2" w:themeTint="BF"/>
-        </w:rPr>
-        <w:t>se</w:t>
-      </w:r>
-      <w:r>
-        <w:rPr>
-          <w:color w:val="215E99" w:themeColor="text2" w:themeTint="BF"/>
-        </w:rPr>
-        <w:t>:</w:t>
-      </w:r>
-      <w:r>
-        <w:rPr>
-          <w:color w:val="215E99" w:themeColor="text2" w:themeTint="BF"/>
-        </w:rPr>
-        <w:t xml:space="preserve"> MARGIE ADD RESPONSE</w:t>
+        <w:t>Response</w:t>
+      </w:r>
+      <w:r>
+        <w:rPr>
+          <w:color w:val="215E99" w:themeColor="text2" w:themeTint="BF"/>
+        </w:rPr>
+        <w:t>:</w:t>
+      </w:r>
+      <w:r>
+        <w:rPr>
+          <w:color w:val="215E99" w:themeColor="text2" w:themeTint="BF"/>
+        </w:rPr>
+        <w:t xml:space="preserve"> We agree. We have now removed the SES discussion from the paper and focused on the biological models. We make brief mention in the introduction and concluding remarks section about the implications for socioecological modelling. </w:t>
+      </w:r>
+      <w:r>
+        <w:rPr>
+          <w:color w:val="215E99" w:themeColor="text2" w:themeTint="BF"/>
+        </w:rPr>
+        <w:t>Instead,</w:t>
+      </w:r>
+      <w:r>
+        <w:rPr>
+          <w:color w:val="215E99" w:themeColor="text2" w:themeTint="BF"/>
+        </w:rPr>
+        <w:t xml:space="preserve"> we use this extra box </w:t>
+      </w:r>
+      <w:r>
+        <w:rPr>
+          <w:color w:val="215E99" w:themeColor="text2" w:themeTint="BF"/>
+        </w:rPr>
+        <w:t xml:space="preserve">bring in a concrete demonstration of how models in the major classes can be coupled across species. </w:t>
       </w:r>
     </w:p>
     <w:p>
@@ -4812,7 +5276,7 @@
           <w:b/>
           <w:bCs/>
         </w:rPr>
-        <w:t>48</w:t>
+        <w:t>50</w:t>
       </w:r>
       <w:r>
         <w:rPr>
@@ -4829,497 +5293,177 @@
         <w:t xml:space="preserve"> </w:t>
       </w:r>
       <w:r>
-        <w:t xml:space="preserve">Box 2 - I think there is a time perspective missing in the description of heat waves as the driver for natural selection and evolution, and I think these two aspects are mistakenly mixed up. Extreme events may clearly drive selection of genetic variants that has the traits to survive the extreme pressure, but less so for evolution because it is a single and dramatic event. And evolution runs over longer time scales. Further, the consequence of extreme events may not be adaptation and evolution, but simply dieback, </w:t>
-      </w:r>
-      <w:proofErr w:type="spellStart"/>
-      <w:r>
-        <w:t>disappearence</w:t>
-      </w:r>
-      <w:proofErr w:type="spellEnd"/>
-      <w:r>
-        <w:t xml:space="preserve"> and replacement. Extreme events may cause dieback and complete removal of certain species or a complete exchange of existing species and systems with new and different species and system (e.g. desertification) meaning that survival and/or invasion may be more important. So, many of the aspects mentioned here clearly play an important </w:t>
+        <w:t>Figure 3 - This is an overly naïve figure that does not provide any useful information of the model approach.</w:t>
+      </w:r>
+      <w:r>
+        <w:br/>
+      </w:r>
+    </w:p>
+    <w:p>
+      <w:r>
+        <w:rPr>
+          <w:b/>
+          <w:bCs/>
+          <w:color w:val="215E99" w:themeColor="text2" w:themeTint="BF"/>
+        </w:rPr>
+        <w:t>Response</w:t>
+      </w:r>
+      <w:r>
+        <w:rPr>
+          <w:color w:val="215E99" w:themeColor="text2" w:themeTint="BF"/>
+        </w:rPr>
+        <w:t>:</w:t>
+      </w:r>
+      <w:r>
+        <w:rPr>
+          <w:color w:val="215E99" w:themeColor="text2" w:themeTint="BF"/>
+        </w:rPr>
+        <w:t xml:space="preserve"> </w:t>
+      </w:r>
+      <w:r>
+        <w:rPr>
+          <w:color w:val="215E99" w:themeColor="text2" w:themeTint="BF"/>
+        </w:rPr>
+        <w:t>Agree. We have removed this figure and the SES box.</w:t>
+      </w:r>
+    </w:p>
+    <w:p>
+      <w:r>
+        <w:lastRenderedPageBreak/>
+        <w:br/>
+      </w:r>
+      <w:r>
+        <w:rPr>
+          <w:b/>
+          <w:bCs/>
+        </w:rPr>
+        <w:t>C</w:t>
+      </w:r>
+      <w:r>
+        <w:rPr>
+          <w:b/>
+          <w:bCs/>
+        </w:rPr>
+        <w:t>51</w:t>
+      </w:r>
+      <w:r>
+        <w:rPr>
+          <w:b/>
+          <w:bCs/>
+        </w:rPr>
+        <w:t>:</w:t>
+      </w:r>
+      <w:r>
+        <w:rPr>
+          <w:b/>
+          <w:bCs/>
+        </w:rPr>
+        <w:t xml:space="preserve"> </w:t>
+      </w:r>
+      <w:r>
+        <w:t>Figure 4 - Even with the long descriptive text, it is a very busy figure not giving a clear idea of what it wants to tell. It seems to be focused on a very limited system with just 2 species which is a bit contradictory to the concept of the paper that speaks about integration across domains and areas. The real challenge and the promise of the paper is about the comprehensive systems view and approach. The figure does not provide any solutions to the larger systems level.</w:t>
+      </w:r>
+      <w:r>
+        <w:br/>
+      </w:r>
+    </w:p>
+    <w:p>
+      <w:r>
+        <w:rPr>
+          <w:b/>
+          <w:bCs/>
+          <w:color w:val="215E99" w:themeColor="text2" w:themeTint="BF"/>
+        </w:rPr>
+        <w:t>Response</w:t>
+      </w:r>
+      <w:r>
+        <w:rPr>
+          <w:color w:val="215E99" w:themeColor="text2" w:themeTint="BF"/>
+        </w:rPr>
+        <w:t>:</w:t>
+      </w:r>
+      <w:r>
+        <w:rPr>
+          <w:color w:val="215E99" w:themeColor="text2" w:themeTint="BF"/>
+        </w:rPr>
+        <w:t xml:space="preserve"> We have now included more detail about the modelling approaches from the supplement in two new boxes. Hopefully this makes the figure emerge more clearly now. We have also tried to simplify it.</w:t>
+      </w:r>
+    </w:p>
+    <w:p>
+      <w:r>
+        <w:br/>
+      </w:r>
+      <w:r>
+        <w:rPr>
+          <w:b/>
+          <w:bCs/>
+        </w:rPr>
+        <w:t>C</w:t>
+      </w:r>
+      <w:r>
+        <w:rPr>
+          <w:b/>
+          <w:bCs/>
+        </w:rPr>
+        <w:t>52</w:t>
+      </w:r>
+      <w:r>
+        <w:rPr>
+          <w:b/>
+          <w:bCs/>
+        </w:rPr>
+        <w:t>:</w:t>
+      </w:r>
+      <w:r>
+        <w:rPr>
+          <w:b/>
+          <w:bCs/>
+        </w:rPr>
+        <w:t xml:space="preserve"> </w:t>
+      </w:r>
+      <w:r>
+        <w:t xml:space="preserve">Outstanding questions - It is great with this attempt to summarize the messages into the next step or research needs for the future. </w:t>
       </w:r>
       <w:proofErr w:type="gramStart"/>
       <w:r>
-        <w:t>role, but</w:t>
+        <w:t>But,</w:t>
       </w:r>
       <w:proofErr w:type="gramEnd"/>
       <w:r>
-        <w:t xml:space="preserve"> may only present part of the story and other relevant and equally important processes and </w:t>
-      </w:r>
-      <w:proofErr w:type="spellStart"/>
-      <w:r>
-        <w:t>ressponses</w:t>
-      </w:r>
-      <w:proofErr w:type="spellEnd"/>
-      <w:r>
-        <w:t xml:space="preserve"> are completely missing. For example, the equation 2 seems to be of minor importance (as also stated in the box text).</w:t>
-      </w:r>
-      <w:r>
-        <w:br/>
-      </w:r>
-    </w:p>
-    <w:p>
-      <w:r>
-        <w:rPr>
-          <w:b/>
-          <w:bCs/>
-          <w:color w:val="215E99" w:themeColor="text2" w:themeTint="BF"/>
-        </w:rPr>
-        <w:t>Response</w:t>
-      </w:r>
-      <w:r>
-        <w:rPr>
-          <w:color w:val="215E99" w:themeColor="text2" w:themeTint="BF"/>
-        </w:rPr>
-        <w:t>:</w:t>
-      </w:r>
-      <w:r>
-        <w:rPr>
-          <w:color w:val="215E99" w:themeColor="text2" w:themeTint="BF"/>
-        </w:rPr>
-        <w:t xml:space="preserve"> Sorry, we are not quite sure what Reviewer 3 means here</w:t>
-      </w:r>
-      <w:r>
-        <w:rPr>
-          <w:color w:val="215E99" w:themeColor="text2" w:themeTint="BF"/>
-        </w:rPr>
-        <w:t>, and we respectfully disagree with some statements</w:t>
-      </w:r>
-      <w:r>
-        <w:rPr>
-          <w:color w:val="215E99" w:themeColor="text2" w:themeTint="BF"/>
-        </w:rPr>
-        <w:t xml:space="preserve">. Evolution can happen over ecological timescales, and extreme events have been shown to lead to rapid evolutionary change (for a recent review see: </w:t>
-      </w:r>
-      <w:r>
-        <w:rPr>
-          <w:color w:val="215E99" w:themeColor="text2" w:themeTint="BF"/>
-        </w:rPr>
-        <w:t>Baeckens, S. and Donihue, C.M., 2025. Evolutionary consequences of extreme climate events. Current Biology, 35(17), R850-R864</w:t>
-      </w:r>
-      <w:r>
-        <w:rPr>
-          <w:color w:val="215E99" w:themeColor="text2" w:themeTint="BF"/>
-        </w:rPr>
-        <w:t xml:space="preserve">). </w:t>
-      </w:r>
-      <w:r>
-        <w:rPr>
-          <w:color w:val="215E99" w:themeColor="text2" w:themeTint="BF"/>
-        </w:rPr>
-        <w:t xml:space="preserve">We do not disagree with Reviewer 3 that that dieback is not an example of evolutionary adaptation, but this example is not one we discuss, so it is unclear how it pertains to Box 3. </w:t>
-      </w:r>
-      <w:r>
-        <w:rPr>
-          <w:color w:val="215E99" w:themeColor="text2" w:themeTint="BF"/>
-        </w:rPr>
-        <w:t xml:space="preserve">Any systems modelling approach needs to eventually identify ways to incorporate eco-evolutionary feedback. Short term evolutionary shifts </w:t>
-      </w:r>
-      <w:r>
-        <w:rPr>
-          <w:color w:val="215E99" w:themeColor="text2" w:themeTint="BF"/>
-        </w:rPr>
-        <w:t xml:space="preserve">or plastic responses </w:t>
-      </w:r>
-      <w:r>
-        <w:rPr>
-          <w:color w:val="215E99" w:themeColor="text2" w:themeTint="BF"/>
-        </w:rPr>
-        <w:t xml:space="preserve">resulting from extreme climates not only </w:t>
-      </w:r>
-      <w:r>
-        <w:rPr>
-          <w:color w:val="215E99" w:themeColor="text2" w:themeTint="BF"/>
-        </w:rPr>
-        <w:t xml:space="preserve">depend (and impact) on selection strength </w:t>
-      </w:r>
-      <w:r>
-        <w:rPr>
-          <w:color w:val="215E99" w:themeColor="text2" w:themeTint="BF"/>
-        </w:rPr>
-        <w:t xml:space="preserve">but </w:t>
-      </w:r>
-      <w:r>
-        <w:rPr>
-          <w:color w:val="215E99" w:themeColor="text2" w:themeTint="BF"/>
-        </w:rPr>
-        <w:t>also</w:t>
-      </w:r>
-      <w:r>
-        <w:rPr>
-          <w:color w:val="215E99" w:themeColor="text2" w:themeTint="BF"/>
-        </w:rPr>
-        <w:t xml:space="preserve"> </w:t>
-      </w:r>
-      <w:r>
-        <w:rPr>
-          <w:color w:val="215E99" w:themeColor="text2" w:themeTint="BF"/>
-        </w:rPr>
-        <w:t xml:space="preserve">phenotypic and </w:t>
-      </w:r>
-      <w:r>
-        <w:rPr>
-          <w:color w:val="215E99" w:themeColor="text2" w:themeTint="BF"/>
-        </w:rPr>
-        <w:t xml:space="preserve">genetic variance which can affect how a system responds in the future. </w:t>
-      </w:r>
-      <w:r>
-        <w:rPr>
-          <w:color w:val="215E99" w:themeColor="text2" w:themeTint="BF"/>
-        </w:rPr>
-        <w:t>We agree however that this box needed to be more focused and emphasis a few of these important points better. It also needed to be shortened so we have re-written the text in this box (now Box 3).</w:t>
-      </w:r>
-    </w:p>
-    <w:p>
-      <w:r>
-        <w:br/>
-      </w:r>
-      <w:r>
-        <w:rPr>
-          <w:b/>
-          <w:bCs/>
-        </w:rPr>
-        <w:t>C</w:t>
-      </w:r>
-      <w:r>
-        <w:rPr>
-          <w:b/>
-          <w:bCs/>
-        </w:rPr>
-        <w:t>49</w:t>
-      </w:r>
-      <w:r>
-        <w:rPr>
-          <w:b/>
-          <w:bCs/>
-        </w:rPr>
-        <w:t>:</w:t>
-      </w:r>
-      <w:r>
-        <w:rPr>
-          <w:b/>
-          <w:bCs/>
-        </w:rPr>
-        <w:t xml:space="preserve"> </w:t>
-      </w:r>
-      <w:r>
-        <w:t xml:space="preserve">Box 3 - I acknowledge that heat waves </w:t>
-      </w:r>
-      <w:commentRangeStart w:id="14"/>
-      <w:r>
-        <w:t xml:space="preserve">and other climatic extremes causing major impacts on plants and ecosystems will cascade to also have potentially significant societal impacts. However, the paper has a strange mismatch in scale with on the one </w:t>
-      </w:r>
-      <w:r>
-        <w:lastRenderedPageBreak/>
-        <w:t xml:space="preserve">hand quite some detailed description of single species and on the other hand attempts to embrace the entire global society - and these overly complex societal responses are handled by a single box and just 15 lines! This is just not convincing. </w:t>
-      </w:r>
-      <w:commentRangeEnd w:id="14"/>
+        <w:t xml:space="preserve"> these questions should follow logically from the paper, which I do not think they do. I cannot identify for any of the 8 points where this is a logical conclusion from things presented and discussed in the paper. Moreover, these 8 points are quite substantial outstanding questions which speaks against the title of the paper promising the reader an approach to model consequences of heat waves. It seems to me that the authors should </w:t>
+      </w:r>
+      <w:proofErr w:type="gramStart"/>
+      <w:r>
+        <w:t>consider,</w:t>
+      </w:r>
+      <w:proofErr w:type="gramEnd"/>
+      <w:r>
+        <w:t xml:space="preserve"> whether they actually </w:t>
+      </w:r>
+      <w:proofErr w:type="gramStart"/>
+      <w:r>
+        <w:t>believe</w:t>
+      </w:r>
+      <w:commentRangeStart w:id="15"/>
+      <w:r>
+        <w:t>s</w:t>
+      </w:r>
+      <w:proofErr w:type="gramEnd"/>
+      <w:r>
+        <w:t xml:space="preserve"> they can present a model approach, and if so, then present the approach with clear documentation and figures that present the different elements and how they are linked</w:t>
+      </w:r>
+      <w:commentRangeEnd w:id="15"/>
       <w:r>
         <w:rPr>
           <w:rStyle w:val="CommentReference"/>
         </w:rPr>
-        <w:commentReference w:id="14"/>
-      </w:r>
-      <w:r>
-        <w:t xml:space="preserve">The societal aspects of these changes may be </w:t>
+        <w:commentReference w:id="15"/>
+      </w:r>
+      <w:r>
+        <w:t xml:space="preserve">. Or, if such an approach is more wishful thinking and not achievable </w:t>
       </w:r>
       <w:proofErr w:type="gramStart"/>
       <w:r>
-        <w:t>really complex</w:t>
-      </w:r>
-      <w:proofErr w:type="gramEnd"/>
-      <w:r>
-        <w:t xml:space="preserve"> and involve severe impacts on anything from changes in classic </w:t>
-      </w:r>
-      <w:proofErr w:type="spellStart"/>
-      <w:r>
-        <w:t>provisionary</w:t>
-      </w:r>
-      <w:proofErr w:type="spellEnd"/>
-      <w:r>
-        <w:t xml:space="preserve"> ecosystems services like food, feed and fibre to economic progress, human </w:t>
-      </w:r>
-      <w:proofErr w:type="spellStart"/>
-      <w:r>
-        <w:t>behavior</w:t>
-      </w:r>
-      <w:proofErr w:type="spellEnd"/>
-      <w:r>
-        <w:t xml:space="preserve">, migration and political unrest. These are really complex changes which the paper does not really acknowledge, and therefore the statement in line 292 that systems modelling can provide us with quantitative tools for </w:t>
-      </w:r>
-      <w:proofErr w:type="spellStart"/>
-      <w:r>
-        <w:t>predictins</w:t>
-      </w:r>
-      <w:proofErr w:type="spellEnd"/>
-      <w:r>
-        <w:t xml:space="preserve"> and decisions may in principle be correct, but we do not get any clear descriptions or approaches (which was the promise in the title of the paper) - or even a glance of what need to be scientifically and </w:t>
-      </w:r>
-      <w:proofErr w:type="spellStart"/>
-      <w:r>
-        <w:t>modelwise</w:t>
-      </w:r>
-      <w:proofErr w:type="spellEnd"/>
-      <w:r>
-        <w:t xml:space="preserve"> developed to get there. It may be relevant to include these aspects, but it </w:t>
-      </w:r>
-      <w:proofErr w:type="gramStart"/>
-      <w:r>
-        <w:t>has to</w:t>
-      </w:r>
-      <w:proofErr w:type="gramEnd"/>
-      <w:r>
-        <w:t xml:space="preserve"> be carefully described and framed, and the modelling aspects must be treated with the same carefulness as the physical-biological systems.</w:t>
-      </w:r>
-      <w:r>
-        <w:br/>
-      </w:r>
-    </w:p>
-    <w:p>
-      <w:r>
-        <w:rPr>
-          <w:b/>
-          <w:bCs/>
-          <w:color w:val="215E99" w:themeColor="text2" w:themeTint="BF"/>
-        </w:rPr>
-        <w:t>Response</w:t>
-      </w:r>
-      <w:r>
-        <w:rPr>
-          <w:color w:val="215E99" w:themeColor="text2" w:themeTint="BF"/>
-        </w:rPr>
-        <w:t>:</w:t>
-      </w:r>
-      <w:r>
-        <w:rPr>
-          <w:color w:val="215E99" w:themeColor="text2" w:themeTint="BF"/>
-        </w:rPr>
-        <w:t xml:space="preserve"> We agree. We have now removed the SES discussion from the paper and focused on the biological models. We make brief mention in the introduction and concluding remarks section about the implications for socioecological modelling. </w:t>
-      </w:r>
-      <w:r>
-        <w:rPr>
-          <w:color w:val="215E99" w:themeColor="text2" w:themeTint="BF"/>
-        </w:rPr>
-        <w:t>Instead,</w:t>
-      </w:r>
-      <w:r>
-        <w:rPr>
-          <w:color w:val="215E99" w:themeColor="text2" w:themeTint="BF"/>
-        </w:rPr>
-        <w:t xml:space="preserve"> we use this extra box </w:t>
-      </w:r>
-      <w:r>
-        <w:rPr>
-          <w:color w:val="215E99" w:themeColor="text2" w:themeTint="BF"/>
-        </w:rPr>
-        <w:t xml:space="preserve">bring in a concrete demonstration of how models in the major classes can be coupled across species. </w:t>
-      </w:r>
-    </w:p>
-    <w:p>
-      <w:r>
-        <w:br/>
-      </w:r>
-      <w:r>
-        <w:rPr>
-          <w:b/>
-          <w:bCs/>
-        </w:rPr>
-        <w:t>C</w:t>
-      </w:r>
-      <w:r>
-        <w:rPr>
-          <w:b/>
-          <w:bCs/>
-        </w:rPr>
-        <w:t>50</w:t>
-      </w:r>
-      <w:r>
-        <w:rPr>
-          <w:b/>
-          <w:bCs/>
-        </w:rPr>
-        <w:t>:</w:t>
-      </w:r>
-      <w:r>
-        <w:rPr>
-          <w:b/>
-          <w:bCs/>
-        </w:rPr>
-        <w:t xml:space="preserve"> </w:t>
-      </w:r>
-      <w:r>
-        <w:t>Figure 3 - This is an overly naïve figure that does not provide any useful information of the model approach.</w:t>
-      </w:r>
-      <w:r>
-        <w:br/>
-      </w:r>
-    </w:p>
-    <w:p>
-      <w:r>
-        <w:rPr>
-          <w:b/>
-          <w:bCs/>
-          <w:color w:val="215E99" w:themeColor="text2" w:themeTint="BF"/>
-        </w:rPr>
-        <w:t>Response</w:t>
-      </w:r>
-      <w:r>
-        <w:rPr>
-          <w:color w:val="215E99" w:themeColor="text2" w:themeTint="BF"/>
-        </w:rPr>
-        <w:t>:</w:t>
-      </w:r>
-      <w:r>
-        <w:rPr>
-          <w:color w:val="215E99" w:themeColor="text2" w:themeTint="BF"/>
-        </w:rPr>
-        <w:t xml:space="preserve"> </w:t>
-      </w:r>
-      <w:r>
-        <w:rPr>
-          <w:color w:val="215E99" w:themeColor="text2" w:themeTint="BF"/>
-        </w:rPr>
-        <w:t>Agree. We have removed this figure and the SES box.</w:t>
-      </w:r>
-    </w:p>
-    <w:p>
-      <w:r>
-        <w:br/>
-      </w:r>
-      <w:r>
-        <w:rPr>
-          <w:b/>
-          <w:bCs/>
-        </w:rPr>
-        <w:t>C</w:t>
-      </w:r>
-      <w:r>
-        <w:rPr>
-          <w:b/>
-          <w:bCs/>
-        </w:rPr>
-        <w:t>51</w:t>
-      </w:r>
-      <w:r>
-        <w:rPr>
-          <w:b/>
-          <w:bCs/>
-        </w:rPr>
-        <w:t>:</w:t>
-      </w:r>
-      <w:r>
-        <w:rPr>
-          <w:b/>
-          <w:bCs/>
-        </w:rPr>
-        <w:t xml:space="preserve"> </w:t>
-      </w:r>
-      <w:r>
-        <w:t>Figure 4 - Even with the long descriptive text, it is a very busy figure not giving a clear idea of what it wants to tell. It seems to be focused on a very limited system with just 2 species which is a bit contradictory to the concept of the paper that speaks about integration across domains and areas. The real challenge and the promise of the paper is about the comprehensive systems view and approach. The figure does not provide any solutions to the larger systems level.</w:t>
-      </w:r>
-      <w:r>
-        <w:br/>
-      </w:r>
-    </w:p>
-    <w:p>
-      <w:r>
-        <w:rPr>
-          <w:b/>
-          <w:bCs/>
-          <w:color w:val="215E99" w:themeColor="text2" w:themeTint="BF"/>
-        </w:rPr>
-        <w:t>Response</w:t>
-      </w:r>
-      <w:r>
-        <w:rPr>
-          <w:color w:val="215E99" w:themeColor="text2" w:themeTint="BF"/>
-        </w:rPr>
-        <w:t>:</w:t>
-      </w:r>
-      <w:r>
-        <w:rPr>
-          <w:color w:val="215E99" w:themeColor="text2" w:themeTint="BF"/>
-        </w:rPr>
-        <w:t xml:space="preserve"> We have now included more detail about the modelling approaches from the supplement in two new boxes. Hopefully this makes the figure emerge more clearly now. We have also tried to simplify it.</w:t>
-      </w:r>
-    </w:p>
-    <w:p>
-      <w:r>
-        <w:br/>
-      </w:r>
-      <w:r>
-        <w:rPr>
-          <w:b/>
-          <w:bCs/>
-        </w:rPr>
-        <w:t>C</w:t>
-      </w:r>
-      <w:r>
-        <w:rPr>
-          <w:b/>
-          <w:bCs/>
-        </w:rPr>
-        <w:t>52</w:t>
-      </w:r>
-      <w:r>
-        <w:rPr>
-          <w:b/>
-          <w:bCs/>
-        </w:rPr>
-        <w:t>:</w:t>
-      </w:r>
-      <w:r>
-        <w:rPr>
-          <w:b/>
-          <w:bCs/>
-        </w:rPr>
-        <w:t xml:space="preserve"> </w:t>
-      </w:r>
-      <w:r>
-        <w:t xml:space="preserve">Outstanding questions - It is great with this attempt to summarize the messages into the next step or research needs for the future. </w:t>
-      </w:r>
-      <w:proofErr w:type="gramStart"/>
-      <w:r>
-        <w:t>But,</w:t>
-      </w:r>
-      <w:proofErr w:type="gramEnd"/>
-      <w:r>
-        <w:t xml:space="preserve"> these questions should follow logically from the paper, which I do not think they do. I cannot identify for any of the 8 points where this is a logical conclusion from things presented and discussed in the paper. Moreover, these 8 points are quite substantial outstanding questions which speaks against the title of the paper promising the reader an approach to model consequences of heat waves. It seems to me that the authors should </w:t>
-      </w:r>
-      <w:proofErr w:type="gramStart"/>
-      <w:r>
-        <w:t>consider,</w:t>
-      </w:r>
-      <w:proofErr w:type="gramEnd"/>
-      <w:r>
-        <w:t xml:space="preserve"> whether they actually </w:t>
-      </w:r>
-      <w:proofErr w:type="gramStart"/>
-      <w:r>
-        <w:t>believe</w:t>
-      </w:r>
-      <w:commentRangeStart w:id="15"/>
-      <w:r>
-        <w:t>s</w:t>
-      </w:r>
-      <w:proofErr w:type="gramEnd"/>
-      <w:r>
-        <w:t xml:space="preserve"> they can present a model approach, and if so, then present the approach with clear documentation and figures that present the different elements and how they are linked</w:t>
-      </w:r>
-      <w:commentRangeEnd w:id="15"/>
-      <w:r>
-        <w:rPr>
-          <w:rStyle w:val="CommentReference"/>
-        </w:rPr>
-        <w:commentReference w:id="15"/>
-      </w:r>
-      <w:r>
-        <w:t xml:space="preserve">. Or, if such an approach is more wishful thinking and not achievable </w:t>
-      </w:r>
-      <w:proofErr w:type="gramStart"/>
-      <w:r>
-        <w:lastRenderedPageBreak/>
         <w:t>at the moment</w:t>
       </w:r>
       <w:proofErr w:type="gramEnd"/>
@@ -5901,10 +6045,7 @@
         <w:annotationRef/>
       </w:r>
       <w:r>
-        <w:t xml:space="preserve">Adrienne, Margie, Mike and Belinda, can you have a crack as clearly my questions </w:t>
-      </w:r>
-      <w:r>
-        <w:t>suck!</w:t>
+        <w:t>Adrienne, Margie, Mike and Belinda, can you have a crack as clearly my questions suck!</w:t>
       </w:r>
     </w:p>
   </w:comment>

</xml_diff>